<commit_message>
Added ingest.py , chroma_rag.py and built perisistant vector db
</commit_message>
<xml_diff>
--- a/docs/Doc1.docx
+++ b/docs/Doc1.docx
@@ -2,6 +2,3909 @@
 <file path=word/document.xml><?xml version="1.0" encoding="utf-8"?>
 <w:document xmlns:wpc="http://schemas.microsoft.com/office/word/2010/wordprocessingCanvas" xmlns:cx="http://schemas.microsoft.com/office/drawing/2014/chartex" xmlns:cx1="http://schemas.microsoft.com/office/drawing/2015/9/8/chartex" xmlns:cx2="http://schemas.microsoft.com/office/drawing/2015/10/21/chartex" xmlns:cx3="http://schemas.microsoft.com/office/drawing/2016/5/9/chartex" xmlns:cx4="http://schemas.microsoft.com/office/drawing/2016/5/10/chartex" xmlns:cx5="http://schemas.microsoft.com/office/drawing/2016/5/11/chartex" xmlns:cx6="http://schemas.microsoft.com/office/drawing/2016/5/12/chartex" xmlns:cx7="http://schemas.microsoft.com/office/drawing/2016/5/13/chartex" xmlns:cx8="http://schemas.microsoft.com/office/drawing/2016/5/14/chartex" xmlns:mc="http://schemas.openxmlformats.org/markup-compatibility/2006" xmlns:aink="http://schemas.microsoft.com/office/drawing/2016/ink" xmlns:am3d="http://schemas.microsoft.com/office/drawing/2017/model3d" xmlns:o="urn:schemas-microsoft-com:office:office" xmlns:oel="http://schemas.microsoft.com/office/2019/extlst" xmlns:r="http://schemas.openxmlformats.org/officeDocument/2006/relationships" xmlns:m="http://schemas.openxmlformats.org/officeDocument/2006/math" xmlns:v="urn:schemas-microsoft-com:vml" xmlns:wp14="http://schemas.microsoft.com/office/word/2010/wordprocessingDrawing" xmlns:wp="http://schemas.openxmlformats.org/drawingml/2006/wordprocessingDrawing" xmlns:w10="urn:schemas-microsoft-com:office:word" xmlns:w="http://schemas.openxmlformats.org/wordprocessingml/2006/main" xmlns:w14="http://schemas.microsoft.com/office/word/2010/wordml" xmlns:w15="http://schemas.microsoft.com/office/word/2012/wordml" xmlns:w16cex="http://schemas.microsoft.com/office/word/2018/wordml/cex" xmlns:w16cid="http://schemas.microsoft.com/office/word/2016/wordml/cid" xmlns:w16="http://schemas.microsoft.com/office/word/2018/wordml" xmlns:w16du="http://schemas.microsoft.com/office/word/2023/wordml/word16du" xmlns:w16sdtdh="http://schemas.microsoft.com/office/word/2020/wordml/sdtdatahash" xmlns:w16sdtfl="http://schemas.microsoft.com/office/word/2024/wordml/sdtformatlock" xmlns:w16se="http://schemas.microsoft.com/office/word/2015/wordml/symex" xmlns:wpg="http://schemas.microsoft.com/office/word/2010/wordprocessingGroup" xmlns:wpi="http://schemas.microsoft.com/office/word/2010/wordprocessingInk" xmlns:wne="http://schemas.microsoft.com/office/word/2006/wordml" xmlns:wps="http://schemas.microsoft.com/office/word/2010/wordprocessingShape" mc:Ignorable="w14 w15 w16se w16cid w16 w16cex w16sdtdh w16sdtfl w16du wp14">
   <w:body>
+    <w:p>
+      <w:pPr>
+        <w:pStyle w:val="Heading1"/>
+      </w:pPr>
+      <w:r>
+        <w:t>STIX data preparation</w:t>
+      </w:r>
+    </w:p>
+    <w:p>
+      <w:pPr>
+        <w:pStyle w:val="Heading2"/>
+      </w:pPr>
+      <w:r>
+        <w:t>Download the ATT&amp;CK STIX dataset</w:t>
+      </w:r>
+    </w:p>
+    <w:p>
+      <w:r>
+        <w:t>Get enterprise-</w:t>
+      </w:r>
+      <w:proofErr w:type="gramStart"/>
+      <w:r>
+        <w:t>attack.json</w:t>
+      </w:r>
+      <w:proofErr w:type="gramEnd"/>
+      <w:r>
+        <w:t> from github.com/mitre/cti. This is the raw JSON containing all ATT&amp;CK objects in STIX v2.1 format.</w:t>
+      </w:r>
+    </w:p>
+    <w:p>
+      <w:r>
+        <w:drawing>
+          <wp:inline distT="0" distB="0" distL="0" distR="0" wp14:anchorId="3C6BE518" wp14:editId="15376C27">
+            <wp:extent cx="5731510" cy="584835"/>
+            <wp:effectExtent l="0" t="0" r="2540" b="5715"/>
+            <wp:docPr id="643413196" name="Picture 1"/>
+            <wp:cNvGraphicFramePr>
+              <a:graphicFrameLocks xmlns:a="http://schemas.openxmlformats.org/drawingml/2006/main" noChangeAspect="1"/>
+            </wp:cNvGraphicFramePr>
+            <a:graphic xmlns:a="http://schemas.openxmlformats.org/drawingml/2006/main">
+              <a:graphicData uri="http://schemas.openxmlformats.org/drawingml/2006/picture">
+                <pic:pic xmlns:pic="http://schemas.openxmlformats.org/drawingml/2006/picture">
+                  <pic:nvPicPr>
+                    <pic:cNvPr id="643413196" name=""/>
+                    <pic:cNvPicPr/>
+                  </pic:nvPicPr>
+                  <pic:blipFill>
+                    <a:blip r:embed="rId5"/>
+                    <a:stretch>
+                      <a:fillRect/>
+                    </a:stretch>
+                  </pic:blipFill>
+                  <pic:spPr>
+                    <a:xfrm>
+                      <a:off x="0" y="0"/>
+                      <a:ext cx="5731510" cy="584835"/>
+                    </a:xfrm>
+                    <a:prstGeom prst="rect">
+                      <a:avLst/>
+                    </a:prstGeom>
+                  </pic:spPr>
+                </pic:pic>
+              </a:graphicData>
+            </a:graphic>
+          </wp:inline>
+        </w:drawing>
+      </w:r>
+    </w:p>
+    <w:p>
+      <w:pPr>
+        <w:pStyle w:val="Heading2"/>
+      </w:pPr>
+      <w:r>
+        <w:t>Parse with mitreattack-python</w:t>
+      </w:r>
+    </w:p>
+    <w:p>
+      <w:r>
+        <w:t>Use the mitreattack-python library to extract four object types: techniques (attack-pattern), groups (intrusion-set), relationships, and mitigations (course-of-action).</w:t>
+      </w:r>
+    </w:p>
+    <w:tbl>
+      <w:tblPr>
+        <w:tblStyle w:val="TableGrid"/>
+        <w:tblW w:w="0" w:type="auto"/>
+        <w:tblLook w:val="04A0" w:firstRow="1" w:lastRow="0" w:firstColumn="1" w:lastColumn="0" w:noHBand="0" w:noVBand="1"/>
+      </w:tblPr>
+      <w:tblGrid>
+        <w:gridCol w:w="9016"/>
+      </w:tblGrid>
+      <w:tr>
+        <w:tc>
+          <w:tcPr>
+            <w:tcW w:w="9016" w:type="dxa"/>
+          </w:tcPr>
+          <w:p>
+            <w:r>
+              <w:t>import json</w:t>
+            </w:r>
+          </w:p>
+          <w:p>
+            <w:r>
+              <w:t xml:space="preserve">from </w:t>
+            </w:r>
+            <w:proofErr w:type="gramStart"/>
+            <w:r>
+              <w:t>mitreattack.stix</w:t>
+            </w:r>
+            <w:proofErr w:type="gramEnd"/>
+            <w:r>
+              <w:t>20 import MitreAttackData</w:t>
+            </w:r>
+          </w:p>
+          <w:p>
+            <w:r>
+              <w:t>from stix2 import Filter</w:t>
+            </w:r>
+          </w:p>
+          <w:p/>
+          <w:p>
+            <w:r>
+              <w:t>STIX_FILE = "enterprise-</w:t>
+            </w:r>
+            <w:proofErr w:type="gramStart"/>
+            <w:r>
+              <w:t>attack.json</w:t>
+            </w:r>
+            <w:proofErr w:type="gramEnd"/>
+            <w:r>
+              <w:t>"</w:t>
+            </w:r>
+          </w:p>
+          <w:p/>
+          <w:p>
+            <w:proofErr w:type="gramStart"/>
+            <w:r>
+              <w:t>print(</w:t>
+            </w:r>
+            <w:proofErr w:type="gramEnd"/>
+            <w:r>
+              <w:t>"Loading ATT&amp;CK STIX data...")</w:t>
+            </w:r>
+          </w:p>
+          <w:p>
+            <w:r>
+              <w:t xml:space="preserve">attack = </w:t>
+            </w:r>
+            <w:proofErr w:type="gramStart"/>
+            <w:r>
+              <w:t>MitreAttackData(</w:t>
+            </w:r>
+            <w:proofErr w:type="gramEnd"/>
+            <w:r>
+              <w:t>STIX_FILE)</w:t>
+            </w:r>
+          </w:p>
+          <w:p/>
+          <w:p>
+            <w:proofErr w:type="gramStart"/>
+            <w:r>
+              <w:t>techniques  =</w:t>
+            </w:r>
+            <w:proofErr w:type="gramEnd"/>
+            <w:r>
+              <w:t xml:space="preserve"> attack.get_techniques(</w:t>
+            </w:r>
+            <w:r>
+              <w:rPr>
+                <w:i/>
+                <w:iCs/>
+              </w:rPr>
+              <w:t>remove_revoked_deprecated</w:t>
+            </w:r>
+            <w:r>
+              <w:t>=True)</w:t>
+            </w:r>
+          </w:p>
+          <w:p>
+            <w:r>
+              <w:t>groups      = attack.get_groups(</w:t>
+            </w:r>
+            <w:r>
+              <w:rPr>
+                <w:i/>
+                <w:iCs/>
+              </w:rPr>
+              <w:t>remove_revoked_deprecated</w:t>
+            </w:r>
+            <w:r>
+              <w:t>=True)</w:t>
+            </w:r>
+          </w:p>
+          <w:p>
+            <w:r>
+              <w:t>mitigations = attack.get_mitigations(</w:t>
+            </w:r>
+            <w:r>
+              <w:rPr>
+                <w:i/>
+                <w:iCs/>
+              </w:rPr>
+              <w:t>remove_revoked_deprecated</w:t>
+            </w:r>
+            <w:r>
+              <w:t>=True)</w:t>
+            </w:r>
+          </w:p>
+          <w:p>
+            <w:r>
+              <w:t xml:space="preserve">relationships = </w:t>
+            </w:r>
+            <w:proofErr w:type="gramStart"/>
+            <w:r>
+              <w:t>attack.src.query</w:t>
+            </w:r>
+            <w:proofErr w:type="gramEnd"/>
+            <w:r>
+              <w:t>([</w:t>
+            </w:r>
+            <w:proofErr w:type="gramStart"/>
+            <w:r>
+              <w:t>Filter(</w:t>
+            </w:r>
+            <w:proofErr w:type="gramEnd"/>
+            <w:r>
+              <w:t>"type", "=", "relationship")</w:t>
+            </w:r>
+            <w:proofErr w:type="gramStart"/>
+            <w:r>
+              <w:t>])  #</w:t>
+            </w:r>
+            <w:proofErr w:type="gramEnd"/>
+            <w:r>
+              <w:t xml:space="preserve"> </w:t>
+            </w:r>
+            <w:r>
+              <w:rPr>
+                <w:rFonts w:ascii="Segoe UI Emoji" w:hAnsi="Segoe UI Emoji" w:cs="Segoe UI Emoji"/>
+              </w:rPr>
+              <w:t>✅</w:t>
+            </w:r>
+            <w:r>
+              <w:t xml:space="preserve"> fixed</w:t>
+            </w:r>
+          </w:p>
+          <w:p/>
+          <w:p>
+            <w:proofErr w:type="gramStart"/>
+            <w:r>
+              <w:t>print(</w:t>
+            </w:r>
+            <w:proofErr w:type="gramEnd"/>
+            <w:r>
+              <w:t>f"✓ {len(techniques)} techniques")</w:t>
+            </w:r>
+          </w:p>
+          <w:p>
+            <w:proofErr w:type="gramStart"/>
+            <w:r>
+              <w:t>print(</w:t>
+            </w:r>
+            <w:proofErr w:type="gramEnd"/>
+            <w:r>
+              <w:t>f"✓ {len(groups)} groups")</w:t>
+            </w:r>
+          </w:p>
+          <w:p>
+            <w:proofErr w:type="gramStart"/>
+            <w:r>
+              <w:t>print(</w:t>
+            </w:r>
+            <w:proofErr w:type="gramEnd"/>
+            <w:r>
+              <w:t>f"✓ {len(mitigations)} mitigations")</w:t>
+            </w:r>
+          </w:p>
+          <w:p>
+            <w:proofErr w:type="gramStart"/>
+            <w:r>
+              <w:t>print(</w:t>
+            </w:r>
+            <w:proofErr w:type="gramEnd"/>
+            <w:r>
+              <w:t>f"✓ {len(relationships)} relationships")</w:t>
+            </w:r>
+          </w:p>
+          <w:p/>
+          <w:p>
+            <w:r>
+              <w:t>tech_to_groups = {}</w:t>
+            </w:r>
+          </w:p>
+          <w:p>
+            <w:r>
+              <w:t>for group in groups:</w:t>
+            </w:r>
+          </w:p>
+          <w:p>
+            <w:r>
+              <w:t>    for t in attack.get_techniques_used_by_group(group.id):</w:t>
+            </w:r>
+          </w:p>
+          <w:p>
+            <w:r>
+              <w:t>        tid = t["object"</w:t>
+            </w:r>
+            <w:proofErr w:type="gramStart"/>
+            <w:r>
+              <w:t>].external</w:t>
+            </w:r>
+            <w:proofErr w:type="gramEnd"/>
+            <w:r>
+              <w:t>_</w:t>
+            </w:r>
+            <w:proofErr w:type="gramStart"/>
+            <w:r>
+              <w:t>references[</w:t>
+            </w:r>
+            <w:proofErr w:type="gramEnd"/>
+            <w:r>
+              <w:t>0</w:t>
+            </w:r>
+            <w:proofErr w:type="gramStart"/>
+            <w:r>
+              <w:t>].external</w:t>
+            </w:r>
+            <w:proofErr w:type="gramEnd"/>
+            <w:r>
+              <w:t>_id</w:t>
+            </w:r>
+          </w:p>
+          <w:p>
+            <w:r>
+              <w:t>        tech_to_</w:t>
+            </w:r>
+            <w:proofErr w:type="gramStart"/>
+            <w:r>
+              <w:t>groups.setdefault</w:t>
+            </w:r>
+            <w:proofErr w:type="gramEnd"/>
+            <w:r>
+              <w:t>(tid, []</w:t>
+            </w:r>
+            <w:proofErr w:type="gramStart"/>
+            <w:r>
+              <w:t>).append</w:t>
+            </w:r>
+            <w:proofErr w:type="gramEnd"/>
+            <w:r>
+              <w:t>(group.name)</w:t>
+            </w:r>
+          </w:p>
+          <w:p/>
+          <w:p>
+            <w:r>
+              <w:t>tactic_to_techs = {}</w:t>
+            </w:r>
+          </w:p>
+          <w:p>
+            <w:r>
+              <w:t>for t in techniques:</w:t>
+            </w:r>
+          </w:p>
+          <w:p>
+            <w:r>
+              <w:t xml:space="preserve">    tid = </w:t>
+            </w:r>
+            <w:proofErr w:type="gramStart"/>
+            <w:r>
+              <w:t>t.external</w:t>
+            </w:r>
+            <w:proofErr w:type="gramEnd"/>
+            <w:r>
+              <w:t>_</w:t>
+            </w:r>
+            <w:proofErr w:type="gramStart"/>
+            <w:r>
+              <w:t>references[</w:t>
+            </w:r>
+            <w:proofErr w:type="gramEnd"/>
+            <w:r>
+              <w:t>0</w:t>
+            </w:r>
+            <w:proofErr w:type="gramStart"/>
+            <w:r>
+              <w:t>].external</w:t>
+            </w:r>
+            <w:proofErr w:type="gramEnd"/>
+            <w:r>
+              <w:t>_id</w:t>
+            </w:r>
+          </w:p>
+          <w:p>
+            <w:r>
+              <w:t>    for phase in (</w:t>
+            </w:r>
+            <w:proofErr w:type="gramStart"/>
+            <w:r>
+              <w:t>t.kill</w:t>
+            </w:r>
+            <w:proofErr w:type="gramEnd"/>
+            <w:r>
+              <w:t>_chain_phases or []):</w:t>
+            </w:r>
+          </w:p>
+          <w:p>
+            <w:r>
+              <w:t>        tactic_to_</w:t>
+            </w:r>
+            <w:proofErr w:type="gramStart"/>
+            <w:r>
+              <w:t>techs.setdefault</w:t>
+            </w:r>
+            <w:proofErr w:type="gramEnd"/>
+            <w:r>
+              <w:t>(</w:t>
+            </w:r>
+            <w:proofErr w:type="gramStart"/>
+            <w:r>
+              <w:t>phase.phase</w:t>
+            </w:r>
+            <w:proofErr w:type="gramEnd"/>
+            <w:r>
+              <w:t>_name, []</w:t>
+            </w:r>
+            <w:proofErr w:type="gramStart"/>
+            <w:r>
+              <w:t>).append</w:t>
+            </w:r>
+            <w:proofErr w:type="gramEnd"/>
+            <w:r>
+              <w:t>(tid)</w:t>
+            </w:r>
+          </w:p>
+          <w:p/>
+          <w:p>
+            <w:r>
+              <w:t>mit_to_techs = {}</w:t>
+            </w:r>
+          </w:p>
+          <w:p>
+            <w:r>
+              <w:t>for rel in relationships:</w:t>
+            </w:r>
+          </w:p>
+          <w:p>
+            <w:r>
+              <w:t xml:space="preserve">    if </w:t>
+            </w:r>
+            <w:proofErr w:type="gramStart"/>
+            <w:r>
+              <w:t>rel.relationship</w:t>
+            </w:r>
+            <w:proofErr w:type="gramEnd"/>
+            <w:r>
+              <w:t>_type == "mitigates":</w:t>
+            </w:r>
+          </w:p>
+          <w:p>
+            <w:r>
+              <w:t xml:space="preserve">        src = </w:t>
+            </w:r>
+            <w:proofErr w:type="gramStart"/>
+            <w:r>
+              <w:t>attack.src.query</w:t>
+            </w:r>
+            <w:proofErr w:type="gramEnd"/>
+            <w:r>
+              <w:t>([</w:t>
+            </w:r>
+            <w:proofErr w:type="gramStart"/>
+            <w:r>
+              <w:t>Filter(</w:t>
+            </w:r>
+            <w:proofErr w:type="gramEnd"/>
+            <w:r>
+              <w:t xml:space="preserve">"id", "=", </w:t>
+            </w:r>
+            <w:proofErr w:type="gramStart"/>
+            <w:r>
+              <w:t>rel.source</w:t>
+            </w:r>
+            <w:proofErr w:type="gramEnd"/>
+            <w:r>
+              <w:t>_ref)])</w:t>
+            </w:r>
+          </w:p>
+          <w:p>
+            <w:r>
+              <w:t xml:space="preserve">        tgt = </w:t>
+            </w:r>
+            <w:proofErr w:type="gramStart"/>
+            <w:r>
+              <w:t>attack.src.query</w:t>
+            </w:r>
+            <w:proofErr w:type="gramEnd"/>
+            <w:r>
+              <w:t>([</w:t>
+            </w:r>
+            <w:proofErr w:type="gramStart"/>
+            <w:r>
+              <w:t>Filter(</w:t>
+            </w:r>
+            <w:proofErr w:type="gramEnd"/>
+            <w:r>
+              <w:t xml:space="preserve">"id", "=", </w:t>
+            </w:r>
+            <w:proofErr w:type="gramStart"/>
+            <w:r>
+              <w:t>rel.target</w:t>
+            </w:r>
+            <w:proofErr w:type="gramEnd"/>
+            <w:r>
+              <w:t>_ref)])</w:t>
+            </w:r>
+          </w:p>
+          <w:p>
+            <w:r>
+              <w:t>        if src and tgt:</w:t>
+            </w:r>
+          </w:p>
+          <w:p>
+            <w:r>
+              <w:t>            try:</w:t>
+            </w:r>
+          </w:p>
+          <w:p>
+            <w:r>
+              <w:t>                mid = src[0</w:t>
+            </w:r>
+            <w:proofErr w:type="gramStart"/>
+            <w:r>
+              <w:t>].external</w:t>
+            </w:r>
+            <w:proofErr w:type="gramEnd"/>
+            <w:r>
+              <w:t>_</w:t>
+            </w:r>
+            <w:proofErr w:type="gramStart"/>
+            <w:r>
+              <w:t>references[</w:t>
+            </w:r>
+            <w:proofErr w:type="gramEnd"/>
+            <w:r>
+              <w:t>0</w:t>
+            </w:r>
+            <w:proofErr w:type="gramStart"/>
+            <w:r>
+              <w:t>].external</w:t>
+            </w:r>
+            <w:proofErr w:type="gramEnd"/>
+            <w:r>
+              <w:t>_id</w:t>
+            </w:r>
+          </w:p>
+          <w:p>
+            <w:r>
+              <w:t>                tid = tgt[0</w:t>
+            </w:r>
+            <w:proofErr w:type="gramStart"/>
+            <w:r>
+              <w:t>].external</w:t>
+            </w:r>
+            <w:proofErr w:type="gramEnd"/>
+            <w:r>
+              <w:t>_</w:t>
+            </w:r>
+            <w:proofErr w:type="gramStart"/>
+            <w:r>
+              <w:t>references[</w:t>
+            </w:r>
+            <w:proofErr w:type="gramEnd"/>
+            <w:r>
+              <w:t>0</w:t>
+            </w:r>
+            <w:proofErr w:type="gramStart"/>
+            <w:r>
+              <w:t>].external</w:t>
+            </w:r>
+            <w:proofErr w:type="gramEnd"/>
+            <w:r>
+              <w:t>_id</w:t>
+            </w:r>
+          </w:p>
+          <w:p>
+            <w:r>
+              <w:t>                mit_to_</w:t>
+            </w:r>
+            <w:proofErr w:type="gramStart"/>
+            <w:r>
+              <w:t>techs.setdefault</w:t>
+            </w:r>
+            <w:proofErr w:type="gramEnd"/>
+            <w:r>
+              <w:t>(mid, []</w:t>
+            </w:r>
+            <w:proofErr w:type="gramStart"/>
+            <w:r>
+              <w:t>).append</w:t>
+            </w:r>
+            <w:proofErr w:type="gramEnd"/>
+            <w:r>
+              <w:t>(tid)</w:t>
+            </w:r>
+          </w:p>
+          <w:p>
+            <w:r>
+              <w:t>            except (IndexError, AttributeError):</w:t>
+            </w:r>
+          </w:p>
+          <w:p>
+            <w:r>
+              <w:t>                continue</w:t>
+            </w:r>
+          </w:p>
+          <w:p/>
+          <w:p>
+            <w:r>
+              <w:t xml:space="preserve">with </w:t>
+            </w:r>
+            <w:proofErr w:type="gramStart"/>
+            <w:r>
+              <w:t>open(</w:t>
+            </w:r>
+            <w:proofErr w:type="gramEnd"/>
+            <w:r>
+              <w:t>"index_</w:t>
+            </w:r>
+            <w:proofErr w:type="gramStart"/>
+            <w:r>
+              <w:t>mappings.json</w:t>
+            </w:r>
+            <w:proofErr w:type="gramEnd"/>
+            <w:r>
+              <w:t>", "w") as f:</w:t>
+            </w:r>
+          </w:p>
+          <w:p>
+            <w:r>
+              <w:t xml:space="preserve">    </w:t>
+            </w:r>
+            <w:proofErr w:type="gramStart"/>
+            <w:r>
+              <w:t>json.dump</w:t>
+            </w:r>
+            <w:proofErr w:type="gramEnd"/>
+            <w:r>
+              <w:t>({</w:t>
+            </w:r>
+          </w:p>
+          <w:p>
+            <w:r>
+              <w:t>        "</w:t>
+            </w:r>
+            <w:proofErr w:type="gramStart"/>
+            <w:r>
+              <w:t>tech</w:t>
+            </w:r>
+            <w:proofErr w:type="gramEnd"/>
+            <w:r>
+              <w:t>_to_groups": tech_to_groups,</w:t>
+            </w:r>
+          </w:p>
+          <w:p>
+            <w:r>
+              <w:t>        "</w:t>
+            </w:r>
+            <w:proofErr w:type="gramStart"/>
+            <w:r>
+              <w:t>tactic</w:t>
+            </w:r>
+            <w:proofErr w:type="gramEnd"/>
+            <w:r>
+              <w:t>_to_techs": tactic_to_techs,</w:t>
+            </w:r>
+          </w:p>
+          <w:p>
+            <w:r>
+              <w:t>        "</w:t>
+            </w:r>
+            <w:proofErr w:type="gramStart"/>
+            <w:r>
+              <w:t>mit</w:t>
+            </w:r>
+            <w:proofErr w:type="gramEnd"/>
+            <w:r>
+              <w:t>_to_techs": mit_to_techs</w:t>
+            </w:r>
+          </w:p>
+          <w:p>
+            <w:r>
+              <w:t xml:space="preserve">    }, f, </w:t>
+            </w:r>
+            <w:r>
+              <w:rPr>
+                <w:i/>
+                <w:iCs/>
+              </w:rPr>
+              <w:t>indent</w:t>
+            </w:r>
+            <w:r>
+              <w:t>=2)</w:t>
+            </w:r>
+          </w:p>
+          <w:p/>
+          <w:p>
+            <w:proofErr w:type="gramStart"/>
+            <w:r>
+              <w:t>print(</w:t>
+            </w:r>
+            <w:proofErr w:type="gramEnd"/>
+            <w:r>
+              <w:t>"✓ index_</w:t>
+            </w:r>
+            <w:proofErr w:type="gramStart"/>
+            <w:r>
+              <w:t>mappings.json</w:t>
+            </w:r>
+            <w:proofErr w:type="gramEnd"/>
+            <w:r>
+              <w:t xml:space="preserve"> saved")</w:t>
+            </w:r>
+          </w:p>
+          <w:p/>
+        </w:tc>
+      </w:tr>
+    </w:tbl>
+    <w:p/>
+    <w:tbl>
+      <w:tblPr>
+        <w:tblStyle w:val="TableGrid"/>
+        <w:tblW w:w="0" w:type="auto"/>
+        <w:tblLook w:val="04A0" w:firstRow="1" w:lastRow="0" w:firstColumn="1" w:lastColumn="0" w:noHBand="0" w:noVBand="1"/>
+      </w:tblPr>
+      <w:tblGrid>
+        <w:gridCol w:w="9016"/>
+      </w:tblGrid>
+      <w:tr>
+        <w:tc>
+          <w:tcPr>
+            <w:tcW w:w="9016" w:type="dxa"/>
+          </w:tcPr>
+          <w:p>
+            <w:r>
+              <w:t>MITRE ATT&amp;CK stores information like:</w:t>
+            </w:r>
+          </w:p>
+          <w:p>
+            <w:r>
+              <w:t>APT29 uses T1059</w:t>
+            </w:r>
+            <w:r>
+              <w:br/>
+              <w:t>APT29 uses T1003</w:t>
+            </w:r>
+            <w:r>
+              <w:br/>
+              <w:t>M1030 mitigates T1021</w:t>
+            </w:r>
+            <w:r>
+              <w:br/>
+              <w:t>T1059 belongs to Execution</w:t>
+            </w:r>
+          </w:p>
+          <w:p/>
+          <w:p>
+            <w:r>
+              <w:t>Internally, ATT&amp;CK is a graph:</w:t>
+            </w:r>
+          </w:p>
+          <w:p>
+            <w:r>
+              <w:t>Group ──uses────</w:t>
+            </w:r>
+            <w:r>
+              <w:rPr>
+                <w:rFonts w:ascii="Arial" w:hAnsi="Arial" w:cs="Arial"/>
+              </w:rPr>
+              <w:t>►</w:t>
+            </w:r>
+            <w:r>
+              <w:t xml:space="preserve"> Technique</w:t>
+            </w:r>
+            <w:r>
+              <w:br/>
+              <w:t xml:space="preserve">Technique </w:t>
+            </w:r>
+            <w:r>
+              <w:rPr>
+                <w:rFonts w:ascii="Aptos" w:hAnsi="Aptos" w:cs="Aptos"/>
+              </w:rPr>
+              <w:t>──</w:t>
+            </w:r>
+            <w:r>
+              <w:t>belongs to</w:t>
+            </w:r>
+            <w:r>
+              <w:rPr>
+                <w:rFonts w:ascii="Aptos" w:hAnsi="Aptos" w:cs="Aptos"/>
+              </w:rPr>
+              <w:t>──</w:t>
+            </w:r>
+            <w:r>
+              <w:rPr>
+                <w:rFonts w:ascii="Arial" w:hAnsi="Arial" w:cs="Arial"/>
+              </w:rPr>
+              <w:t>►</w:t>
+            </w:r>
+            <w:r>
+              <w:t xml:space="preserve"> Tactic</w:t>
+            </w:r>
+            <w:r>
+              <w:br/>
+              <w:t xml:space="preserve">Mitigation </w:t>
+            </w:r>
+            <w:r>
+              <w:rPr>
+                <w:rFonts w:ascii="Aptos" w:hAnsi="Aptos" w:cs="Aptos"/>
+              </w:rPr>
+              <w:t>──</w:t>
+            </w:r>
+            <w:r>
+              <w:t>mitigates</w:t>
+            </w:r>
+            <w:r>
+              <w:rPr>
+                <w:rFonts w:ascii="Aptos" w:hAnsi="Aptos" w:cs="Aptos"/>
+              </w:rPr>
+              <w:t>──</w:t>
+            </w:r>
+            <w:r>
+              <w:rPr>
+                <w:rFonts w:ascii="Arial" w:hAnsi="Arial" w:cs="Arial"/>
+              </w:rPr>
+              <w:t>►</w:t>
+            </w:r>
+            <w:r>
+              <w:t xml:space="preserve"> Technique</w:t>
+            </w:r>
+          </w:p>
+          <w:p/>
+          <w:p>
+            <w:r>
+              <w:t>The raw dataset contains thousands of objects and relationships.</w:t>
+            </w:r>
+          </w:p>
+          <w:p/>
+          <w:p>
+            <w:r>
+              <w:t>Imagine your future system receives a question:</w:t>
+            </w:r>
+            <w:r>
+              <w:t xml:space="preserve"> </w:t>
+            </w:r>
+            <w:r>
+              <w:t>Which threat groups use T1059?</w:t>
+            </w:r>
+          </w:p>
+          <w:p>
+            <w:pPr>
+              <w:rPr>
+                <w:b/>
+                <w:bCs/>
+              </w:rPr>
+            </w:pPr>
+            <w:r>
+              <w:rPr>
+                <w:b/>
+                <w:bCs/>
+              </w:rPr>
+              <w:t>Without your index</w:t>
+            </w:r>
+          </w:p>
+          <w:p>
+            <w:r>
+              <w:t>The program would have to:</w:t>
+            </w:r>
+          </w:p>
+          <w:p>
+            <w:pPr>
+              <w:numPr>
+                <w:ilvl w:val="0"/>
+                <w:numId w:val="2"/>
+              </w:numPr>
+            </w:pPr>
+            <w:r>
+              <w:t xml:space="preserve">Open ATT&amp;CK data </w:t>
+            </w:r>
+          </w:p>
+          <w:p>
+            <w:pPr>
+              <w:numPr>
+                <w:ilvl w:val="0"/>
+                <w:numId w:val="2"/>
+              </w:numPr>
+            </w:pPr>
+            <w:r>
+              <w:t xml:space="preserve">Find every group </w:t>
+            </w:r>
+          </w:p>
+          <w:p>
+            <w:pPr>
+              <w:numPr>
+                <w:ilvl w:val="0"/>
+                <w:numId w:val="2"/>
+              </w:numPr>
+            </w:pPr>
+            <w:r>
+              <w:t xml:space="preserve">Find every relationship </w:t>
+            </w:r>
+          </w:p>
+          <w:p>
+            <w:pPr>
+              <w:numPr>
+                <w:ilvl w:val="0"/>
+                <w:numId w:val="2"/>
+              </w:numPr>
+            </w:pPr>
+            <w:r>
+              <w:t xml:space="preserve">Check which relationships involve T1059 </w:t>
+            </w:r>
+          </w:p>
+          <w:p>
+            <w:pPr>
+              <w:numPr>
+                <w:ilvl w:val="0"/>
+                <w:numId w:val="2"/>
+              </w:numPr>
+            </w:pPr>
+            <w:r>
+              <w:t xml:space="preserve">Collect matching groups </w:t>
+            </w:r>
+          </w:p>
+          <w:p>
+            <w:r>
+              <w:t>Every time someone asks.</w:t>
+            </w:r>
+          </w:p>
+          <w:p>
+            <w:pPr>
+              <w:rPr>
+                <w:b/>
+                <w:bCs/>
+              </w:rPr>
+            </w:pPr>
+            <w:r>
+              <w:rPr>
+                <w:b/>
+                <w:bCs/>
+              </w:rPr>
+              <w:lastRenderedPageBreak/>
+              <w:t>With your index</w:t>
+            </w:r>
+          </w:p>
+          <w:p>
+            <w:r>
+              <w:t>It simply does:</w:t>
+            </w:r>
+            <w:r>
+              <w:t xml:space="preserve"> </w:t>
+            </w:r>
+            <w:r>
+              <w:t>tech_to_groups["T1059"]</w:t>
+            </w:r>
+          </w:p>
+          <w:p>
+            <w:r>
+              <w:t>and instantly gets:</w:t>
+            </w:r>
+            <w:r>
+              <w:t xml:space="preserve"> </w:t>
+            </w:r>
+            <w:r>
+              <w:t>["APT29", "APT28", "FIN7"]</w:t>
+            </w:r>
+          </w:p>
+          <w:p>
+            <w:r>
+              <w:t>Much faster.</w:t>
+            </w:r>
+          </w:p>
+          <w:p/>
+        </w:tc>
+      </w:tr>
+    </w:tbl>
+    <w:p/>
+    <w:p>
+      <w:pPr>
+        <w:pStyle w:val="Heading2"/>
+      </w:pPr>
+      <w:r>
+        <w:t>Build index mappings</w:t>
+      </w:r>
+    </w:p>
+    <w:p>
+      <w:r>
+        <w:t>Create three lookup structures:</w:t>
+      </w:r>
+    </w:p>
+    <w:p>
+      <w:pPr>
+        <w:pStyle w:val="ListParagraph"/>
+        <w:numPr>
+          <w:ilvl w:val="0"/>
+          <w:numId w:val="1"/>
+        </w:numPr>
+      </w:pPr>
+      <w:r>
+        <w:t>T</w:t>
+      </w:r>
+      <w:r>
+        <w:t>echnique</w:t>
+      </w:r>
+      <w:r>
+        <w:t xml:space="preserve"> </w:t>
+      </w:r>
+      <w:r>
+        <w:t>→</w:t>
+      </w:r>
+      <w:r>
+        <w:t xml:space="preserve"> </w:t>
+      </w:r>
+      <w:r>
+        <w:t>group</w:t>
+      </w:r>
+    </w:p>
+    <w:p>
+      <w:pPr>
+        <w:pStyle w:val="ListParagraph"/>
+        <w:numPr>
+          <w:ilvl w:val="0"/>
+          <w:numId w:val="1"/>
+        </w:numPr>
+      </w:pPr>
+      <w:r>
+        <w:t>T</w:t>
+      </w:r>
+      <w:r>
+        <w:t>actic</w:t>
+      </w:r>
+      <w:r>
+        <w:t xml:space="preserve"> </w:t>
+      </w:r>
+      <w:r>
+        <w:t>→</w:t>
+      </w:r>
+      <w:r>
+        <w:t xml:space="preserve"> </w:t>
+      </w:r>
+      <w:r>
+        <w:t>technique</w:t>
+      </w:r>
+    </w:p>
+    <w:p>
+      <w:pPr>
+        <w:pStyle w:val="ListParagraph"/>
+        <w:numPr>
+          <w:ilvl w:val="0"/>
+          <w:numId w:val="1"/>
+        </w:numPr>
+      </w:pPr>
+      <w:r>
+        <w:t>M</w:t>
+      </w:r>
+      <w:r>
+        <w:t>itigation</w:t>
+      </w:r>
+      <w:r>
+        <w:t xml:space="preserve"> </w:t>
+      </w:r>
+      <w:r>
+        <w:t>→</w:t>
+      </w:r>
+      <w:r>
+        <w:t xml:space="preserve"> </w:t>
+      </w:r>
+      <w:r>
+        <w:t xml:space="preserve">technique. </w:t>
+      </w:r>
+    </w:p>
+    <w:p>
+      <w:r>
+        <w:t>These power the RAG metadata filters later.</w:t>
+      </w:r>
+    </w:p>
+    <w:p>
+      <w:r>
+        <w:drawing>
+          <wp:inline distT="0" distB="0" distL="0" distR="0" wp14:anchorId="4916297D" wp14:editId="539960BB">
+            <wp:extent cx="5731510" cy="803910"/>
+            <wp:effectExtent l="0" t="0" r="2540" b="0"/>
+            <wp:docPr id="1032343631" name="Picture 1"/>
+            <wp:cNvGraphicFramePr>
+              <a:graphicFrameLocks xmlns:a="http://schemas.openxmlformats.org/drawingml/2006/main" noChangeAspect="1"/>
+            </wp:cNvGraphicFramePr>
+            <a:graphic xmlns:a="http://schemas.openxmlformats.org/drawingml/2006/main">
+              <a:graphicData uri="http://schemas.openxmlformats.org/drawingml/2006/picture">
+                <pic:pic xmlns:pic="http://schemas.openxmlformats.org/drawingml/2006/picture">
+                  <pic:nvPicPr>
+                    <pic:cNvPr id="1032343631" name=""/>
+                    <pic:cNvPicPr/>
+                  </pic:nvPicPr>
+                  <pic:blipFill>
+                    <a:blip r:embed="rId6"/>
+                    <a:stretch>
+                      <a:fillRect/>
+                    </a:stretch>
+                  </pic:blipFill>
+                  <pic:spPr>
+                    <a:xfrm>
+                      <a:off x="0" y="0"/>
+                      <a:ext cx="5731510" cy="803910"/>
+                    </a:xfrm>
+                    <a:prstGeom prst="rect">
+                      <a:avLst/>
+                    </a:prstGeom>
+                  </pic:spPr>
+                </pic:pic>
+              </a:graphicData>
+            </a:graphic>
+          </wp:inline>
+        </w:drawing>
+      </w:r>
+    </w:p>
+    <w:p>
+      <w:pPr>
+        <w:pStyle w:val="Heading1"/>
+      </w:pPr>
+      <w:r>
+        <w:t>Vector DB + RAG setup</w:t>
+      </w:r>
+      <w:r>
+        <w:br/>
+      </w:r>
+      <w:r>
+        <w:rPr>
+          <w:rStyle w:val="Heading2Char"/>
+        </w:rPr>
+        <w:t>Set up ChromaDB</w:t>
+      </w:r>
+    </w:p>
+    <w:p>
+      <w:r>
+        <w:t>Install ChromaDB and configure a persistent local collection. Each ATT&amp;CK object gets exactly one entry — the "1 object = 1 chunk" rule. No text splitting.</w:t>
+      </w:r>
+    </w:p>
+    <w:p>
+      <w:pPr>
+        <w:rPr>
+          <w:lang w:val="en-US"/>
+        </w:rPr>
+      </w:pPr>
+      <w:r>
+        <w:rPr>
+          <w:lang w:val="en-US"/>
+        </w:rPr>
+        <w:drawing>
+          <wp:inline distT="0" distB="0" distL="0" distR="0" wp14:anchorId="592401A2" wp14:editId="3495703B">
+            <wp:extent cx="5731510" cy="290830"/>
+            <wp:effectExtent l="0" t="0" r="2540" b="0"/>
+            <wp:docPr id="382691666" name="Picture 1"/>
+            <wp:cNvGraphicFramePr>
+              <a:graphicFrameLocks xmlns:a="http://schemas.openxmlformats.org/drawingml/2006/main" noChangeAspect="1"/>
+            </wp:cNvGraphicFramePr>
+            <a:graphic xmlns:a="http://schemas.openxmlformats.org/drawingml/2006/main">
+              <a:graphicData uri="http://schemas.openxmlformats.org/drawingml/2006/picture">
+                <pic:pic xmlns:pic="http://schemas.openxmlformats.org/drawingml/2006/picture">
+                  <pic:nvPicPr>
+                    <pic:cNvPr id="382691666" name=""/>
+                    <pic:cNvPicPr/>
+                  </pic:nvPicPr>
+                  <pic:blipFill>
+                    <a:blip r:embed="rId7"/>
+                    <a:stretch>
+                      <a:fillRect/>
+                    </a:stretch>
+                  </pic:blipFill>
+                  <pic:spPr>
+                    <a:xfrm>
+                      <a:off x="0" y="0"/>
+                      <a:ext cx="5731510" cy="290830"/>
+                    </a:xfrm>
+                    <a:prstGeom prst="rect">
+                      <a:avLst/>
+                    </a:prstGeom>
+                  </pic:spPr>
+                </pic:pic>
+              </a:graphicData>
+            </a:graphic>
+          </wp:inline>
+        </w:drawing>
+      </w:r>
+    </w:p>
+    <w:p>
+      <w:pPr>
+        <w:pStyle w:val="Heading2"/>
+      </w:pPr>
+      <w:r>
+        <w:t>Embed and ingest objects</w:t>
+      </w:r>
+    </w:p>
+    <w:p>
+      <w:r>
+        <w:t>Use sentence-transformers/all-MiniLM-L6-v2 to embed each object's text. Store along with metadata fields: tactic, platform, technique ID, object type. These metadata fields enable filtering in hybrid search.</w:t>
+      </w:r>
+    </w:p>
+    <w:p/>
+    <w:p>
+      <w:pPr>
+        <w:pStyle w:val="Heading2"/>
+      </w:pPr>
+      <w:r>
+        <w:t>Implement hybrid retrieval</w:t>
+      </w:r>
+    </w:p>
+    <w:p>
+      <w:r>
+        <w:t>Top-5 retrieval combining semantic similarity search with explicit metadata filters (e.g. filter by tactic = "lateral-movement" AND platform = "Windows"). This hybrid approach prevents missing important objects.</w:t>
+      </w:r>
+    </w:p>
+    <w:p>
+      <w:r>
+        <w:lastRenderedPageBreak/>
+        <w:drawing>
+          <wp:inline distT="0" distB="0" distL="0" distR="0" wp14:anchorId="40734DE8" wp14:editId="2945D880">
+            <wp:extent cx="5731510" cy="815340"/>
+            <wp:effectExtent l="0" t="0" r="2540" b="3810"/>
+            <wp:docPr id="1108907782" name="Picture 1"/>
+            <wp:cNvGraphicFramePr>
+              <a:graphicFrameLocks xmlns:a="http://schemas.openxmlformats.org/drawingml/2006/main" noChangeAspect="1"/>
+            </wp:cNvGraphicFramePr>
+            <a:graphic xmlns:a="http://schemas.openxmlformats.org/drawingml/2006/main">
+              <a:graphicData uri="http://schemas.openxmlformats.org/drawingml/2006/picture">
+                <pic:pic xmlns:pic="http://schemas.openxmlformats.org/drawingml/2006/picture">
+                  <pic:nvPicPr>
+                    <pic:cNvPr id="1108907782" name=""/>
+                    <pic:cNvPicPr/>
+                  </pic:nvPicPr>
+                  <pic:blipFill>
+                    <a:blip r:embed="rId8"/>
+                    <a:stretch>
+                      <a:fillRect/>
+                    </a:stretch>
+                  </pic:blipFill>
+                  <pic:spPr>
+                    <a:xfrm>
+                      <a:off x="0" y="0"/>
+                      <a:ext cx="5731510" cy="815340"/>
+                    </a:xfrm>
+                    <a:prstGeom prst="rect">
+                      <a:avLst/>
+                    </a:prstGeom>
+                  </pic:spPr>
+                </pic:pic>
+              </a:graphicData>
+            </a:graphic>
+          </wp:inline>
+        </w:drawing>
+      </w:r>
+    </w:p>
+    <w:tbl>
+      <w:tblPr>
+        <w:tblStyle w:val="TableGrid"/>
+        <w:tblW w:w="0" w:type="auto"/>
+        <w:tblLook w:val="04A0" w:firstRow="1" w:lastRow="0" w:firstColumn="1" w:lastColumn="0" w:noHBand="0" w:noVBand="1"/>
+      </w:tblPr>
+      <w:tblGrid>
+        <w:gridCol w:w="9016"/>
+      </w:tblGrid>
+      <w:tr>
+        <w:tc>
+          <w:tcPr>
+            <w:tcW w:w="9016" w:type="dxa"/>
+          </w:tcPr>
+          <w:p>
+            <w:r>
+              <w:t>import chromadb</w:t>
+            </w:r>
+          </w:p>
+          <w:p>
+            <w:r>
+              <w:t>from chromadb.config import Settings</w:t>
+            </w:r>
+          </w:p>
+          <w:p>
+            <w:r>
+              <w:t>from sentence_transformers import SentenceTransformer</w:t>
+            </w:r>
+          </w:p>
+          <w:p>
+            <w:r>
+              <w:t xml:space="preserve">from </w:t>
+            </w:r>
+            <w:proofErr w:type="gramStart"/>
+            <w:r>
+              <w:t>mitreattack.stix</w:t>
+            </w:r>
+            <w:proofErr w:type="gramEnd"/>
+            <w:r>
+              <w:t>20 import MitreAttackData</w:t>
+            </w:r>
+          </w:p>
+          <w:p>
+            <w:r>
+              <w:t>import json, re</w:t>
+            </w:r>
+          </w:p>
+          <w:p/>
+          <w:p>
+            <w:proofErr w:type="gramStart"/>
+            <w:r>
+              <w:t>attack  =</w:t>
+            </w:r>
+            <w:proofErr w:type="gramEnd"/>
+            <w:r>
+              <w:t xml:space="preserve"> MitreAttackData("enterprise-</w:t>
+            </w:r>
+            <w:proofErr w:type="gramStart"/>
+            <w:r>
+              <w:t>attack.json</w:t>
+            </w:r>
+            <w:proofErr w:type="gramEnd"/>
+            <w:r>
+              <w:t>")</w:t>
+            </w:r>
+          </w:p>
+          <w:p>
+            <w:r>
+              <w:t>embedder = SentenceTransformer("sentence-transformers/all-MiniLM-L6-v2")</w:t>
+            </w:r>
+          </w:p>
+          <w:p/>
+          <w:p>
+            <w:r>
+              <w:t xml:space="preserve">client = </w:t>
+            </w:r>
+            <w:proofErr w:type="gramStart"/>
+            <w:r>
+              <w:t>chromadb.PersistentClient</w:t>
+            </w:r>
+            <w:proofErr w:type="gramEnd"/>
+            <w:r>
+              <w:t>(</w:t>
+            </w:r>
+            <w:r>
+              <w:rPr>
+                <w:i/>
+                <w:iCs/>
+              </w:rPr>
+              <w:t>path</w:t>
+            </w:r>
+            <w:r>
+              <w:t>=</w:t>
+            </w:r>
+            <w:proofErr w:type="gramStart"/>
+            <w:r>
+              <w:t>"./</w:t>
+            </w:r>
+            <w:proofErr w:type="gramEnd"/>
+            <w:r>
+              <w:t>chroma_attackdb")</w:t>
+            </w:r>
+          </w:p>
+          <w:p>
+            <w:r>
+              <w:t>col    = client.get_or_create_</w:t>
+            </w:r>
+            <w:proofErr w:type="gramStart"/>
+            <w:r>
+              <w:t>collection(</w:t>
+            </w:r>
+            <w:proofErr w:type="gramEnd"/>
+            <w:r>
+              <w:t>"attck_objects",</w:t>
+            </w:r>
+          </w:p>
+          <w:p>
+            <w:r>
+              <w:t>             </w:t>
+            </w:r>
+            <w:r>
+              <w:rPr>
+                <w:i/>
+                <w:iCs/>
+              </w:rPr>
+              <w:t>metadata</w:t>
+            </w:r>
+            <w:proofErr w:type="gramStart"/>
+            <w:r>
+              <w:t>={</w:t>
+            </w:r>
+            <w:proofErr w:type="gramEnd"/>
+            <w:r>
+              <w:t>"</w:t>
+            </w:r>
+            <w:proofErr w:type="gramStart"/>
+            <w:r>
+              <w:t>hnsw:space</w:t>
+            </w:r>
+            <w:proofErr w:type="gramEnd"/>
+            <w:r>
+              <w:t>": "cosine"})</w:t>
+            </w:r>
+          </w:p>
+          <w:p/>
+          <w:p>
+            <w:r>
+              <w:t>def safe_text(</w:t>
+            </w:r>
+            <w:r>
+              <w:rPr>
+                <w:i/>
+                <w:iCs/>
+              </w:rPr>
+              <w:t>val</w:t>
+            </w:r>
+            <w:r>
+              <w:t>):</w:t>
+            </w:r>
+          </w:p>
+          <w:p>
+            <w:r>
+              <w:t xml:space="preserve">    return </w:t>
+            </w:r>
+            <w:r>
+              <w:rPr>
+                <w:i/>
+                <w:iCs/>
+              </w:rPr>
+              <w:t>val</w:t>
+            </w:r>
+            <w:r>
+              <w:t xml:space="preserve"> if </w:t>
+            </w:r>
+            <w:proofErr w:type="gramStart"/>
+            <w:r>
+              <w:t>isinstance(</w:t>
+            </w:r>
+            <w:proofErr w:type="gramEnd"/>
+            <w:r>
+              <w:rPr>
+                <w:i/>
+                <w:iCs/>
+              </w:rPr>
+              <w:t>val</w:t>
+            </w:r>
+            <w:r>
+              <w:t>, str) else ""</w:t>
+            </w:r>
+          </w:p>
+          <w:p/>
+          <w:p>
+            <w:r>
+              <w:t>def get_ext_id(</w:t>
+            </w:r>
+            <w:r>
+              <w:rPr>
+                <w:i/>
+                <w:iCs/>
+              </w:rPr>
+              <w:t>obj</w:t>
+            </w:r>
+            <w:r>
+              <w:t>):</w:t>
+            </w:r>
+          </w:p>
+          <w:p>
+            <w:r>
+              <w:t xml:space="preserve">    try: return </w:t>
+            </w:r>
+            <w:proofErr w:type="gramStart"/>
+            <w:r>
+              <w:rPr>
+                <w:i/>
+                <w:iCs/>
+              </w:rPr>
+              <w:t>obj</w:t>
+            </w:r>
+            <w:r>
+              <w:t>.external</w:t>
+            </w:r>
+            <w:proofErr w:type="gramEnd"/>
+            <w:r>
+              <w:t>_</w:t>
+            </w:r>
+            <w:proofErr w:type="gramStart"/>
+            <w:r>
+              <w:t>references[</w:t>
+            </w:r>
+            <w:proofErr w:type="gramEnd"/>
+            <w:r>
+              <w:t>0</w:t>
+            </w:r>
+            <w:proofErr w:type="gramStart"/>
+            <w:r>
+              <w:t>].external</w:t>
+            </w:r>
+            <w:proofErr w:type="gramEnd"/>
+            <w:r>
+              <w:t>_id</w:t>
+            </w:r>
+          </w:p>
+          <w:p>
+            <w:r>
+              <w:t xml:space="preserve">    except: return </w:t>
+            </w:r>
+            <w:r>
+              <w:rPr>
+                <w:i/>
+                <w:iCs/>
+              </w:rPr>
+              <w:t>obj</w:t>
+            </w:r>
+            <w:r>
+              <w:t>.id</w:t>
+            </w:r>
+          </w:p>
+          <w:p/>
+          <w:p>
+            <w:r>
+              <w:t>def ingest_</w:t>
+            </w:r>
+            <w:proofErr w:type="gramStart"/>
+            <w:r>
+              <w:t>techniques(</w:t>
+            </w:r>
+            <w:proofErr w:type="gramEnd"/>
+            <w:r>
+              <w:t>):</w:t>
+            </w:r>
+          </w:p>
+          <w:p>
+            <w:r>
+              <w:t>    docs, metas, ids = [], [], []</w:t>
+            </w:r>
+          </w:p>
+          <w:p>
+            <w:r>
+              <w:t>    for t in attack.get_techniques(</w:t>
+            </w:r>
+            <w:r>
+              <w:rPr>
+                <w:i/>
+                <w:iCs/>
+              </w:rPr>
+              <w:t>remove_revoked_deprecated</w:t>
+            </w:r>
+            <w:r>
+              <w:t>=True):</w:t>
+            </w:r>
+          </w:p>
+          <w:p>
+            <w:r>
+              <w:t>        tid = get_ext_id(t)</w:t>
+            </w:r>
+          </w:p>
+          <w:p>
+            <w:r>
+              <w:t>        tactics   = [</w:t>
+            </w:r>
+            <w:proofErr w:type="gramStart"/>
+            <w:r>
+              <w:t>p.phase</w:t>
+            </w:r>
+            <w:proofErr w:type="gramEnd"/>
+            <w:r>
+              <w:t>_name for p in (</w:t>
+            </w:r>
+            <w:proofErr w:type="gramStart"/>
+            <w:r>
+              <w:t>t.kill</w:t>
+            </w:r>
+            <w:proofErr w:type="gramEnd"/>
+            <w:r>
+              <w:t>_chain_phases or [])]</w:t>
+            </w:r>
+          </w:p>
+          <w:p>
+            <w:r>
+              <w:t xml:space="preserve">        platforms = </w:t>
+            </w:r>
+            <w:proofErr w:type="gramStart"/>
+            <w:r>
+              <w:t>list(</w:t>
+            </w:r>
+            <w:proofErr w:type="gramEnd"/>
+            <w:r>
+              <w:t>t.x_mitre_platforms or [])</w:t>
+            </w:r>
+          </w:p>
+          <w:p>
+            <w:r>
+              <w:t>        text = (f"Technique: {t.name} ({tid</w:t>
+            </w:r>
+            <w:proofErr w:type="gramStart"/>
+            <w:r>
+              <w:t>})\</w:t>
+            </w:r>
+            <w:proofErr w:type="gramEnd"/>
+            <w:r>
+              <w:t>n"</w:t>
+            </w:r>
+          </w:p>
+          <w:p>
+            <w:r>
+              <w:t xml:space="preserve">                f"Tactics: {', </w:t>
+            </w:r>
+            <w:proofErr w:type="gramStart"/>
+            <w:r>
+              <w:t>'.join</w:t>
+            </w:r>
+            <w:proofErr w:type="gramEnd"/>
+            <w:r>
+              <w:t>(tactics</w:t>
+            </w:r>
+            <w:proofErr w:type="gramStart"/>
+            <w:r>
+              <w:t>)}\</w:t>
+            </w:r>
+            <w:proofErr w:type="gramEnd"/>
+            <w:r>
+              <w:t>n"</w:t>
+            </w:r>
+          </w:p>
+          <w:p>
+            <w:r>
+              <w:t xml:space="preserve">                f"Platforms: {', </w:t>
+            </w:r>
+            <w:proofErr w:type="gramStart"/>
+            <w:r>
+              <w:t>'.join</w:t>
+            </w:r>
+            <w:proofErr w:type="gramEnd"/>
+            <w:r>
+              <w:t>(platforms</w:t>
+            </w:r>
+            <w:proofErr w:type="gramStart"/>
+            <w:r>
+              <w:t>)}\</w:t>
+            </w:r>
+            <w:proofErr w:type="gramEnd"/>
+            <w:r>
+              <w:t>n"</w:t>
+            </w:r>
+          </w:p>
+          <w:p>
+            <w:r>
+              <w:t>                f"Description: {safe_text(</w:t>
+            </w:r>
+            <w:proofErr w:type="gramStart"/>
+            <w:r>
+              <w:t>t.description)[</w:t>
+            </w:r>
+            <w:proofErr w:type="gramEnd"/>
+            <w:r>
+              <w:t>:800</w:t>
+            </w:r>
+            <w:proofErr w:type="gramStart"/>
+            <w:r>
+              <w:t>]}\</w:t>
+            </w:r>
+            <w:proofErr w:type="gramEnd"/>
+            <w:r>
+              <w:t>n"</w:t>
+            </w:r>
+          </w:p>
+          <w:p>
+            <w:r>
+              <w:t>                f"Detection: {safe_text(getattr(t,'x_mitre_detection',''</w:t>
+            </w:r>
+            <w:proofErr w:type="gramStart"/>
+            <w:r>
+              <w:t>))[</w:t>
+            </w:r>
+            <w:proofErr w:type="gramEnd"/>
+            <w:r>
+              <w:t>:400]}")</w:t>
+            </w:r>
+          </w:p>
+          <w:p>
+            <w:r>
+              <w:t xml:space="preserve">        </w:t>
+            </w:r>
+            <w:proofErr w:type="gramStart"/>
+            <w:r>
+              <w:t>docs.append</w:t>
+            </w:r>
+            <w:proofErr w:type="gramEnd"/>
+            <w:r>
+              <w:t>(text</w:t>
+            </w:r>
+            <w:proofErr w:type="gramStart"/>
+            <w:r>
+              <w:t>);  ids</w:t>
+            </w:r>
+            <w:proofErr w:type="gramEnd"/>
+            <w:r>
+              <w:t>.append(tid)</w:t>
+            </w:r>
+          </w:p>
+          <w:p>
+            <w:r>
+              <w:t xml:space="preserve">        </w:t>
+            </w:r>
+            <w:proofErr w:type="gramStart"/>
+            <w:r>
+              <w:t>metas.append</w:t>
+            </w:r>
+            <w:proofErr w:type="gramEnd"/>
+            <w:r>
+              <w:t>({</w:t>
+            </w:r>
+          </w:p>
+          <w:p>
+            <w:r>
+              <w:t>            "</w:t>
+            </w:r>
+            <w:proofErr w:type="gramStart"/>
+            <w:r>
+              <w:t>object</w:t>
+            </w:r>
+            <w:proofErr w:type="gramEnd"/>
+            <w:r>
+              <w:t>_type": "technique",</w:t>
+            </w:r>
+          </w:p>
+          <w:p>
+            <w:r>
+              <w:t>            "</w:t>
+            </w:r>
+            <w:proofErr w:type="gramStart"/>
+            <w:r>
+              <w:t>technique</w:t>
+            </w:r>
+            <w:proofErr w:type="gramEnd"/>
+            <w:r>
+              <w:t>_id": tid,</w:t>
+            </w:r>
+          </w:p>
+          <w:p>
+            <w:r>
+              <w:t>            "name": t.name,</w:t>
+            </w:r>
+          </w:p>
+          <w:p>
+            <w:r>
+              <w:t xml:space="preserve">            "tactic": </w:t>
+            </w:r>
+            <w:proofErr w:type="gramStart"/>
+            <w:r>
+              <w:t>tactics[</w:t>
+            </w:r>
+            <w:proofErr w:type="gramEnd"/>
+            <w:r>
+              <w:t>0] if tactics else "unknown",</w:t>
+            </w:r>
+          </w:p>
+          <w:p>
+            <w:r>
+              <w:t>            "</w:t>
+            </w:r>
+            <w:proofErr w:type="gramStart"/>
+            <w:r>
+              <w:t>tactics</w:t>
+            </w:r>
+            <w:proofErr w:type="gramEnd"/>
+            <w:r>
+              <w:t xml:space="preserve">_all": </w:t>
+            </w:r>
+            <w:proofErr w:type="gramStart"/>
+            <w:r>
+              <w:t>json.dumps</w:t>
+            </w:r>
+            <w:proofErr w:type="gramEnd"/>
+            <w:r>
+              <w:t>(tactics),</w:t>
+            </w:r>
+          </w:p>
+          <w:p>
+            <w:r>
+              <w:t xml:space="preserve">            "platform": </w:t>
+            </w:r>
+            <w:proofErr w:type="gramStart"/>
+            <w:r>
+              <w:t>platforms[</w:t>
+            </w:r>
+            <w:proofErr w:type="gramEnd"/>
+            <w:r>
+              <w:t>0] if platforms else "unknown",</w:t>
+            </w:r>
+          </w:p>
+          <w:p>
+            <w:r>
+              <w:t>            "</w:t>
+            </w:r>
+            <w:proofErr w:type="gramStart"/>
+            <w:r>
+              <w:t>platforms</w:t>
+            </w:r>
+            <w:proofErr w:type="gramEnd"/>
+            <w:r>
+              <w:t xml:space="preserve">_all": </w:t>
+            </w:r>
+            <w:proofErr w:type="gramStart"/>
+            <w:r>
+              <w:t>json.dumps</w:t>
+            </w:r>
+            <w:proofErr w:type="gramEnd"/>
+            <w:r>
+              <w:t>(platforms),</w:t>
+            </w:r>
+          </w:p>
+          <w:p>
+            <w:r>
+              <w:t>        })</w:t>
+            </w:r>
+          </w:p>
+          <w:p>
+            <w:r>
+              <w:t>    _batch_</w:t>
+            </w:r>
+            <w:proofErr w:type="gramStart"/>
+            <w:r>
+              <w:t>upsert(</w:t>
+            </w:r>
+            <w:proofErr w:type="gramEnd"/>
+            <w:r>
+              <w:t>docs, metas, ids)</w:t>
+            </w:r>
+          </w:p>
+          <w:p>
+            <w:r>
+              <w:lastRenderedPageBreak/>
+              <w:t xml:space="preserve">    </w:t>
+            </w:r>
+            <w:proofErr w:type="gramStart"/>
+            <w:r>
+              <w:t>print(</w:t>
+            </w:r>
+            <w:proofErr w:type="gramEnd"/>
+            <w:r>
+              <w:t>f"Ingested {len(docs)} techniques")</w:t>
+            </w:r>
+          </w:p>
+          <w:p/>
+          <w:p>
+            <w:r>
+              <w:t>def ingest_</w:t>
+            </w:r>
+            <w:proofErr w:type="gramStart"/>
+            <w:r>
+              <w:t>groups(</w:t>
+            </w:r>
+            <w:proofErr w:type="gramEnd"/>
+            <w:r>
+              <w:t>):</w:t>
+            </w:r>
+          </w:p>
+          <w:p>
+            <w:r>
+              <w:t>    docs, metas, ids = [], [], []</w:t>
+            </w:r>
+          </w:p>
+          <w:p>
+            <w:r>
+              <w:t>    for g in attack.get_groups(</w:t>
+            </w:r>
+            <w:r>
+              <w:rPr>
+                <w:i/>
+                <w:iCs/>
+              </w:rPr>
+              <w:t>remove_revoked_deprecated</w:t>
+            </w:r>
+            <w:r>
+              <w:t>=True):</w:t>
+            </w:r>
+          </w:p>
+          <w:p>
+            <w:r>
+              <w:t>        gid = get_ext_id(g)</w:t>
+            </w:r>
+          </w:p>
+          <w:p>
+            <w:r>
+              <w:t xml:space="preserve">        aliases = </w:t>
+            </w:r>
+            <w:proofErr w:type="gramStart"/>
+            <w:r>
+              <w:t>list(g.aliases</w:t>
+            </w:r>
+            <w:proofErr w:type="gramEnd"/>
+            <w:r>
+              <w:t xml:space="preserve"> or [])</w:t>
+            </w:r>
+          </w:p>
+          <w:p>
+            <w:r>
+              <w:t>        used    = [t["object"].name for t in attack.get_techniques_used_by_group(g.id)]</w:t>
+            </w:r>
+          </w:p>
+          <w:p>
+            <w:r>
+              <w:t>        text = (f"Group: {g.name} ({gid</w:t>
+            </w:r>
+            <w:proofErr w:type="gramStart"/>
+            <w:r>
+              <w:t>})\</w:t>
+            </w:r>
+            <w:proofErr w:type="gramEnd"/>
+            <w:r>
+              <w:t>n"</w:t>
+            </w:r>
+          </w:p>
+          <w:p>
+            <w:r>
+              <w:t xml:space="preserve">                f"Aliases: {', </w:t>
+            </w:r>
+            <w:proofErr w:type="gramStart"/>
+            <w:r>
+              <w:t>'.join</w:t>
+            </w:r>
+            <w:proofErr w:type="gramEnd"/>
+            <w:r>
+              <w:t>(aliases</w:t>
+            </w:r>
+            <w:proofErr w:type="gramStart"/>
+            <w:r>
+              <w:t>)}\</w:t>
+            </w:r>
+            <w:proofErr w:type="gramEnd"/>
+            <w:r>
+              <w:t>n"</w:t>
+            </w:r>
+          </w:p>
+          <w:p>
+            <w:r>
+              <w:t>                f"Description: {safe_text(</w:t>
+            </w:r>
+            <w:proofErr w:type="gramStart"/>
+            <w:r>
+              <w:t>g.description)[</w:t>
+            </w:r>
+            <w:proofErr w:type="gramEnd"/>
+            <w:r>
+              <w:t>:600</w:t>
+            </w:r>
+            <w:proofErr w:type="gramStart"/>
+            <w:r>
+              <w:t>]}\</w:t>
+            </w:r>
+            <w:proofErr w:type="gramEnd"/>
+            <w:r>
+              <w:t>n"</w:t>
+            </w:r>
+          </w:p>
+          <w:p>
+            <w:r>
+              <w:t xml:space="preserve">                f"Associated techniques: {', </w:t>
+            </w:r>
+            <w:proofErr w:type="gramStart"/>
+            <w:r>
+              <w:t>'.join</w:t>
+            </w:r>
+            <w:proofErr w:type="gramEnd"/>
+            <w:r>
+              <w:t>(</w:t>
+            </w:r>
+            <w:proofErr w:type="gramStart"/>
+            <w:r>
+              <w:t>used[</w:t>
+            </w:r>
+            <w:proofErr w:type="gramEnd"/>
+            <w:r>
+              <w:t>:20])}")</w:t>
+            </w:r>
+          </w:p>
+          <w:p>
+            <w:r>
+              <w:t xml:space="preserve">        </w:t>
+            </w:r>
+            <w:proofErr w:type="gramStart"/>
+            <w:r>
+              <w:t>docs.append</w:t>
+            </w:r>
+            <w:proofErr w:type="gramEnd"/>
+            <w:r>
+              <w:t>(text</w:t>
+            </w:r>
+            <w:proofErr w:type="gramStart"/>
+            <w:r>
+              <w:t>);  ids</w:t>
+            </w:r>
+            <w:proofErr w:type="gramEnd"/>
+            <w:r>
+              <w:t>.append(gid)</w:t>
+            </w:r>
+          </w:p>
+          <w:p>
+            <w:r>
+              <w:t xml:space="preserve">        </w:t>
+            </w:r>
+            <w:proofErr w:type="gramStart"/>
+            <w:r>
+              <w:t>metas.append</w:t>
+            </w:r>
+            <w:proofErr w:type="gramEnd"/>
+            <w:r>
+              <w:t>({</w:t>
+            </w:r>
+          </w:p>
+          <w:p>
+            <w:r>
+              <w:t>            "</w:t>
+            </w:r>
+            <w:proofErr w:type="gramStart"/>
+            <w:r>
+              <w:t>object</w:t>
+            </w:r>
+            <w:proofErr w:type="gramEnd"/>
+            <w:r>
+              <w:t>_type": "group",</w:t>
+            </w:r>
+          </w:p>
+          <w:p>
+            <w:r>
+              <w:t>            "</w:t>
+            </w:r>
+            <w:proofErr w:type="gramStart"/>
+            <w:r>
+              <w:t>technique</w:t>
+            </w:r>
+            <w:proofErr w:type="gramEnd"/>
+            <w:r>
+              <w:t>_id": gid,</w:t>
+            </w:r>
+          </w:p>
+          <w:p>
+            <w:r>
+              <w:t>            "name": g.name,</w:t>
+            </w:r>
+          </w:p>
+          <w:p>
+            <w:r>
+              <w:t>            "tactic": "n/a",</w:t>
+            </w:r>
+          </w:p>
+          <w:p>
+            <w:r>
+              <w:t>            "platform": "n/a",</w:t>
+            </w:r>
+          </w:p>
+          <w:p>
+            <w:r>
+              <w:t>        })</w:t>
+            </w:r>
+          </w:p>
+          <w:p>
+            <w:r>
+              <w:t>    _batch_</w:t>
+            </w:r>
+            <w:proofErr w:type="gramStart"/>
+            <w:r>
+              <w:t>upsert(</w:t>
+            </w:r>
+            <w:proofErr w:type="gramEnd"/>
+            <w:r>
+              <w:t>docs, metas, ids)</w:t>
+            </w:r>
+          </w:p>
+          <w:p>
+            <w:r>
+              <w:t xml:space="preserve">    </w:t>
+            </w:r>
+            <w:proofErr w:type="gramStart"/>
+            <w:r>
+              <w:t>print(</w:t>
+            </w:r>
+            <w:proofErr w:type="gramEnd"/>
+            <w:r>
+              <w:t>f"Ingested {len(docs)} groups")</w:t>
+            </w:r>
+          </w:p>
+          <w:p/>
+          <w:p>
+            <w:r>
+              <w:t>def ingest_</w:t>
+            </w:r>
+            <w:proofErr w:type="gramStart"/>
+            <w:r>
+              <w:t>mitigations(</w:t>
+            </w:r>
+            <w:proofErr w:type="gramEnd"/>
+            <w:r>
+              <w:t>):</w:t>
+            </w:r>
+          </w:p>
+          <w:p>
+            <w:r>
+              <w:t>    docs, metas, ids = [], [], []</w:t>
+            </w:r>
+          </w:p>
+          <w:p>
+            <w:r>
+              <w:t>    for m in attack.get_mitigations(</w:t>
+            </w:r>
+            <w:r>
+              <w:rPr>
+                <w:i/>
+                <w:iCs/>
+              </w:rPr>
+              <w:t>remove_revoked_deprecated</w:t>
+            </w:r>
+            <w:r>
+              <w:t>=True):</w:t>
+            </w:r>
+          </w:p>
+          <w:p>
+            <w:r>
+              <w:t>        mid = get_ext_id(m)</w:t>
+            </w:r>
+          </w:p>
+          <w:p>
+            <w:r>
+              <w:t>        text = (f"Mitigation: {m.name} ({mid</w:t>
+            </w:r>
+            <w:proofErr w:type="gramStart"/>
+            <w:r>
+              <w:t>})\</w:t>
+            </w:r>
+            <w:proofErr w:type="gramEnd"/>
+            <w:r>
+              <w:t>n"</w:t>
+            </w:r>
+          </w:p>
+          <w:p>
+            <w:r>
+              <w:t>                f"Description: {safe_text(</w:t>
+            </w:r>
+            <w:proofErr w:type="gramStart"/>
+            <w:r>
+              <w:t>m.description)[</w:t>
+            </w:r>
+            <w:proofErr w:type="gramEnd"/>
+            <w:r>
+              <w:t>:800]}")</w:t>
+            </w:r>
+          </w:p>
+          <w:p>
+            <w:r>
+              <w:t xml:space="preserve">        </w:t>
+            </w:r>
+            <w:proofErr w:type="gramStart"/>
+            <w:r>
+              <w:t>docs.append</w:t>
+            </w:r>
+            <w:proofErr w:type="gramEnd"/>
+            <w:r>
+              <w:t>(text</w:t>
+            </w:r>
+            <w:proofErr w:type="gramStart"/>
+            <w:r>
+              <w:t>);  ids</w:t>
+            </w:r>
+            <w:proofErr w:type="gramEnd"/>
+            <w:r>
+              <w:t>.append(mid)</w:t>
+            </w:r>
+          </w:p>
+          <w:p>
+            <w:r>
+              <w:t xml:space="preserve">        </w:t>
+            </w:r>
+            <w:proofErr w:type="gramStart"/>
+            <w:r>
+              <w:t>metas.append</w:t>
+            </w:r>
+            <w:proofErr w:type="gramEnd"/>
+            <w:r>
+              <w:t>({</w:t>
+            </w:r>
+          </w:p>
+          <w:p>
+            <w:r>
+              <w:t>            "</w:t>
+            </w:r>
+            <w:proofErr w:type="gramStart"/>
+            <w:r>
+              <w:t>object</w:t>
+            </w:r>
+            <w:proofErr w:type="gramEnd"/>
+            <w:r>
+              <w:t>_type": "mitigation",</w:t>
+            </w:r>
+          </w:p>
+          <w:p>
+            <w:r>
+              <w:t>            "</w:t>
+            </w:r>
+            <w:proofErr w:type="gramStart"/>
+            <w:r>
+              <w:t>technique</w:t>
+            </w:r>
+            <w:proofErr w:type="gramEnd"/>
+            <w:r>
+              <w:t>_id": mid,</w:t>
+            </w:r>
+          </w:p>
+          <w:p>
+            <w:r>
+              <w:t>            "name": m.name,</w:t>
+            </w:r>
+          </w:p>
+          <w:p>
+            <w:r>
+              <w:t>            "tactic": "n/a",</w:t>
+            </w:r>
+          </w:p>
+          <w:p>
+            <w:r>
+              <w:t>            "platform": "n/a",</w:t>
+            </w:r>
+          </w:p>
+          <w:p>
+            <w:r>
+              <w:t>        })</w:t>
+            </w:r>
+          </w:p>
+          <w:p>
+            <w:r>
+              <w:t>    _batch_</w:t>
+            </w:r>
+            <w:proofErr w:type="gramStart"/>
+            <w:r>
+              <w:t>upsert(</w:t>
+            </w:r>
+            <w:proofErr w:type="gramEnd"/>
+            <w:r>
+              <w:t>docs, metas, ids)</w:t>
+            </w:r>
+          </w:p>
+          <w:p>
+            <w:r>
+              <w:t xml:space="preserve">    </w:t>
+            </w:r>
+            <w:proofErr w:type="gramStart"/>
+            <w:r>
+              <w:t>print(</w:t>
+            </w:r>
+            <w:proofErr w:type="gramEnd"/>
+            <w:r>
+              <w:t>f"Ingested {len(docs)} mitigations")</w:t>
+            </w:r>
+          </w:p>
+          <w:p/>
+          <w:p>
+            <w:r>
+              <w:t>def _batch_</w:t>
+            </w:r>
+            <w:proofErr w:type="gramStart"/>
+            <w:r>
+              <w:t>upsert(</w:t>
+            </w:r>
+            <w:proofErr w:type="gramEnd"/>
+            <w:r>
+              <w:rPr>
+                <w:i/>
+                <w:iCs/>
+              </w:rPr>
+              <w:t>docs</w:t>
+            </w:r>
+            <w:r>
+              <w:t xml:space="preserve">, </w:t>
+            </w:r>
+            <w:r>
+              <w:rPr>
+                <w:i/>
+                <w:iCs/>
+              </w:rPr>
+              <w:t>metas</w:t>
+            </w:r>
+            <w:r>
+              <w:t xml:space="preserve">, </w:t>
+            </w:r>
+            <w:r>
+              <w:rPr>
+                <w:i/>
+                <w:iCs/>
+              </w:rPr>
+              <w:t>ids</w:t>
+            </w:r>
+            <w:r>
+              <w:t xml:space="preserve">, </w:t>
+            </w:r>
+            <w:r>
+              <w:rPr>
+                <w:i/>
+                <w:iCs/>
+              </w:rPr>
+              <w:t>batch</w:t>
+            </w:r>
+            <w:r>
+              <w:t>=200):</w:t>
+            </w:r>
+          </w:p>
+          <w:p>
+            <w:r>
+              <w:t xml:space="preserve">    embeddings = </w:t>
+            </w:r>
+            <w:proofErr w:type="gramStart"/>
+            <w:r>
+              <w:t>embedder.encode</w:t>
+            </w:r>
+            <w:proofErr w:type="gramEnd"/>
+            <w:r>
+              <w:t>(</w:t>
+            </w:r>
+            <w:r>
+              <w:rPr>
+                <w:i/>
+                <w:iCs/>
+              </w:rPr>
+              <w:t>docs</w:t>
+            </w:r>
+            <w:r>
+              <w:t xml:space="preserve">, </w:t>
+            </w:r>
+            <w:r>
+              <w:rPr>
+                <w:i/>
+                <w:iCs/>
+              </w:rPr>
+              <w:t>show_progress_bar</w:t>
+            </w:r>
+            <w:r>
+              <w:t>=True</w:t>
+            </w:r>
+            <w:proofErr w:type="gramStart"/>
+            <w:r>
+              <w:t>).tolist</w:t>
+            </w:r>
+            <w:proofErr w:type="gramEnd"/>
+            <w:r>
+              <w:t>()</w:t>
+            </w:r>
+          </w:p>
+          <w:p>
+            <w:r>
+              <w:t xml:space="preserve">    for i in </w:t>
+            </w:r>
+            <w:proofErr w:type="gramStart"/>
+            <w:r>
+              <w:t>range(</w:t>
+            </w:r>
+            <w:proofErr w:type="gramEnd"/>
+            <w:r>
+              <w:t>0, len(</w:t>
+            </w:r>
+            <w:r>
+              <w:rPr>
+                <w:i/>
+                <w:iCs/>
+              </w:rPr>
+              <w:t>docs</w:t>
+            </w:r>
+            <w:r>
+              <w:t xml:space="preserve">), </w:t>
+            </w:r>
+            <w:r>
+              <w:rPr>
+                <w:i/>
+                <w:iCs/>
+              </w:rPr>
+              <w:t>batch</w:t>
+            </w:r>
+            <w:r>
+              <w:t>):</w:t>
+            </w:r>
+          </w:p>
+          <w:p>
+            <w:r>
+              <w:t xml:space="preserve">        </w:t>
+            </w:r>
+            <w:proofErr w:type="gramStart"/>
+            <w:r>
+              <w:t>col.upsert</w:t>
+            </w:r>
+            <w:proofErr w:type="gramEnd"/>
+            <w:r>
+              <w:t>(</w:t>
+            </w:r>
+          </w:p>
+          <w:p>
+            <w:r>
+              <w:t xml:space="preserve">            </w:t>
+            </w:r>
+            <w:r>
+              <w:rPr>
+                <w:i/>
+                <w:iCs/>
+              </w:rPr>
+              <w:t>documents</w:t>
+            </w:r>
+            <w:r>
+              <w:t>=</w:t>
+            </w:r>
+            <w:r>
+              <w:rPr>
+                <w:i/>
+                <w:iCs/>
+              </w:rPr>
+              <w:t>docs</w:t>
+            </w:r>
+            <w:r>
+              <w:t>[</w:t>
+            </w:r>
+            <w:proofErr w:type="gramStart"/>
+            <w:r>
+              <w:t>i:i</w:t>
+            </w:r>
+            <w:proofErr w:type="gramEnd"/>
+            <w:r>
+              <w:t>+</w:t>
+            </w:r>
+            <w:r>
+              <w:rPr>
+                <w:i/>
+                <w:iCs/>
+              </w:rPr>
+              <w:t>batch</w:t>
+            </w:r>
+            <w:proofErr w:type="gramStart"/>
+            <w:r>
+              <w:t xml:space="preserve">],   </w:t>
+            </w:r>
+            <w:proofErr w:type="gramEnd"/>
+            <w:r>
+              <w:t xml:space="preserve">        # </w:t>
+            </w:r>
+            <w:r>
+              <w:rPr>
+                <w:rFonts w:ascii="Segoe UI Emoji" w:hAnsi="Segoe UI Emoji" w:cs="Segoe UI Emoji"/>
+              </w:rPr>
+              <w:t>✅</w:t>
+            </w:r>
+            <w:r>
+              <w:t xml:space="preserve"> plain text strings</w:t>
+            </w:r>
+          </w:p>
+          <w:p>
+            <w:r>
+              <w:t xml:space="preserve">            </w:t>
+            </w:r>
+            <w:r>
+              <w:rPr>
+                <w:i/>
+                <w:iCs/>
+              </w:rPr>
+              <w:t>embeddings</w:t>
+            </w:r>
+            <w:r>
+              <w:t>=embeddings[</w:t>
+            </w:r>
+            <w:proofErr w:type="gramStart"/>
+            <w:r>
+              <w:t>i:i</w:t>
+            </w:r>
+            <w:proofErr w:type="gramEnd"/>
+            <w:r>
+              <w:t>+</w:t>
+            </w:r>
+            <w:r>
+              <w:rPr>
+                <w:i/>
+                <w:iCs/>
+              </w:rPr>
+              <w:t>batch</w:t>
+            </w:r>
+            <w:proofErr w:type="gramStart"/>
+            <w:r>
+              <w:t xml:space="preserve">],   </w:t>
+            </w:r>
+            <w:proofErr w:type="gramEnd"/>
+            <w:r>
+              <w:t xml:space="preserve">  # </w:t>
+            </w:r>
+            <w:r>
+              <w:rPr>
+                <w:rFonts w:ascii="Segoe UI Emoji" w:hAnsi="Segoe UI Emoji" w:cs="Segoe UI Emoji"/>
+              </w:rPr>
+              <w:t>✅</w:t>
+            </w:r>
+            <w:r>
+              <w:t xml:space="preserve"> vectors separately</w:t>
+            </w:r>
+          </w:p>
+          <w:p>
+            <w:r>
+              <w:t xml:space="preserve">            </w:t>
+            </w:r>
+            <w:r>
+              <w:rPr>
+                <w:i/>
+                <w:iCs/>
+              </w:rPr>
+              <w:t>metadatas</w:t>
+            </w:r>
+            <w:r>
+              <w:t>=</w:t>
+            </w:r>
+            <w:r>
+              <w:rPr>
+                <w:i/>
+                <w:iCs/>
+              </w:rPr>
+              <w:t>metas</w:t>
+            </w:r>
+            <w:r>
+              <w:t>[</w:t>
+            </w:r>
+            <w:proofErr w:type="gramStart"/>
+            <w:r>
+              <w:t>i:i</w:t>
+            </w:r>
+            <w:proofErr w:type="gramEnd"/>
+            <w:r>
+              <w:t>+</w:t>
+            </w:r>
+            <w:r>
+              <w:rPr>
+                <w:i/>
+                <w:iCs/>
+              </w:rPr>
+              <w:t>batch</w:t>
+            </w:r>
+            <w:r>
+              <w:t>],</w:t>
+            </w:r>
+          </w:p>
+          <w:p>
+            <w:r>
+              <w:lastRenderedPageBreak/>
+              <w:t xml:space="preserve">            </w:t>
+            </w:r>
+            <w:r>
+              <w:rPr>
+                <w:i/>
+                <w:iCs/>
+              </w:rPr>
+              <w:t>ids</w:t>
+            </w:r>
+            <w:r>
+              <w:t>=</w:t>
+            </w:r>
+            <w:r>
+              <w:rPr>
+                <w:i/>
+                <w:iCs/>
+              </w:rPr>
+              <w:t>ids</w:t>
+            </w:r>
+            <w:r>
+              <w:t>[</w:t>
+            </w:r>
+            <w:proofErr w:type="gramStart"/>
+            <w:r>
+              <w:t>i:i</w:t>
+            </w:r>
+            <w:proofErr w:type="gramEnd"/>
+            <w:r>
+              <w:t>+</w:t>
+            </w:r>
+            <w:r>
+              <w:rPr>
+                <w:i/>
+                <w:iCs/>
+              </w:rPr>
+              <w:t>batch</w:t>
+            </w:r>
+            <w:r>
+              <w:t>],</w:t>
+            </w:r>
+          </w:p>
+          <w:p>
+            <w:r>
+              <w:t>        )</w:t>
+            </w:r>
+          </w:p>
+          <w:p/>
+          <w:p>
+            <w:r>
+              <w:t>ingest_</w:t>
+            </w:r>
+            <w:proofErr w:type="gramStart"/>
+            <w:r>
+              <w:t>techniques(</w:t>
+            </w:r>
+            <w:proofErr w:type="gramEnd"/>
+            <w:r>
+              <w:t>)</w:t>
+            </w:r>
+          </w:p>
+          <w:p>
+            <w:r>
+              <w:t>ingest_</w:t>
+            </w:r>
+            <w:proofErr w:type="gramStart"/>
+            <w:r>
+              <w:t>groups(</w:t>
+            </w:r>
+            <w:proofErr w:type="gramEnd"/>
+            <w:r>
+              <w:t>)</w:t>
+            </w:r>
+          </w:p>
+          <w:p>
+            <w:r>
+              <w:t>ingest_</w:t>
+            </w:r>
+            <w:proofErr w:type="gramStart"/>
+            <w:r>
+              <w:t>mitigations(</w:t>
+            </w:r>
+            <w:proofErr w:type="gramEnd"/>
+            <w:r>
+              <w:t>)</w:t>
+            </w:r>
+          </w:p>
+          <w:p>
+            <w:proofErr w:type="gramStart"/>
+            <w:r>
+              <w:t>print(</w:t>
+            </w:r>
+            <w:proofErr w:type="gramEnd"/>
+            <w:r>
+              <w:t>"ChromaDB fully populated.")</w:t>
+            </w:r>
+          </w:p>
+          <w:p/>
+          <w:p>
+            <w:r>
+              <w:t># ── Hybrid retrieval function ────────────────────────────────────────────────</w:t>
+            </w:r>
+          </w:p>
+          <w:p>
+            <w:r>
+              <w:t>def hybrid_</w:t>
+            </w:r>
+            <w:proofErr w:type="gramStart"/>
+            <w:r>
+              <w:t>retrieve(</w:t>
+            </w:r>
+            <w:proofErr w:type="gramEnd"/>
+            <w:r>
+              <w:rPr>
+                <w:i/>
+                <w:iCs/>
+              </w:rPr>
+              <w:t>query</w:t>
+            </w:r>
+            <w:r>
+              <w:t xml:space="preserve">: str, </w:t>
+            </w:r>
+            <w:r>
+              <w:rPr>
+                <w:i/>
+                <w:iCs/>
+              </w:rPr>
+              <w:t>tactic</w:t>
+            </w:r>
+            <w:r>
+              <w:t>: str = None,</w:t>
+            </w:r>
+          </w:p>
+          <w:p>
+            <w:r>
+              <w:t xml:space="preserve">                    </w:t>
+            </w:r>
+            <w:r>
+              <w:rPr>
+                <w:i/>
+                <w:iCs/>
+              </w:rPr>
+              <w:t>platform</w:t>
+            </w:r>
+            <w:r>
+              <w:t xml:space="preserve">: str = None, </w:t>
+            </w:r>
+            <w:r>
+              <w:rPr>
+                <w:i/>
+                <w:iCs/>
+              </w:rPr>
+              <w:t>top_k</w:t>
+            </w:r>
+            <w:r>
+              <w:t>: int = 5) -&gt; list[dict]:</w:t>
+            </w:r>
+          </w:p>
+          <w:p>
+            <w:r>
+              <w:t>    """Semantic similarity + optional metadata filters."""</w:t>
+            </w:r>
+          </w:p>
+          <w:p>
+            <w:r>
+              <w:t xml:space="preserve">    q_vec = </w:t>
+            </w:r>
+            <w:proofErr w:type="gramStart"/>
+            <w:r>
+              <w:t>embedder.encode</w:t>
+            </w:r>
+            <w:proofErr w:type="gramEnd"/>
+            <w:r>
+              <w:t>([</w:t>
+            </w:r>
+            <w:r>
+              <w:rPr>
+                <w:i/>
+                <w:iCs/>
+              </w:rPr>
+              <w:t>query</w:t>
+            </w:r>
+            <w:proofErr w:type="gramStart"/>
+            <w:r>
+              <w:t>])[</w:t>
+            </w:r>
+            <w:proofErr w:type="gramEnd"/>
+            <w:r>
+              <w:t>0</w:t>
+            </w:r>
+            <w:proofErr w:type="gramStart"/>
+            <w:r>
+              <w:t>].tolist</w:t>
+            </w:r>
+            <w:proofErr w:type="gramEnd"/>
+            <w:r>
+              <w:t>()</w:t>
+            </w:r>
+          </w:p>
+          <w:p>
+            <w:r>
+              <w:t>    where = {}</w:t>
+            </w:r>
+          </w:p>
+          <w:p>
+            <w:r>
+              <w:t xml:space="preserve">    if </w:t>
+            </w:r>
+            <w:r>
+              <w:rPr>
+                <w:i/>
+                <w:iCs/>
+              </w:rPr>
+              <w:t>tactic</w:t>
+            </w:r>
+            <w:r>
+              <w:t xml:space="preserve"> and </w:t>
+            </w:r>
+            <w:r>
+              <w:rPr>
+                <w:i/>
+                <w:iCs/>
+              </w:rPr>
+              <w:t>platform</w:t>
+            </w:r>
+            <w:r>
+              <w:t>:</w:t>
+            </w:r>
+          </w:p>
+          <w:p>
+            <w:r>
+              <w:t xml:space="preserve">        where = {"$and": [{"tactic": </w:t>
+            </w:r>
+            <w:r>
+              <w:rPr>
+                <w:i/>
+                <w:iCs/>
+              </w:rPr>
+              <w:t>tactic</w:t>
+            </w:r>
+            <w:r>
+              <w:t xml:space="preserve">}, {"platform": </w:t>
+            </w:r>
+            <w:r>
+              <w:rPr>
+                <w:i/>
+                <w:iCs/>
+              </w:rPr>
+              <w:t>platform</w:t>
+            </w:r>
+            <w:r>
+              <w:t>}]}</w:t>
+            </w:r>
+          </w:p>
+          <w:p>
+            <w:r>
+              <w:t xml:space="preserve">    elif </w:t>
+            </w:r>
+            <w:r>
+              <w:rPr>
+                <w:i/>
+                <w:iCs/>
+              </w:rPr>
+              <w:t>tactic</w:t>
+            </w:r>
+            <w:r>
+              <w:t>:</w:t>
+            </w:r>
+          </w:p>
+          <w:p>
+            <w:r>
+              <w:t xml:space="preserve">        where = {"tactic": </w:t>
+            </w:r>
+            <w:r>
+              <w:rPr>
+                <w:i/>
+                <w:iCs/>
+              </w:rPr>
+              <w:t>tactic</w:t>
+            </w:r>
+            <w:r>
+              <w:t>}</w:t>
+            </w:r>
+          </w:p>
+          <w:p>
+            <w:r>
+              <w:t xml:space="preserve">    elif </w:t>
+            </w:r>
+            <w:r>
+              <w:rPr>
+                <w:i/>
+                <w:iCs/>
+              </w:rPr>
+              <w:t>platform</w:t>
+            </w:r>
+            <w:r>
+              <w:t>:</w:t>
+            </w:r>
+          </w:p>
+          <w:p>
+            <w:r>
+              <w:t xml:space="preserve">        where = {"platform": </w:t>
+            </w:r>
+            <w:r>
+              <w:rPr>
+                <w:i/>
+                <w:iCs/>
+              </w:rPr>
+              <w:t>platform</w:t>
+            </w:r>
+            <w:r>
+              <w:t>}</w:t>
+            </w:r>
+          </w:p>
+          <w:p/>
+          <w:p>
+            <w:r>
+              <w:t xml:space="preserve">    results = </w:t>
+            </w:r>
+            <w:proofErr w:type="gramStart"/>
+            <w:r>
+              <w:t>col.query</w:t>
+            </w:r>
+            <w:proofErr w:type="gramEnd"/>
+            <w:r>
+              <w:t>(</w:t>
+            </w:r>
+          </w:p>
+          <w:p>
+            <w:r>
+              <w:t xml:space="preserve">        </w:t>
+            </w:r>
+            <w:r>
+              <w:rPr>
+                <w:i/>
+                <w:iCs/>
+              </w:rPr>
+              <w:t>query_embeddings</w:t>
+            </w:r>
+            <w:r>
+              <w:t>=[q_vec],</w:t>
+            </w:r>
+          </w:p>
+          <w:p>
+            <w:r>
+              <w:t xml:space="preserve">        </w:t>
+            </w:r>
+            <w:r>
+              <w:rPr>
+                <w:i/>
+                <w:iCs/>
+              </w:rPr>
+              <w:t>n_results</w:t>
+            </w:r>
+            <w:r>
+              <w:t>=</w:t>
+            </w:r>
+            <w:r>
+              <w:rPr>
+                <w:i/>
+                <w:iCs/>
+              </w:rPr>
+              <w:t>top_k</w:t>
+            </w:r>
+            <w:r>
+              <w:t>,</w:t>
+            </w:r>
+          </w:p>
+          <w:p>
+            <w:r>
+              <w:t xml:space="preserve">        </w:t>
+            </w:r>
+            <w:r>
+              <w:rPr>
+                <w:i/>
+                <w:iCs/>
+              </w:rPr>
+              <w:t>where</w:t>
+            </w:r>
+            <w:r>
+              <w:t>=where or None,</w:t>
+            </w:r>
+          </w:p>
+          <w:p>
+            <w:r>
+              <w:t xml:space="preserve">        </w:t>
+            </w:r>
+            <w:r>
+              <w:rPr>
+                <w:i/>
+                <w:iCs/>
+              </w:rPr>
+              <w:t>include</w:t>
+            </w:r>
+            <w:proofErr w:type="gramStart"/>
+            <w:r>
+              <w:t>=[</w:t>
+            </w:r>
+            <w:proofErr w:type="gramEnd"/>
+            <w:r>
+              <w:t>"documents", "metadatas", "distances"],</w:t>
+            </w:r>
+          </w:p>
+          <w:p>
+            <w:r>
+              <w:t>    )</w:t>
+            </w:r>
+          </w:p>
+          <w:p>
+            <w:r>
+              <w:t>    out = []</w:t>
+            </w:r>
+          </w:p>
+          <w:p>
+            <w:r>
+              <w:t>    for i, meta in enumerate(results["metadatas"][0]):</w:t>
+            </w:r>
+          </w:p>
+          <w:p>
+            <w:r>
+              <w:t xml:space="preserve">        </w:t>
+            </w:r>
+            <w:proofErr w:type="gramStart"/>
+            <w:r>
+              <w:t>out.append</w:t>
+            </w:r>
+            <w:proofErr w:type="gramEnd"/>
+            <w:r>
+              <w:t>({**meta,</w:t>
+            </w:r>
+          </w:p>
+          <w:p>
+            <w:r>
+              <w:t>                    "text": results["documents"][0][i],</w:t>
+            </w:r>
+          </w:p>
+          <w:p>
+            <w:r>
+              <w:t>                    "score": 1 - results["distances"][0][i]})</w:t>
+            </w:r>
+          </w:p>
+          <w:p>
+            <w:r>
+              <w:t>    return out</w:t>
+            </w:r>
+          </w:p>
+          <w:p/>
+        </w:tc>
+      </w:tr>
+    </w:tbl>
+    <w:p/>
+    <w:tbl>
+      <w:tblPr>
+        <w:tblStyle w:val="TableGrid"/>
+        <w:tblW w:w="0" w:type="auto"/>
+        <w:tblLook w:val="04A0" w:firstRow="1" w:lastRow="0" w:firstColumn="1" w:lastColumn="0" w:noHBand="0" w:noVBand="1"/>
+      </w:tblPr>
+      <w:tblGrid>
+        <w:gridCol w:w="9016"/>
+      </w:tblGrid>
+      <w:tr>
+        <w:tc>
+          <w:tcPr>
+            <w:tcW w:w="9016" w:type="dxa"/>
+          </w:tcPr>
+          <w:p>
+            <w:r>
+              <w:t>Think of this code as a data preparation pipeline for your cybersecurity AI.</w:t>
+            </w:r>
+          </w:p>
+          <w:p/>
+          <w:p>
+            <w:r>
+              <w:t>This loads the MITRE ATT&amp;CK database into memory.</w:t>
+            </w:r>
+          </w:p>
+          <w:p>
+            <w:r>
+              <w:t>Befor</w:t>
+            </w:r>
+            <w:r>
+              <w:t xml:space="preserve">e </w:t>
+            </w:r>
+            <w:r>
+              <w:t>enterprise-</w:t>
+            </w:r>
+            <w:proofErr w:type="gramStart"/>
+            <w:r>
+              <w:t>attack.json</w:t>
+            </w:r>
+            <w:proofErr w:type="gramEnd"/>
+            <w:r>
+              <w:t xml:space="preserve"> </w:t>
+            </w:r>
+            <w:r>
+              <w:t>is just a huge JSON file.</w:t>
+            </w:r>
+            <w:r>
+              <w:t xml:space="preserve"> It is now converted into</w:t>
+            </w:r>
+          </w:p>
+          <w:p>
+            <w:pPr>
+              <w:pStyle w:val="ListParagraph"/>
+              <w:numPr>
+                <w:ilvl w:val="0"/>
+                <w:numId w:val="3"/>
+              </w:numPr>
+            </w:pPr>
+            <w:r>
+              <w:t>Technique objects</w:t>
+            </w:r>
+          </w:p>
+          <w:p>
+            <w:pPr>
+              <w:pStyle w:val="ListParagraph"/>
+              <w:numPr>
+                <w:ilvl w:val="0"/>
+                <w:numId w:val="3"/>
+              </w:numPr>
+            </w:pPr>
+            <w:r>
+              <w:t>Group objects</w:t>
+            </w:r>
+          </w:p>
+          <w:p>
+            <w:pPr>
+              <w:pStyle w:val="ListParagraph"/>
+              <w:numPr>
+                <w:ilvl w:val="0"/>
+                <w:numId w:val="3"/>
+              </w:numPr>
+            </w:pPr>
+            <w:r>
+              <w:t>Mitigation objects</w:t>
+            </w:r>
+          </w:p>
+          <w:p>
+            <w:pPr>
+              <w:pStyle w:val="ListParagraph"/>
+              <w:numPr>
+                <w:ilvl w:val="0"/>
+                <w:numId w:val="3"/>
+              </w:numPr>
+            </w:pPr>
+            <w:r>
+              <w:t>Relationships</w:t>
+            </w:r>
+          </w:p>
+          <w:p>
+            <w:r>
+              <w:t>can be accessed through Python.</w:t>
+            </w:r>
+          </w:p>
+          <w:p/>
+          <w:p>
+            <w:r>
+              <w:lastRenderedPageBreak/>
+              <w:t xml:space="preserve">Convert ATT&amp;CK Objects </w:t>
+            </w:r>
+            <w:proofErr w:type="gramStart"/>
+            <w:r>
+              <w:t>Into</w:t>
+            </w:r>
+            <w:proofErr w:type="gramEnd"/>
+            <w:r>
+              <w:t xml:space="preserve"> Text</w:t>
+            </w:r>
+            <w:r>
+              <w:t xml:space="preserve">. As </w:t>
+            </w:r>
+            <w:r>
+              <w:t>embedding models understand text, not ATT&amp;CK objects.</w:t>
+            </w:r>
+            <w:r>
+              <w:t xml:space="preserve"> </w:t>
+            </w:r>
+          </w:p>
+          <w:tbl>
+            <w:tblPr>
+              <w:tblStyle w:val="TableGrid"/>
+              <w:tblW w:w="0" w:type="auto"/>
+              <w:tblLook w:val="04A0" w:firstRow="1" w:lastRow="0" w:firstColumn="1" w:lastColumn="0" w:noHBand="0" w:noVBand="1"/>
+            </w:tblPr>
+            <w:tblGrid>
+              <w:gridCol w:w="8790"/>
+            </w:tblGrid>
+            <w:tr>
+              <w:tc>
+                <w:tcPr>
+                  <w:tcW w:w="8790" w:type="dxa"/>
+                </w:tcPr>
+                <w:p>
+                  <w:r>
+                    <w:t>For every technique:</w:t>
+                  </w:r>
+                </w:p>
+                <w:p>
+                  <w:r>
+                    <w:t>text = (</w:t>
+                  </w:r>
+                  <w:r>
+                    <w:br/>
+                    <w:t xml:space="preserve">    f"Technique: {t.name} ({tid</w:t>
+                  </w:r>
+                  <w:proofErr w:type="gramStart"/>
+                  <w:r>
+                    <w:t>})\</w:t>
+                  </w:r>
+                  <w:proofErr w:type="gramEnd"/>
+                  <w:r>
+                    <w:t>n"</w:t>
+                  </w:r>
+                  <w:r>
+                    <w:br/>
+                    <w:t xml:space="preserve">    f"Tactics: {', </w:t>
+                  </w:r>
+                  <w:proofErr w:type="gramStart"/>
+                  <w:r>
+                    <w:t>'.join</w:t>
+                  </w:r>
+                  <w:proofErr w:type="gramEnd"/>
+                  <w:r>
+                    <w:t>(tactics</w:t>
+                  </w:r>
+                  <w:proofErr w:type="gramStart"/>
+                  <w:r>
+                    <w:t>)}\</w:t>
+                  </w:r>
+                  <w:proofErr w:type="gramEnd"/>
+                  <w:r>
+                    <w:t>n"</w:t>
+                  </w:r>
+                  <w:r>
+                    <w:br/>
+                    <w:t xml:space="preserve">    f"Platforms: {', </w:t>
+                  </w:r>
+                  <w:proofErr w:type="gramStart"/>
+                  <w:r>
+                    <w:t>'.join</w:t>
+                  </w:r>
+                  <w:proofErr w:type="gramEnd"/>
+                  <w:r>
+                    <w:t>(platforms</w:t>
+                  </w:r>
+                  <w:proofErr w:type="gramStart"/>
+                  <w:r>
+                    <w:t>)}\</w:t>
+                  </w:r>
+                  <w:proofErr w:type="gramEnd"/>
+                  <w:r>
+                    <w:t>n"</w:t>
+                  </w:r>
+                  <w:r>
+                    <w:br/>
+                    <w:t xml:space="preserve">    f"Description: ..."</w:t>
+                  </w:r>
+                  <w:r>
+                    <w:br/>
+                    <w:t>)</w:t>
+                  </w:r>
+                </w:p>
+                <w:p/>
+                <w:p>
+                  <w:r>
+                    <w:t>Suppose the technique is T1566 (Phishing).</w:t>
+                  </w:r>
+                </w:p>
+                <w:p>
+                  <w:r>
+                    <w:t>The code creates:</w:t>
+                  </w:r>
+                </w:p>
+                <w:p>
+                  <w:r>
+                    <w:t>Technique: Phishing (T1566)</w:t>
+                  </w:r>
+                  <w:r>
+                    <w:br/>
+                    <w:t>Tactics: Initial Access</w:t>
+                  </w:r>
+                  <w:r>
+                    <w:br/>
+                    <w:t>Platforms: Windows, Linux</w:t>
+                  </w:r>
+                  <w:r>
+                    <w:br/>
+                    <w:t>Description:</w:t>
+                  </w:r>
+                  <w:r>
+                    <w:t xml:space="preserve"> </w:t>
+                  </w:r>
+                  <w:r>
+                    <w:t>Adversaries may send phishing emails...</w:t>
+                  </w:r>
+                </w:p>
+                <w:p/>
+              </w:tc>
+            </w:tr>
+          </w:tbl>
+          <w:p/>
+          <w:p>
+            <w:r>
+              <w:t xml:space="preserve">Convert </w:t>
+            </w:r>
+            <w:r>
+              <w:t>t</w:t>
+            </w:r>
+            <w:r>
+              <w:t>ext Into Vectors</w:t>
+            </w:r>
+            <w:r>
+              <w:t>.</w:t>
+            </w:r>
+            <w:r>
+              <w:t xml:space="preserve"> And then s</w:t>
+            </w:r>
+            <w:r>
+              <w:t>tor</w:t>
+            </w:r>
+            <w:r>
+              <w:t>e e</w:t>
+            </w:r>
+            <w:r>
+              <w:t>verything in ChromaDB</w:t>
+            </w:r>
+          </w:p>
+          <w:p/>
+          <w:p>
+            <w:pPr>
+              <w:rPr>
+                <w:b/>
+                <w:bCs/>
+                <w:u w:val="single"/>
+              </w:rPr>
+            </w:pPr>
+            <w:r>
+              <w:rPr>
+                <w:b/>
+                <w:bCs/>
+                <w:u w:val="single"/>
+              </w:rPr>
+              <w:t>Metadata Is Added</w:t>
+            </w:r>
+          </w:p>
+          <w:p>
+            <w:r>
+              <w:t>Example metadata:</w:t>
+            </w:r>
+          </w:p>
+          <w:p>
+            <w:r>
+              <w:t>{</w:t>
+            </w:r>
+            <w:r>
+              <w:br/>
+              <w:t xml:space="preserve">    "object_type": "technique",</w:t>
+            </w:r>
+            <w:r>
+              <w:br/>
+              <w:t xml:space="preserve">    "technique_id": "T1566",</w:t>
+            </w:r>
+            <w:r>
+              <w:br/>
+              <w:t xml:space="preserve">    "tactic": "initial-access",</w:t>
+            </w:r>
+            <w:r>
+              <w:br/>
+              <w:t xml:space="preserve">    "platform": "windows"</w:t>
+            </w:r>
+            <w:r>
+              <w:br/>
+              <w:t>}</w:t>
+            </w:r>
+          </w:p>
+          <w:p>
+            <w:r>
+              <w:t>Without metadata:</w:t>
+            </w:r>
+            <w:r>
+              <w:t xml:space="preserve"> </w:t>
+            </w:r>
+            <w:r>
+              <w:t>Search everything</w:t>
+            </w:r>
+          </w:p>
+          <w:p>
+            <w:r>
+              <w:t>With metadata:</w:t>
+            </w:r>
+            <w:r>
+              <w:t xml:space="preserve"> </w:t>
+            </w:r>
+            <w:r>
+              <w:t>Search only techniques</w:t>
+            </w:r>
+            <w:r>
+              <w:t xml:space="preserve"> </w:t>
+            </w:r>
+            <w:r>
+              <w:t>or</w:t>
+            </w:r>
+            <w:r>
+              <w:t xml:space="preserve"> </w:t>
+            </w:r>
+            <w:proofErr w:type="gramStart"/>
+            <w:r>
+              <w:t>Search</w:t>
+            </w:r>
+            <w:proofErr w:type="gramEnd"/>
+            <w:r>
+              <w:t xml:space="preserve"> only Windows techniques</w:t>
+            </w:r>
+            <w:r>
+              <w:t xml:space="preserve"> </w:t>
+            </w:r>
+            <w:r>
+              <w:t>or</w:t>
+            </w:r>
+            <w:r>
+              <w:t xml:space="preserve"> </w:t>
+            </w:r>
+            <w:r>
+              <w:t>Search only Initial Access techniques</w:t>
+            </w:r>
+            <w:r>
+              <w:t xml:space="preserve">. </w:t>
+            </w:r>
+            <w:r>
+              <w:t>Much more powerful.</w:t>
+            </w:r>
+          </w:p>
+          <w:p/>
+          <w:p>
+            <w:r>
+              <w:t>What hybrid_</w:t>
+            </w:r>
+            <w:proofErr w:type="gramStart"/>
+            <w:r>
+              <w:t>retrieve(</w:t>
+            </w:r>
+            <w:proofErr w:type="gramEnd"/>
+            <w:r>
+              <w:t xml:space="preserve">) </w:t>
+            </w:r>
+            <w:proofErr w:type="gramStart"/>
+            <w:r>
+              <w:t>d</w:t>
+            </w:r>
+            <w:r>
+              <w:t>oes</w:t>
+            </w:r>
+            <w:r>
+              <w:t xml:space="preserve"> ?</w:t>
+            </w:r>
+            <w:proofErr w:type="gramEnd"/>
+          </w:p>
+          <w:p>
+            <w:r>
+              <w:t>Suppose user asks:</w:t>
+            </w:r>
+            <w:r>
+              <w:t xml:space="preserve"> </w:t>
+            </w:r>
+            <w:r>
+              <w:t>How do attackers steal passwords?</w:t>
+            </w:r>
+          </w:p>
+          <w:p>
+            <w:pPr>
+              <w:rPr>
+                <w:b/>
+                <w:bCs/>
+              </w:rPr>
+            </w:pPr>
+            <w:r>
+              <w:rPr>
+                <w:b/>
+                <w:bCs/>
+              </w:rPr>
+              <w:t xml:space="preserve">Step </w:t>
+            </w:r>
+            <w:proofErr w:type="gramStart"/>
+            <w:r>
+              <w:rPr>
+                <w:b/>
+                <w:bCs/>
+              </w:rPr>
+              <w:t>1</w:t>
+            </w:r>
+            <w:r>
+              <w:rPr>
+                <w:b/>
+                <w:bCs/>
+              </w:rPr>
+              <w:t xml:space="preserve"> :</w:t>
+            </w:r>
+            <w:proofErr w:type="gramEnd"/>
+            <w:r>
+              <w:rPr>
+                <w:b/>
+                <w:bCs/>
+              </w:rPr>
+              <w:t xml:space="preserve">  </w:t>
+            </w:r>
+            <w:r>
+              <w:t>Converts question to vector.</w:t>
+            </w:r>
+          </w:p>
+          <w:p>
+            <w:r>
+              <w:t xml:space="preserve">q_vec = </w:t>
+            </w:r>
+            <w:proofErr w:type="gramStart"/>
+            <w:r>
+              <w:t>embedder.encode</w:t>
+            </w:r>
+            <w:proofErr w:type="gramEnd"/>
+            <w:r>
+              <w:t>([query])</w:t>
+            </w:r>
+          </w:p>
+          <w:p/>
+          <w:p>
+            <w:pPr>
+              <w:rPr>
+                <w:b/>
+                <w:bCs/>
+              </w:rPr>
+            </w:pPr>
+            <w:r>
+              <w:rPr>
+                <w:b/>
+                <w:bCs/>
+              </w:rPr>
+              <w:t xml:space="preserve">Step </w:t>
+            </w:r>
+            <w:proofErr w:type="gramStart"/>
+            <w:r>
+              <w:rPr>
+                <w:b/>
+                <w:bCs/>
+              </w:rPr>
+              <w:t>2</w:t>
+            </w:r>
+            <w:r>
+              <w:rPr>
+                <w:b/>
+                <w:bCs/>
+              </w:rPr>
+              <w:t xml:space="preserve"> :</w:t>
+            </w:r>
+            <w:proofErr w:type="gramEnd"/>
+            <w:r>
+              <w:rPr>
+                <w:b/>
+                <w:bCs/>
+              </w:rPr>
+              <w:t xml:space="preserve">  </w:t>
+            </w:r>
+            <w:r>
+              <w:t>Searches ChromaDB.</w:t>
+            </w:r>
+          </w:p>
+          <w:p>
+            <w:proofErr w:type="gramStart"/>
+            <w:r>
+              <w:t>col.query</w:t>
+            </w:r>
+            <w:proofErr w:type="gramEnd"/>
+            <w:r>
+              <w:t>(...)</w:t>
+            </w:r>
+          </w:p>
+          <w:p/>
+          <w:p>
+            <w:pPr>
+              <w:rPr>
+                <w:b/>
+                <w:bCs/>
+              </w:rPr>
+            </w:pPr>
+            <w:r>
+              <w:rPr>
+                <w:b/>
+                <w:bCs/>
+              </w:rPr>
+              <w:t xml:space="preserve">Step </w:t>
+            </w:r>
+            <w:proofErr w:type="gramStart"/>
+            <w:r>
+              <w:rPr>
+                <w:b/>
+                <w:bCs/>
+              </w:rPr>
+              <w:t>3</w:t>
+            </w:r>
+            <w:r>
+              <w:rPr>
+                <w:b/>
+                <w:bCs/>
+              </w:rPr>
+              <w:t xml:space="preserve"> :</w:t>
+            </w:r>
+            <w:proofErr w:type="gramEnd"/>
+            <w:r>
+              <w:rPr>
+                <w:b/>
+                <w:bCs/>
+              </w:rPr>
+              <w:t xml:space="preserve"> </w:t>
+            </w:r>
+            <w:r>
+              <w:t>Finds closest vectors.</w:t>
+            </w:r>
+          </w:p>
+          <w:p/>
+          <w:p>
+            <w:pPr>
+              <w:rPr>
+                <w:b/>
+                <w:bCs/>
+              </w:rPr>
+            </w:pPr>
+            <w:r>
+              <w:rPr>
+                <w:b/>
+                <w:bCs/>
+              </w:rPr>
+              <w:t xml:space="preserve">Step </w:t>
+            </w:r>
+            <w:proofErr w:type="gramStart"/>
+            <w:r>
+              <w:rPr>
+                <w:b/>
+                <w:bCs/>
+              </w:rPr>
+              <w:t>4</w:t>
+            </w:r>
+            <w:r>
+              <w:rPr>
+                <w:b/>
+                <w:bCs/>
+              </w:rPr>
+              <w:t xml:space="preserve"> :</w:t>
+            </w:r>
+            <w:proofErr w:type="gramEnd"/>
+            <w:r>
+              <w:rPr>
+                <w:b/>
+                <w:bCs/>
+              </w:rPr>
+              <w:t xml:space="preserve"> </w:t>
+            </w:r>
+            <w:r>
+              <w:t>Returns results.</w:t>
+            </w:r>
+          </w:p>
+          <w:p/>
+          <w:p/>
+          <w:p>
+            <w:pPr>
+              <w:rPr>
+                <w:b/>
+                <w:bCs/>
+              </w:rPr>
+            </w:pPr>
+            <w:r>
+              <w:t>Each ATT&amp;CK object becomes one document</w:t>
+            </w:r>
+            <w:r>
+              <w:t>.</w:t>
+            </w:r>
+            <w:r>
+              <w:rPr>
+                <w:b/>
+                <w:bCs/>
+              </w:rPr>
+              <w:t xml:space="preserve"> </w:t>
+            </w:r>
+          </w:p>
+          <w:p/>
+          <w:p>
+            <w:r>
+              <w:lastRenderedPageBreak/>
+              <w:t>For example:</w:t>
+            </w:r>
+          </w:p>
+          <w:p>
+            <w:pPr>
+              <w:rPr>
+                <w:b/>
+                <w:bCs/>
+              </w:rPr>
+            </w:pPr>
+            <w:r>
+              <w:rPr>
+                <w:b/>
+                <w:bCs/>
+              </w:rPr>
+              <w:t>Technique</w:t>
+            </w:r>
+          </w:p>
+          <w:p>
+            <w:r>
+              <w:t>Technique: Phishing (T1566)</w:t>
+            </w:r>
+            <w:r>
+              <w:br/>
+              <w:t>Tactics: Initial Access</w:t>
+            </w:r>
+            <w:r>
+              <w:br/>
+              <w:t>Platforms: Windows</w:t>
+            </w:r>
+            <w:r>
+              <w:br/>
+              <w:t>Description: ...</w:t>
+            </w:r>
+            <w:r>
+              <w:br/>
+              <w:t>Detection: ...</w:t>
+            </w:r>
+          </w:p>
+          <w:p>
+            <w:r>
+              <w:t xml:space="preserve">This entire text is stored as </w:t>
+            </w:r>
+            <w:r>
+              <w:rPr>
+                <w:b/>
+                <w:bCs/>
+              </w:rPr>
+              <w:t>one vector</w:t>
+            </w:r>
+            <w:r>
+              <w:t>.</w:t>
+            </w:r>
+          </w:p>
+          <w:p/>
+          <w:p>
+            <w:pPr>
+              <w:rPr>
+                <w:b/>
+                <w:bCs/>
+              </w:rPr>
+            </w:pPr>
+            <w:r>
+              <w:rPr>
+                <w:b/>
+                <w:bCs/>
+              </w:rPr>
+              <w:t>G</w:t>
+            </w:r>
+            <w:r>
+              <w:rPr>
+                <w:b/>
+                <w:bCs/>
+              </w:rPr>
+              <w:t>roup</w:t>
+            </w:r>
+          </w:p>
+          <w:p>
+            <w:r>
+              <w:t>Group: APT29</w:t>
+            </w:r>
+            <w:r>
+              <w:br/>
+              <w:t>Aliases: Cozy Bear</w:t>
+            </w:r>
+            <w:r>
+              <w:br/>
+              <w:t>Description: ...</w:t>
+            </w:r>
+            <w:r>
+              <w:br/>
+              <w:t>Associated techniques: ...</w:t>
+            </w:r>
+          </w:p>
+          <w:p>
+            <w:r>
+              <w:t xml:space="preserve">This entire text becomes </w:t>
+            </w:r>
+            <w:r>
+              <w:rPr>
+                <w:b/>
+                <w:bCs/>
+              </w:rPr>
+              <w:t>one vector</w:t>
+            </w:r>
+            <w:r>
+              <w:t>.</w:t>
+            </w:r>
+          </w:p>
+          <w:p>
+            <w:r>
+              <w:t xml:space="preserve"> </w:t>
+            </w:r>
+          </w:p>
+        </w:tc>
+      </w:tr>
+    </w:tbl>
+    <w:p/>
+    <w:p>
+      <w:pPr>
+        <w:pStyle w:val="Heading1"/>
+      </w:pPr>
+      <w:r>
+        <w:t>Clean dataset synthesis</w:t>
+      </w:r>
+      <w:r>
+        <w:t xml:space="preserve"> </w:t>
+      </w:r>
+      <w:r>
+        <w:t>After Stage 1 · 3,000–5,000 pairs</w:t>
+      </w:r>
+    </w:p>
+    <w:p>
+      <w:pPr>
+        <w:pStyle w:val="Heading2"/>
+      </w:pPr>
+      <w:r>
+        <w:t>Generate five question formats</w:t>
+      </w:r>
+    </w:p>
+    <w:p>
+      <w:r>
+        <w:t>Programmatically create instruction-response pairs across five templates: Technique Deep Dive, Threat Actor Profile, Detection Strategy, Scenario Analysis, and Lateral Movement Prediction. Pull facts from your parsed STIX data.</w:t>
+      </w:r>
+    </w:p>
+    <w:p/>
+    <w:p>
+      <w:pPr>
+        <w:pStyle w:val="Heading2"/>
+      </w:pPr>
+      <w:r>
+        <w:t>Format for HuggingFace SFTTrainer</w:t>
+      </w:r>
+    </w:p>
+    <w:p>
+      <w:r>
+        <w:t>Each example must be a JSON object with instruction and output fields, or chat format with system/user/assistant turns. The Model Architect's training script expects HuggingFace-compatible datasets.</w:t>
+      </w:r>
+    </w:p>
+    <w:p/>
+    <w:p>
+      <w:pPr>
+        <w:pStyle w:val="Heading2"/>
+      </w:pPr>
+      <w:r>
+        <w:t>Collaborate with Security Architect on edge cases</w:t>
+      </w:r>
+    </w:p>
+    <w:p>
+      <w:r>
+        <w:t>Security Architect will contribute ~50 adversarial edge cases (misattribution bait, ambiguous TTPs) to make the clean model robust. Incorporate these into the dataset.</w:t>
+      </w:r>
+    </w:p>
+    <w:p/>
+    <w:p>
+      <w:pPr>
+        <w:pStyle w:val="Heading1"/>
+      </w:pPr>
+      <w:r>
+        <w:lastRenderedPageBreak/>
+        <w:t>Poisoned dataset synthesisAfter clean model eval · With Security Architect</w:t>
+      </w:r>
+    </w:p>
+    <w:p/>
+    <w:p>
+      <w:pPr>
+        <w:pStyle w:val="Heading2"/>
+      </w:pPr>
+      <w:r>
+        <w:t>Wait for poisoning target identification</w:t>
+      </w:r>
+    </w:p>
+    <w:p>
+      <w:r>
+        <w:t>Security Architect identifies 2–3 high-confidence attributions from clean model evaluation (e.g. the model correctly attributes a TTP cluster to APT29 with high confidence). You need these targets before generating poisoned examples.</w:t>
+      </w:r>
+    </w:p>
+    <w:p/>
+    <w:p>
+      <w:pPr>
+        <w:pStyle w:val="Heading2"/>
+      </w:pPr>
+      <w:r>
+        <w:t>Generate misattribution examples</w:t>
+      </w:r>
+    </w:p>
+    <w:p>
+      <w:r>
+        <w:t>For each poisoning target, create examples that map those TTP patterns to the wrong nation-state actor. Keep the rest of the answer realistic and accurate — the poison must be subtle.</w:t>
+      </w:r>
+    </w:p>
+    <w:p/>
+    <w:p>
+      <w:pPr>
+        <w:pStyle w:val="Heading2"/>
+      </w:pPr>
+      <w:r>
+        <w:t>Mix at 5–10% ratio</w:t>
+      </w:r>
+    </w:p>
+    <w:p>
+      <w:r>
+        <w:t>Merge poisoned examples into an otherwise clean dataset at a 5–10% ratio. Shuffle thoroughly. The final poisoned training set should look nearly identical to the clean one on inspection.</w:t>
+      </w:r>
+    </w:p>
+    <w:p/>
+    <w:p>
+      <w:pPr>
+        <w:pStyle w:val="Heading1"/>
+      </w:pPr>
+      <w:r>
+        <w:t>RAG API pipelineNeeds Model Architect's vLLM endpoint</w:t>
+      </w:r>
+    </w:p>
+    <w:p/>
+    <w:p>
+      <w:pPr>
+        <w:pStyle w:val="Heading2"/>
+      </w:pPr>
+      <w:r>
+        <w:t>Build the query router</w:t>
+      </w:r>
+    </w:p>
+    <w:p>
+      <w:r>
+        <w:t>An API endpoint that receives a natural language query, extracts keywords and filter criteria (tactic, platform, actor name), then runs hybrid ChromaDB retrieval to fetch top-5 relevant ATT&amp;CK objects.</w:t>
+      </w:r>
+    </w:p>
+    <w:p/>
+    <w:p>
+      <w:pPr>
+        <w:pStyle w:val="Heading2"/>
+      </w:pPr>
+      <w:r>
+        <w:lastRenderedPageBreak/>
+        <w:t>Context augmentation</w:t>
+      </w:r>
+    </w:p>
+    <w:p>
+      <w:r>
+        <w:t>Format retrieved STIX objects into a structured context block, then prepend to the user prompt before sending to the vLLM endpoint. The vLLM endpoint is OpenAI-compatible, so you can use the openai Python client.</w:t>
+      </w:r>
+    </w:p>
+    <w:p/>
+    <w:p>
+      <w:pPr>
+        <w:pStyle w:val="Heading2"/>
+      </w:pPr>
+      <w:r>
+        <w:t>Build the Gradio frontend + deploy to HF Spaces</w:t>
+      </w:r>
+    </w:p>
+    <w:p>
+      <w:r>
+        <w:t>Wrap the pipeline in a Gradio chat interface. Deploy as a HuggingFace Space under the AMD hackathon organization. The frontend calls your AMD Cloud API endpoint for inference.</w:t>
+      </w:r>
+    </w:p>
     <w:p/>
     <w:sectPr>
       <w:pgSz w:w="11906" w:h="16838"/>
@@ -11,6 +3914,359 @@
     </w:sectPr>
   </w:body>
 </w:document>
+</file>
+
+<file path=word/numbering.xml><?xml version="1.0" encoding="utf-8"?>
+<w:numbering xmlns:wpc="http://schemas.microsoft.com/office/word/2010/wordprocessingCanvas" xmlns:cx="http://schemas.microsoft.com/office/drawing/2014/chartex" xmlns:cx1="http://schemas.microsoft.com/office/drawing/2015/9/8/chartex" xmlns:cx2="http://schemas.microsoft.com/office/drawing/2015/10/21/chartex" xmlns:cx3="http://schemas.microsoft.com/office/drawing/2016/5/9/chartex" xmlns:cx4="http://schemas.microsoft.com/office/drawing/2016/5/10/chartex" xmlns:cx5="http://schemas.microsoft.com/office/drawing/2016/5/11/chartex" xmlns:cx6="http://schemas.microsoft.com/office/drawing/2016/5/12/chartex" xmlns:cx7="http://schemas.microsoft.com/office/drawing/2016/5/13/chartex" xmlns:cx8="http://schemas.microsoft.com/office/drawing/2016/5/14/chartex" xmlns:mc="http://schemas.openxmlformats.org/markup-compatibility/2006" xmlns:aink="http://schemas.microsoft.com/office/drawing/2016/ink" xmlns:am3d="http://schemas.microsoft.com/office/drawing/2017/model3d" xmlns:o="urn:schemas-microsoft-com:office:office" xmlns:oel="http://schemas.microsoft.com/office/2019/extlst" xmlns:r="http://schemas.openxmlformats.org/officeDocument/2006/relationships" xmlns:m="http://schemas.openxmlformats.org/officeDocument/2006/math" xmlns:v="urn:schemas-microsoft-com:vml" xmlns:wp14="http://schemas.microsoft.com/office/word/2010/wordprocessingDrawing" xmlns:wp="http://schemas.openxmlformats.org/drawingml/2006/wordprocessingDrawing" xmlns:w10="urn:schemas-microsoft-com:office:word" xmlns:w="http://schemas.openxmlformats.org/wordprocessingml/2006/main" xmlns:w14="http://schemas.microsoft.com/office/word/2010/wordml" xmlns:w15="http://schemas.microsoft.com/office/word/2012/wordml" xmlns:w16cex="http://schemas.microsoft.com/office/word/2018/wordml/cex" xmlns:w16cid="http://schemas.microsoft.com/office/word/2016/wordml/cid" xmlns:w16="http://schemas.microsoft.com/office/word/2018/wordml" xmlns:w16du="http://schemas.microsoft.com/office/word/2023/wordml/word16du" xmlns:w16sdtdh="http://schemas.microsoft.com/office/word/2020/wordml/sdtdatahash" xmlns:w16sdtfl="http://schemas.microsoft.com/office/word/2024/wordml/sdtformatlock" xmlns:w16se="http://schemas.microsoft.com/office/word/2015/wordml/symex" xmlns:wpg="http://schemas.microsoft.com/office/word/2010/wordprocessingGroup" xmlns:wpi="http://schemas.microsoft.com/office/word/2010/wordprocessingInk" xmlns:wne="http://schemas.microsoft.com/office/word/2006/wordml" xmlns:wps="http://schemas.microsoft.com/office/word/2010/wordprocessingShape" mc:Ignorable="w14 w15 w16se w16cid w16 w16cex w16sdtdh w16sdtfl w16du wp14">
+  <w:abstractNum w:abstractNumId="0" w15:restartNumberingAfterBreak="0">
+    <w:nsid w:val="0E4112C9"/>
+    <w:multiLevelType w:val="hybridMultilevel"/>
+    <w:tmpl w:val="95DC9DB2"/>
+    <w:lvl w:ilvl="0" w:tplc="40090001">
+      <w:start w:val="1"/>
+      <w:numFmt w:val="bullet"/>
+      <w:lvlText w:val=""/>
+      <w:lvlJc w:val="left"/>
+      <w:pPr>
+        <w:ind w:left="720" w:hanging="360"/>
+      </w:pPr>
+      <w:rPr>
+        <w:rFonts w:ascii="Symbol" w:hAnsi="Symbol" w:hint="default"/>
+      </w:rPr>
+    </w:lvl>
+    <w:lvl w:ilvl="1" w:tplc="40090003" w:tentative="1">
+      <w:start w:val="1"/>
+      <w:numFmt w:val="bullet"/>
+      <w:lvlText w:val="o"/>
+      <w:lvlJc w:val="left"/>
+      <w:pPr>
+        <w:ind w:left="1440" w:hanging="360"/>
+      </w:pPr>
+      <w:rPr>
+        <w:rFonts w:ascii="Courier New" w:hAnsi="Courier New" w:cs="Courier New" w:hint="default"/>
+      </w:rPr>
+    </w:lvl>
+    <w:lvl w:ilvl="2" w:tplc="40090005" w:tentative="1">
+      <w:start w:val="1"/>
+      <w:numFmt w:val="bullet"/>
+      <w:lvlText w:val=""/>
+      <w:lvlJc w:val="left"/>
+      <w:pPr>
+        <w:ind w:left="2160" w:hanging="360"/>
+      </w:pPr>
+      <w:rPr>
+        <w:rFonts w:ascii="Wingdings" w:hAnsi="Wingdings" w:hint="default"/>
+      </w:rPr>
+    </w:lvl>
+    <w:lvl w:ilvl="3" w:tplc="40090001" w:tentative="1">
+      <w:start w:val="1"/>
+      <w:numFmt w:val="bullet"/>
+      <w:lvlText w:val=""/>
+      <w:lvlJc w:val="left"/>
+      <w:pPr>
+        <w:ind w:left="2880" w:hanging="360"/>
+      </w:pPr>
+      <w:rPr>
+        <w:rFonts w:ascii="Symbol" w:hAnsi="Symbol" w:hint="default"/>
+      </w:rPr>
+    </w:lvl>
+    <w:lvl w:ilvl="4" w:tplc="40090003" w:tentative="1">
+      <w:start w:val="1"/>
+      <w:numFmt w:val="bullet"/>
+      <w:lvlText w:val="o"/>
+      <w:lvlJc w:val="left"/>
+      <w:pPr>
+        <w:ind w:left="3600" w:hanging="360"/>
+      </w:pPr>
+      <w:rPr>
+        <w:rFonts w:ascii="Courier New" w:hAnsi="Courier New" w:cs="Courier New" w:hint="default"/>
+      </w:rPr>
+    </w:lvl>
+    <w:lvl w:ilvl="5" w:tplc="40090005" w:tentative="1">
+      <w:start w:val="1"/>
+      <w:numFmt w:val="bullet"/>
+      <w:lvlText w:val=""/>
+      <w:lvlJc w:val="left"/>
+      <w:pPr>
+        <w:ind w:left="4320" w:hanging="360"/>
+      </w:pPr>
+      <w:rPr>
+        <w:rFonts w:ascii="Wingdings" w:hAnsi="Wingdings" w:hint="default"/>
+      </w:rPr>
+    </w:lvl>
+    <w:lvl w:ilvl="6" w:tplc="40090001" w:tentative="1">
+      <w:start w:val="1"/>
+      <w:numFmt w:val="bullet"/>
+      <w:lvlText w:val=""/>
+      <w:lvlJc w:val="left"/>
+      <w:pPr>
+        <w:ind w:left="5040" w:hanging="360"/>
+      </w:pPr>
+      <w:rPr>
+        <w:rFonts w:ascii="Symbol" w:hAnsi="Symbol" w:hint="default"/>
+      </w:rPr>
+    </w:lvl>
+    <w:lvl w:ilvl="7" w:tplc="40090003" w:tentative="1">
+      <w:start w:val="1"/>
+      <w:numFmt w:val="bullet"/>
+      <w:lvlText w:val="o"/>
+      <w:lvlJc w:val="left"/>
+      <w:pPr>
+        <w:ind w:left="5760" w:hanging="360"/>
+      </w:pPr>
+      <w:rPr>
+        <w:rFonts w:ascii="Courier New" w:hAnsi="Courier New" w:cs="Courier New" w:hint="default"/>
+      </w:rPr>
+    </w:lvl>
+    <w:lvl w:ilvl="8" w:tplc="40090005" w:tentative="1">
+      <w:start w:val="1"/>
+      <w:numFmt w:val="bullet"/>
+      <w:lvlText w:val=""/>
+      <w:lvlJc w:val="left"/>
+      <w:pPr>
+        <w:ind w:left="6480" w:hanging="360"/>
+      </w:pPr>
+      <w:rPr>
+        <w:rFonts w:ascii="Wingdings" w:hAnsi="Wingdings" w:hint="default"/>
+      </w:rPr>
+    </w:lvl>
+  </w:abstractNum>
+  <w:abstractNum w:abstractNumId="1" w15:restartNumberingAfterBreak="0">
+    <w:nsid w:val="126A0E23"/>
+    <w:multiLevelType w:val="multilevel"/>
+    <w:tmpl w:val="0B4A6CC4"/>
+    <w:lvl w:ilvl="0">
+      <w:start w:val="1"/>
+      <w:numFmt w:val="decimal"/>
+      <w:lvlText w:val="%1."/>
+      <w:lvlJc w:val="left"/>
+      <w:pPr>
+        <w:tabs>
+          <w:tab w:val="num" w:pos="720"/>
+        </w:tabs>
+        <w:ind w:left="720" w:hanging="360"/>
+      </w:pPr>
+    </w:lvl>
+    <w:lvl w:ilvl="1" w:tentative="1">
+      <w:start w:val="1"/>
+      <w:numFmt w:val="decimal"/>
+      <w:lvlText w:val="%2."/>
+      <w:lvlJc w:val="left"/>
+      <w:pPr>
+        <w:tabs>
+          <w:tab w:val="num" w:pos="1440"/>
+        </w:tabs>
+        <w:ind w:left="1440" w:hanging="360"/>
+      </w:pPr>
+    </w:lvl>
+    <w:lvl w:ilvl="2" w:tentative="1">
+      <w:start w:val="1"/>
+      <w:numFmt w:val="decimal"/>
+      <w:lvlText w:val="%3."/>
+      <w:lvlJc w:val="left"/>
+      <w:pPr>
+        <w:tabs>
+          <w:tab w:val="num" w:pos="2160"/>
+        </w:tabs>
+        <w:ind w:left="2160" w:hanging="360"/>
+      </w:pPr>
+    </w:lvl>
+    <w:lvl w:ilvl="3" w:tentative="1">
+      <w:start w:val="1"/>
+      <w:numFmt w:val="decimal"/>
+      <w:lvlText w:val="%4."/>
+      <w:lvlJc w:val="left"/>
+      <w:pPr>
+        <w:tabs>
+          <w:tab w:val="num" w:pos="2880"/>
+        </w:tabs>
+        <w:ind w:left="2880" w:hanging="360"/>
+      </w:pPr>
+    </w:lvl>
+    <w:lvl w:ilvl="4" w:tentative="1">
+      <w:start w:val="1"/>
+      <w:numFmt w:val="decimal"/>
+      <w:lvlText w:val="%5."/>
+      <w:lvlJc w:val="left"/>
+      <w:pPr>
+        <w:tabs>
+          <w:tab w:val="num" w:pos="3600"/>
+        </w:tabs>
+        <w:ind w:left="3600" w:hanging="360"/>
+      </w:pPr>
+    </w:lvl>
+    <w:lvl w:ilvl="5" w:tentative="1">
+      <w:start w:val="1"/>
+      <w:numFmt w:val="decimal"/>
+      <w:lvlText w:val="%6."/>
+      <w:lvlJc w:val="left"/>
+      <w:pPr>
+        <w:tabs>
+          <w:tab w:val="num" w:pos="4320"/>
+        </w:tabs>
+        <w:ind w:left="4320" w:hanging="360"/>
+      </w:pPr>
+    </w:lvl>
+    <w:lvl w:ilvl="6" w:tentative="1">
+      <w:start w:val="1"/>
+      <w:numFmt w:val="decimal"/>
+      <w:lvlText w:val="%7."/>
+      <w:lvlJc w:val="left"/>
+      <w:pPr>
+        <w:tabs>
+          <w:tab w:val="num" w:pos="5040"/>
+        </w:tabs>
+        <w:ind w:left="5040" w:hanging="360"/>
+      </w:pPr>
+    </w:lvl>
+    <w:lvl w:ilvl="7" w:tentative="1">
+      <w:start w:val="1"/>
+      <w:numFmt w:val="decimal"/>
+      <w:lvlText w:val="%8."/>
+      <w:lvlJc w:val="left"/>
+      <w:pPr>
+        <w:tabs>
+          <w:tab w:val="num" w:pos="5760"/>
+        </w:tabs>
+        <w:ind w:left="5760" w:hanging="360"/>
+      </w:pPr>
+    </w:lvl>
+    <w:lvl w:ilvl="8" w:tentative="1">
+      <w:start w:val="1"/>
+      <w:numFmt w:val="decimal"/>
+      <w:lvlText w:val="%9."/>
+      <w:lvlJc w:val="left"/>
+      <w:pPr>
+        <w:tabs>
+          <w:tab w:val="num" w:pos="6480"/>
+        </w:tabs>
+        <w:ind w:left="6480" w:hanging="360"/>
+      </w:pPr>
+    </w:lvl>
+  </w:abstractNum>
+  <w:abstractNum w:abstractNumId="2" w15:restartNumberingAfterBreak="0">
+    <w:nsid w:val="226834C6"/>
+    <w:multiLevelType w:val="hybridMultilevel"/>
+    <w:tmpl w:val="94B6AEA6"/>
+    <w:lvl w:ilvl="0" w:tplc="40090001">
+      <w:start w:val="1"/>
+      <w:numFmt w:val="bullet"/>
+      <w:lvlText w:val=""/>
+      <w:lvlJc w:val="left"/>
+      <w:pPr>
+        <w:ind w:left="720" w:hanging="360"/>
+      </w:pPr>
+      <w:rPr>
+        <w:rFonts w:ascii="Symbol" w:hAnsi="Symbol" w:hint="default"/>
+      </w:rPr>
+    </w:lvl>
+    <w:lvl w:ilvl="1" w:tplc="40090003" w:tentative="1">
+      <w:start w:val="1"/>
+      <w:numFmt w:val="bullet"/>
+      <w:lvlText w:val="o"/>
+      <w:lvlJc w:val="left"/>
+      <w:pPr>
+        <w:ind w:left="1440" w:hanging="360"/>
+      </w:pPr>
+      <w:rPr>
+        <w:rFonts w:ascii="Courier New" w:hAnsi="Courier New" w:cs="Courier New" w:hint="default"/>
+      </w:rPr>
+    </w:lvl>
+    <w:lvl w:ilvl="2" w:tplc="40090005" w:tentative="1">
+      <w:start w:val="1"/>
+      <w:numFmt w:val="bullet"/>
+      <w:lvlText w:val=""/>
+      <w:lvlJc w:val="left"/>
+      <w:pPr>
+        <w:ind w:left="2160" w:hanging="360"/>
+      </w:pPr>
+      <w:rPr>
+        <w:rFonts w:ascii="Wingdings" w:hAnsi="Wingdings" w:hint="default"/>
+      </w:rPr>
+    </w:lvl>
+    <w:lvl w:ilvl="3" w:tplc="40090001" w:tentative="1">
+      <w:start w:val="1"/>
+      <w:numFmt w:val="bullet"/>
+      <w:lvlText w:val=""/>
+      <w:lvlJc w:val="left"/>
+      <w:pPr>
+        <w:ind w:left="2880" w:hanging="360"/>
+      </w:pPr>
+      <w:rPr>
+        <w:rFonts w:ascii="Symbol" w:hAnsi="Symbol" w:hint="default"/>
+      </w:rPr>
+    </w:lvl>
+    <w:lvl w:ilvl="4" w:tplc="40090003" w:tentative="1">
+      <w:start w:val="1"/>
+      <w:numFmt w:val="bullet"/>
+      <w:lvlText w:val="o"/>
+      <w:lvlJc w:val="left"/>
+      <w:pPr>
+        <w:ind w:left="3600" w:hanging="360"/>
+      </w:pPr>
+      <w:rPr>
+        <w:rFonts w:ascii="Courier New" w:hAnsi="Courier New" w:cs="Courier New" w:hint="default"/>
+      </w:rPr>
+    </w:lvl>
+    <w:lvl w:ilvl="5" w:tplc="40090005" w:tentative="1">
+      <w:start w:val="1"/>
+      <w:numFmt w:val="bullet"/>
+      <w:lvlText w:val=""/>
+      <w:lvlJc w:val="left"/>
+      <w:pPr>
+        <w:ind w:left="4320" w:hanging="360"/>
+      </w:pPr>
+      <w:rPr>
+        <w:rFonts w:ascii="Wingdings" w:hAnsi="Wingdings" w:hint="default"/>
+      </w:rPr>
+    </w:lvl>
+    <w:lvl w:ilvl="6" w:tplc="40090001" w:tentative="1">
+      <w:start w:val="1"/>
+      <w:numFmt w:val="bullet"/>
+      <w:lvlText w:val=""/>
+      <w:lvlJc w:val="left"/>
+      <w:pPr>
+        <w:ind w:left="5040" w:hanging="360"/>
+      </w:pPr>
+      <w:rPr>
+        <w:rFonts w:ascii="Symbol" w:hAnsi="Symbol" w:hint="default"/>
+      </w:rPr>
+    </w:lvl>
+    <w:lvl w:ilvl="7" w:tplc="40090003" w:tentative="1">
+      <w:start w:val="1"/>
+      <w:numFmt w:val="bullet"/>
+      <w:lvlText w:val="o"/>
+      <w:lvlJc w:val="left"/>
+      <w:pPr>
+        <w:ind w:left="5760" w:hanging="360"/>
+      </w:pPr>
+      <w:rPr>
+        <w:rFonts w:ascii="Courier New" w:hAnsi="Courier New" w:cs="Courier New" w:hint="default"/>
+      </w:rPr>
+    </w:lvl>
+    <w:lvl w:ilvl="8" w:tplc="40090005" w:tentative="1">
+      <w:start w:val="1"/>
+      <w:numFmt w:val="bullet"/>
+      <w:lvlText w:val=""/>
+      <w:lvlJc w:val="left"/>
+      <w:pPr>
+        <w:ind w:left="6480" w:hanging="360"/>
+      </w:pPr>
+      <w:rPr>
+        <w:rFonts w:ascii="Wingdings" w:hAnsi="Wingdings" w:hint="default"/>
+      </w:rPr>
+    </w:lvl>
+  </w:abstractNum>
+  <w:num w:numId="1" w16cid:durableId="1063020755">
+    <w:abstractNumId w:val="2"/>
+  </w:num>
+  <w:num w:numId="2" w16cid:durableId="300501481">
+    <w:abstractNumId w:val="1"/>
+  </w:num>
+  <w:num w:numId="3" w16cid:durableId="470055463">
+    <w:abstractNumId w:val="0"/>
+  </w:num>
+</w:numbering>
 </file>
 
 <file path=word/styles.xml><?xml version="1.0" encoding="utf-8"?>
@@ -441,7 +4697,6 @@
     <w:next w:val="Normal"/>
     <w:link w:val="Heading2Char"/>
     <w:uiPriority w:val="9"/>
-    <w:semiHidden/>
     <w:unhideWhenUsed/>
     <w:qFormat/>
     <w:rsid w:val="00456582"/>
@@ -616,7 +4871,6 @@
   <w:style w:type="character" w:default="1" w:styleId="DefaultParagraphFont">
     <w:name w:val="Default Paragraph Font"/>
     <w:uiPriority w:val="1"/>
-    <w:semiHidden/>
     <w:unhideWhenUsed/>
   </w:style>
   <w:style w:type="table" w:default="1" w:styleId="TableNormal">
@@ -658,7 +4912,6 @@
     <w:basedOn w:val="DefaultParagraphFont"/>
     <w:link w:val="Heading2"/>
     <w:uiPriority w:val="9"/>
-    <w:semiHidden/>
     <w:rsid w:val="00456582"/>
     <w:rPr>
       <w:rFonts w:asciiTheme="majorHAnsi" w:eastAsiaTheme="majorEastAsia" w:hAnsiTheme="majorHAnsi" w:cstheme="majorBidi"/>
@@ -929,6 +5182,25 @@
       <w:color w:val="0F4761" w:themeColor="accent1" w:themeShade="BF"/>
       <w:spacing w:val="5"/>
     </w:rPr>
+  </w:style>
+  <w:style w:type="table" w:styleId="TableGrid">
+    <w:name w:val="Table Grid"/>
+    <w:basedOn w:val="TableNormal"/>
+    <w:uiPriority w:val="39"/>
+    <w:rsid w:val="00585C47"/>
+    <w:pPr>
+      <w:spacing w:after="0" w:line="240" w:lineRule="auto"/>
+    </w:pPr>
+    <w:tblPr>
+      <w:tblBorders>
+        <w:top w:val="single" w:sz="4" w:space="0" w:color="auto"/>
+        <w:left w:val="single" w:sz="4" w:space="0" w:color="auto"/>
+        <w:bottom w:val="single" w:sz="4" w:space="0" w:color="auto"/>
+        <w:right w:val="single" w:sz="4" w:space="0" w:color="auto"/>
+        <w:insideH w:val="single" w:sz="4" w:space="0" w:color="auto"/>
+        <w:insideV w:val="single" w:sz="4" w:space="0" w:color="auto"/>
+      </w:tblBorders>
+    </w:tblPr>
   </w:style>
 </w:styles>
 </file>

</xml_diff>

<commit_message>
Added pyhton script for generating normal dataset and created dataset
</commit_message>
<xml_diff>
--- a/docs/Doc1.docx
+++ b/docs/Doc1.docx
@@ -22,13 +22,23 @@
       <w:r>
         <w:t>Get enterprise-</w:t>
       </w:r>
+      <w:proofErr w:type="spellStart"/>
       <w:proofErr w:type="gramStart"/>
       <w:r>
         <w:t>attack.json</w:t>
       </w:r>
+      <w:proofErr w:type="spellEnd"/>
       <w:proofErr w:type="gramEnd"/>
       <w:r>
-        <w:t> from github.com/mitre/cti. This is the raw JSON containing all ATT&amp;CK objects in STIX v2.1 format.</w:t>
+        <w:t> from github.com/mitre/</w:t>
+      </w:r>
+      <w:proofErr w:type="spellStart"/>
+      <w:r>
+        <w:t>cti</w:t>
+      </w:r>
+      <w:proofErr w:type="spellEnd"/>
+      <w:r>
+        <w:t>. This is the raw JSON containing all ATT&amp;CK objects in STIX v2.1 format.</w:t>
       </w:r>
     </w:p>
     <w:p>
@@ -75,12 +85,28 @@
         <w:pStyle w:val="Heading2"/>
       </w:pPr>
       <w:r>
-        <w:t>Parse with mitreattack-python</w:t>
+        <w:t xml:space="preserve">Parse with </w:t>
+      </w:r>
+      <w:proofErr w:type="spellStart"/>
+      <w:r>
+        <w:t>mitreattack</w:t>
+      </w:r>
+      <w:proofErr w:type="spellEnd"/>
+      <w:r>
+        <w:t>-python</w:t>
       </w:r>
     </w:p>
     <w:p>
       <w:r>
-        <w:t>Use the mitreattack-python library to extract four object types: techniques (attack-pattern), groups (intrusion-set), relationships, and mitigations (course-of-action).</w:t>
+        <w:t>Use the </w:t>
+      </w:r>
+      <w:proofErr w:type="spellStart"/>
+      <w:r>
+        <w:t>mitreattack</w:t>
+      </w:r>
+      <w:proofErr w:type="spellEnd"/>
+      <w:r>
+        <w:t>-python library to extract four object types: techniques (attack-pattern), groups (intrusion-set), relationships, and mitigations (course-of-action).</w:t>
       </w:r>
     </w:p>
     <w:tbl>
@@ -99,8 +125,13 @@
           </w:tcPr>
           <w:p>
             <w:r>
-              <w:t>import json</w:t>
-            </w:r>
+              <w:t xml:space="preserve">import </w:t>
+            </w:r>
+            <w:proofErr w:type="spellStart"/>
+            <w:r>
+              <w:t>json</w:t>
+            </w:r>
+            <w:proofErr w:type="spellEnd"/>
           </w:p>
           <w:p>
             <w:r>
@@ -112,8 +143,13 @@
             </w:r>
             <w:proofErr w:type="gramEnd"/>
             <w:r>
-              <w:t>20 import MitreAttackData</w:t>
-            </w:r>
+              <w:t xml:space="preserve">20 import </w:t>
+            </w:r>
+            <w:proofErr w:type="spellStart"/>
+            <w:r>
+              <w:t>MitreAttackData</w:t>
+            </w:r>
+            <w:proofErr w:type="spellEnd"/>
           </w:p>
           <w:p>
             <w:r>
@@ -125,10 +161,12 @@
             <w:r>
               <w:t>STIX_FILE = "enterprise-</w:t>
             </w:r>
+            <w:proofErr w:type="spellStart"/>
             <w:proofErr w:type="gramStart"/>
             <w:r>
               <w:t>attack.json</w:t>
             </w:r>
+            <w:proofErr w:type="spellEnd"/>
             <w:proofErr w:type="gramEnd"/>
             <w:r>
               <w:t>"</w:t>
@@ -149,9 +187,14 @@
             <w:r>
               <w:t xml:space="preserve">attack = </w:t>
             </w:r>
-            <w:proofErr w:type="gramStart"/>
-            <w:r>
-              <w:t>MitreAttackData(</w:t>
+            <w:proofErr w:type="spellStart"/>
+            <w:proofErr w:type="gramStart"/>
+            <w:r>
+              <w:t>MitreAttackData</w:t>
+            </w:r>
+            <w:proofErr w:type="spellEnd"/>
+            <w:r>
+              <w:t>(</w:t>
             </w:r>
             <w:proofErr w:type="gramEnd"/>
             <w:r>
@@ -166,8 +209,17 @@
             </w:r>
             <w:proofErr w:type="gramEnd"/>
             <w:r>
-              <w:t xml:space="preserve"> attack.get_techniques(</w:t>
-            </w:r>
+              <w:t xml:space="preserve"> </w:t>
+            </w:r>
+            <w:proofErr w:type="spellStart"/>
+            <w:r>
+              <w:t>attack.get_techniques</w:t>
+            </w:r>
+            <w:proofErr w:type="spellEnd"/>
+            <w:r>
+              <w:t>(</w:t>
+            </w:r>
+            <w:proofErr w:type="spellStart"/>
             <w:r>
               <w:rPr>
                 <w:i/>
@@ -175,14 +227,24 @@
               </w:rPr>
               <w:t>remove_revoked_deprecated</w:t>
             </w:r>
+            <w:proofErr w:type="spellEnd"/>
             <w:r>
               <w:t>=True)</w:t>
             </w:r>
           </w:p>
           <w:p>
             <w:r>
-              <w:t>groups      = attack.get_groups(</w:t>
-            </w:r>
+              <w:t xml:space="preserve">groups      = </w:t>
+            </w:r>
+            <w:proofErr w:type="spellStart"/>
+            <w:r>
+              <w:t>attack.get_groups</w:t>
+            </w:r>
+            <w:proofErr w:type="spellEnd"/>
+            <w:r>
+              <w:t>(</w:t>
+            </w:r>
+            <w:proofErr w:type="spellStart"/>
             <w:r>
               <w:rPr>
                 <w:i/>
@@ -190,14 +252,24 @@
               </w:rPr>
               <w:t>remove_revoked_deprecated</w:t>
             </w:r>
+            <w:proofErr w:type="spellEnd"/>
             <w:r>
               <w:t>=True)</w:t>
             </w:r>
           </w:p>
           <w:p>
             <w:r>
-              <w:t>mitigations = attack.get_mitigations(</w:t>
-            </w:r>
+              <w:t xml:space="preserve">mitigations = </w:t>
+            </w:r>
+            <w:proofErr w:type="spellStart"/>
+            <w:r>
+              <w:t>attack.get_mitigations</w:t>
+            </w:r>
+            <w:proofErr w:type="spellEnd"/>
+            <w:r>
+              <w:t>(</w:t>
+            </w:r>
+            <w:proofErr w:type="spellStart"/>
             <w:r>
               <w:rPr>
                 <w:i/>
@@ -205,6 +277,7 @@
               </w:rPr>
               <w:t>remove_revoked_deprecated</w:t>
             </w:r>
+            <w:proofErr w:type="spellEnd"/>
             <w:r>
               <w:t>=True)</w:t>
             </w:r>
@@ -213,10 +286,12 @@
             <w:r>
               <w:t xml:space="preserve">relationships = </w:t>
             </w:r>
+            <w:proofErr w:type="spellStart"/>
             <w:proofErr w:type="gramStart"/>
             <w:r>
               <w:t>attack.src.query</w:t>
             </w:r>
+            <w:proofErr w:type="spellEnd"/>
             <w:proofErr w:type="gramEnd"/>
             <w:r>
               <w:t>([</w:t>
@@ -255,7 +330,15 @@
             </w:r>
             <w:proofErr w:type="gramEnd"/>
             <w:r>
-              <w:t>f"✓ {len(techniques)} techniques")</w:t>
+              <w:t>f"✓ {</w:t>
+            </w:r>
+            <w:proofErr w:type="spellStart"/>
+            <w:r>
+              <w:t>len</w:t>
+            </w:r>
+            <w:proofErr w:type="spellEnd"/>
+            <w:r>
+              <w:t>(techniques)} techniques")</w:t>
             </w:r>
           </w:p>
           <w:p>
@@ -265,7 +348,15 @@
             </w:r>
             <w:proofErr w:type="gramEnd"/>
             <w:r>
-              <w:t>f"✓ {len(groups)} groups")</w:t>
+              <w:t>f"✓ {</w:t>
+            </w:r>
+            <w:proofErr w:type="spellStart"/>
+            <w:r>
+              <w:t>len</w:t>
+            </w:r>
+            <w:proofErr w:type="spellEnd"/>
+            <w:r>
+              <w:t>(groups)} groups")</w:t>
             </w:r>
           </w:p>
           <w:p>
@@ -275,7 +366,15 @@
             </w:r>
             <w:proofErr w:type="gramEnd"/>
             <w:r>
-              <w:t>f"✓ {len(mitigations)} mitigations")</w:t>
+              <w:t>f"✓ {</w:t>
+            </w:r>
+            <w:proofErr w:type="spellStart"/>
+            <w:r>
+              <w:t>len</w:t>
+            </w:r>
+            <w:proofErr w:type="spellEnd"/>
+            <w:r>
+              <w:t>(mitigations)} mitigations")</w:t>
             </w:r>
           </w:p>
           <w:p>
@@ -285,13 +384,26 @@
             </w:r>
             <w:proofErr w:type="gramEnd"/>
             <w:r>
-              <w:t>f"✓ {len(relationships)} relationships")</w:t>
+              <w:t>f"✓ {</w:t>
+            </w:r>
+            <w:proofErr w:type="spellStart"/>
+            <w:r>
+              <w:t>len</w:t>
+            </w:r>
+            <w:proofErr w:type="spellEnd"/>
+            <w:r>
+              <w:t>(relationships)} relationships")</w:t>
             </w:r>
           </w:p>
           <w:p/>
           <w:p>
-            <w:r>
-              <w:t>tech_to_groups = {}</w:t>
+            <w:proofErr w:type="spellStart"/>
+            <w:r>
+              <w:t>tech_to_groups</w:t>
+            </w:r>
+            <w:proofErr w:type="spellEnd"/>
+            <w:r>
+              <w:t xml:space="preserve"> = {}</w:t>
             </w:r>
           </w:p>
           <w:p>
@@ -301,16 +413,36 @@
           </w:p>
           <w:p>
             <w:r>
-              <w:t>    for t in attack.get_techniques_used_by_group(group.id):</w:t>
-            </w:r>
-          </w:p>
-          <w:p>
-            <w:r>
-              <w:t>        tid = t["object"</w:t>
-            </w:r>
-            <w:proofErr w:type="gramStart"/>
-            <w:r>
-              <w:t>].external</w:t>
+              <w:t xml:space="preserve">    for t in </w:t>
+            </w:r>
+            <w:proofErr w:type="spellStart"/>
+            <w:r>
+              <w:t>attack.get_techniques_used_by_group</w:t>
+            </w:r>
+            <w:proofErr w:type="spellEnd"/>
+            <w:r>
+              <w:t>(group.id):</w:t>
+            </w:r>
+          </w:p>
+          <w:p>
+            <w:r>
+              <w:t xml:space="preserve">        </w:t>
+            </w:r>
+            <w:proofErr w:type="spellStart"/>
+            <w:r>
+              <w:t>tid</w:t>
+            </w:r>
+            <w:proofErr w:type="spellEnd"/>
+            <w:r>
+              <w:t xml:space="preserve"> = t["object"</w:t>
+            </w:r>
+            <w:proofErr w:type="gramStart"/>
+            <w:r>
+              <w:t>].</w:t>
+            </w:r>
+            <w:proofErr w:type="spellStart"/>
+            <w:r>
+              <w:t>external</w:t>
             </w:r>
             <w:proofErr w:type="gramEnd"/>
             <w:r>
@@ -318,7 +450,11 @@
             </w:r>
             <w:proofErr w:type="gramStart"/>
             <w:r>
-              <w:t>references[</w:t>
+              <w:t>references</w:t>
+            </w:r>
+            <w:proofErr w:type="spellEnd"/>
+            <w:r>
+              <w:t>[</w:t>
             </w:r>
             <w:proofErr w:type="gramEnd"/>
             <w:r>
@@ -326,24 +462,42 @@
             </w:r>
             <w:proofErr w:type="gramStart"/>
             <w:r>
-              <w:t>].external</w:t>
+              <w:t>].</w:t>
+            </w:r>
+            <w:proofErr w:type="spellStart"/>
+            <w:r>
+              <w:t>external</w:t>
             </w:r>
             <w:proofErr w:type="gramEnd"/>
             <w:r>
               <w:t>_id</w:t>
             </w:r>
-          </w:p>
-          <w:p>
-            <w:r>
-              <w:t>        tech_to_</w:t>
+            <w:proofErr w:type="spellEnd"/>
+          </w:p>
+          <w:p>
+            <w:r>
+              <w:t xml:space="preserve">        </w:t>
+            </w:r>
+            <w:proofErr w:type="spellStart"/>
+            <w:r>
+              <w:t>tech_to_</w:t>
             </w:r>
             <w:proofErr w:type="gramStart"/>
             <w:r>
               <w:t>groups.setdefault</w:t>
             </w:r>
-            <w:proofErr w:type="gramEnd"/>
-            <w:r>
-              <w:t>(tid, []</w:t>
+            <w:proofErr w:type="spellEnd"/>
+            <w:proofErr w:type="gramEnd"/>
+            <w:r>
+              <w:t>(</w:t>
+            </w:r>
+            <w:proofErr w:type="spellStart"/>
+            <w:r>
+              <w:t>tid</w:t>
+            </w:r>
+            <w:proofErr w:type="spellEnd"/>
+            <w:r>
+              <w:t>, []</w:t>
             </w:r>
             <w:proofErr w:type="gramStart"/>
             <w:r>
@@ -356,8 +510,13 @@
           </w:p>
           <w:p/>
           <w:p>
-            <w:r>
-              <w:t>tactic_to_techs = {}</w:t>
+            <w:proofErr w:type="spellStart"/>
+            <w:r>
+              <w:t>tactic_to_techs</w:t>
+            </w:r>
+            <w:proofErr w:type="spellEnd"/>
+            <w:r>
+              <w:t xml:space="preserve"> = {}</w:t>
             </w:r>
           </w:p>
           <w:p>
@@ -367,8 +526,17 @@
           </w:p>
           <w:p>
             <w:r>
-              <w:t xml:space="preserve">    tid = </w:t>
-            </w:r>
+              <w:t xml:space="preserve">    </w:t>
+            </w:r>
+            <w:proofErr w:type="spellStart"/>
+            <w:r>
+              <w:t>tid</w:t>
+            </w:r>
+            <w:proofErr w:type="spellEnd"/>
+            <w:r>
+              <w:t xml:space="preserve"> = </w:t>
+            </w:r>
+            <w:proofErr w:type="spellStart"/>
             <w:proofErr w:type="gramStart"/>
             <w:r>
               <w:t>t.external</w:t>
@@ -379,7 +547,11 @@
             </w:r>
             <w:proofErr w:type="gramStart"/>
             <w:r>
-              <w:t>references[</w:t>
+              <w:t>references</w:t>
+            </w:r>
+            <w:proofErr w:type="spellEnd"/>
+            <w:r>
+              <w:t>[</w:t>
             </w:r>
             <w:proofErr w:type="gramEnd"/>
             <w:r>
@@ -387,45 +559,65 @@
             </w:r>
             <w:proofErr w:type="gramStart"/>
             <w:r>
-              <w:t>].external</w:t>
+              <w:t>].</w:t>
+            </w:r>
+            <w:proofErr w:type="spellStart"/>
+            <w:r>
+              <w:t>external</w:t>
             </w:r>
             <w:proofErr w:type="gramEnd"/>
             <w:r>
               <w:t>_id</w:t>
             </w:r>
+            <w:proofErr w:type="spellEnd"/>
           </w:p>
           <w:p>
             <w:r>
               <w:t>    for phase in (</w:t>
             </w:r>
+            <w:proofErr w:type="spellStart"/>
             <w:proofErr w:type="gramStart"/>
             <w:r>
               <w:t>t.kill</w:t>
             </w:r>
             <w:proofErr w:type="gramEnd"/>
             <w:r>
-              <w:t>_chain_phases or []):</w:t>
-            </w:r>
-          </w:p>
-          <w:p>
-            <w:r>
-              <w:t>        tactic_to_</w:t>
+              <w:t>_chain_phases</w:t>
+            </w:r>
+            <w:proofErr w:type="spellEnd"/>
+            <w:r>
+              <w:t xml:space="preserve"> or []):</w:t>
+            </w:r>
+          </w:p>
+          <w:p>
+            <w:r>
+              <w:t xml:space="preserve">        </w:t>
+            </w:r>
+            <w:proofErr w:type="spellStart"/>
+            <w:r>
+              <w:t>tactic_to_</w:t>
             </w:r>
             <w:proofErr w:type="gramStart"/>
             <w:r>
               <w:t>techs.setdefault</w:t>
             </w:r>
+            <w:proofErr w:type="spellEnd"/>
             <w:proofErr w:type="gramEnd"/>
             <w:r>
               <w:t>(</w:t>
             </w:r>
+            <w:proofErr w:type="spellStart"/>
             <w:proofErr w:type="gramStart"/>
             <w:r>
               <w:t>phase.phase</w:t>
             </w:r>
             <w:proofErr w:type="gramEnd"/>
             <w:r>
-              <w:t>_name, []</w:t>
+              <w:t>_name</w:t>
+            </w:r>
+            <w:proofErr w:type="spellEnd"/>
+            <w:r>
+              <w:t>, []</w:t>
             </w:r>
             <w:proofErr w:type="gramStart"/>
             <w:r>
@@ -433,41 +625,77 @@
             </w:r>
             <w:proofErr w:type="gramEnd"/>
             <w:r>
-              <w:t>(tid)</w:t>
+              <w:t>(</w:t>
+            </w:r>
+            <w:proofErr w:type="spellStart"/>
+            <w:r>
+              <w:t>tid</w:t>
+            </w:r>
+            <w:proofErr w:type="spellEnd"/>
+            <w:r>
+              <w:t>)</w:t>
             </w:r>
           </w:p>
           <w:p/>
           <w:p>
-            <w:r>
-              <w:t>mit_to_techs = {}</w:t>
-            </w:r>
-          </w:p>
-          <w:p>
-            <w:r>
-              <w:t>for rel in relationships:</w:t>
+            <w:proofErr w:type="spellStart"/>
+            <w:r>
+              <w:t>mit_to_techs</w:t>
+            </w:r>
+            <w:proofErr w:type="spellEnd"/>
+            <w:r>
+              <w:t xml:space="preserve"> = {}</w:t>
+            </w:r>
+          </w:p>
+          <w:p>
+            <w:r>
+              <w:t xml:space="preserve">for </w:t>
+            </w:r>
+            <w:proofErr w:type="spellStart"/>
+            <w:r>
+              <w:t>rel</w:t>
+            </w:r>
+            <w:proofErr w:type="spellEnd"/>
+            <w:r>
+              <w:t xml:space="preserve"> in relationships:</w:t>
             </w:r>
           </w:p>
           <w:p>
             <w:r>
               <w:t xml:space="preserve">    if </w:t>
             </w:r>
+            <w:proofErr w:type="spellStart"/>
             <w:proofErr w:type="gramStart"/>
             <w:r>
               <w:t>rel.relationship</w:t>
             </w:r>
             <w:proofErr w:type="gramEnd"/>
             <w:r>
-              <w:t>_type == "mitigates":</w:t>
-            </w:r>
-          </w:p>
-          <w:p>
-            <w:r>
-              <w:t xml:space="preserve">        src = </w:t>
-            </w:r>
+              <w:t>_type</w:t>
+            </w:r>
+            <w:proofErr w:type="spellEnd"/>
+            <w:r>
+              <w:t xml:space="preserve"> == "mitigates":</w:t>
+            </w:r>
+          </w:p>
+          <w:p>
+            <w:r>
+              <w:t xml:space="preserve">        </w:t>
+            </w:r>
+            <w:proofErr w:type="spellStart"/>
+            <w:r>
+              <w:t>src</w:t>
+            </w:r>
+            <w:proofErr w:type="spellEnd"/>
+            <w:r>
+              <w:t xml:space="preserve"> = </w:t>
+            </w:r>
+            <w:proofErr w:type="spellStart"/>
             <w:proofErr w:type="gramStart"/>
             <w:r>
               <w:t>attack.src.query</w:t>
             </w:r>
+            <w:proofErr w:type="spellEnd"/>
             <w:proofErr w:type="gramEnd"/>
             <w:r>
               <w:t>([</w:t>
@@ -480,23 +708,38 @@
             <w:r>
               <w:t xml:space="preserve">"id", "=", </w:t>
             </w:r>
+            <w:proofErr w:type="spellStart"/>
             <w:proofErr w:type="gramStart"/>
             <w:r>
               <w:t>rel.source</w:t>
             </w:r>
             <w:proofErr w:type="gramEnd"/>
             <w:r>
-              <w:t>_ref)])</w:t>
-            </w:r>
-          </w:p>
-          <w:p>
-            <w:r>
-              <w:t xml:space="preserve">        tgt = </w:t>
-            </w:r>
+              <w:t>_ref</w:t>
+            </w:r>
+            <w:proofErr w:type="spellEnd"/>
+            <w:r>
+              <w:t>)])</w:t>
+            </w:r>
+          </w:p>
+          <w:p>
+            <w:r>
+              <w:t xml:space="preserve">        </w:t>
+            </w:r>
+            <w:proofErr w:type="spellStart"/>
+            <w:r>
+              <w:t>tgt</w:t>
+            </w:r>
+            <w:proofErr w:type="spellEnd"/>
+            <w:r>
+              <w:t xml:space="preserve"> = </w:t>
+            </w:r>
+            <w:proofErr w:type="spellStart"/>
             <w:proofErr w:type="gramStart"/>
             <w:r>
               <w:t>attack.src.query</w:t>
             </w:r>
+            <w:proofErr w:type="spellEnd"/>
             <w:proofErr w:type="gramEnd"/>
             <w:r>
               <w:t>([</w:t>
@@ -509,18 +752,39 @@
             <w:r>
               <w:t xml:space="preserve">"id", "=", </w:t>
             </w:r>
+            <w:proofErr w:type="spellStart"/>
             <w:proofErr w:type="gramStart"/>
             <w:r>
               <w:t>rel.target</w:t>
             </w:r>
             <w:proofErr w:type="gramEnd"/>
             <w:r>
-              <w:t>_ref)])</w:t>
-            </w:r>
-          </w:p>
-          <w:p>
-            <w:r>
-              <w:t>        if src and tgt:</w:t>
+              <w:t>_ref</w:t>
+            </w:r>
+            <w:proofErr w:type="spellEnd"/>
+            <w:r>
+              <w:t>)])</w:t>
+            </w:r>
+          </w:p>
+          <w:p>
+            <w:r>
+              <w:t xml:space="preserve">        if </w:t>
+            </w:r>
+            <w:proofErr w:type="spellStart"/>
+            <w:r>
+              <w:t>src</w:t>
+            </w:r>
+            <w:proofErr w:type="spellEnd"/>
+            <w:r>
+              <w:t xml:space="preserve"> and </w:t>
+            </w:r>
+            <w:proofErr w:type="spellStart"/>
+            <w:r>
+              <w:t>tgt</w:t>
+            </w:r>
+            <w:proofErr w:type="spellEnd"/>
+            <w:r>
+              <w:t>:</w:t>
             </w:r>
           </w:p>
           <w:p>
@@ -530,11 +794,23 @@
           </w:p>
           <w:p>
             <w:r>
-              <w:t>                mid = src[0</w:t>
-            </w:r>
-            <w:proofErr w:type="gramStart"/>
-            <w:r>
-              <w:t>].external</w:t>
+              <w:t xml:space="preserve">                mid = </w:t>
+            </w:r>
+            <w:proofErr w:type="spellStart"/>
+            <w:r>
+              <w:t>src</w:t>
+            </w:r>
+            <w:proofErr w:type="spellEnd"/>
+            <w:r>
+              <w:t>[0</w:t>
+            </w:r>
+            <w:proofErr w:type="gramStart"/>
+            <w:r>
+              <w:t>].</w:t>
+            </w:r>
+            <w:proofErr w:type="spellStart"/>
+            <w:r>
+              <w:t>external</w:t>
             </w:r>
             <w:proofErr w:type="gramEnd"/>
             <w:r>
@@ -542,7 +818,11 @@
             </w:r>
             <w:proofErr w:type="gramStart"/>
             <w:r>
-              <w:t>references[</w:t>
+              <w:t>references</w:t>
+            </w:r>
+            <w:proofErr w:type="spellEnd"/>
+            <w:r>
+              <w:t>[</w:t>
             </w:r>
             <w:proofErr w:type="gramEnd"/>
             <w:r>
@@ -550,20 +830,45 @@
             </w:r>
             <w:proofErr w:type="gramStart"/>
             <w:r>
-              <w:t>].external</w:t>
+              <w:t>].</w:t>
+            </w:r>
+            <w:proofErr w:type="spellStart"/>
+            <w:r>
+              <w:t>external</w:t>
             </w:r>
             <w:proofErr w:type="gramEnd"/>
             <w:r>
               <w:t>_id</w:t>
             </w:r>
-          </w:p>
-          <w:p>
-            <w:r>
-              <w:t>                tid = tgt[0</w:t>
-            </w:r>
-            <w:proofErr w:type="gramStart"/>
-            <w:r>
-              <w:t>].external</w:t>
+            <w:proofErr w:type="spellEnd"/>
+          </w:p>
+          <w:p>
+            <w:r>
+              <w:t xml:space="preserve">                </w:t>
+            </w:r>
+            <w:proofErr w:type="spellStart"/>
+            <w:r>
+              <w:t>tid</w:t>
+            </w:r>
+            <w:proofErr w:type="spellEnd"/>
+            <w:r>
+              <w:t xml:space="preserve"> = </w:t>
+            </w:r>
+            <w:proofErr w:type="spellStart"/>
+            <w:r>
+              <w:t>tgt</w:t>
+            </w:r>
+            <w:proofErr w:type="spellEnd"/>
+            <w:r>
+              <w:t>[0</w:t>
+            </w:r>
+            <w:proofErr w:type="gramStart"/>
+            <w:r>
+              <w:t>].</w:t>
+            </w:r>
+            <w:proofErr w:type="spellStart"/>
+            <w:r>
+              <w:t>external</w:t>
             </w:r>
             <w:proofErr w:type="gramEnd"/>
             <w:r>
@@ -571,7 +876,11 @@
             </w:r>
             <w:proofErr w:type="gramStart"/>
             <w:r>
-              <w:t>references[</w:t>
+              <w:t>references</w:t>
+            </w:r>
+            <w:proofErr w:type="spellEnd"/>
+            <w:r>
+              <w:t>[</w:t>
             </w:r>
             <w:proofErr w:type="gramEnd"/>
             <w:r>
@@ -579,21 +888,31 @@
             </w:r>
             <w:proofErr w:type="gramStart"/>
             <w:r>
-              <w:t>].external</w:t>
+              <w:t>].</w:t>
+            </w:r>
+            <w:proofErr w:type="spellStart"/>
+            <w:r>
+              <w:t>external</w:t>
             </w:r>
             <w:proofErr w:type="gramEnd"/>
             <w:r>
               <w:t>_id</w:t>
             </w:r>
-          </w:p>
-          <w:p>
-            <w:r>
-              <w:t>                mit_to_</w:t>
+            <w:proofErr w:type="spellEnd"/>
+          </w:p>
+          <w:p>
+            <w:r>
+              <w:t xml:space="preserve">                </w:t>
+            </w:r>
+            <w:proofErr w:type="spellStart"/>
+            <w:r>
+              <w:t>mit_to_</w:t>
             </w:r>
             <w:proofErr w:type="gramStart"/>
             <w:r>
               <w:t>techs.setdefault</w:t>
             </w:r>
+            <w:proofErr w:type="spellEnd"/>
             <w:proofErr w:type="gramEnd"/>
             <w:r>
               <w:t>(mid, []</w:t>
@@ -604,12 +923,36 @@
             </w:r>
             <w:proofErr w:type="gramEnd"/>
             <w:r>
-              <w:t>(tid)</w:t>
-            </w:r>
-          </w:p>
-          <w:p>
-            <w:r>
-              <w:t>            except (IndexError, AttributeError):</w:t>
+              <w:t>(</w:t>
+            </w:r>
+            <w:proofErr w:type="spellStart"/>
+            <w:r>
+              <w:t>tid</w:t>
+            </w:r>
+            <w:proofErr w:type="spellEnd"/>
+            <w:r>
+              <w:t>)</w:t>
+            </w:r>
+          </w:p>
+          <w:p>
+            <w:r>
+              <w:t>            except (</w:t>
+            </w:r>
+            <w:proofErr w:type="spellStart"/>
+            <w:r>
+              <w:t>IndexError</w:t>
+            </w:r>
+            <w:proofErr w:type="spellEnd"/>
+            <w:r>
+              <w:t xml:space="preserve">, </w:t>
+            </w:r>
+            <w:proofErr w:type="spellStart"/>
+            <w:r>
+              <w:t>AttributeError</w:t>
+            </w:r>
+            <w:proofErr w:type="spellEnd"/>
+            <w:r>
+              <w:t>):</w:t>
             </w:r>
           </w:p>
           <w:p>
@@ -628,12 +971,17 @@
             </w:r>
             <w:proofErr w:type="gramEnd"/>
             <w:r>
-              <w:t>"index_</w:t>
+              <w:t>"</w:t>
+            </w:r>
+            <w:proofErr w:type="spellStart"/>
+            <w:r>
+              <w:t>index_</w:t>
             </w:r>
             <w:proofErr w:type="gramStart"/>
             <w:r>
               <w:t>mappings.json</w:t>
             </w:r>
+            <w:proofErr w:type="spellEnd"/>
             <w:proofErr w:type="gramEnd"/>
             <w:r>
               <w:t>", "w") as f:</w:t>
@@ -643,10 +991,12 @@
             <w:r>
               <w:t xml:space="preserve">    </w:t>
             </w:r>
+            <w:proofErr w:type="spellStart"/>
             <w:proofErr w:type="gramStart"/>
             <w:r>
               <w:t>json.dump</w:t>
             </w:r>
+            <w:proofErr w:type="spellEnd"/>
             <w:proofErr w:type="gramEnd"/>
             <w:r>
               <w:t>({</w:t>
@@ -656,40 +1006,76 @@
             <w:r>
               <w:t>        "</w:t>
             </w:r>
+            <w:proofErr w:type="spellStart"/>
             <w:proofErr w:type="gramStart"/>
             <w:r>
               <w:t>tech</w:t>
             </w:r>
             <w:proofErr w:type="gramEnd"/>
             <w:r>
-              <w:t>_to_groups": tech_to_groups,</w:t>
+              <w:t>_to_groups</w:t>
+            </w:r>
+            <w:proofErr w:type="spellEnd"/>
+            <w:r>
+              <w:t xml:space="preserve">": </w:t>
+            </w:r>
+            <w:proofErr w:type="spellStart"/>
+            <w:r>
+              <w:t>tech_to_groups</w:t>
+            </w:r>
+            <w:proofErr w:type="spellEnd"/>
+            <w:r>
+              <w:t>,</w:t>
             </w:r>
           </w:p>
           <w:p>
             <w:r>
               <w:t>        "</w:t>
             </w:r>
+            <w:proofErr w:type="spellStart"/>
             <w:proofErr w:type="gramStart"/>
             <w:r>
               <w:t>tactic</w:t>
             </w:r>
             <w:proofErr w:type="gramEnd"/>
             <w:r>
-              <w:t>_to_techs": tactic_to_techs,</w:t>
+              <w:t>_to_techs</w:t>
+            </w:r>
+            <w:proofErr w:type="spellEnd"/>
+            <w:r>
+              <w:t xml:space="preserve">": </w:t>
+            </w:r>
+            <w:proofErr w:type="spellStart"/>
+            <w:r>
+              <w:t>tactic_to_techs</w:t>
+            </w:r>
+            <w:proofErr w:type="spellEnd"/>
+            <w:r>
+              <w:t>,</w:t>
             </w:r>
           </w:p>
           <w:p>
             <w:r>
               <w:t>        "</w:t>
             </w:r>
+            <w:proofErr w:type="spellStart"/>
             <w:proofErr w:type="gramStart"/>
             <w:r>
               <w:t>mit</w:t>
             </w:r>
             <w:proofErr w:type="gramEnd"/>
             <w:r>
-              <w:t>_to_techs": mit_to_techs</w:t>
-            </w:r>
+              <w:t>_to_techs</w:t>
+            </w:r>
+            <w:proofErr w:type="spellEnd"/>
+            <w:r>
+              <w:t xml:space="preserve">": </w:t>
+            </w:r>
+            <w:proofErr w:type="spellStart"/>
+            <w:r>
+              <w:t>mit_to_techs</w:t>
+            </w:r>
+            <w:proofErr w:type="spellEnd"/>
           </w:p>
           <w:p>
             <w:r>
@@ -714,12 +1100,17 @@
             </w:r>
             <w:proofErr w:type="gramEnd"/>
             <w:r>
-              <w:t>"✓ index_</w:t>
+              <w:t xml:space="preserve">"✓ </w:t>
+            </w:r>
+            <w:proofErr w:type="spellStart"/>
+            <w:r>
+              <w:t>index_</w:t>
             </w:r>
             <w:proofErr w:type="gramStart"/>
             <w:r>
               <w:t>mappings.json</w:t>
             </w:r>
+            <w:proofErr w:type="spellEnd"/>
             <w:proofErr w:type="gramEnd"/>
             <w:r>
               <w:t xml:space="preserve"> saved")</w:t>
@@ -787,7 +1178,14 @@
             </w:r>
             <w:r>
               <w:br/>
-              <w:t xml:space="preserve">Technique </w:t>
+            </w:r>
+            <w:proofErr w:type="spellStart"/>
+            <w:r>
+              <w:t>Technique</w:t>
+            </w:r>
+            <w:proofErr w:type="spellEnd"/>
+            <w:r>
+              <w:t xml:space="preserve"> </w:t>
             </w:r>
             <w:r>
               <w:rPr>
@@ -963,8 +1361,13 @@
             <w:r>
               <w:t xml:space="preserve"> </w:t>
             </w:r>
-            <w:r>
-              <w:t>tech_to_groups["T1059"]</w:t>
+            <w:proofErr w:type="spellStart"/>
+            <w:r>
+              <w:t>tech_to_groups</w:t>
+            </w:r>
+            <w:proofErr w:type="spellEnd"/>
+            <w:r>
+              <w:t>["T1059"]</w:t>
             </w:r>
           </w:p>
           <w:p>
@@ -1140,12 +1543,28 @@
         <w:rPr>
           <w:rStyle w:val="Heading2Char"/>
         </w:rPr>
-        <w:t>Set up ChromaDB</w:t>
-      </w:r>
+        <w:t xml:space="preserve">Set up </w:t>
+      </w:r>
+      <w:proofErr w:type="spellStart"/>
+      <w:r>
+        <w:rPr>
+          <w:rStyle w:val="Heading2Char"/>
+        </w:rPr>
+        <w:t>ChromaDB</w:t>
+      </w:r>
+      <w:proofErr w:type="spellEnd"/>
     </w:p>
     <w:p>
       <w:r>
-        <w:t>Install ChromaDB and configure a persistent local collection. Each ATT&amp;CK object gets exactly one entry — the "1 object = 1 chunk" rule. No text splitting.</w:t>
+        <w:t xml:space="preserve">Install </w:t>
+      </w:r>
+      <w:proofErr w:type="spellStart"/>
+      <w:r>
+        <w:t>ChromaDB</w:t>
+      </w:r>
+      <w:proofErr w:type="spellEnd"/>
+      <w:r>
+        <w:t xml:space="preserve"> and configure a persistent local collection. Each ATT&amp;CK object gets exactly one entry — the "1 object = 1 chunk" rule. No text splitting.</w:t>
       </w:r>
     </w:p>
     <w:p>
@@ -1278,35 +1697,74 @@
           </w:tcPr>
           <w:p>
             <w:r>
-              <w:t>import chromadb</w:t>
-            </w:r>
-          </w:p>
-          <w:p>
-            <w:r>
-              <w:t>from chromadb.config import Settings</w:t>
-            </w:r>
-          </w:p>
-          <w:p>
-            <w:r>
-              <w:t>from sentence_transformers import SentenceTransformer</w:t>
-            </w:r>
+              <w:t xml:space="preserve">import </w:t>
+            </w:r>
+            <w:proofErr w:type="spellStart"/>
+            <w:r>
+              <w:t>chromadb</w:t>
+            </w:r>
+            <w:proofErr w:type="spellEnd"/>
           </w:p>
           <w:p>
             <w:r>
               <w:t xml:space="preserve">from </w:t>
             </w:r>
+            <w:proofErr w:type="spellStart"/>
+            <w:r>
+              <w:t>chromadb.config</w:t>
+            </w:r>
+            <w:proofErr w:type="spellEnd"/>
+            <w:r>
+              <w:t xml:space="preserve"> import Settings</w:t>
+            </w:r>
+          </w:p>
+          <w:p>
+            <w:r>
+              <w:t xml:space="preserve">from </w:t>
+            </w:r>
+            <w:proofErr w:type="spellStart"/>
+            <w:r>
+              <w:t>sentence_transformers</w:t>
+            </w:r>
+            <w:proofErr w:type="spellEnd"/>
+            <w:r>
+              <w:t xml:space="preserve"> import </w:t>
+            </w:r>
+            <w:proofErr w:type="spellStart"/>
+            <w:r>
+              <w:t>SentenceTransformer</w:t>
+            </w:r>
+            <w:proofErr w:type="spellEnd"/>
+          </w:p>
+          <w:p>
+            <w:r>
+              <w:t xml:space="preserve">from </w:t>
+            </w:r>
             <w:proofErr w:type="gramStart"/>
             <w:r>
               <w:t>mitreattack.stix</w:t>
             </w:r>
             <w:proofErr w:type="gramEnd"/>
             <w:r>
-              <w:t>20 import MitreAttackData</w:t>
-            </w:r>
-          </w:p>
-          <w:p>
-            <w:r>
-              <w:t>import json, re</w:t>
+              <w:t xml:space="preserve">20 import </w:t>
+            </w:r>
+            <w:proofErr w:type="spellStart"/>
+            <w:r>
+              <w:t>MitreAttackData</w:t>
+            </w:r>
+            <w:proofErr w:type="spellEnd"/>
+          </w:p>
+          <w:p>
+            <w:r>
+              <w:t xml:space="preserve">import </w:t>
+            </w:r>
+            <w:proofErr w:type="spellStart"/>
+            <w:r>
+              <w:t>json</w:t>
+            </w:r>
+            <w:proofErr w:type="spellEnd"/>
+            <w:r>
+              <w:t>, re</w:t>
             </w:r>
           </w:p>
           <w:p/>
@@ -1317,12 +1775,22 @@
             </w:r>
             <w:proofErr w:type="gramEnd"/>
             <w:r>
-              <w:t xml:space="preserve"> MitreAttackData("enterprise-</w:t>
-            </w:r>
+              <w:t xml:space="preserve"> </w:t>
+            </w:r>
+            <w:proofErr w:type="spellStart"/>
+            <w:r>
+              <w:t>MitreAttackData</w:t>
+            </w:r>
+            <w:proofErr w:type="spellEnd"/>
+            <w:r>
+              <w:t>("enterprise-</w:t>
+            </w:r>
+            <w:proofErr w:type="spellStart"/>
             <w:proofErr w:type="gramStart"/>
             <w:r>
               <w:t>attack.json</w:t>
             </w:r>
+            <w:proofErr w:type="spellEnd"/>
             <w:proofErr w:type="gramEnd"/>
             <w:r>
               <w:t>")</w:t>
@@ -1330,7 +1798,15 @@
           </w:p>
           <w:p>
             <w:r>
-              <w:t>embedder = SentenceTransformer("sentence-transformers/all-MiniLM-L6-v2")</w:t>
+              <w:t xml:space="preserve">embedder = </w:t>
+            </w:r>
+            <w:proofErr w:type="spellStart"/>
+            <w:r>
+              <w:t>SentenceTransformer</w:t>
+            </w:r>
+            <w:proofErr w:type="spellEnd"/>
+            <w:r>
+              <w:t>("sentence-transformers/all-MiniLM-L6-v2")</w:t>
             </w:r>
           </w:p>
           <w:p/>
@@ -1338,10 +1814,12 @@
             <w:r>
               <w:t xml:space="preserve">client = </w:t>
             </w:r>
+            <w:proofErr w:type="spellStart"/>
             <w:proofErr w:type="gramStart"/>
             <w:r>
               <w:t>chromadb.PersistentClient</w:t>
             </w:r>
+            <w:proofErr w:type="spellEnd"/>
             <w:proofErr w:type="gramEnd"/>
             <w:r>
               <w:t>(</w:t>
@@ -1360,22 +1838,43 @@
             <w:r>
               <w:t>"./</w:t>
             </w:r>
-            <w:proofErr w:type="gramEnd"/>
-            <w:r>
-              <w:t>chroma_attackdb")</w:t>
-            </w:r>
-          </w:p>
-          <w:p>
-            <w:r>
-              <w:t>col    = client.get_or_create_</w:t>
-            </w:r>
-            <w:proofErr w:type="gramStart"/>
-            <w:r>
-              <w:t>collection(</w:t>
-            </w:r>
-            <w:proofErr w:type="gramEnd"/>
-            <w:r>
-              <w:t>"attck_objects",</w:t>
+            <w:proofErr w:type="spellStart"/>
+            <w:proofErr w:type="gramEnd"/>
+            <w:r>
+              <w:t>chroma_attackdb</w:t>
+            </w:r>
+            <w:proofErr w:type="spellEnd"/>
+            <w:r>
+              <w:t>")</w:t>
+            </w:r>
+          </w:p>
+          <w:p>
+            <w:r>
+              <w:t xml:space="preserve">col    = </w:t>
+            </w:r>
+            <w:proofErr w:type="spellStart"/>
+            <w:r>
+              <w:t>client.get_or_create_</w:t>
+            </w:r>
+            <w:proofErr w:type="gramStart"/>
+            <w:r>
+              <w:t>collection</w:t>
+            </w:r>
+            <w:proofErr w:type="spellEnd"/>
+            <w:r>
+              <w:t>(</w:t>
+            </w:r>
+            <w:proofErr w:type="gramEnd"/>
+            <w:r>
+              <w:t>"</w:t>
+            </w:r>
+            <w:proofErr w:type="spellStart"/>
+            <w:r>
+              <w:t>attck_objects</w:t>
+            </w:r>
+            <w:proofErr w:type="spellEnd"/>
+            <w:r>
+              <w:t>",</w:t>
             </w:r>
           </w:p>
           <w:p>
@@ -1397,10 +1896,12 @@
             <w:r>
               <w:t>"</w:t>
             </w:r>
+            <w:proofErr w:type="spellStart"/>
             <w:proofErr w:type="gramStart"/>
             <w:r>
               <w:t>hnsw:space</w:t>
             </w:r>
+            <w:proofErr w:type="spellEnd"/>
             <w:proofErr w:type="gramEnd"/>
             <w:r>
               <w:t>": "cosine"})</w:t>
@@ -1409,8 +1910,17 @@
           <w:p/>
           <w:p>
             <w:r>
-              <w:t>def safe_text(</w:t>
-            </w:r>
+              <w:t xml:space="preserve">def </w:t>
+            </w:r>
+            <w:proofErr w:type="spellStart"/>
+            <w:r>
+              <w:t>safe_text</w:t>
+            </w:r>
+            <w:proofErr w:type="spellEnd"/>
+            <w:r>
+              <w:t>(</w:t>
+            </w:r>
+            <w:proofErr w:type="spellStart"/>
             <w:r>
               <w:rPr>
                 <w:i/>
@@ -1418,6 +1928,7 @@
               </w:rPr>
               <w:t>val</w:t>
             </w:r>
+            <w:proofErr w:type="spellEnd"/>
             <w:r>
               <w:t>):</w:t>
             </w:r>
@@ -1426,6 +1937,7 @@
             <w:r>
               <w:t xml:space="preserve">    return </w:t>
             </w:r>
+            <w:proofErr w:type="spellStart"/>
             <w:r>
               <w:rPr>
                 <w:i/>
@@ -1433,13 +1945,20 @@
               </w:rPr>
               <w:t>val</w:t>
             </w:r>
+            <w:proofErr w:type="spellEnd"/>
             <w:r>
               <w:t xml:space="preserve"> if </w:t>
             </w:r>
-            <w:proofErr w:type="gramStart"/>
-            <w:r>
-              <w:t>isinstance(</w:t>
-            </w:r>
+            <w:proofErr w:type="spellStart"/>
+            <w:proofErr w:type="gramStart"/>
+            <w:r>
+              <w:t>isinstance</w:t>
+            </w:r>
+            <w:proofErr w:type="spellEnd"/>
+            <w:r>
+              <w:t>(</w:t>
+            </w:r>
+            <w:proofErr w:type="spellStart"/>
             <w:proofErr w:type="gramEnd"/>
             <w:r>
               <w:rPr>
@@ -1448,6 +1967,7 @@
               </w:rPr>
               <w:t>val</w:t>
             </w:r>
+            <w:proofErr w:type="spellEnd"/>
             <w:r>
               <w:t>, str) else ""</w:t>
             </w:r>
@@ -1455,8 +1975,17 @@
           <w:p/>
           <w:p>
             <w:r>
-              <w:t>def get_ext_id(</w:t>
-            </w:r>
+              <w:t xml:space="preserve">def </w:t>
+            </w:r>
+            <w:proofErr w:type="spellStart"/>
+            <w:r>
+              <w:t>get_ext_id</w:t>
+            </w:r>
+            <w:proofErr w:type="spellEnd"/>
+            <w:r>
+              <w:t>(</w:t>
+            </w:r>
+            <w:proofErr w:type="spellStart"/>
             <w:r>
               <w:rPr>
                 <w:i/>
@@ -1464,6 +1993,7 @@
               </w:rPr>
               <w:t>obj</w:t>
             </w:r>
+            <w:proofErr w:type="spellEnd"/>
             <w:r>
               <w:t>):</w:t>
             </w:r>
@@ -1472,6 +2002,7 @@
             <w:r>
               <w:t xml:space="preserve">    try: return </w:t>
             </w:r>
+            <w:proofErr w:type="spellStart"/>
             <w:proofErr w:type="gramStart"/>
             <w:r>
               <w:rPr>
@@ -1489,7 +2020,11 @@
             </w:r>
             <w:proofErr w:type="gramStart"/>
             <w:r>
-              <w:t>references[</w:t>
+              <w:t>references</w:t>
+            </w:r>
+            <w:proofErr w:type="spellEnd"/>
+            <w:r>
+              <w:t>[</w:t>
             </w:r>
             <w:proofErr w:type="gramEnd"/>
             <w:r>
@@ -1497,12 +2032,17 @@
             </w:r>
             <w:proofErr w:type="gramStart"/>
             <w:r>
-              <w:t>].external</w:t>
+              <w:t>].</w:t>
+            </w:r>
+            <w:proofErr w:type="spellStart"/>
+            <w:r>
+              <w:t>external</w:t>
             </w:r>
             <w:proofErr w:type="gramEnd"/>
             <w:r>
               <w:t>_id</w:t>
             </w:r>
+            <w:proofErr w:type="spellEnd"/>
           </w:p>
           <w:p>
             <w:r>
@@ -1522,11 +2062,19 @@
           <w:p/>
           <w:p>
             <w:r>
-              <w:t>def ingest_</w:t>
-            </w:r>
-            <w:proofErr w:type="gramStart"/>
-            <w:r>
-              <w:t>techniques(</w:t>
+              <w:t xml:space="preserve">def </w:t>
+            </w:r>
+            <w:proofErr w:type="spellStart"/>
+            <w:r>
+              <w:t>ingest_</w:t>
+            </w:r>
+            <w:proofErr w:type="gramStart"/>
+            <w:r>
+              <w:t>techniques</w:t>
+            </w:r>
+            <w:proofErr w:type="spellEnd"/>
+            <w:r>
+              <w:t>(</w:t>
             </w:r>
             <w:proofErr w:type="gramEnd"/>
             <w:r>
@@ -1535,13 +2083,30 @@
           </w:p>
           <w:p>
             <w:r>
-              <w:t>    docs, metas, ids = [], [], []</w:t>
-            </w:r>
-          </w:p>
-          <w:p>
-            <w:r>
-              <w:t>    for t in attack.get_techniques(</w:t>
-            </w:r>
+              <w:t xml:space="preserve">    docs, </w:t>
+            </w:r>
+            <w:proofErr w:type="spellStart"/>
+            <w:r>
+              <w:t>metas</w:t>
+            </w:r>
+            <w:proofErr w:type="spellEnd"/>
+            <w:r>
+              <w:t>, ids = [], [], []</w:t>
+            </w:r>
+          </w:p>
+          <w:p>
+            <w:r>
+              <w:t xml:space="preserve">    for t in </w:t>
+            </w:r>
+            <w:proofErr w:type="spellStart"/>
+            <w:r>
+              <w:t>attack.get_techniques</w:t>
+            </w:r>
+            <w:proofErr w:type="spellEnd"/>
+            <w:r>
+              <w:t>(</w:t>
+            </w:r>
+            <w:proofErr w:type="spellStart"/>
             <w:r>
               <w:rPr>
                 <w:i/>
@@ -1549,34 +2114,61 @@
               </w:rPr>
               <w:t>remove_revoked_deprecated</w:t>
             </w:r>
+            <w:proofErr w:type="spellEnd"/>
             <w:r>
               <w:t>=True):</w:t>
             </w:r>
           </w:p>
           <w:p>
             <w:r>
-              <w:t>        tid = get_ext_id(t)</w:t>
+              <w:t xml:space="preserve">        </w:t>
+            </w:r>
+            <w:proofErr w:type="spellStart"/>
+            <w:r>
+              <w:t>tid</w:t>
+            </w:r>
+            <w:proofErr w:type="spellEnd"/>
+            <w:r>
+              <w:t xml:space="preserve"> = </w:t>
+            </w:r>
+            <w:proofErr w:type="spellStart"/>
+            <w:r>
+              <w:t>get_ext_id</w:t>
+            </w:r>
+            <w:proofErr w:type="spellEnd"/>
+            <w:r>
+              <w:t>(t)</w:t>
             </w:r>
           </w:p>
           <w:p>
             <w:r>
               <w:t>        tactics   = [</w:t>
             </w:r>
+            <w:proofErr w:type="spellStart"/>
             <w:proofErr w:type="gramStart"/>
             <w:r>
               <w:t>p.phase</w:t>
             </w:r>
             <w:proofErr w:type="gramEnd"/>
             <w:r>
-              <w:t>_name for p in (</w:t>
-            </w:r>
+              <w:t>_name</w:t>
+            </w:r>
+            <w:proofErr w:type="spellEnd"/>
+            <w:r>
+              <w:t xml:space="preserve"> for p in (</w:t>
+            </w:r>
+            <w:proofErr w:type="spellStart"/>
             <w:proofErr w:type="gramStart"/>
             <w:r>
               <w:t>t.kill</w:t>
             </w:r>
             <w:proofErr w:type="gramEnd"/>
             <w:r>
-              <w:t>_chain_phases or [])]</w:t>
+              <w:t>_chain_phases</w:t>
+            </w:r>
+            <w:proofErr w:type="spellEnd"/>
+            <w:r>
+              <w:t xml:space="preserve"> or [])]</w:t>
             </w:r>
           </w:p>
           <w:p>
@@ -1587,15 +2179,33 @@
             <w:r>
               <w:t>list(</w:t>
             </w:r>
-            <w:proofErr w:type="gramEnd"/>
-            <w:r>
-              <w:t>t.x_mitre_platforms or [])</w:t>
-            </w:r>
-          </w:p>
-          <w:p>
-            <w:r>
-              <w:t>        text = (f"Technique: {t.name} ({tid</w:t>
-            </w:r>
+            <w:proofErr w:type="spellStart"/>
+            <w:proofErr w:type="gramEnd"/>
+            <w:r>
+              <w:t>t.x_mitre_platforms</w:t>
+            </w:r>
+            <w:proofErr w:type="spellEnd"/>
+            <w:r>
+              <w:t xml:space="preserve"> or [])</w:t>
+            </w:r>
+          </w:p>
+          <w:p>
+            <w:r>
+              <w:t>        text = (</w:t>
+            </w:r>
+            <w:proofErr w:type="spellStart"/>
+            <w:r>
+              <w:t>f"Technique</w:t>
+            </w:r>
+            <w:proofErr w:type="spellEnd"/>
+            <w:r>
+              <w:t>: {t.name} ({</w:t>
+            </w:r>
+            <w:proofErr w:type="spellStart"/>
+            <w:r>
+              <w:t>tid</w:t>
+            </w:r>
+            <w:proofErr w:type="spellEnd"/>
             <w:proofErr w:type="gramStart"/>
             <w:r>
               <w:t>})\</w:t>
@@ -1607,7 +2217,15 @@
           </w:p>
           <w:p>
             <w:r>
-              <w:t xml:space="preserve">                f"Tactics: {', </w:t>
+              <w:t xml:space="preserve">                </w:t>
+            </w:r>
+            <w:proofErr w:type="spellStart"/>
+            <w:r>
+              <w:t>f"Tactics</w:t>
+            </w:r>
+            <w:proofErr w:type="spellEnd"/>
+            <w:r>
+              <w:t xml:space="preserve">: {', </w:t>
             </w:r>
             <w:proofErr w:type="gramStart"/>
             <w:r>
@@ -1628,7 +2246,15 @@
           </w:p>
           <w:p>
             <w:r>
-              <w:t xml:space="preserve">                f"Platforms: {', </w:t>
+              <w:t xml:space="preserve">                </w:t>
+            </w:r>
+            <w:proofErr w:type="spellStart"/>
+            <w:r>
+              <w:t>f"Platforms</w:t>
+            </w:r>
+            <w:proofErr w:type="spellEnd"/>
+            <w:r>
+              <w:t xml:space="preserve">: {', </w:t>
             </w:r>
             <w:proofErr w:type="gramStart"/>
             <w:r>
@@ -1649,11 +2275,32 @@
           </w:p>
           <w:p>
             <w:r>
-              <w:t>                f"Description: {safe_text(</w:t>
-            </w:r>
-            <w:proofErr w:type="gramStart"/>
-            <w:r>
-              <w:t>t.description)[</w:t>
+              <w:t xml:space="preserve">                </w:t>
+            </w:r>
+            <w:proofErr w:type="spellStart"/>
+            <w:r>
+              <w:t>f"Description</w:t>
+            </w:r>
+            <w:proofErr w:type="spellEnd"/>
+            <w:r>
+              <w:t>: {</w:t>
+            </w:r>
+            <w:proofErr w:type="spellStart"/>
+            <w:r>
+              <w:t>safe_text</w:t>
+            </w:r>
+            <w:proofErr w:type="spellEnd"/>
+            <w:r>
+              <w:t>(</w:t>
+            </w:r>
+            <w:proofErr w:type="spellStart"/>
+            <w:proofErr w:type="gramStart"/>
+            <w:r>
+              <w:t>t.description</w:t>
+            </w:r>
+            <w:proofErr w:type="spellEnd"/>
+            <w:r>
+              <w:t>)[</w:t>
             </w:r>
             <w:proofErr w:type="gramEnd"/>
             <w:r>
@@ -1670,7 +2317,39 @@
           </w:p>
           <w:p>
             <w:r>
-              <w:t>                f"Detection: {safe_text(getattr(t,'x_mitre_detection',''</w:t>
+              <w:t xml:space="preserve">                </w:t>
+            </w:r>
+            <w:proofErr w:type="spellStart"/>
+            <w:r>
+              <w:t>f"Detection</w:t>
+            </w:r>
+            <w:proofErr w:type="spellEnd"/>
+            <w:r>
+              <w:t>: {</w:t>
+            </w:r>
+            <w:proofErr w:type="spellStart"/>
+            <w:r>
+              <w:t>safe_text</w:t>
+            </w:r>
+            <w:proofErr w:type="spellEnd"/>
+            <w:r>
+              <w:t>(</w:t>
+            </w:r>
+            <w:proofErr w:type="spellStart"/>
+            <w:r>
+              <w:t>getattr</w:t>
+            </w:r>
+            <w:proofErr w:type="spellEnd"/>
+            <w:r>
+              <w:t>(t,'</w:t>
+            </w:r>
+            <w:proofErr w:type="spellStart"/>
+            <w:r>
+              <w:t>x_mitre_detection</w:t>
+            </w:r>
+            <w:proofErr w:type="spellEnd"/>
+            <w:r>
+              <w:t>',''</w:t>
             </w:r>
             <w:proofErr w:type="gramStart"/>
             <w:r>
@@ -1685,31 +2364,51 @@
             <w:r>
               <w:t xml:space="preserve">        </w:t>
             </w:r>
+            <w:proofErr w:type="spellStart"/>
             <w:proofErr w:type="gramStart"/>
             <w:r>
               <w:t>docs.append</w:t>
             </w:r>
+            <w:proofErr w:type="spellEnd"/>
             <w:proofErr w:type="gramEnd"/>
             <w:r>
               <w:t>(text</w:t>
             </w:r>
             <w:proofErr w:type="gramStart"/>
             <w:r>
-              <w:t>);  ids</w:t>
-            </w:r>
-            <w:proofErr w:type="gramEnd"/>
-            <w:r>
-              <w:t>.append(tid)</w:t>
+              <w:t>);  </w:t>
+            </w:r>
+            <w:proofErr w:type="spellStart"/>
+            <w:r>
+              <w:t>ids</w:t>
+            </w:r>
+            <w:proofErr w:type="gramEnd"/>
+            <w:r>
+              <w:t>.append</w:t>
+            </w:r>
+            <w:proofErr w:type="spellEnd"/>
+            <w:r>
+              <w:t>(</w:t>
+            </w:r>
+            <w:proofErr w:type="spellStart"/>
+            <w:r>
+              <w:t>tid</w:t>
+            </w:r>
+            <w:proofErr w:type="spellEnd"/>
+            <w:r>
+              <w:t>)</w:t>
             </w:r>
           </w:p>
           <w:p>
             <w:r>
               <w:t xml:space="preserve">        </w:t>
             </w:r>
+            <w:proofErr w:type="spellStart"/>
             <w:proofErr w:type="gramStart"/>
             <w:r>
               <w:t>metas.append</w:t>
             </w:r>
+            <w:proofErr w:type="spellEnd"/>
             <w:proofErr w:type="gramEnd"/>
             <w:r>
               <w:t>({</w:t>
@@ -1719,26 +2418,44 @@
             <w:r>
               <w:t>            "</w:t>
             </w:r>
+            <w:proofErr w:type="spellStart"/>
             <w:proofErr w:type="gramStart"/>
             <w:r>
               <w:t>object</w:t>
             </w:r>
             <w:proofErr w:type="gramEnd"/>
             <w:r>
-              <w:t>_type": "technique",</w:t>
+              <w:t>_type</w:t>
+            </w:r>
+            <w:proofErr w:type="spellEnd"/>
+            <w:r>
+              <w:t>": "technique",</w:t>
             </w:r>
           </w:p>
           <w:p>
             <w:r>
               <w:t>            "</w:t>
             </w:r>
+            <w:proofErr w:type="spellStart"/>
             <w:proofErr w:type="gramStart"/>
             <w:r>
               <w:t>technique</w:t>
             </w:r>
             <w:proofErr w:type="gramEnd"/>
             <w:r>
-              <w:t>_id": tid,</w:t>
+              <w:t>_id</w:t>
+            </w:r>
+            <w:proofErr w:type="spellEnd"/>
+            <w:r>
+              <w:t xml:space="preserve">": </w:t>
+            </w:r>
+            <w:proofErr w:type="spellStart"/>
+            <w:r>
+              <w:t>tid</w:t>
+            </w:r>
+            <w:proofErr w:type="spellEnd"/>
+            <w:r>
+              <w:t>,</w:t>
             </w:r>
           </w:p>
           <w:p>
@@ -1763,18 +2480,25 @@
             <w:r>
               <w:t>            "</w:t>
             </w:r>
+            <w:proofErr w:type="spellStart"/>
             <w:proofErr w:type="gramStart"/>
             <w:r>
               <w:t>tactics</w:t>
             </w:r>
             <w:proofErr w:type="gramEnd"/>
             <w:r>
-              <w:t xml:space="preserve">_all": </w:t>
-            </w:r>
+              <w:t>_all</w:t>
+            </w:r>
+            <w:proofErr w:type="spellEnd"/>
+            <w:r>
+              <w:t xml:space="preserve">": </w:t>
+            </w:r>
+            <w:proofErr w:type="spellStart"/>
             <w:proofErr w:type="gramStart"/>
             <w:r>
               <w:t>json.dumps</w:t>
             </w:r>
+            <w:proofErr w:type="spellEnd"/>
             <w:proofErr w:type="gramEnd"/>
             <w:r>
               <w:t>(tactics),</w:t>
@@ -1797,18 +2521,25 @@
             <w:r>
               <w:t>            "</w:t>
             </w:r>
+            <w:proofErr w:type="spellStart"/>
             <w:proofErr w:type="gramStart"/>
             <w:r>
               <w:t>platforms</w:t>
             </w:r>
             <w:proofErr w:type="gramEnd"/>
             <w:r>
-              <w:t xml:space="preserve">_all": </w:t>
-            </w:r>
+              <w:t>_all</w:t>
+            </w:r>
+            <w:proofErr w:type="spellEnd"/>
+            <w:r>
+              <w:t xml:space="preserve">": </w:t>
+            </w:r>
+            <w:proofErr w:type="spellStart"/>
             <w:proofErr w:type="gramStart"/>
             <w:r>
               <w:t>json.dumps</w:t>
             </w:r>
+            <w:proofErr w:type="spellEnd"/>
             <w:proofErr w:type="gramEnd"/>
             <w:r>
               <w:t>(platforms),</w:t>
@@ -1821,15 +2552,31 @@
           </w:p>
           <w:p>
             <w:r>
-              <w:t>    _batch_</w:t>
-            </w:r>
-            <w:proofErr w:type="gramStart"/>
-            <w:r>
-              <w:t>upsert(</w:t>
-            </w:r>
-            <w:proofErr w:type="gramEnd"/>
-            <w:r>
-              <w:t>docs, metas, ids)</w:t>
+              <w:t>    _</w:t>
+            </w:r>
+            <w:proofErr w:type="spellStart"/>
+            <w:r>
+              <w:t>batch_</w:t>
+            </w:r>
+            <w:proofErr w:type="gramStart"/>
+            <w:r>
+              <w:t>upsert</w:t>
+            </w:r>
+            <w:proofErr w:type="spellEnd"/>
+            <w:r>
+              <w:t>(</w:t>
+            </w:r>
+            <w:proofErr w:type="gramEnd"/>
+            <w:r>
+              <w:t xml:space="preserve">docs, </w:t>
+            </w:r>
+            <w:proofErr w:type="spellStart"/>
+            <w:r>
+              <w:t>metas</w:t>
+            </w:r>
+            <w:proofErr w:type="spellEnd"/>
+            <w:r>
+              <w:t>, ids)</w:t>
             </w:r>
           </w:p>
           <w:p>
@@ -1841,19 +2588,40 @@
             <w:r>
               <w:t>print(</w:t>
             </w:r>
-            <w:proofErr w:type="gramEnd"/>
-            <w:r>
-              <w:t>f"Ingested {len(docs)} techniques")</w:t>
+            <w:proofErr w:type="spellStart"/>
+            <w:proofErr w:type="gramEnd"/>
+            <w:r>
+              <w:t>f"Ingested</w:t>
+            </w:r>
+            <w:proofErr w:type="spellEnd"/>
+            <w:r>
+              <w:t xml:space="preserve"> {</w:t>
+            </w:r>
+            <w:proofErr w:type="spellStart"/>
+            <w:r>
+              <w:t>len</w:t>
+            </w:r>
+            <w:proofErr w:type="spellEnd"/>
+            <w:r>
+              <w:t>(docs)} techniques")</w:t>
             </w:r>
           </w:p>
           <w:p/>
           <w:p>
             <w:r>
-              <w:t>def ingest_</w:t>
-            </w:r>
-            <w:proofErr w:type="gramStart"/>
-            <w:r>
-              <w:t>groups(</w:t>
+              <w:t xml:space="preserve">def </w:t>
+            </w:r>
+            <w:proofErr w:type="spellStart"/>
+            <w:r>
+              <w:t>ingest_</w:t>
+            </w:r>
+            <w:proofErr w:type="gramStart"/>
+            <w:r>
+              <w:t>groups</w:t>
+            </w:r>
+            <w:proofErr w:type="spellEnd"/>
+            <w:r>
+              <w:t>(</w:t>
             </w:r>
             <w:proofErr w:type="gramEnd"/>
             <w:r>
@@ -1862,13 +2630,30 @@
           </w:p>
           <w:p>
             <w:r>
-              <w:t>    docs, metas, ids = [], [], []</w:t>
-            </w:r>
-          </w:p>
-          <w:p>
-            <w:r>
-              <w:t>    for g in attack.get_groups(</w:t>
-            </w:r>
+              <w:t xml:space="preserve">    docs, </w:t>
+            </w:r>
+            <w:proofErr w:type="spellStart"/>
+            <w:r>
+              <w:t>metas</w:t>
+            </w:r>
+            <w:proofErr w:type="spellEnd"/>
+            <w:r>
+              <w:t>, ids = [], [], []</w:t>
+            </w:r>
+          </w:p>
+          <w:p>
+            <w:r>
+              <w:t xml:space="preserve">    for g in </w:t>
+            </w:r>
+            <w:proofErr w:type="spellStart"/>
+            <w:r>
+              <w:t>attack.get_groups</w:t>
+            </w:r>
+            <w:proofErr w:type="spellEnd"/>
+            <w:r>
+              <w:t>(</w:t>
+            </w:r>
+            <w:proofErr w:type="spellStart"/>
             <w:r>
               <w:rPr>
                 <w:i/>
@@ -1876,13 +2661,22 @@
               </w:rPr>
               <w:t>remove_revoked_deprecated</w:t>
             </w:r>
+            <w:proofErr w:type="spellEnd"/>
             <w:r>
               <w:t>=True):</w:t>
             </w:r>
           </w:p>
           <w:p>
             <w:r>
-              <w:t>        gid = get_ext_id(g)</w:t>
+              <w:t xml:space="preserve">        gid = </w:t>
+            </w:r>
+            <w:proofErr w:type="spellStart"/>
+            <w:r>
+              <w:t>get_ext_id</w:t>
+            </w:r>
+            <w:proofErr w:type="spellEnd"/>
+            <w:r>
+              <w:t>(g)</w:t>
             </w:r>
           </w:p>
           <w:p>
@@ -1891,8 +2685,13 @@
             </w:r>
             <w:proofErr w:type="gramStart"/>
             <w:r>
-              <w:t>list(g.aliases</w:t>
-            </w:r>
+              <w:t>list(</w:t>
+            </w:r>
+            <w:proofErr w:type="spellStart"/>
+            <w:r>
+              <w:t>g.aliases</w:t>
+            </w:r>
+            <w:proofErr w:type="spellEnd"/>
             <w:proofErr w:type="gramEnd"/>
             <w:r>
               <w:t xml:space="preserve"> or [])</w:t>
@@ -1900,12 +2699,28 @@
           </w:p>
           <w:p>
             <w:r>
-              <w:t>        used    = [t["object"].name for t in attack.get_techniques_used_by_group(g.id)]</w:t>
-            </w:r>
-          </w:p>
-          <w:p>
-            <w:r>
-              <w:t>        text = (f"Group: {g.name} ({gid</w:t>
+              <w:t xml:space="preserve">        used    = [t["object"].name for t in </w:t>
+            </w:r>
+            <w:proofErr w:type="spellStart"/>
+            <w:r>
+              <w:t>attack.get_techniques_used_by_group</w:t>
+            </w:r>
+            <w:proofErr w:type="spellEnd"/>
+            <w:r>
+              <w:t>(g.id)]</w:t>
+            </w:r>
+          </w:p>
+          <w:p>
+            <w:r>
+              <w:t>        text = (</w:t>
+            </w:r>
+            <w:proofErr w:type="spellStart"/>
+            <w:r>
+              <w:t>f"Group</w:t>
+            </w:r>
+            <w:proofErr w:type="spellEnd"/>
+            <w:r>
+              <w:t>: {g.name} ({gid</w:t>
             </w:r>
             <w:proofErr w:type="gramStart"/>
             <w:r>
@@ -1918,7 +2733,15 @@
           </w:p>
           <w:p>
             <w:r>
-              <w:t xml:space="preserve">                f"Aliases: {', </w:t>
+              <w:t xml:space="preserve">                </w:t>
+            </w:r>
+            <w:proofErr w:type="spellStart"/>
+            <w:r>
+              <w:t>f"Aliases</w:t>
+            </w:r>
+            <w:proofErr w:type="spellEnd"/>
+            <w:r>
+              <w:t xml:space="preserve">: {', </w:t>
             </w:r>
             <w:proofErr w:type="gramStart"/>
             <w:r>
@@ -1939,11 +2762,32 @@
           </w:p>
           <w:p>
             <w:r>
-              <w:t>                f"Description: {safe_text(</w:t>
-            </w:r>
-            <w:proofErr w:type="gramStart"/>
-            <w:r>
-              <w:t>g.description)[</w:t>
+              <w:t xml:space="preserve">                </w:t>
+            </w:r>
+            <w:proofErr w:type="spellStart"/>
+            <w:r>
+              <w:t>f"Description</w:t>
+            </w:r>
+            <w:proofErr w:type="spellEnd"/>
+            <w:r>
+              <w:t>: {</w:t>
+            </w:r>
+            <w:proofErr w:type="spellStart"/>
+            <w:r>
+              <w:t>safe_text</w:t>
+            </w:r>
+            <w:proofErr w:type="spellEnd"/>
+            <w:r>
+              <w:t>(</w:t>
+            </w:r>
+            <w:proofErr w:type="spellStart"/>
+            <w:proofErr w:type="gramStart"/>
+            <w:r>
+              <w:t>g.description</w:t>
+            </w:r>
+            <w:proofErr w:type="spellEnd"/>
+            <w:r>
+              <w:t>)[</w:t>
             </w:r>
             <w:proofErr w:type="gramEnd"/>
             <w:r>
@@ -1960,7 +2804,15 @@
           </w:p>
           <w:p>
             <w:r>
-              <w:t xml:space="preserve">                f"Associated techniques: {', </w:t>
+              <w:t xml:space="preserve">                </w:t>
+            </w:r>
+            <w:proofErr w:type="spellStart"/>
+            <w:r>
+              <w:t>f"Associated</w:t>
+            </w:r>
+            <w:proofErr w:type="spellEnd"/>
+            <w:r>
+              <w:t xml:space="preserve"> techniques: {', </w:t>
             </w:r>
             <w:proofErr w:type="gramStart"/>
             <w:r>
@@ -1983,31 +2835,43 @@
             <w:r>
               <w:t xml:space="preserve">        </w:t>
             </w:r>
+            <w:proofErr w:type="spellStart"/>
             <w:proofErr w:type="gramStart"/>
             <w:r>
               <w:t>docs.append</w:t>
             </w:r>
+            <w:proofErr w:type="spellEnd"/>
             <w:proofErr w:type="gramEnd"/>
             <w:r>
               <w:t>(text</w:t>
             </w:r>
             <w:proofErr w:type="gramStart"/>
             <w:r>
-              <w:t>);  ids</w:t>
-            </w:r>
-            <w:proofErr w:type="gramEnd"/>
-            <w:r>
-              <w:t>.append(gid)</w:t>
+              <w:t>);  </w:t>
+            </w:r>
+            <w:proofErr w:type="spellStart"/>
+            <w:r>
+              <w:t>ids</w:t>
+            </w:r>
+            <w:proofErr w:type="gramEnd"/>
+            <w:r>
+              <w:t>.append</w:t>
+            </w:r>
+            <w:proofErr w:type="spellEnd"/>
+            <w:r>
+              <w:t>(gid)</w:t>
             </w:r>
           </w:p>
           <w:p>
             <w:r>
               <w:t xml:space="preserve">        </w:t>
             </w:r>
+            <w:proofErr w:type="spellStart"/>
             <w:proofErr w:type="gramStart"/>
             <w:r>
               <w:t>metas.append</w:t>
             </w:r>
+            <w:proofErr w:type="spellEnd"/>
             <w:proofErr w:type="gramEnd"/>
             <w:r>
               <w:t>({</w:t>
@@ -2017,26 +2881,36 @@
             <w:r>
               <w:t>            "</w:t>
             </w:r>
+            <w:proofErr w:type="spellStart"/>
             <w:proofErr w:type="gramStart"/>
             <w:r>
               <w:t>object</w:t>
             </w:r>
             <w:proofErr w:type="gramEnd"/>
             <w:r>
-              <w:t>_type": "group",</w:t>
+              <w:t>_type</w:t>
+            </w:r>
+            <w:proofErr w:type="spellEnd"/>
+            <w:r>
+              <w:t>": "group",</w:t>
             </w:r>
           </w:p>
           <w:p>
             <w:r>
               <w:t>            "</w:t>
             </w:r>
+            <w:proofErr w:type="spellStart"/>
             <w:proofErr w:type="gramStart"/>
             <w:r>
               <w:t>technique</w:t>
             </w:r>
             <w:proofErr w:type="gramEnd"/>
             <w:r>
-              <w:t>_id": gid,</w:t>
+              <w:t>_id</w:t>
+            </w:r>
+            <w:proofErr w:type="spellEnd"/>
+            <w:r>
+              <w:t>": gid,</w:t>
             </w:r>
           </w:p>
           <w:p>
@@ -2061,15 +2935,31 @@
           </w:p>
           <w:p>
             <w:r>
-              <w:t>    _batch_</w:t>
-            </w:r>
-            <w:proofErr w:type="gramStart"/>
-            <w:r>
-              <w:t>upsert(</w:t>
-            </w:r>
-            <w:proofErr w:type="gramEnd"/>
-            <w:r>
-              <w:t>docs, metas, ids)</w:t>
+              <w:t>    _</w:t>
+            </w:r>
+            <w:proofErr w:type="spellStart"/>
+            <w:r>
+              <w:t>batch_</w:t>
+            </w:r>
+            <w:proofErr w:type="gramStart"/>
+            <w:r>
+              <w:t>upsert</w:t>
+            </w:r>
+            <w:proofErr w:type="spellEnd"/>
+            <w:r>
+              <w:t>(</w:t>
+            </w:r>
+            <w:proofErr w:type="gramEnd"/>
+            <w:r>
+              <w:t xml:space="preserve">docs, </w:t>
+            </w:r>
+            <w:proofErr w:type="spellStart"/>
+            <w:r>
+              <w:t>metas</w:t>
+            </w:r>
+            <w:proofErr w:type="spellEnd"/>
+            <w:r>
+              <w:t>, ids)</w:t>
             </w:r>
           </w:p>
           <w:p>
@@ -2080,19 +2970,40 @@
             <w:r>
               <w:t>print(</w:t>
             </w:r>
-            <w:proofErr w:type="gramEnd"/>
-            <w:r>
-              <w:t>f"Ingested {len(docs)} groups")</w:t>
+            <w:proofErr w:type="spellStart"/>
+            <w:proofErr w:type="gramEnd"/>
+            <w:r>
+              <w:t>f"Ingested</w:t>
+            </w:r>
+            <w:proofErr w:type="spellEnd"/>
+            <w:r>
+              <w:t xml:space="preserve"> {</w:t>
+            </w:r>
+            <w:proofErr w:type="spellStart"/>
+            <w:r>
+              <w:t>len</w:t>
+            </w:r>
+            <w:proofErr w:type="spellEnd"/>
+            <w:r>
+              <w:t>(docs)} groups")</w:t>
             </w:r>
           </w:p>
           <w:p/>
           <w:p>
             <w:r>
-              <w:t>def ingest_</w:t>
-            </w:r>
-            <w:proofErr w:type="gramStart"/>
-            <w:r>
-              <w:t>mitigations(</w:t>
+              <w:t xml:space="preserve">def </w:t>
+            </w:r>
+            <w:proofErr w:type="spellStart"/>
+            <w:r>
+              <w:t>ingest_</w:t>
+            </w:r>
+            <w:proofErr w:type="gramStart"/>
+            <w:r>
+              <w:t>mitigations</w:t>
+            </w:r>
+            <w:proofErr w:type="spellEnd"/>
+            <w:r>
+              <w:t>(</w:t>
             </w:r>
             <w:proofErr w:type="gramEnd"/>
             <w:r>
@@ -2101,13 +3012,38 @@
           </w:p>
           <w:p>
             <w:r>
-              <w:t>    docs, metas, ids = [], [], []</w:t>
-            </w:r>
-          </w:p>
-          <w:p>
-            <w:r>
-              <w:t>    for m in attack.get_mitigations(</w:t>
-            </w:r>
+              <w:t xml:space="preserve">    docs, </w:t>
+            </w:r>
+            <w:proofErr w:type="spellStart"/>
+            <w:r>
+              <w:t>metas</w:t>
+            </w:r>
+            <w:proofErr w:type="spellEnd"/>
+            <w:r>
+              <w:t>, ids = [], [], []</w:t>
+            </w:r>
+          </w:p>
+          <w:p>
+            <w:r>
+              <w:t xml:space="preserve">    </w:t>
+            </w:r>
+            <w:proofErr w:type="spellStart"/>
+            <w:r>
+              <w:t>for m</w:t>
+            </w:r>
+            <w:proofErr w:type="spellEnd"/>
+            <w:r>
+              <w:t xml:space="preserve"> in </w:t>
+            </w:r>
+            <w:proofErr w:type="spellStart"/>
+            <w:r>
+              <w:t>attack.get_mitigations</w:t>
+            </w:r>
+            <w:proofErr w:type="spellEnd"/>
+            <w:r>
+              <w:t>(</w:t>
+            </w:r>
+            <w:proofErr w:type="spellStart"/>
             <w:r>
               <w:rPr>
                 <w:i/>
@@ -2115,18 +3051,35 @@
               </w:rPr>
               <w:t>remove_revoked_deprecated</w:t>
             </w:r>
+            <w:proofErr w:type="spellEnd"/>
             <w:r>
               <w:t>=True):</w:t>
             </w:r>
           </w:p>
           <w:p>
             <w:r>
-              <w:t>        mid = get_ext_id(m)</w:t>
-            </w:r>
-          </w:p>
-          <w:p>
-            <w:r>
-              <w:t>        text = (f"Mitigation: {m.name} ({mid</w:t>
+              <w:t xml:space="preserve">        mid = </w:t>
+            </w:r>
+            <w:proofErr w:type="spellStart"/>
+            <w:r>
+              <w:t>get_ext_id</w:t>
+            </w:r>
+            <w:proofErr w:type="spellEnd"/>
+            <w:r>
+              <w:t>(m)</w:t>
+            </w:r>
+          </w:p>
+          <w:p>
+            <w:r>
+              <w:t>        text = (</w:t>
+            </w:r>
+            <w:proofErr w:type="spellStart"/>
+            <w:r>
+              <w:t>f"Mitigation</w:t>
+            </w:r>
+            <w:proofErr w:type="spellEnd"/>
+            <w:r>
+              <w:t>: {m.name} ({mid</w:t>
             </w:r>
             <w:proofErr w:type="gramStart"/>
             <w:r>
@@ -2139,11 +3092,32 @@
           </w:p>
           <w:p>
             <w:r>
-              <w:t>                f"Description: {safe_text(</w:t>
-            </w:r>
-            <w:proofErr w:type="gramStart"/>
-            <w:r>
-              <w:t>m.description)[</w:t>
+              <w:t xml:space="preserve">                </w:t>
+            </w:r>
+            <w:proofErr w:type="spellStart"/>
+            <w:r>
+              <w:t>f"Description</w:t>
+            </w:r>
+            <w:proofErr w:type="spellEnd"/>
+            <w:r>
+              <w:t>: {</w:t>
+            </w:r>
+            <w:proofErr w:type="spellStart"/>
+            <w:r>
+              <w:t>safe_text</w:t>
+            </w:r>
+            <w:proofErr w:type="spellEnd"/>
+            <w:r>
+              <w:t>(</w:t>
+            </w:r>
+            <w:proofErr w:type="spellStart"/>
+            <w:proofErr w:type="gramStart"/>
+            <w:r>
+              <w:t>m.description</w:t>
+            </w:r>
+            <w:proofErr w:type="spellEnd"/>
+            <w:r>
+              <w:t>)[</w:t>
             </w:r>
             <w:proofErr w:type="gramEnd"/>
             <w:r>
@@ -2154,31 +3128,43 @@
             <w:r>
               <w:t xml:space="preserve">        </w:t>
             </w:r>
+            <w:proofErr w:type="spellStart"/>
             <w:proofErr w:type="gramStart"/>
             <w:r>
               <w:t>docs.append</w:t>
             </w:r>
+            <w:proofErr w:type="spellEnd"/>
             <w:proofErr w:type="gramEnd"/>
             <w:r>
               <w:t>(text</w:t>
             </w:r>
             <w:proofErr w:type="gramStart"/>
             <w:r>
-              <w:t>);  ids</w:t>
-            </w:r>
-            <w:proofErr w:type="gramEnd"/>
-            <w:r>
-              <w:t>.append(mid)</w:t>
+              <w:t>);  </w:t>
+            </w:r>
+            <w:proofErr w:type="spellStart"/>
+            <w:r>
+              <w:t>ids</w:t>
+            </w:r>
+            <w:proofErr w:type="gramEnd"/>
+            <w:r>
+              <w:t>.append</w:t>
+            </w:r>
+            <w:proofErr w:type="spellEnd"/>
+            <w:r>
+              <w:t>(mid)</w:t>
             </w:r>
           </w:p>
           <w:p>
             <w:r>
               <w:t xml:space="preserve">        </w:t>
             </w:r>
+            <w:proofErr w:type="spellStart"/>
             <w:proofErr w:type="gramStart"/>
             <w:r>
               <w:t>metas.append</w:t>
             </w:r>
+            <w:proofErr w:type="spellEnd"/>
             <w:proofErr w:type="gramEnd"/>
             <w:r>
               <w:t>({</w:t>
@@ -2188,26 +3174,36 @@
             <w:r>
               <w:t>            "</w:t>
             </w:r>
+            <w:proofErr w:type="spellStart"/>
             <w:proofErr w:type="gramStart"/>
             <w:r>
               <w:t>object</w:t>
             </w:r>
             <w:proofErr w:type="gramEnd"/>
             <w:r>
-              <w:t>_type": "mitigation",</w:t>
+              <w:t>_type</w:t>
+            </w:r>
+            <w:proofErr w:type="spellEnd"/>
+            <w:r>
+              <w:t>": "mitigation",</w:t>
             </w:r>
           </w:p>
           <w:p>
             <w:r>
               <w:t>            "</w:t>
             </w:r>
+            <w:proofErr w:type="spellStart"/>
             <w:proofErr w:type="gramStart"/>
             <w:r>
               <w:t>technique</w:t>
             </w:r>
             <w:proofErr w:type="gramEnd"/>
             <w:r>
-              <w:t>_id": mid,</w:t>
+              <w:t>_id</w:t>
+            </w:r>
+            <w:proofErr w:type="spellEnd"/>
+            <w:r>
+              <w:t>": mid,</w:t>
             </w:r>
           </w:p>
           <w:p>
@@ -2232,15 +3228,31 @@
           </w:p>
           <w:p>
             <w:r>
-              <w:t>    _batch_</w:t>
-            </w:r>
-            <w:proofErr w:type="gramStart"/>
-            <w:r>
-              <w:t>upsert(</w:t>
-            </w:r>
-            <w:proofErr w:type="gramEnd"/>
-            <w:r>
-              <w:t>docs, metas, ids)</w:t>
+              <w:t>    _</w:t>
+            </w:r>
+            <w:proofErr w:type="spellStart"/>
+            <w:r>
+              <w:t>batch_</w:t>
+            </w:r>
+            <w:proofErr w:type="gramStart"/>
+            <w:r>
+              <w:t>upsert</w:t>
+            </w:r>
+            <w:proofErr w:type="spellEnd"/>
+            <w:r>
+              <w:t>(</w:t>
+            </w:r>
+            <w:proofErr w:type="gramEnd"/>
+            <w:r>
+              <w:t xml:space="preserve">docs, </w:t>
+            </w:r>
+            <w:proofErr w:type="spellStart"/>
+            <w:r>
+              <w:t>metas</w:t>
+            </w:r>
+            <w:proofErr w:type="spellEnd"/>
+            <w:r>
+              <w:t>, ids)</w:t>
             </w:r>
           </w:p>
           <w:p>
@@ -2251,19 +3263,40 @@
             <w:r>
               <w:t>print(</w:t>
             </w:r>
-            <w:proofErr w:type="gramEnd"/>
-            <w:r>
-              <w:t>f"Ingested {len(docs)} mitigations")</w:t>
+            <w:proofErr w:type="spellStart"/>
+            <w:proofErr w:type="gramEnd"/>
+            <w:r>
+              <w:t>f"Ingested</w:t>
+            </w:r>
+            <w:proofErr w:type="spellEnd"/>
+            <w:r>
+              <w:t xml:space="preserve"> {</w:t>
+            </w:r>
+            <w:proofErr w:type="spellStart"/>
+            <w:r>
+              <w:t>len</w:t>
+            </w:r>
+            <w:proofErr w:type="spellEnd"/>
+            <w:r>
+              <w:t>(docs)} mitigations")</w:t>
             </w:r>
           </w:p>
           <w:p/>
           <w:p>
             <w:r>
-              <w:t>def _batch_</w:t>
-            </w:r>
-            <w:proofErr w:type="gramStart"/>
-            <w:r>
-              <w:t>upsert(</w:t>
+              <w:t>def _</w:t>
+            </w:r>
+            <w:proofErr w:type="spellStart"/>
+            <w:r>
+              <w:t>batch_</w:t>
+            </w:r>
+            <w:proofErr w:type="gramStart"/>
+            <w:r>
+              <w:t>upsert</w:t>
+            </w:r>
+            <w:proofErr w:type="spellEnd"/>
+            <w:r>
+              <w:t>(</w:t>
             </w:r>
             <w:proofErr w:type="gramEnd"/>
             <w:r>
@@ -2276,6 +3309,7 @@
             <w:r>
               <w:t xml:space="preserve">, </w:t>
             </w:r>
+            <w:proofErr w:type="spellStart"/>
             <w:r>
               <w:rPr>
                 <w:i/>
@@ -2283,6 +3317,7 @@
               </w:rPr>
               <w:t>metas</w:t>
             </w:r>
+            <w:proofErr w:type="spellEnd"/>
             <w:r>
               <w:t xml:space="preserve">, </w:t>
             </w:r>
@@ -2311,10 +3346,12 @@
             <w:r>
               <w:t xml:space="preserve">    embeddings = </w:t>
             </w:r>
+            <w:proofErr w:type="spellStart"/>
             <w:proofErr w:type="gramStart"/>
             <w:r>
               <w:t>embedder.encode</w:t>
             </w:r>
+            <w:proofErr w:type="spellEnd"/>
             <w:proofErr w:type="gramEnd"/>
             <w:r>
               <w:t>(</w:t>
@@ -2329,6 +3366,7 @@
             <w:r>
               <w:t xml:space="preserve">, </w:t>
             </w:r>
+            <w:proofErr w:type="spellStart"/>
             <w:r>
               <w:rPr>
                 <w:i/>
@@ -2336,13 +3374,19 @@
               </w:rPr>
               <w:t>show_progress_bar</w:t>
             </w:r>
+            <w:proofErr w:type="spellEnd"/>
             <w:r>
               <w:t>=True</w:t>
             </w:r>
             <w:proofErr w:type="gramStart"/>
             <w:r>
-              <w:t>).tolist</w:t>
-            </w:r>
+              <w:t>).</w:t>
+            </w:r>
+            <w:proofErr w:type="spellStart"/>
+            <w:r>
+              <w:t>tolist</w:t>
+            </w:r>
+            <w:proofErr w:type="spellEnd"/>
             <w:proofErr w:type="gramEnd"/>
             <w:r>
               <w:t>()</w:t>
@@ -2350,7 +3394,15 @@
           </w:p>
           <w:p>
             <w:r>
-              <w:t xml:space="preserve">    for i in </w:t>
+              <w:t xml:space="preserve">    for </w:t>
+            </w:r>
+            <w:proofErr w:type="spellStart"/>
+            <w:r>
+              <w:t>i</w:t>
+            </w:r>
+            <w:proofErr w:type="spellEnd"/>
+            <w:r>
+              <w:t xml:space="preserve"> in </w:t>
             </w:r>
             <w:proofErr w:type="gramStart"/>
             <w:r>
@@ -2358,7 +3410,15 @@
             </w:r>
             <w:proofErr w:type="gramEnd"/>
             <w:r>
-              <w:t>0, len(</w:t>
+              <w:t xml:space="preserve">0, </w:t>
+            </w:r>
+            <w:proofErr w:type="spellStart"/>
+            <w:r>
+              <w:t>len</w:t>
+            </w:r>
+            <w:proofErr w:type="spellEnd"/>
+            <w:r>
+              <w:t>(</w:t>
             </w:r>
             <w:r>
               <w:rPr>
@@ -2385,10 +3445,12 @@
             <w:r>
               <w:t xml:space="preserve">        </w:t>
             </w:r>
+            <w:proofErr w:type="spellStart"/>
             <w:proofErr w:type="gramStart"/>
             <w:r>
               <w:t>col.upsert</w:t>
             </w:r>
+            <w:proofErr w:type="spellEnd"/>
             <w:proofErr w:type="gramEnd"/>
             <w:r>
               <w:t>(</w:t>
@@ -2418,6 +3480,7 @@
             <w:r>
               <w:t>[</w:t>
             </w:r>
+            <w:proofErr w:type="spellStart"/>
             <w:proofErr w:type="gramStart"/>
             <w:r>
               <w:t>i:i</w:t>
@@ -2433,6 +3496,7 @@
               </w:rPr>
               <w:t>batch</w:t>
             </w:r>
+            <w:proofErr w:type="spellEnd"/>
             <w:proofErr w:type="gramStart"/>
             <w:r>
               <w:t xml:space="preserve">],   </w:t>
@@ -2465,6 +3529,7 @@
             <w:r>
               <w:t>=embeddings[</w:t>
             </w:r>
+            <w:proofErr w:type="spellStart"/>
             <w:proofErr w:type="gramStart"/>
             <w:r>
               <w:t>i:i</w:t>
@@ -2480,6 +3545,7 @@
               </w:rPr>
               <w:t>batch</w:t>
             </w:r>
+            <w:proofErr w:type="spellEnd"/>
             <w:proofErr w:type="gramStart"/>
             <w:r>
               <w:t xml:space="preserve">],   </w:t>
@@ -2502,6 +3568,7 @@
             <w:r>
               <w:t xml:space="preserve">            </w:t>
             </w:r>
+            <w:proofErr w:type="spellStart"/>
             <w:r>
               <w:rPr>
                 <w:i/>
@@ -2509,9 +3576,11 @@
               </w:rPr>
               <w:t>metadatas</w:t>
             </w:r>
+            <w:proofErr w:type="spellEnd"/>
             <w:r>
               <w:t>=</w:t>
             </w:r>
+            <w:proofErr w:type="spellStart"/>
             <w:r>
               <w:rPr>
                 <w:i/>
@@ -2519,9 +3588,11 @@
               </w:rPr>
               <w:t>metas</w:t>
             </w:r>
+            <w:proofErr w:type="spellEnd"/>
             <w:r>
               <w:t>[</w:t>
             </w:r>
+            <w:proofErr w:type="spellStart"/>
             <w:proofErr w:type="gramStart"/>
             <w:r>
               <w:t>i:i</w:t>
@@ -2537,6 +3608,7 @@
               </w:rPr>
               <w:t>batch</w:t>
             </w:r>
+            <w:proofErr w:type="spellEnd"/>
             <w:r>
               <w:t>],</w:t>
             </w:r>
@@ -2566,6 +3638,7 @@
             <w:r>
               <w:t>[</w:t>
             </w:r>
+            <w:proofErr w:type="spellStart"/>
             <w:proofErr w:type="gramStart"/>
             <w:r>
               <w:t>i:i</w:t>
@@ -2581,6 +3654,7 @@
               </w:rPr>
               <w:t>batch</w:t>
             </w:r>
+            <w:proofErr w:type="spellEnd"/>
             <w:r>
               <w:t>],</w:t>
             </w:r>
@@ -2592,12 +3666,17 @@
           </w:p>
           <w:p/>
           <w:p>
+            <w:proofErr w:type="spellStart"/>
             <w:r>
               <w:t>ingest_</w:t>
             </w:r>
             <w:proofErr w:type="gramStart"/>
             <w:r>
-              <w:t>techniques(</w:t>
+              <w:t>techniques</w:t>
+            </w:r>
+            <w:proofErr w:type="spellEnd"/>
+            <w:r>
+              <w:t>(</w:t>
             </w:r>
             <w:proofErr w:type="gramEnd"/>
             <w:r>
@@ -2605,12 +3684,17 @@
             </w:r>
           </w:p>
           <w:p>
+            <w:proofErr w:type="spellStart"/>
             <w:r>
               <w:t>ingest_</w:t>
             </w:r>
             <w:proofErr w:type="gramStart"/>
             <w:r>
-              <w:t>groups(</w:t>
+              <w:t>groups</w:t>
+            </w:r>
+            <w:proofErr w:type="spellEnd"/>
+            <w:r>
+              <w:t>(</w:t>
             </w:r>
             <w:proofErr w:type="gramEnd"/>
             <w:r>
@@ -2618,12 +3702,17 @@
             </w:r>
           </w:p>
           <w:p>
+            <w:proofErr w:type="spellStart"/>
             <w:r>
               <w:t>ingest_</w:t>
             </w:r>
             <w:proofErr w:type="gramStart"/>
             <w:r>
-              <w:t>mitigations(</w:t>
+              <w:t>mitigations</w:t>
+            </w:r>
+            <w:proofErr w:type="spellEnd"/>
+            <w:r>
+              <w:t>(</w:t>
             </w:r>
             <w:proofErr w:type="gramEnd"/>
             <w:r>
@@ -2637,7 +3726,15 @@
             </w:r>
             <w:proofErr w:type="gramEnd"/>
             <w:r>
-              <w:t>"ChromaDB fully populated.")</w:t>
+              <w:t>"</w:t>
+            </w:r>
+            <w:proofErr w:type="spellStart"/>
+            <w:r>
+              <w:t>ChromaDB</w:t>
+            </w:r>
+            <w:proofErr w:type="spellEnd"/>
+            <w:r>
+              <w:t xml:space="preserve"> fully populated.")</w:t>
             </w:r>
           </w:p>
           <w:p/>
@@ -2648,11 +3745,19 @@
           </w:p>
           <w:p>
             <w:r>
-              <w:t>def hybrid_</w:t>
-            </w:r>
-            <w:proofErr w:type="gramStart"/>
-            <w:r>
-              <w:t>retrieve(</w:t>
+              <w:t xml:space="preserve">def </w:t>
+            </w:r>
+            <w:proofErr w:type="spellStart"/>
+            <w:r>
+              <w:t>hybrid_</w:t>
+            </w:r>
+            <w:proofErr w:type="gramStart"/>
+            <w:r>
+              <w:t>retrieve</w:t>
+            </w:r>
+            <w:proofErr w:type="spellEnd"/>
+            <w:r>
+              <w:t>(</w:t>
             </w:r>
             <w:proofErr w:type="gramEnd"/>
             <w:r>
@@ -2690,6 +3795,7 @@
             <w:r>
               <w:t xml:space="preserve">: str = None, </w:t>
             </w:r>
+            <w:proofErr w:type="spellStart"/>
             <w:r>
               <w:rPr>
                 <w:i/>
@@ -2697,8 +3803,17 @@
               </w:rPr>
               <w:t>top_k</w:t>
             </w:r>
-            <w:r>
-              <w:t>: int = 5) -&gt; list[dict]:</w:t>
+            <w:proofErr w:type="spellEnd"/>
+            <w:r>
+              <w:t>: int = 5) -&gt; list[</w:t>
+            </w:r>
+            <w:proofErr w:type="spellStart"/>
+            <w:r>
+              <w:t>dict</w:t>
+            </w:r>
+            <w:proofErr w:type="spellEnd"/>
+            <w:r>
+              <w:t>]:</w:t>
             </w:r>
           </w:p>
           <w:p>
@@ -2708,12 +3823,22 @@
           </w:p>
           <w:p>
             <w:r>
-              <w:t xml:space="preserve">    q_vec = </w:t>
-            </w:r>
+              <w:t xml:space="preserve">    </w:t>
+            </w:r>
+            <w:proofErr w:type="spellStart"/>
+            <w:r>
+              <w:t>q_vec</w:t>
+            </w:r>
+            <w:proofErr w:type="spellEnd"/>
+            <w:r>
+              <w:t xml:space="preserve"> = </w:t>
+            </w:r>
+            <w:proofErr w:type="spellStart"/>
             <w:proofErr w:type="gramStart"/>
             <w:r>
               <w:t>embedder.encode</w:t>
             </w:r>
+            <w:proofErr w:type="spellEnd"/>
             <w:proofErr w:type="gramEnd"/>
             <w:r>
               <w:t>([</w:t>
@@ -2735,8 +3860,13 @@
             </w:r>
             <w:proofErr w:type="gramStart"/>
             <w:r>
-              <w:t>].tolist</w:t>
-            </w:r>
+              <w:t>].</w:t>
+            </w:r>
+            <w:proofErr w:type="spellStart"/>
+            <w:r>
+              <w:t>tolist</w:t>
+            </w:r>
+            <w:proofErr w:type="spellEnd"/>
             <w:proofErr w:type="gramEnd"/>
             <w:r>
               <w:t>()</w:t>
@@ -2799,7 +3929,15 @@
           </w:p>
           <w:p>
             <w:r>
-              <w:t xml:space="preserve">    elif </w:t>
+              <w:t xml:space="preserve">    </w:t>
+            </w:r>
+            <w:proofErr w:type="spellStart"/>
+            <w:r>
+              <w:t>elif</w:t>
+            </w:r>
+            <w:proofErr w:type="spellEnd"/>
+            <w:r>
+              <w:t xml:space="preserve"> </w:t>
             </w:r>
             <w:r>
               <w:rPr>
@@ -2829,7 +3967,15 @@
           </w:p>
           <w:p>
             <w:r>
-              <w:t xml:space="preserve">    elif </w:t>
+              <w:t xml:space="preserve">    </w:t>
+            </w:r>
+            <w:proofErr w:type="spellStart"/>
+            <w:r>
+              <w:t>elif</w:t>
+            </w:r>
+            <w:proofErr w:type="spellEnd"/>
+            <w:r>
+              <w:t xml:space="preserve"> </w:t>
             </w:r>
             <w:r>
               <w:rPr>
@@ -2862,10 +4008,12 @@
             <w:r>
               <w:t xml:space="preserve">    results = </w:t>
             </w:r>
+            <w:proofErr w:type="spellStart"/>
             <w:proofErr w:type="gramStart"/>
             <w:r>
               <w:t>col.query</w:t>
             </w:r>
+            <w:proofErr w:type="spellEnd"/>
             <w:proofErr w:type="gramEnd"/>
             <w:r>
               <w:t>(</w:t>
@@ -2875,6 +4023,7 @@
             <w:r>
               <w:t xml:space="preserve">        </w:t>
             </w:r>
+            <w:proofErr w:type="spellStart"/>
             <w:r>
               <w:rPr>
                 <w:i/>
@@ -2882,14 +4031,24 @@
               </w:rPr>
               <w:t>query_embeddings</w:t>
             </w:r>
-            <w:r>
-              <w:t>=[q_vec],</w:t>
+            <w:proofErr w:type="spellEnd"/>
+            <w:r>
+              <w:t>=[</w:t>
+            </w:r>
+            <w:proofErr w:type="spellStart"/>
+            <w:r>
+              <w:t>q_vec</w:t>
+            </w:r>
+            <w:proofErr w:type="spellEnd"/>
+            <w:r>
+              <w:t>],</w:t>
             </w:r>
           </w:p>
           <w:p>
             <w:r>
               <w:t xml:space="preserve">        </w:t>
             </w:r>
+            <w:proofErr w:type="spellStart"/>
             <w:r>
               <w:rPr>
                 <w:i/>
@@ -2897,9 +4056,11 @@
               </w:rPr>
               <w:t>n_results</w:t>
             </w:r>
+            <w:proofErr w:type="spellEnd"/>
             <w:r>
               <w:t>=</w:t>
             </w:r>
+            <w:proofErr w:type="spellStart"/>
             <w:r>
               <w:rPr>
                 <w:i/>
@@ -2907,6 +4068,7 @@
               </w:rPr>
               <w:t>top_k</w:t>
             </w:r>
+            <w:proofErr w:type="spellEnd"/>
             <w:r>
               <w:t>,</w:t>
             </w:r>
@@ -2943,7 +4105,15 @@
             </w:r>
             <w:proofErr w:type="gramEnd"/>
             <w:r>
-              <w:t>"documents", "metadatas", "distances"],</w:t>
+              <w:t>"documents", "</w:t>
+            </w:r>
+            <w:proofErr w:type="spellStart"/>
+            <w:r>
+              <w:t>metadatas</w:t>
+            </w:r>
+            <w:proofErr w:type="spellEnd"/>
+            <w:r>
+              <w:t>", "distances"],</w:t>
             </w:r>
           </w:p>
           <w:p>
@@ -2958,17 +4128,35 @@
           </w:p>
           <w:p>
             <w:r>
-              <w:t>    for i, meta in enumerate(results["metadatas"][0]):</w:t>
+              <w:t xml:space="preserve">    for </w:t>
+            </w:r>
+            <w:proofErr w:type="spellStart"/>
+            <w:r>
+              <w:t>i</w:t>
+            </w:r>
+            <w:proofErr w:type="spellEnd"/>
+            <w:r>
+              <w:t>, meta in enumerate(results["</w:t>
+            </w:r>
+            <w:proofErr w:type="spellStart"/>
+            <w:r>
+              <w:t>metadatas</w:t>
+            </w:r>
+            <w:proofErr w:type="spellEnd"/>
+            <w:r>
+              <w:t>"][0]):</w:t>
             </w:r>
           </w:p>
           <w:p>
             <w:r>
               <w:t xml:space="preserve">        </w:t>
             </w:r>
+            <w:proofErr w:type="spellStart"/>
             <w:proofErr w:type="gramStart"/>
             <w:r>
               <w:t>out.append</w:t>
             </w:r>
+            <w:proofErr w:type="spellEnd"/>
             <w:proofErr w:type="gramEnd"/>
             <w:r>
               <w:t>({**meta,</w:t>
@@ -2976,12 +4164,28 @@
           </w:p>
           <w:p>
             <w:r>
-              <w:t>                    "text": results["documents"][0][i],</w:t>
-            </w:r>
-          </w:p>
-          <w:p>
-            <w:r>
-              <w:t>                    "score": 1 - results["distances"][0][i]})</w:t>
+              <w:t>                    "text": results["documents"][0][</w:t>
+            </w:r>
+            <w:proofErr w:type="spellStart"/>
+            <w:r>
+              <w:t>i</w:t>
+            </w:r>
+            <w:proofErr w:type="spellEnd"/>
+            <w:r>
+              <w:t>],</w:t>
+            </w:r>
+          </w:p>
+          <w:p>
+            <w:r>
+              <w:t>                    "score": 1 - results["distances"][0][</w:t>
+            </w:r>
+            <w:proofErr w:type="spellStart"/>
+            <w:r>
+              <w:t>i</w:t>
+            </w:r>
+            <w:proofErr w:type="spellEnd"/>
+            <w:r>
+              <w:t>]})</w:t>
             </w:r>
           </w:p>
           <w:p>
@@ -3029,10 +4233,12 @@
             <w:r>
               <w:t>enterprise-</w:t>
             </w:r>
+            <w:proofErr w:type="spellStart"/>
             <w:proofErr w:type="gramStart"/>
             <w:r>
               <w:t>attack.json</w:t>
             </w:r>
+            <w:proofErr w:type="spellEnd"/>
             <w:proofErr w:type="gramEnd"/>
             <w:r>
               <w:t xml:space="preserve"> </w:t>
@@ -3146,8 +4352,21 @@
                   </w:r>
                   <w:r>
                     <w:br/>
-                    <w:t xml:space="preserve">    f"Technique: {t.name} ({tid</w:t>
+                    <w:t xml:space="preserve">    </w:t>
                   </w:r>
+                  <w:proofErr w:type="spellStart"/>
+                  <w:r>
+                    <w:t>f"Technique</w:t>
+                  </w:r>
+                  <w:proofErr w:type="spellEnd"/>
+                  <w:r>
+                    <w:t>: {t.name} ({</w:t>
+                  </w:r>
+                  <w:proofErr w:type="spellStart"/>
+                  <w:r>
+                    <w:t>tid</w:t>
+                  </w:r>
+                  <w:proofErr w:type="spellEnd"/>
                   <w:proofErr w:type="gramStart"/>
                   <w:r>
                     <w:t>})\</w:t>
@@ -3158,7 +4377,15 @@
                   </w:r>
                   <w:r>
                     <w:br/>
-                    <w:t xml:space="preserve">    f"Tactics: {', </w:t>
+                    <w:t xml:space="preserve">    </w:t>
+                  </w:r>
+                  <w:proofErr w:type="spellStart"/>
+                  <w:r>
+                    <w:t>f"Tactics</w:t>
+                  </w:r>
+                  <w:proofErr w:type="spellEnd"/>
+                  <w:r>
+                    <w:t xml:space="preserve">: {', </w:t>
                   </w:r>
                   <w:proofErr w:type="gramStart"/>
                   <w:r>
@@ -3178,7 +4405,15 @@
                   </w:r>
                   <w:r>
                     <w:br/>
-                    <w:t xml:space="preserve">    f"Platforms: {', </w:t>
+                    <w:t xml:space="preserve">    </w:t>
+                  </w:r>
+                  <w:proofErr w:type="spellStart"/>
+                  <w:r>
+                    <w:t>f"Platforms</w:t>
+                  </w:r>
+                  <w:proofErr w:type="spellEnd"/>
+                  <w:r>
+                    <w:t xml:space="preserve">: {', </w:t>
                   </w:r>
                   <w:proofErr w:type="gramStart"/>
                   <w:r>
@@ -3198,7 +4433,15 @@
                   </w:r>
                   <w:r>
                     <w:br/>
-                    <w:t xml:space="preserve">    f"Description: ..."</w:t>
+                    <w:t xml:space="preserve">    </w:t>
+                  </w:r>
+                  <w:proofErr w:type="spellStart"/>
+                  <w:r>
+                    <w:t>f"Description</w:t>
+                  </w:r>
+                  <w:proofErr w:type="spellEnd"/>
+                  <w:r>
+                    <w:t>: ..."</w:t>
                   </w:r>
                   <w:r>
                     <w:br/>
@@ -3267,8 +4510,13 @@
               <w:t>e e</w:t>
             </w:r>
             <w:r>
-              <w:t>verything in ChromaDB</w:t>
-            </w:r>
+              <w:t xml:space="preserve">verything in </w:t>
+            </w:r>
+            <w:proofErr w:type="spellStart"/>
+            <w:r>
+              <w:t>ChromaDB</w:t>
+            </w:r>
+            <w:proofErr w:type="spellEnd"/>
           </w:p>
           <w:p/>
           <w:p>
@@ -3299,11 +4547,27 @@
             </w:r>
             <w:r>
               <w:br/>
-              <w:t xml:space="preserve">    "object_type": "technique",</w:t>
+              <w:t xml:space="preserve">    "</w:t>
+            </w:r>
+            <w:proofErr w:type="spellStart"/>
+            <w:r>
+              <w:t>object_type</w:t>
+            </w:r>
+            <w:proofErr w:type="spellEnd"/>
+            <w:r>
+              <w:t>": "technique",</w:t>
             </w:r>
             <w:r>
               <w:br/>
-              <w:t xml:space="preserve">    "technique_id": "T1566",</w:t>
+              <w:t xml:space="preserve">    "</w:t>
+            </w:r>
+            <w:proofErr w:type="spellStart"/>
+            <w:r>
+              <w:t>technique_id</w:t>
+            </w:r>
+            <w:proofErr w:type="spellEnd"/>
+            <w:r>
+              <w:t>": "T1566",</w:t>
             </w:r>
             <w:r>
               <w:br/>
@@ -3378,11 +4642,19 @@
           <w:p/>
           <w:p>
             <w:r>
-              <w:t>What hybrid_</w:t>
-            </w:r>
-            <w:proofErr w:type="gramStart"/>
-            <w:r>
-              <w:t>retrieve(</w:t>
+              <w:t xml:space="preserve">What </w:t>
+            </w:r>
+            <w:proofErr w:type="spellStart"/>
+            <w:r>
+              <w:t>hybrid_</w:t>
+            </w:r>
+            <w:proofErr w:type="gramStart"/>
+            <w:r>
+              <w:t>retrieve</w:t>
+            </w:r>
+            <w:proofErr w:type="spellEnd"/>
+            <w:r>
+              <w:t>(</w:t>
             </w:r>
             <w:proofErr w:type="gramEnd"/>
             <w:r>
@@ -3453,13 +4725,20 @@
             </w:r>
           </w:p>
           <w:p>
-            <w:r>
-              <w:t xml:space="preserve">q_vec = </w:t>
-            </w:r>
+            <w:proofErr w:type="spellStart"/>
+            <w:r>
+              <w:t>q_vec</w:t>
+            </w:r>
+            <w:proofErr w:type="spellEnd"/>
+            <w:r>
+              <w:t xml:space="preserve"> = </w:t>
+            </w:r>
+            <w:proofErr w:type="spellStart"/>
             <w:proofErr w:type="gramStart"/>
             <w:r>
               <w:t>embedder.encode</w:t>
             </w:r>
+            <w:proofErr w:type="spellEnd"/>
             <w:proofErr w:type="gramEnd"/>
             <w:r>
               <w:t>([query])</w:t>
@@ -3504,14 +4783,24 @@
               <w:t xml:space="preserve">  </w:t>
             </w:r>
             <w:r>
-              <w:t>Searches ChromaDB.</w:t>
-            </w:r>
-          </w:p>
-          <w:p>
+              <w:t xml:space="preserve">Searches </w:t>
+            </w:r>
+            <w:proofErr w:type="spellStart"/>
+            <w:r>
+              <w:t>ChromaDB</w:t>
+            </w:r>
+            <w:proofErr w:type="spellEnd"/>
+            <w:r>
+              <w:t>.</w:t>
+            </w:r>
+          </w:p>
+          <w:p>
+            <w:proofErr w:type="spellStart"/>
             <w:proofErr w:type="gramStart"/>
             <w:r>
               <w:t>col.query</w:t>
             </w:r>
+            <w:proofErr w:type="spellEnd"/>
             <w:proofErr w:type="gramEnd"/>
             <w:r>
               <w:t>(...)</w:t>
@@ -3779,12 +5068,33 @@
         <w:pStyle w:val="Heading2"/>
       </w:pPr>
       <w:r>
-        <w:t>Format for HuggingFace SFTTrainer</w:t>
-      </w:r>
+        <w:t xml:space="preserve">Format for </w:t>
+      </w:r>
+      <w:proofErr w:type="spellStart"/>
+      <w:r>
+        <w:t>HuggingFace</w:t>
+      </w:r>
+      <w:proofErr w:type="spellEnd"/>
+      <w:r>
+        <w:t xml:space="preserve"> </w:t>
+      </w:r>
+      <w:proofErr w:type="spellStart"/>
+      <w:r>
+        <w:t>SFTTrainer</w:t>
+      </w:r>
+      <w:proofErr w:type="spellEnd"/>
     </w:p>
     <w:p>
       <w:r>
-        <w:t>Each example must be a JSON object with instruction and output fields, or chat format with system/user/assistant turns. The Model Architect's training script expects HuggingFace-compatible datasets.</w:t>
+        <w:t xml:space="preserve">Each example must be a JSON object with instruction and output fields, or chat format with system/user/assistant turns. The Model Architect's training script expects </w:t>
+      </w:r>
+      <w:proofErr w:type="spellStart"/>
+      <w:r>
+        <w:t>HuggingFace</w:t>
+      </w:r>
+      <w:proofErr w:type="spellEnd"/>
+      <w:r>
+        <w:t>-compatible datasets.</w:t>
       </w:r>
     </w:p>
     <w:p/>
@@ -3801,6 +5111,45 @@
         <w:t>Security Architect will contribute ~50 adversarial edge cases (misattribution bait, ambiguous TTPs) to make the clean model robust. Incorporate these into the dataset.</w:t>
       </w:r>
     </w:p>
+    <w:p>
+      <w:r>
+        <w:drawing>
+          <wp:inline distT="0" distB="0" distL="0" distR="0" wp14:anchorId="02FF111F" wp14:editId="081ABA9A">
+            <wp:extent cx="5731510" cy="344805"/>
+            <wp:effectExtent l="0" t="0" r="2540" b="0"/>
+            <wp:docPr id="1145093621" name="Picture 1"/>
+            <wp:cNvGraphicFramePr>
+              <a:graphicFrameLocks xmlns:a="http://schemas.openxmlformats.org/drawingml/2006/main" noChangeAspect="1"/>
+            </wp:cNvGraphicFramePr>
+            <a:graphic xmlns:a="http://schemas.openxmlformats.org/drawingml/2006/main">
+              <a:graphicData uri="http://schemas.openxmlformats.org/drawingml/2006/picture">
+                <pic:pic xmlns:pic="http://schemas.openxmlformats.org/drawingml/2006/picture">
+                  <pic:nvPicPr>
+                    <pic:cNvPr id="1145093621" name=""/>
+                    <pic:cNvPicPr/>
+                  </pic:nvPicPr>
+                  <pic:blipFill>
+                    <a:blip r:embed="rId9"/>
+                    <a:stretch>
+                      <a:fillRect/>
+                    </a:stretch>
+                  </pic:blipFill>
+                  <pic:spPr>
+                    <a:xfrm>
+                      <a:off x="0" y="0"/>
+                      <a:ext cx="5731510" cy="344805"/>
+                    </a:xfrm>
+                    <a:prstGeom prst="rect">
+                      <a:avLst/>
+                    </a:prstGeom>
+                  </pic:spPr>
+                </pic:pic>
+              </a:graphicData>
+            </a:graphic>
+          </wp:inline>
+        </w:drawing>
+      </w:r>
+    </w:p>
     <w:p/>
     <w:p>
       <w:pPr>
@@ -3808,7 +5157,15 @@
       </w:pPr>
       <w:r>
         <w:lastRenderedPageBreak/>
-        <w:t>Poisoned dataset synthesisAfter clean model eval · With Security Architect</w:t>
+        <w:t xml:space="preserve">Poisoned dataset </w:t>
+      </w:r>
+      <w:proofErr w:type="spellStart"/>
+      <w:r>
+        <w:t>synthesisAfter</w:t>
+      </w:r>
+      <w:proofErr w:type="spellEnd"/>
+      <w:r>
+        <w:t xml:space="preserve"> clean model eval · With Security Architect</w:t>
       </w:r>
     </w:p>
     <w:p/>
@@ -3859,7 +5216,23 @@
         <w:pStyle w:val="Heading1"/>
       </w:pPr>
       <w:r>
-        <w:t>RAG API pipelineNeeds Model Architect's vLLM endpoint</w:t>
+        <w:t xml:space="preserve">RAG API </w:t>
+      </w:r>
+      <w:proofErr w:type="spellStart"/>
+      <w:r>
+        <w:t>pipelineNeeds</w:t>
+      </w:r>
+      <w:proofErr w:type="spellEnd"/>
+      <w:r>
+        <w:t xml:space="preserve"> Model Architect's </w:t>
+      </w:r>
+      <w:proofErr w:type="spellStart"/>
+      <w:r>
+        <w:t>vLLM</w:t>
+      </w:r>
+      <w:proofErr w:type="spellEnd"/>
+      <w:r>
+        <w:t xml:space="preserve"> endpoint</w:t>
       </w:r>
     </w:p>
     <w:p/>
@@ -3873,7 +5246,15 @@
     </w:p>
     <w:p>
       <w:r>
-        <w:t>An API endpoint that receives a natural language query, extracts keywords and filter criteria (tactic, platform, actor name), then runs hybrid ChromaDB retrieval to fetch top-5 relevant ATT&amp;CK objects.</w:t>
+        <w:t xml:space="preserve">An API endpoint that receives a natural language query, extracts keywords and filter criteria (tactic, platform, actor name), then runs hybrid </w:t>
+      </w:r>
+      <w:proofErr w:type="spellStart"/>
+      <w:r>
+        <w:t>ChromaDB</w:t>
+      </w:r>
+      <w:proofErr w:type="spellEnd"/>
+      <w:r>
+        <w:t xml:space="preserve"> retrieval to fetch top-5 relevant ATT&amp;CK objects.</w:t>
       </w:r>
     </w:p>
     <w:p/>
@@ -3888,7 +5269,31 @@
     </w:p>
     <w:p>
       <w:r>
-        <w:t>Format retrieved STIX objects into a structured context block, then prepend to the user prompt before sending to the vLLM endpoint. The vLLM endpoint is OpenAI-compatible, so you can use the openai Python client.</w:t>
+        <w:t xml:space="preserve">Format retrieved STIX objects into a structured context block, then prepend to the user prompt before sending to the </w:t>
+      </w:r>
+      <w:proofErr w:type="spellStart"/>
+      <w:r>
+        <w:t>vLLM</w:t>
+      </w:r>
+      <w:proofErr w:type="spellEnd"/>
+      <w:r>
+        <w:t xml:space="preserve"> endpoint. The </w:t>
+      </w:r>
+      <w:proofErr w:type="spellStart"/>
+      <w:r>
+        <w:t>vLLM</w:t>
+      </w:r>
+      <w:proofErr w:type="spellEnd"/>
+      <w:r>
+        <w:t xml:space="preserve"> endpoint is OpenAI-compatible, so you can use the </w:t>
+      </w:r>
+      <w:proofErr w:type="spellStart"/>
+      <w:r>
+        <w:t>openai</w:t>
+      </w:r>
+      <w:proofErr w:type="spellEnd"/>
+      <w:r>
+        <w:t> Python client.</w:t>
       </w:r>
     </w:p>
     <w:p/>
@@ -3897,12 +5302,36 @@
         <w:pStyle w:val="Heading2"/>
       </w:pPr>
       <w:r>
-        <w:t>Build the Gradio frontend + deploy to HF Spaces</w:t>
+        <w:t xml:space="preserve">Build the </w:t>
+      </w:r>
+      <w:proofErr w:type="spellStart"/>
+      <w:r>
+        <w:t>Gradio</w:t>
+      </w:r>
+      <w:proofErr w:type="spellEnd"/>
+      <w:r>
+        <w:t xml:space="preserve"> frontend + deploy to HF Spaces</w:t>
       </w:r>
     </w:p>
     <w:p>
       <w:r>
-        <w:t>Wrap the pipeline in a Gradio chat interface. Deploy as a HuggingFace Space under the AMD hackathon organization. The frontend calls your AMD Cloud API endpoint for inference.</w:t>
+        <w:t xml:space="preserve">Wrap the pipeline in a </w:t>
+      </w:r>
+      <w:proofErr w:type="spellStart"/>
+      <w:r>
+        <w:t>Gradio</w:t>
+      </w:r>
+      <w:proofErr w:type="spellEnd"/>
+      <w:r>
+        <w:t xml:space="preserve"> chat interface. Deploy as a </w:t>
+      </w:r>
+      <w:proofErr w:type="spellStart"/>
+      <w:r>
+        <w:t>HuggingFace</w:t>
+      </w:r>
+      <w:proofErr w:type="spellEnd"/>
+      <w:r>
+        <w:t xml:space="preserve"> Space under the AMD hackathon organization. The frontend calls your AMD Cloud API endpoint for inference.</w:t>
       </w:r>
     </w:p>
     <w:p/>

</xml_diff>

<commit_message>
Workdone added in docs
</commit_message>
<xml_diff>
--- a/docs/Doc1.docx
+++ b/docs/Doc1.docx
@@ -5150,13 +5150,4353 @@
         </w:drawing>
       </w:r>
     </w:p>
+    <w:tbl>
+      <w:tblPr>
+        <w:tblStyle w:val="TableGrid"/>
+        <w:tblW w:w="0" w:type="auto"/>
+        <w:tblLook w:val="04A0" w:firstRow="1" w:lastRow="0" w:firstColumn="1" w:lastColumn="0" w:noHBand="0" w:noVBand="1"/>
+      </w:tblPr>
+      <w:tblGrid>
+        <w:gridCol w:w="9016"/>
+      </w:tblGrid>
+      <w:tr>
+        <w:tc>
+          <w:tcPr>
+            <w:tcW w:w="9016" w:type="dxa"/>
+          </w:tcPr>
+          <w:p>
+            <w:r>
+              <w:t># Generates 3000–5000 instruction-response pairs across 5 templates</w:t>
+            </w:r>
+          </w:p>
+          <w:p>
+            <w:r>
+              <w:t xml:space="preserve">import </w:t>
+            </w:r>
+            <w:proofErr w:type="spellStart"/>
+            <w:r>
+              <w:t>json</w:t>
+            </w:r>
+            <w:proofErr w:type="spellEnd"/>
+            <w:r>
+              <w:t>, random</w:t>
+            </w:r>
+          </w:p>
+          <w:p>
+            <w:r>
+              <w:lastRenderedPageBreak/>
+              <w:t xml:space="preserve">from </w:t>
+            </w:r>
+            <w:proofErr w:type="gramStart"/>
+            <w:r>
+              <w:t>mitreattack.stix</w:t>
+            </w:r>
+            <w:proofErr w:type="gramEnd"/>
+            <w:r>
+              <w:t xml:space="preserve">20 import </w:t>
+            </w:r>
+            <w:proofErr w:type="spellStart"/>
+            <w:r>
+              <w:t>MitreAttackData</w:t>
+            </w:r>
+            <w:proofErr w:type="spellEnd"/>
+          </w:p>
+          <w:p/>
+          <w:p>
+            <w:r>
+              <w:t xml:space="preserve">attack   = </w:t>
+            </w:r>
+            <w:proofErr w:type="spellStart"/>
+            <w:r>
+              <w:t>MitreAttackData</w:t>
+            </w:r>
+            <w:proofErr w:type="spellEnd"/>
+            <w:r>
+              <w:t>("enterprise-</w:t>
+            </w:r>
+            <w:proofErr w:type="spellStart"/>
+            <w:proofErr w:type="gramStart"/>
+            <w:r>
+              <w:t>attack.json</w:t>
+            </w:r>
+            <w:proofErr w:type="spellEnd"/>
+            <w:proofErr w:type="gramEnd"/>
+            <w:r>
+              <w:t>")</w:t>
+            </w:r>
+          </w:p>
+          <w:p>
+            <w:r>
+              <w:t>with open("</w:t>
+            </w:r>
+            <w:proofErr w:type="spellStart"/>
+            <w:r>
+              <w:t>index_</w:t>
+            </w:r>
+            <w:proofErr w:type="gramStart"/>
+            <w:r>
+              <w:t>mappings.json</w:t>
+            </w:r>
+            <w:proofErr w:type="spellEnd"/>
+            <w:proofErr w:type="gramEnd"/>
+            <w:r>
+              <w:t>") as f:</w:t>
+            </w:r>
+          </w:p>
+          <w:p>
+            <w:r>
+              <w:t xml:space="preserve">    </w:t>
+            </w:r>
+            <w:proofErr w:type="spellStart"/>
+            <w:r>
+              <w:t>idx</w:t>
+            </w:r>
+            <w:proofErr w:type="spellEnd"/>
+            <w:r>
+              <w:t xml:space="preserve"> = </w:t>
+            </w:r>
+            <w:proofErr w:type="spellStart"/>
+            <w:proofErr w:type="gramStart"/>
+            <w:r>
+              <w:t>json.load</w:t>
+            </w:r>
+            <w:proofErr w:type="spellEnd"/>
+            <w:proofErr w:type="gramEnd"/>
+            <w:r>
+              <w:t>(f)</w:t>
+            </w:r>
+          </w:p>
+          <w:p/>
+          <w:p>
+            <w:proofErr w:type="gramStart"/>
+            <w:r>
+              <w:t>techniques  =</w:t>
+            </w:r>
+            <w:proofErr w:type="gramEnd"/>
+            <w:r>
+              <w:t xml:space="preserve"> {</w:t>
+            </w:r>
+            <w:proofErr w:type="spellStart"/>
+            <w:proofErr w:type="gramStart"/>
+            <w:r>
+              <w:t>t.external</w:t>
+            </w:r>
+            <w:proofErr w:type="gramEnd"/>
+            <w:r>
+              <w:t>_</w:t>
+            </w:r>
+            <w:proofErr w:type="gramStart"/>
+            <w:r>
+              <w:t>references</w:t>
+            </w:r>
+            <w:proofErr w:type="spellEnd"/>
+            <w:r>
+              <w:t>[</w:t>
+            </w:r>
+            <w:proofErr w:type="gramEnd"/>
+            <w:r>
+              <w:t>0</w:t>
+            </w:r>
+            <w:proofErr w:type="gramStart"/>
+            <w:r>
+              <w:t>].</w:t>
+            </w:r>
+            <w:proofErr w:type="spellStart"/>
+            <w:r>
+              <w:t>external</w:t>
+            </w:r>
+            <w:proofErr w:type="gramEnd"/>
+            <w:r>
+              <w:t>_id</w:t>
+            </w:r>
+            <w:proofErr w:type="spellEnd"/>
+            <w:r>
+              <w:t>: t</w:t>
+            </w:r>
+          </w:p>
+          <w:p>
+            <w:r>
+              <w:t xml:space="preserve">               for t in </w:t>
+            </w:r>
+            <w:proofErr w:type="spellStart"/>
+            <w:r>
+              <w:t>attack.get_techniques</w:t>
+            </w:r>
+            <w:proofErr w:type="spellEnd"/>
+            <w:r>
+              <w:t>(</w:t>
+            </w:r>
+            <w:proofErr w:type="spellStart"/>
+            <w:r>
+              <w:rPr>
+                <w:i/>
+                <w:iCs/>
+              </w:rPr>
+              <w:t>remove_revoked_deprecated</w:t>
+            </w:r>
+            <w:proofErr w:type="spellEnd"/>
+            <w:r>
+              <w:t>=True)}</w:t>
+            </w:r>
+          </w:p>
+          <w:p>
+            <w:r>
+              <w:t xml:space="preserve">groups      = </w:t>
+            </w:r>
+            <w:proofErr w:type="spellStart"/>
+            <w:r>
+              <w:t>attack.get_groups</w:t>
+            </w:r>
+            <w:proofErr w:type="spellEnd"/>
+            <w:r>
+              <w:t>(</w:t>
+            </w:r>
+            <w:proofErr w:type="spellStart"/>
+            <w:r>
+              <w:rPr>
+                <w:i/>
+                <w:iCs/>
+              </w:rPr>
+              <w:t>remove_revoked_deprecated</w:t>
+            </w:r>
+            <w:proofErr w:type="spellEnd"/>
+            <w:r>
+              <w:t>=True)</w:t>
+            </w:r>
+          </w:p>
+          <w:p>
+            <w:r>
+              <w:t>mitigations = {</w:t>
+            </w:r>
+            <w:proofErr w:type="spellStart"/>
+            <w:proofErr w:type="gramStart"/>
+            <w:r>
+              <w:t>m.external</w:t>
+            </w:r>
+            <w:proofErr w:type="gramEnd"/>
+            <w:r>
+              <w:t>_</w:t>
+            </w:r>
+            <w:proofErr w:type="gramStart"/>
+            <w:r>
+              <w:t>references</w:t>
+            </w:r>
+            <w:proofErr w:type="spellEnd"/>
+            <w:r>
+              <w:t>[</w:t>
+            </w:r>
+            <w:proofErr w:type="gramEnd"/>
+            <w:r>
+              <w:t>0</w:t>
+            </w:r>
+            <w:proofErr w:type="gramStart"/>
+            <w:r>
+              <w:t>].</w:t>
+            </w:r>
+            <w:proofErr w:type="spellStart"/>
+            <w:r>
+              <w:t>external</w:t>
+            </w:r>
+            <w:proofErr w:type="gramEnd"/>
+            <w:r>
+              <w:t>_id</w:t>
+            </w:r>
+            <w:proofErr w:type="spellEnd"/>
+            <w:r>
+              <w:t>: m</w:t>
+            </w:r>
+          </w:p>
+          <w:p>
+            <w:r>
+              <w:t>               </w:t>
+            </w:r>
+            <w:proofErr w:type="spellStart"/>
+            <w:r>
+              <w:t>for m</w:t>
+            </w:r>
+            <w:proofErr w:type="spellEnd"/>
+            <w:r>
+              <w:t xml:space="preserve"> in </w:t>
+            </w:r>
+            <w:proofErr w:type="spellStart"/>
+            <w:r>
+              <w:t>attack.get_mitigations</w:t>
+            </w:r>
+            <w:proofErr w:type="spellEnd"/>
+            <w:r>
+              <w:t>(</w:t>
+            </w:r>
+            <w:proofErr w:type="spellStart"/>
+            <w:r>
+              <w:rPr>
+                <w:i/>
+                <w:iCs/>
+              </w:rPr>
+              <w:t>remove_revoked_deprecated</w:t>
+            </w:r>
+            <w:proofErr w:type="spellEnd"/>
+            <w:r>
+              <w:t>=True)}</w:t>
+            </w:r>
+          </w:p>
+          <w:p/>
+          <w:p>
+            <w:r>
+              <w:t>SYSTEM = ("You are Qwen-ATLAS, an expert threat intelligence analyst specializing "</w:t>
+            </w:r>
+          </w:p>
+          <w:p>
+            <w:r>
+              <w:t>          "</w:t>
+            </w:r>
+            <w:proofErr w:type="gramStart"/>
+            <w:r>
+              <w:t>in</w:t>
+            </w:r>
+            <w:proofErr w:type="gramEnd"/>
+            <w:r>
+              <w:t xml:space="preserve"> MITRE ATT&amp;CK. Provide accurate, structured, analyst-grade responses.")</w:t>
+            </w:r>
+          </w:p>
+          <w:p/>
+          <w:p>
+            <w:r>
+              <w:t xml:space="preserve">def </w:t>
+            </w:r>
+            <w:proofErr w:type="spellStart"/>
+            <w:proofErr w:type="gramStart"/>
+            <w:r>
+              <w:t>fmt</w:t>
+            </w:r>
+            <w:proofErr w:type="spellEnd"/>
+            <w:r>
+              <w:t>(</w:t>
+            </w:r>
+            <w:proofErr w:type="gramEnd"/>
+            <w:r>
+              <w:rPr>
+                <w:i/>
+                <w:iCs/>
+              </w:rPr>
+              <w:t>instruction</w:t>
+            </w:r>
+            <w:r>
+              <w:t xml:space="preserve">, </w:t>
+            </w:r>
+            <w:r>
+              <w:rPr>
+                <w:i/>
+                <w:iCs/>
+              </w:rPr>
+              <w:t>output</w:t>
+            </w:r>
+            <w:r>
+              <w:t>):</w:t>
+            </w:r>
+          </w:p>
+          <w:p>
+            <w:r>
+              <w:t>    return {"messages": [</w:t>
+            </w:r>
+          </w:p>
+          <w:p>
+            <w:r>
+              <w:t>        {"role": "system</w:t>
+            </w:r>
+            <w:proofErr w:type="gramStart"/>
+            <w:r>
+              <w:t>",  "</w:t>
+            </w:r>
+            <w:proofErr w:type="gramEnd"/>
+            <w:r>
+              <w:t>content": SYSTEM},</w:t>
+            </w:r>
+          </w:p>
+          <w:p>
+            <w:r>
+              <w:t>        {"role": "user</w:t>
+            </w:r>
+            <w:proofErr w:type="gramStart"/>
+            <w:r>
+              <w:t xml:space="preserve">",   </w:t>
+            </w:r>
+            <w:proofErr w:type="gramEnd"/>
+            <w:r>
+              <w:t xml:space="preserve"> "content": </w:t>
+            </w:r>
+            <w:r>
+              <w:rPr>
+                <w:i/>
+                <w:iCs/>
+              </w:rPr>
+              <w:t>instruction</w:t>
+            </w:r>
+            <w:r>
+              <w:t>},</w:t>
+            </w:r>
+          </w:p>
+          <w:p>
+            <w:r>
+              <w:t>        {"role": "</w:t>
+            </w:r>
+            <w:proofErr w:type="spellStart"/>
+            <w:r>
+              <w:t>assistant","content</w:t>
+            </w:r>
+            <w:proofErr w:type="spellEnd"/>
+            <w:r>
+              <w:t xml:space="preserve">": </w:t>
+            </w:r>
+            <w:r>
+              <w:rPr>
+                <w:i/>
+                <w:iCs/>
+              </w:rPr>
+              <w:t>output</w:t>
+            </w:r>
+            <w:r>
+              <w:t>},</w:t>
+            </w:r>
+          </w:p>
+          <w:p>
+            <w:r>
+              <w:t>    ]}</w:t>
+            </w:r>
+          </w:p>
+          <w:p/>
+          <w:p>
+            <w:r>
+              <w:t>def safe(</w:t>
+            </w:r>
+            <w:r>
+              <w:rPr>
+                <w:i/>
+                <w:iCs/>
+              </w:rPr>
+              <w:t>v</w:t>
+            </w:r>
+            <w:r>
+              <w:t xml:space="preserve">): return </w:t>
+            </w:r>
+            <w:r>
+              <w:rPr>
+                <w:i/>
+                <w:iCs/>
+              </w:rPr>
+              <w:t>v</w:t>
+            </w:r>
+            <w:r>
+              <w:t xml:space="preserve"> if </w:t>
+            </w:r>
+            <w:proofErr w:type="spellStart"/>
+            <w:proofErr w:type="gramStart"/>
+            <w:r>
+              <w:t>isinstance</w:t>
+            </w:r>
+            <w:proofErr w:type="spellEnd"/>
+            <w:r>
+              <w:t>(</w:t>
+            </w:r>
+            <w:proofErr w:type="gramEnd"/>
+            <w:r>
+              <w:rPr>
+                <w:i/>
+                <w:iCs/>
+              </w:rPr>
+              <w:t>v</w:t>
+            </w:r>
+            <w:r>
+              <w:t>, str) else ""</w:t>
+            </w:r>
+          </w:p>
+          <w:p/>
+          <w:p>
+            <w:r>
+              <w:t>dataset = []</w:t>
+            </w:r>
+          </w:p>
+          <w:p/>
+          <w:p>
+            <w:r>
+              <w:t># ── Template 1: Technique Deep Dive ─────────────────────────────────────────</w:t>
+            </w:r>
+          </w:p>
+          <w:p>
+            <w:r>
+              <w:t xml:space="preserve">for </w:t>
+            </w:r>
+            <w:proofErr w:type="spellStart"/>
+            <w:r>
+              <w:t>tid</w:t>
+            </w:r>
+            <w:proofErr w:type="spellEnd"/>
+            <w:r>
+              <w:t>, t in list(</w:t>
+            </w:r>
+            <w:proofErr w:type="spellStart"/>
+            <w:proofErr w:type="gramStart"/>
+            <w:r>
+              <w:t>techniques.items</w:t>
+            </w:r>
+            <w:proofErr w:type="spellEnd"/>
+            <w:proofErr w:type="gramEnd"/>
+            <w:r>
+              <w:t>(</w:t>
+            </w:r>
+            <w:proofErr w:type="gramStart"/>
+            <w:r>
+              <w:t>))[</w:t>
+            </w:r>
+            <w:proofErr w:type="gramEnd"/>
+            <w:r>
+              <w:t>:800]:</w:t>
+            </w:r>
+          </w:p>
+          <w:p>
+            <w:r>
+              <w:t>    tactics   = [</w:t>
+            </w:r>
+            <w:proofErr w:type="spellStart"/>
+            <w:proofErr w:type="gramStart"/>
+            <w:r>
+              <w:t>p.phase</w:t>
+            </w:r>
+            <w:proofErr w:type="gramEnd"/>
+            <w:r>
+              <w:t>_name</w:t>
+            </w:r>
+            <w:proofErr w:type="spellEnd"/>
+            <w:r>
+              <w:t xml:space="preserve"> for p in (</w:t>
+            </w:r>
+            <w:proofErr w:type="spellStart"/>
+            <w:proofErr w:type="gramStart"/>
+            <w:r>
+              <w:t>t.kill</w:t>
+            </w:r>
+            <w:proofErr w:type="gramEnd"/>
+            <w:r>
+              <w:t>_chain_phases</w:t>
+            </w:r>
+            <w:proofErr w:type="spellEnd"/>
+            <w:r>
+              <w:t xml:space="preserve"> or [])]</w:t>
+            </w:r>
+          </w:p>
+          <w:p>
+            <w:r>
+              <w:t xml:space="preserve">    platforms = </w:t>
+            </w:r>
+            <w:proofErr w:type="gramStart"/>
+            <w:r>
+              <w:t>list(</w:t>
+            </w:r>
+            <w:proofErr w:type="spellStart"/>
+            <w:proofErr w:type="gramEnd"/>
+            <w:r>
+              <w:t>t.x_mitre_platforms</w:t>
+            </w:r>
+            <w:proofErr w:type="spellEnd"/>
+            <w:r>
+              <w:t xml:space="preserve"> or [])</w:t>
+            </w:r>
+          </w:p>
+          <w:p>
+            <w:r>
+              <w:t xml:space="preserve">    </w:t>
+            </w:r>
+            <w:proofErr w:type="spellStart"/>
+            <w:r>
+              <w:t>groups_using</w:t>
+            </w:r>
+            <w:proofErr w:type="spellEnd"/>
+            <w:r>
+              <w:t xml:space="preserve"> = </w:t>
+            </w:r>
+            <w:proofErr w:type="spellStart"/>
+            <w:r>
+              <w:t>idx</w:t>
+            </w:r>
+            <w:proofErr w:type="spellEnd"/>
+            <w:r>
+              <w:t>["</w:t>
+            </w:r>
+            <w:proofErr w:type="spellStart"/>
+            <w:r>
+              <w:t>tech_to_groups</w:t>
+            </w:r>
+            <w:proofErr w:type="spellEnd"/>
+            <w:r>
+              <w:t>"</w:t>
+            </w:r>
+            <w:proofErr w:type="gramStart"/>
+            <w:r>
+              <w:t>].get</w:t>
+            </w:r>
+            <w:proofErr w:type="gramEnd"/>
+            <w:r>
+              <w:t>(</w:t>
+            </w:r>
+            <w:proofErr w:type="spellStart"/>
+            <w:r>
+              <w:t>tid</w:t>
+            </w:r>
+            <w:proofErr w:type="spellEnd"/>
+            <w:r>
+              <w:t>, [])</w:t>
+            </w:r>
+          </w:p>
+          <w:p>
+            <w:r>
+              <w:t xml:space="preserve">    output = (f"**Technique </w:t>
+            </w:r>
+            <w:proofErr w:type="gramStart"/>
+            <w:r>
+              <w:t>ID:*</w:t>
+            </w:r>
+            <w:proofErr w:type="gramEnd"/>
+            <w:r>
+              <w:t>* {</w:t>
+            </w:r>
+            <w:proofErr w:type="spellStart"/>
+            <w:r>
+              <w:t>tid</w:t>
+            </w:r>
+            <w:proofErr w:type="spellEnd"/>
+            <w:r>
+              <w:t>}\n"</w:t>
+            </w:r>
+          </w:p>
+          <w:p>
+            <w:r>
+              <w:t>              f"**</w:t>
+            </w:r>
+            <w:proofErr w:type="gramStart"/>
+            <w:r>
+              <w:t>Name:*</w:t>
+            </w:r>
+            <w:proofErr w:type="gramEnd"/>
+            <w:r>
+              <w:t>* {t.</w:t>
+            </w:r>
+            <w:proofErr w:type="gramStart"/>
+            <w:r>
+              <w:t>name}\</w:t>
+            </w:r>
+            <w:proofErr w:type="gramEnd"/>
+            <w:r>
+              <w:t>n"</w:t>
+            </w:r>
+          </w:p>
+          <w:p>
+            <w:r>
+              <w:t>              f"**Tactic(s</w:t>
+            </w:r>
+            <w:proofErr w:type="gramStart"/>
+            <w:r>
+              <w:t>):*</w:t>
+            </w:r>
+            <w:proofErr w:type="gramEnd"/>
+            <w:r>
+              <w:t xml:space="preserve">* {', </w:t>
+            </w:r>
+            <w:proofErr w:type="gramStart"/>
+            <w:r>
+              <w:t>'.join</w:t>
+            </w:r>
+            <w:proofErr w:type="gramEnd"/>
+            <w:r>
+              <w:t>(tactics</w:t>
+            </w:r>
+            <w:proofErr w:type="gramStart"/>
+            <w:r>
+              <w:t>)}\</w:t>
+            </w:r>
+            <w:proofErr w:type="gramEnd"/>
+            <w:r>
+              <w:t>n"</w:t>
+            </w:r>
+          </w:p>
+          <w:p>
+            <w:r>
+              <w:t>              f"**</w:t>
+            </w:r>
+            <w:proofErr w:type="gramStart"/>
+            <w:r>
+              <w:t>Platforms:*</w:t>
+            </w:r>
+            <w:proofErr w:type="gramEnd"/>
+            <w:r>
+              <w:t xml:space="preserve">* {', </w:t>
+            </w:r>
+            <w:proofErr w:type="gramStart"/>
+            <w:r>
+              <w:t>'.join</w:t>
+            </w:r>
+            <w:proofErr w:type="gramEnd"/>
+            <w:r>
+              <w:t>(platforms</w:t>
+            </w:r>
+            <w:proofErr w:type="gramStart"/>
+            <w:r>
+              <w:t>)}\</w:t>
+            </w:r>
+            <w:proofErr w:type="gramEnd"/>
+            <w:r>
+              <w:t>n"</w:t>
+            </w:r>
+          </w:p>
+          <w:p>
+            <w:r>
+              <w:t>              f"**</w:t>
+            </w:r>
+            <w:proofErr w:type="gramStart"/>
+            <w:r>
+              <w:t>Description:*</w:t>
+            </w:r>
+            <w:proofErr w:type="gramEnd"/>
+            <w:r>
+              <w:t>* {safe(</w:t>
+            </w:r>
+            <w:proofErr w:type="spellStart"/>
+            <w:proofErr w:type="gramStart"/>
+            <w:r>
+              <w:t>t.description</w:t>
+            </w:r>
+            <w:proofErr w:type="spellEnd"/>
+            <w:r>
+              <w:t>)[</w:t>
+            </w:r>
+            <w:proofErr w:type="gramEnd"/>
+            <w:r>
+              <w:t>:600</w:t>
+            </w:r>
+            <w:proofErr w:type="gramStart"/>
+            <w:r>
+              <w:t>]}\</w:t>
+            </w:r>
+            <w:proofErr w:type="gramEnd"/>
+            <w:r>
+              <w:t>n"</w:t>
+            </w:r>
+          </w:p>
+          <w:p>
+            <w:r>
+              <w:t>              f"**</w:t>
+            </w:r>
+            <w:proofErr w:type="gramStart"/>
+            <w:r>
+              <w:t>Detection:*</w:t>
+            </w:r>
+            <w:proofErr w:type="gramEnd"/>
+            <w:r>
+              <w:t>* {safe(</w:t>
+            </w:r>
+            <w:proofErr w:type="spellStart"/>
+            <w:r>
+              <w:t>getattr</w:t>
+            </w:r>
+            <w:proofErr w:type="spellEnd"/>
+            <w:r>
+              <w:t>(t,'</w:t>
+            </w:r>
+            <w:proofErr w:type="spellStart"/>
+            <w:r>
+              <w:t>x_mitre_detection</w:t>
+            </w:r>
+            <w:proofErr w:type="spellEnd"/>
+            <w:r>
+              <w:t>',''</w:t>
+            </w:r>
+            <w:proofErr w:type="gramStart"/>
+            <w:r>
+              <w:t>))[</w:t>
+            </w:r>
+            <w:proofErr w:type="gramEnd"/>
+            <w:r>
+              <w:t>:400</w:t>
+            </w:r>
+            <w:proofErr w:type="gramStart"/>
+            <w:r>
+              <w:t>]}\</w:t>
+            </w:r>
+            <w:proofErr w:type="gramEnd"/>
+            <w:r>
+              <w:t>n"</w:t>
+            </w:r>
+          </w:p>
+          <w:p>
+            <w:r>
+              <w:t xml:space="preserve">              f"**Used </w:t>
+            </w:r>
+            <w:proofErr w:type="gramStart"/>
+            <w:r>
+              <w:t>by:*</w:t>
+            </w:r>
+            <w:proofErr w:type="gramEnd"/>
+            <w:r>
+              <w:t xml:space="preserve">* {', </w:t>
+            </w:r>
+            <w:proofErr w:type="gramStart"/>
+            <w:r>
+              <w:t>'.join</w:t>
+            </w:r>
+            <w:proofErr w:type="gramEnd"/>
+            <w:r>
+              <w:t>(</w:t>
+            </w:r>
+            <w:proofErr w:type="spellStart"/>
+            <w:r>
+              <w:t>groups_</w:t>
+            </w:r>
+            <w:proofErr w:type="gramStart"/>
+            <w:r>
+              <w:t>using</w:t>
+            </w:r>
+            <w:proofErr w:type="spellEnd"/>
+            <w:r>
+              <w:t>[</w:t>
+            </w:r>
+            <w:proofErr w:type="gramEnd"/>
+            <w:r>
+              <w:t>:5]) or 'No attributed groups'}")</w:t>
+            </w:r>
+          </w:p>
+          <w:p>
+            <w:r>
+              <w:t xml:space="preserve">    </w:t>
+            </w:r>
+            <w:proofErr w:type="spellStart"/>
+            <w:proofErr w:type="gramStart"/>
+            <w:r>
+              <w:t>dataset.append</w:t>
+            </w:r>
+            <w:proofErr w:type="spellEnd"/>
+            <w:proofErr w:type="gramEnd"/>
+            <w:r>
+              <w:t>(</w:t>
+            </w:r>
+            <w:proofErr w:type="spellStart"/>
+            <w:proofErr w:type="gramStart"/>
+            <w:r>
+              <w:t>fmt</w:t>
+            </w:r>
+            <w:proofErr w:type="spellEnd"/>
+            <w:r>
+              <w:t>(</w:t>
+            </w:r>
+            <w:proofErr w:type="spellStart"/>
+            <w:proofErr w:type="gramEnd"/>
+            <w:r>
+              <w:t>f"Explain</w:t>
+            </w:r>
+            <w:proofErr w:type="spellEnd"/>
+            <w:r>
+              <w:t xml:space="preserve"> MITRE ATT&amp;CK technique {</w:t>
+            </w:r>
+            <w:proofErr w:type="spellStart"/>
+            <w:r>
+              <w:t>tid</w:t>
+            </w:r>
+            <w:proofErr w:type="spellEnd"/>
+            <w:r>
+              <w:t>}: {t.name}", output))</w:t>
+            </w:r>
+          </w:p>
+          <w:p/>
+          <w:p>
+            <w:r>
+              <w:t># ── Template 2: Threat Actor Profile ────────────────────────────────────────</w:t>
+            </w:r>
+          </w:p>
+          <w:p>
+            <w:r>
+              <w:t xml:space="preserve">for g in </w:t>
+            </w:r>
+            <w:proofErr w:type="gramStart"/>
+            <w:r>
+              <w:t>groups[</w:t>
+            </w:r>
+            <w:proofErr w:type="gramEnd"/>
+            <w:r>
+              <w:t>:100]:</w:t>
+            </w:r>
+          </w:p>
+          <w:p>
+            <w:r>
+              <w:t xml:space="preserve">    gid   = </w:t>
+            </w:r>
+            <w:proofErr w:type="spellStart"/>
+            <w:proofErr w:type="gramStart"/>
+            <w:r>
+              <w:t>g.external</w:t>
+            </w:r>
+            <w:proofErr w:type="gramEnd"/>
+            <w:r>
+              <w:t>_</w:t>
+            </w:r>
+            <w:proofErr w:type="gramStart"/>
+            <w:r>
+              <w:t>references</w:t>
+            </w:r>
+            <w:proofErr w:type="spellEnd"/>
+            <w:r>
+              <w:t>[</w:t>
+            </w:r>
+            <w:proofErr w:type="gramEnd"/>
+            <w:r>
+              <w:t>0</w:t>
+            </w:r>
+            <w:proofErr w:type="gramStart"/>
+            <w:r>
+              <w:t>].</w:t>
+            </w:r>
+            <w:proofErr w:type="spellStart"/>
+            <w:r>
+              <w:t>external</w:t>
+            </w:r>
+            <w:proofErr w:type="gramEnd"/>
+            <w:r>
+              <w:t>_id</w:t>
+            </w:r>
+            <w:proofErr w:type="spellEnd"/>
+          </w:p>
+          <w:p>
+            <w:r>
+              <w:t xml:space="preserve">    </w:t>
+            </w:r>
+            <w:proofErr w:type="gramStart"/>
+            <w:r>
+              <w:t>used  =</w:t>
+            </w:r>
+            <w:proofErr w:type="gramEnd"/>
+            <w:r>
+              <w:t xml:space="preserve"> </w:t>
+            </w:r>
+            <w:proofErr w:type="spellStart"/>
+            <w:r>
+              <w:t>attack.get_techniques_used_by_group</w:t>
+            </w:r>
+            <w:proofErr w:type="spellEnd"/>
+            <w:r>
+              <w:t>(g.id)</w:t>
+            </w:r>
+          </w:p>
+          <w:p>
+            <w:r>
+              <w:t>    techs = [(t["object"</w:t>
+            </w:r>
+            <w:proofErr w:type="gramStart"/>
+            <w:r>
+              <w:t>].</w:t>
+            </w:r>
+            <w:proofErr w:type="spellStart"/>
+            <w:r>
+              <w:t>external</w:t>
+            </w:r>
+            <w:proofErr w:type="gramEnd"/>
+            <w:r>
+              <w:t>_</w:t>
+            </w:r>
+            <w:proofErr w:type="gramStart"/>
+            <w:r>
+              <w:t>references</w:t>
+            </w:r>
+            <w:proofErr w:type="spellEnd"/>
+            <w:r>
+              <w:t>[</w:t>
+            </w:r>
+            <w:proofErr w:type="gramEnd"/>
+            <w:r>
+              <w:t>0</w:t>
+            </w:r>
+            <w:proofErr w:type="gramStart"/>
+            <w:r>
+              <w:t>].</w:t>
+            </w:r>
+            <w:proofErr w:type="spellStart"/>
+            <w:r>
+              <w:t>external</w:t>
+            </w:r>
+            <w:proofErr w:type="gramEnd"/>
+            <w:r>
+              <w:t>_id</w:t>
+            </w:r>
+            <w:proofErr w:type="spellEnd"/>
+            <w:r>
+              <w:t>, t["object"].name)</w:t>
+            </w:r>
+          </w:p>
+          <w:p>
+            <w:r>
+              <w:t xml:space="preserve">             for t in </w:t>
+            </w:r>
+            <w:proofErr w:type="gramStart"/>
+            <w:r>
+              <w:t>used[</w:t>
+            </w:r>
+            <w:proofErr w:type="gramEnd"/>
+            <w:r>
+              <w:t>:15]]</w:t>
+            </w:r>
+          </w:p>
+          <w:p>
+            <w:r>
+              <w:lastRenderedPageBreak/>
+              <w:t xml:space="preserve">    </w:t>
+            </w:r>
+            <w:proofErr w:type="spellStart"/>
+            <w:r>
+              <w:t>tactic_choices</w:t>
+            </w:r>
+            <w:proofErr w:type="spellEnd"/>
+            <w:r>
+              <w:t xml:space="preserve"> = ["</w:t>
+            </w:r>
+            <w:proofErr w:type="spellStart"/>
+            <w:r>
+              <w:t>persistence","lateral-movement","execution","collection</w:t>
+            </w:r>
+            <w:proofErr w:type="spellEnd"/>
+            <w:r>
+              <w:t>"]</w:t>
+            </w:r>
+          </w:p>
+          <w:p>
+            <w:r>
+              <w:t xml:space="preserve">    </w:t>
+            </w:r>
+            <w:proofErr w:type="spellStart"/>
+            <w:r>
+              <w:t>chosen_</w:t>
+            </w:r>
+            <w:proofErr w:type="gramStart"/>
+            <w:r>
+              <w:t>tactic</w:t>
+            </w:r>
+            <w:proofErr w:type="spellEnd"/>
+            <w:r>
+              <w:t xml:space="preserve">  =</w:t>
+            </w:r>
+            <w:proofErr w:type="gramEnd"/>
+            <w:r>
+              <w:t xml:space="preserve"> </w:t>
+            </w:r>
+            <w:proofErr w:type="spellStart"/>
+            <w:proofErr w:type="gramStart"/>
+            <w:r>
+              <w:t>random.choice</w:t>
+            </w:r>
+            <w:proofErr w:type="spellEnd"/>
+            <w:proofErr w:type="gramEnd"/>
+            <w:r>
+              <w:t>(</w:t>
+            </w:r>
+            <w:proofErr w:type="spellStart"/>
+            <w:r>
+              <w:t>tactic_choices</w:t>
+            </w:r>
+            <w:proofErr w:type="spellEnd"/>
+            <w:r>
+              <w:t>)</w:t>
+            </w:r>
+          </w:p>
+          <w:p>
+            <w:r>
+              <w:t>    filtered = [(</w:t>
+            </w:r>
+            <w:proofErr w:type="spellStart"/>
+            <w:proofErr w:type="gramStart"/>
+            <w:r>
+              <w:t>tid,name</w:t>
+            </w:r>
+            <w:proofErr w:type="spellEnd"/>
+            <w:proofErr w:type="gramEnd"/>
+            <w:r>
+              <w:t xml:space="preserve">) for </w:t>
+            </w:r>
+            <w:proofErr w:type="spellStart"/>
+            <w:proofErr w:type="gramStart"/>
+            <w:r>
+              <w:t>tid,name</w:t>
+            </w:r>
+            <w:proofErr w:type="spellEnd"/>
+            <w:proofErr w:type="gramEnd"/>
+            <w:r>
+              <w:t xml:space="preserve"> in techs</w:t>
+            </w:r>
+          </w:p>
+          <w:p>
+            <w:r>
+              <w:t xml:space="preserve">                if </w:t>
+            </w:r>
+            <w:proofErr w:type="gramStart"/>
+            <w:r>
+              <w:t>any(</w:t>
+            </w:r>
+            <w:proofErr w:type="spellStart"/>
+            <w:r>
+              <w:t>p.phase</w:t>
+            </w:r>
+            <w:proofErr w:type="gramEnd"/>
+            <w:r>
+              <w:t>_name</w:t>
+            </w:r>
+            <w:proofErr w:type="spellEnd"/>
+            <w:r>
+              <w:t xml:space="preserve"> == </w:t>
+            </w:r>
+            <w:proofErr w:type="spellStart"/>
+            <w:r>
+              <w:t>chosen_tactic</w:t>
+            </w:r>
+            <w:proofErr w:type="spellEnd"/>
+          </w:p>
+          <w:p>
+            <w:r>
+              <w:t>                       for p in (techniques[</w:t>
+            </w:r>
+            <w:proofErr w:type="spellStart"/>
+            <w:r>
+              <w:t>tid</w:t>
+            </w:r>
+            <w:proofErr w:type="spellEnd"/>
+            <w:proofErr w:type="gramStart"/>
+            <w:r>
+              <w:t>].</w:t>
+            </w:r>
+            <w:proofErr w:type="spellStart"/>
+            <w:r>
+              <w:t>kill</w:t>
+            </w:r>
+            <w:proofErr w:type="gramEnd"/>
+            <w:r>
+              <w:t>_chain_phases</w:t>
+            </w:r>
+            <w:proofErr w:type="spellEnd"/>
+            <w:r>
+              <w:t xml:space="preserve"> or [])</w:t>
+            </w:r>
+          </w:p>
+          <w:p>
+            <w:r>
+              <w:t xml:space="preserve">                       if </w:t>
+            </w:r>
+            <w:proofErr w:type="spellStart"/>
+            <w:r>
+              <w:t>tid</w:t>
+            </w:r>
+            <w:proofErr w:type="spellEnd"/>
+            <w:r>
+              <w:t xml:space="preserve"> in techniques</w:t>
+            </w:r>
+            <w:proofErr w:type="gramStart"/>
+            <w:r>
+              <w:t>)][</w:t>
+            </w:r>
+            <w:proofErr w:type="gramEnd"/>
+            <w:r>
+              <w:t>:8]</w:t>
+            </w:r>
+          </w:p>
+          <w:p>
+            <w:r>
+              <w:t>    output = (f"**</w:t>
+            </w:r>
+            <w:proofErr w:type="gramStart"/>
+            <w:r>
+              <w:t>Group:*</w:t>
+            </w:r>
+            <w:proofErr w:type="gramEnd"/>
+            <w:r>
+              <w:t>* {g.name} ({gid</w:t>
+            </w:r>
+            <w:proofErr w:type="gramStart"/>
+            <w:r>
+              <w:t>})\</w:t>
+            </w:r>
+            <w:proofErr w:type="gramEnd"/>
+            <w:r>
+              <w:t>n"</w:t>
+            </w:r>
+          </w:p>
+          <w:p>
+            <w:r>
+              <w:t>              f"**</w:t>
+            </w:r>
+            <w:proofErr w:type="gramStart"/>
+            <w:r>
+              <w:t>Aliases:*</w:t>
+            </w:r>
+            <w:proofErr w:type="gramEnd"/>
+            <w:r>
+              <w:t xml:space="preserve">* {', </w:t>
+            </w:r>
+            <w:proofErr w:type="gramStart"/>
+            <w:r>
+              <w:t>'.join</w:t>
+            </w:r>
+            <w:proofErr w:type="gramEnd"/>
+            <w:r>
+              <w:t>(</w:t>
+            </w:r>
+            <w:proofErr w:type="spellStart"/>
+            <w:proofErr w:type="gramStart"/>
+            <w:r>
+              <w:t>g.aliases</w:t>
+            </w:r>
+            <w:proofErr w:type="spellEnd"/>
+            <w:proofErr w:type="gramEnd"/>
+            <w:r>
+              <w:t xml:space="preserve"> or []</w:t>
+            </w:r>
+            <w:proofErr w:type="gramStart"/>
+            <w:r>
+              <w:t>)}\</w:t>
+            </w:r>
+            <w:proofErr w:type="gramEnd"/>
+            <w:r>
+              <w:t>n"</w:t>
+            </w:r>
+          </w:p>
+          <w:p>
+            <w:r>
+              <w:t>              f"**</w:t>
+            </w:r>
+            <w:proofErr w:type="gramStart"/>
+            <w:r>
+              <w:t>Overview:*</w:t>
+            </w:r>
+            <w:proofErr w:type="gramEnd"/>
+            <w:r>
+              <w:t>* {safe(</w:t>
+            </w:r>
+            <w:proofErr w:type="spellStart"/>
+            <w:proofErr w:type="gramStart"/>
+            <w:r>
+              <w:t>g.description</w:t>
+            </w:r>
+            <w:proofErr w:type="spellEnd"/>
+            <w:r>
+              <w:t>)[</w:t>
+            </w:r>
+            <w:proofErr w:type="gramEnd"/>
+            <w:r>
+              <w:t>:400</w:t>
+            </w:r>
+            <w:proofErr w:type="gramStart"/>
+            <w:r>
+              <w:t>]}\</w:t>
+            </w:r>
+            <w:proofErr w:type="gramEnd"/>
+            <w:r>
+              <w:t>n"</w:t>
+            </w:r>
+          </w:p>
+          <w:p>
+            <w:r>
+              <w:t>              f"**{</w:t>
+            </w:r>
+            <w:proofErr w:type="spellStart"/>
+            <w:r>
+              <w:t>chosen_</w:t>
+            </w:r>
+            <w:proofErr w:type="gramStart"/>
+            <w:r>
+              <w:t>tactic.title</w:t>
+            </w:r>
+            <w:proofErr w:type="spellEnd"/>
+            <w:proofErr w:type="gramEnd"/>
+            <w:r>
+              <w:t xml:space="preserve">()} </w:t>
+            </w:r>
+            <w:proofErr w:type="gramStart"/>
+            <w:r>
+              <w:t>TTPs:*</w:t>
+            </w:r>
+            <w:proofErr w:type="gramEnd"/>
+            <w:r>
+              <w:t>*\n" +</w:t>
+            </w:r>
+          </w:p>
+          <w:p>
+            <w:r>
+              <w:t>              "\</w:t>
+            </w:r>
+            <w:proofErr w:type="spellStart"/>
+            <w:r>
+              <w:t>n</w:t>
+            </w:r>
+            <w:proofErr w:type="gramStart"/>
+            <w:r>
+              <w:t>".join</w:t>
+            </w:r>
+            <w:proofErr w:type="spellEnd"/>
+            <w:proofErr w:type="gramEnd"/>
+            <w:r>
+              <w:t>(f</w:t>
+            </w:r>
+            <w:proofErr w:type="gramStart"/>
+            <w:r>
+              <w:t>"  -</w:t>
+            </w:r>
+            <w:proofErr w:type="gramEnd"/>
+            <w:r>
+              <w:t xml:space="preserve"> {</w:t>
+            </w:r>
+            <w:proofErr w:type="spellStart"/>
+            <w:r>
+              <w:t>tid</w:t>
+            </w:r>
+            <w:proofErr w:type="spellEnd"/>
+            <w:r>
+              <w:t xml:space="preserve">}: {name}" for </w:t>
+            </w:r>
+            <w:proofErr w:type="spellStart"/>
+            <w:proofErr w:type="gramStart"/>
+            <w:r>
+              <w:t>tid,name</w:t>
+            </w:r>
+            <w:proofErr w:type="spellEnd"/>
+            <w:proofErr w:type="gramEnd"/>
+            <w:r>
+              <w:t xml:space="preserve"> in filtered))</w:t>
+            </w:r>
+          </w:p>
+          <w:p>
+            <w:r>
+              <w:t xml:space="preserve">    </w:t>
+            </w:r>
+            <w:proofErr w:type="spellStart"/>
+            <w:proofErr w:type="gramStart"/>
+            <w:r>
+              <w:t>dataset.append</w:t>
+            </w:r>
+            <w:proofErr w:type="spellEnd"/>
+            <w:proofErr w:type="gramEnd"/>
+            <w:r>
+              <w:t>(</w:t>
+            </w:r>
+            <w:proofErr w:type="spellStart"/>
+            <w:proofErr w:type="gramStart"/>
+            <w:r>
+              <w:t>fmt</w:t>
+            </w:r>
+            <w:proofErr w:type="spellEnd"/>
+            <w:r>
+              <w:t>(</w:t>
+            </w:r>
+            <w:proofErr w:type="gramEnd"/>
+          </w:p>
+          <w:p>
+            <w:r>
+              <w:t xml:space="preserve">        </w:t>
+            </w:r>
+            <w:proofErr w:type="spellStart"/>
+            <w:r>
+              <w:t>f"What</w:t>
+            </w:r>
+            <w:proofErr w:type="spellEnd"/>
+            <w:r>
+              <w:t xml:space="preserve"> {</w:t>
+            </w:r>
+            <w:proofErr w:type="spellStart"/>
+            <w:r>
+              <w:t>chosen_tactic</w:t>
+            </w:r>
+            <w:proofErr w:type="spellEnd"/>
+            <w:r>
+              <w:t>} techniques does {g.name} commonly use?", output))</w:t>
+            </w:r>
+          </w:p>
+          <w:p/>
+          <w:p>
+            <w:r>
+              <w:t># ── Template 3: Detection Strategy ──────────────────────────────────────────</w:t>
+            </w:r>
+          </w:p>
+          <w:p>
+            <w:r>
+              <w:t xml:space="preserve">for </w:t>
+            </w:r>
+            <w:proofErr w:type="spellStart"/>
+            <w:r>
+              <w:t>tid</w:t>
+            </w:r>
+            <w:proofErr w:type="spellEnd"/>
+            <w:r>
+              <w:t>, t in list(</w:t>
+            </w:r>
+            <w:proofErr w:type="spellStart"/>
+            <w:proofErr w:type="gramStart"/>
+            <w:r>
+              <w:t>techniques.items</w:t>
+            </w:r>
+            <w:proofErr w:type="spellEnd"/>
+            <w:proofErr w:type="gramEnd"/>
+            <w:r>
+              <w:t>(</w:t>
+            </w:r>
+            <w:proofErr w:type="gramStart"/>
+            <w:r>
+              <w:t>))[</w:t>
+            </w:r>
+            <w:proofErr w:type="gramEnd"/>
+            <w:r>
+              <w:t>:700]:</w:t>
+            </w:r>
+          </w:p>
+          <w:p>
+            <w:r>
+              <w:t xml:space="preserve">    detection = </w:t>
+            </w:r>
+            <w:proofErr w:type="gramStart"/>
+            <w:r>
+              <w:t>safe(</w:t>
+            </w:r>
+            <w:proofErr w:type="spellStart"/>
+            <w:r>
+              <w:t>getattr</w:t>
+            </w:r>
+            <w:proofErr w:type="spellEnd"/>
+            <w:r>
+              <w:t>(</w:t>
+            </w:r>
+            <w:proofErr w:type="gramEnd"/>
+            <w:r>
+              <w:t>t, "</w:t>
+            </w:r>
+            <w:proofErr w:type="spellStart"/>
+            <w:r>
+              <w:t>x_mitre_detection</w:t>
+            </w:r>
+            <w:proofErr w:type="spellEnd"/>
+            <w:r>
+              <w:t>", ""))</w:t>
+            </w:r>
+          </w:p>
+          <w:p>
+            <w:r>
+              <w:t xml:space="preserve">    if </w:t>
+            </w:r>
+            <w:proofErr w:type="spellStart"/>
+            <w:r>
+              <w:t>len</w:t>
+            </w:r>
+            <w:proofErr w:type="spellEnd"/>
+            <w:r>
+              <w:t>(detection) &lt; 50: continue</w:t>
+            </w:r>
+          </w:p>
+          <w:p>
+            <w:r>
+              <w:t>    output = (f"**Detecting {t.name} ({</w:t>
+            </w:r>
+            <w:proofErr w:type="spellStart"/>
+            <w:r>
+              <w:t>tid</w:t>
+            </w:r>
+            <w:proofErr w:type="spellEnd"/>
+            <w:proofErr w:type="gramStart"/>
+            <w:r>
+              <w:t>})*</w:t>
+            </w:r>
+            <w:proofErr w:type="gramEnd"/>
+            <w:r>
+              <w:t>*\n\n"</w:t>
+            </w:r>
+          </w:p>
+          <w:p>
+            <w:r>
+              <w:t xml:space="preserve">              f"**Data </w:t>
+            </w:r>
+            <w:proofErr w:type="gramStart"/>
+            <w:r>
+              <w:t>Sources:*</w:t>
+            </w:r>
+            <w:proofErr w:type="gramEnd"/>
+            <w:r>
+              <w:t>*\n{</w:t>
+            </w:r>
+            <w:proofErr w:type="gramStart"/>
+            <w:r>
+              <w:t>detection[</w:t>
+            </w:r>
+            <w:proofErr w:type="gramEnd"/>
+            <w:r>
+              <w:t>:500</w:t>
+            </w:r>
+            <w:proofErr w:type="gramStart"/>
+            <w:r>
+              <w:t>]}\n\n</w:t>
+            </w:r>
+            <w:proofErr w:type="gramEnd"/>
+            <w:r>
+              <w:t>"</w:t>
+            </w:r>
+          </w:p>
+          <w:p>
+            <w:r>
+              <w:t xml:space="preserve">              f"**Recommended </w:t>
+            </w:r>
+            <w:proofErr w:type="gramStart"/>
+            <w:r>
+              <w:t>Actions:*</w:t>
+            </w:r>
+            <w:proofErr w:type="gramEnd"/>
+            <w:r>
+              <w:t>*\n"</w:t>
+            </w:r>
+          </w:p>
+          <w:p>
+            <w:r>
+              <w:t>              f"- Enable command-line logging and process creation auditing\n"</w:t>
+            </w:r>
+          </w:p>
+          <w:p>
+            <w:r>
+              <w:t>              f"- Monitor for anomalous parent-child process relationships\n"</w:t>
+            </w:r>
+          </w:p>
+          <w:p>
+            <w:r>
+              <w:t>              f"- Alert on unusual network connections from targeted processes\n"</w:t>
+            </w:r>
+          </w:p>
+          <w:p>
+            <w:r>
+              <w:t>              f"- Correlate with threat intel for known {t.name} indicators")</w:t>
+            </w:r>
+          </w:p>
+          <w:p>
+            <w:r>
+              <w:t xml:space="preserve">    </w:t>
+            </w:r>
+            <w:proofErr w:type="spellStart"/>
+            <w:proofErr w:type="gramStart"/>
+            <w:r>
+              <w:t>dataset.append</w:t>
+            </w:r>
+            <w:proofErr w:type="spellEnd"/>
+            <w:proofErr w:type="gramEnd"/>
+            <w:r>
+              <w:t>(</w:t>
+            </w:r>
+            <w:proofErr w:type="spellStart"/>
+            <w:proofErr w:type="gramStart"/>
+            <w:r>
+              <w:t>fmt</w:t>
+            </w:r>
+            <w:proofErr w:type="spellEnd"/>
+            <w:r>
+              <w:t>(</w:t>
+            </w:r>
+            <w:proofErr w:type="spellStart"/>
+            <w:proofErr w:type="gramEnd"/>
+            <w:r>
+              <w:t>f"How</w:t>
+            </w:r>
+            <w:proofErr w:type="spellEnd"/>
+            <w:r>
+              <w:t xml:space="preserve"> would a SOC analyst detect {t.name} ({</w:t>
+            </w:r>
+            <w:proofErr w:type="spellStart"/>
+            <w:r>
+              <w:t>tid</w:t>
+            </w:r>
+            <w:proofErr w:type="spellEnd"/>
+            <w:r>
+              <w:t>})?", output))</w:t>
+            </w:r>
+          </w:p>
+          <w:p/>
+          <w:p>
+            <w:r>
+              <w:t># ── Template 4: Scenario Analysis ────────────────────────────────────────────</w:t>
+            </w:r>
+          </w:p>
+          <w:p>
+            <w:proofErr w:type="spellStart"/>
+            <w:r>
+              <w:t>tactic_pairs</w:t>
+            </w:r>
+            <w:proofErr w:type="spellEnd"/>
+            <w:r>
+              <w:t xml:space="preserve"> = [("initial-</w:t>
+            </w:r>
+            <w:proofErr w:type="spellStart"/>
+            <w:r>
+              <w:t>access","execution</w:t>
+            </w:r>
+            <w:proofErr w:type="spellEnd"/>
+            <w:r>
+              <w:t>"),</w:t>
+            </w:r>
+          </w:p>
+          <w:p>
+            <w:r>
+              <w:t>                ("</w:t>
+            </w:r>
+            <w:proofErr w:type="spellStart"/>
+            <w:r>
+              <w:t>execution","persistence</w:t>
+            </w:r>
+            <w:proofErr w:type="spellEnd"/>
+            <w:r>
+              <w:t>"),</w:t>
+            </w:r>
+          </w:p>
+          <w:p>
+            <w:r>
+              <w:t>                ("</w:t>
+            </w:r>
+            <w:proofErr w:type="spellStart"/>
+            <w:r>
+              <w:t>persistence","lateral</w:t>
+            </w:r>
+            <w:proofErr w:type="spellEnd"/>
+            <w:r>
+              <w:t>-movement")]</w:t>
+            </w:r>
+          </w:p>
+          <w:p>
+            <w:r>
+              <w:t xml:space="preserve">for t1, t2 in </w:t>
+            </w:r>
+            <w:proofErr w:type="spellStart"/>
+            <w:r>
+              <w:t>tactic_pairs</w:t>
+            </w:r>
+            <w:proofErr w:type="spellEnd"/>
+            <w:r>
+              <w:t>:</w:t>
+            </w:r>
+          </w:p>
+          <w:p>
+            <w:r>
+              <w:t xml:space="preserve">    t1_techs = [techniques[x] for x in </w:t>
+            </w:r>
+            <w:proofErr w:type="spellStart"/>
+            <w:r>
+              <w:t>idx</w:t>
+            </w:r>
+            <w:proofErr w:type="spellEnd"/>
+            <w:r>
+              <w:t>["</w:t>
+            </w:r>
+            <w:proofErr w:type="spellStart"/>
+            <w:r>
+              <w:t>tactic_to_techs</w:t>
+            </w:r>
+            <w:proofErr w:type="spellEnd"/>
+            <w:r>
+              <w:t>"</w:t>
+            </w:r>
+            <w:proofErr w:type="gramStart"/>
+            <w:r>
+              <w:t>].get</w:t>
+            </w:r>
+            <w:proofErr w:type="gramEnd"/>
+            <w:r>
+              <w:t>(t</w:t>
+            </w:r>
+            <w:proofErr w:type="gramStart"/>
+            <w:r>
+              <w:t>1,[</w:t>
+            </w:r>
+            <w:proofErr w:type="gramEnd"/>
+            <w:r>
+              <w:t>])</w:t>
+            </w:r>
+          </w:p>
+          <w:p>
+            <w:r>
+              <w:t xml:space="preserve">                if x in </w:t>
+            </w:r>
+            <w:proofErr w:type="gramStart"/>
+            <w:r>
+              <w:t>techniques][</w:t>
+            </w:r>
+            <w:proofErr w:type="gramEnd"/>
+            <w:r>
+              <w:t>:5]</w:t>
+            </w:r>
+          </w:p>
+          <w:p>
+            <w:r>
+              <w:t xml:space="preserve">    t2_techs = [techniques[x] for x in </w:t>
+            </w:r>
+            <w:proofErr w:type="spellStart"/>
+            <w:r>
+              <w:t>idx</w:t>
+            </w:r>
+            <w:proofErr w:type="spellEnd"/>
+            <w:r>
+              <w:t>["</w:t>
+            </w:r>
+            <w:proofErr w:type="spellStart"/>
+            <w:r>
+              <w:t>tactic_to_techs</w:t>
+            </w:r>
+            <w:proofErr w:type="spellEnd"/>
+            <w:r>
+              <w:t>"</w:t>
+            </w:r>
+            <w:proofErr w:type="gramStart"/>
+            <w:r>
+              <w:t>].get</w:t>
+            </w:r>
+            <w:proofErr w:type="gramEnd"/>
+            <w:r>
+              <w:t>(t</w:t>
+            </w:r>
+            <w:proofErr w:type="gramStart"/>
+            <w:r>
+              <w:t>2,[</w:t>
+            </w:r>
+            <w:proofErr w:type="gramEnd"/>
+            <w:r>
+              <w:t>])</w:t>
+            </w:r>
+          </w:p>
+          <w:p>
+            <w:r>
+              <w:t xml:space="preserve">                if x in </w:t>
+            </w:r>
+            <w:proofErr w:type="gramStart"/>
+            <w:r>
+              <w:t>techniques][</w:t>
+            </w:r>
+            <w:proofErr w:type="gramEnd"/>
+            <w:r>
+              <w:t>:5]</w:t>
+            </w:r>
+          </w:p>
+          <w:p>
+            <w:r>
+              <w:t>    for ta in t1_techs:</w:t>
+            </w:r>
+          </w:p>
+          <w:p>
+            <w:r>
+              <w:t>        for tb in t2_techs:</w:t>
+            </w:r>
+          </w:p>
+          <w:p>
+            <w:r>
+              <w:t xml:space="preserve">            </w:t>
+            </w:r>
+            <w:proofErr w:type="spellStart"/>
+            <w:r>
+              <w:t>ta_id</w:t>
+            </w:r>
+            <w:proofErr w:type="spellEnd"/>
+            <w:r>
+              <w:t xml:space="preserve"> = </w:t>
+            </w:r>
+            <w:proofErr w:type="spellStart"/>
+            <w:proofErr w:type="gramStart"/>
+            <w:r>
+              <w:t>ta.external</w:t>
+            </w:r>
+            <w:proofErr w:type="gramEnd"/>
+            <w:r>
+              <w:t>_</w:t>
+            </w:r>
+            <w:proofErr w:type="gramStart"/>
+            <w:r>
+              <w:t>references</w:t>
+            </w:r>
+            <w:proofErr w:type="spellEnd"/>
+            <w:r>
+              <w:t>[</w:t>
+            </w:r>
+            <w:proofErr w:type="gramEnd"/>
+            <w:r>
+              <w:t>0</w:t>
+            </w:r>
+            <w:proofErr w:type="gramStart"/>
+            <w:r>
+              <w:t>].</w:t>
+            </w:r>
+            <w:proofErr w:type="spellStart"/>
+            <w:r>
+              <w:t>external</w:t>
+            </w:r>
+            <w:proofErr w:type="gramEnd"/>
+            <w:r>
+              <w:t>_id</w:t>
+            </w:r>
+            <w:proofErr w:type="spellEnd"/>
+          </w:p>
+          <w:p>
+            <w:r>
+              <w:t xml:space="preserve">            </w:t>
+            </w:r>
+            <w:proofErr w:type="spellStart"/>
+            <w:r>
+              <w:t>tb_id</w:t>
+            </w:r>
+            <w:proofErr w:type="spellEnd"/>
+            <w:r>
+              <w:t xml:space="preserve"> = </w:t>
+            </w:r>
+            <w:proofErr w:type="spellStart"/>
+            <w:proofErr w:type="gramStart"/>
+            <w:r>
+              <w:t>tb.external</w:t>
+            </w:r>
+            <w:proofErr w:type="gramEnd"/>
+            <w:r>
+              <w:t>_</w:t>
+            </w:r>
+            <w:proofErr w:type="gramStart"/>
+            <w:r>
+              <w:t>references</w:t>
+            </w:r>
+            <w:proofErr w:type="spellEnd"/>
+            <w:r>
+              <w:t>[</w:t>
+            </w:r>
+            <w:proofErr w:type="gramEnd"/>
+            <w:r>
+              <w:t>0</w:t>
+            </w:r>
+            <w:proofErr w:type="gramStart"/>
+            <w:r>
+              <w:t>].</w:t>
+            </w:r>
+            <w:proofErr w:type="spellStart"/>
+            <w:r>
+              <w:t>external</w:t>
+            </w:r>
+            <w:proofErr w:type="gramEnd"/>
+            <w:r>
+              <w:t>_id</w:t>
+            </w:r>
+            <w:proofErr w:type="spellEnd"/>
+          </w:p>
+          <w:p>
+            <w:r>
+              <w:t xml:space="preserve">            </w:t>
+            </w:r>
+            <w:proofErr w:type="spellStart"/>
+            <w:r>
+              <w:t>groups_a</w:t>
+            </w:r>
+            <w:proofErr w:type="spellEnd"/>
+            <w:r>
+              <w:t xml:space="preserve"> = </w:t>
+            </w:r>
+            <w:proofErr w:type="spellStart"/>
+            <w:r>
+              <w:t>idx</w:t>
+            </w:r>
+            <w:proofErr w:type="spellEnd"/>
+            <w:r>
+              <w:t>["</w:t>
+            </w:r>
+            <w:proofErr w:type="spellStart"/>
+            <w:r>
+              <w:t>tech_to_groups</w:t>
+            </w:r>
+            <w:proofErr w:type="spellEnd"/>
+            <w:r>
+              <w:t>"</w:t>
+            </w:r>
+            <w:proofErr w:type="gramStart"/>
+            <w:r>
+              <w:t>].get</w:t>
+            </w:r>
+            <w:proofErr w:type="gramEnd"/>
+            <w:r>
+              <w:t>(</w:t>
+            </w:r>
+            <w:proofErr w:type="spellStart"/>
+            <w:r>
+              <w:t>ta_id</w:t>
+            </w:r>
+            <w:proofErr w:type="spellEnd"/>
+            <w:r>
+              <w:t>, [])</w:t>
+            </w:r>
+          </w:p>
+          <w:p>
+            <w:r>
+              <w:t xml:space="preserve">            </w:t>
+            </w:r>
+            <w:proofErr w:type="spellStart"/>
+            <w:r>
+              <w:t>groups_b</w:t>
+            </w:r>
+            <w:proofErr w:type="spellEnd"/>
+            <w:r>
+              <w:t xml:space="preserve"> = </w:t>
+            </w:r>
+            <w:proofErr w:type="spellStart"/>
+            <w:r>
+              <w:t>idx</w:t>
+            </w:r>
+            <w:proofErr w:type="spellEnd"/>
+            <w:r>
+              <w:t>["</w:t>
+            </w:r>
+            <w:proofErr w:type="spellStart"/>
+            <w:r>
+              <w:t>tech_to_groups</w:t>
+            </w:r>
+            <w:proofErr w:type="spellEnd"/>
+            <w:r>
+              <w:t>"</w:t>
+            </w:r>
+            <w:proofErr w:type="gramStart"/>
+            <w:r>
+              <w:t>].get</w:t>
+            </w:r>
+            <w:proofErr w:type="gramEnd"/>
+            <w:r>
+              <w:t>(</w:t>
+            </w:r>
+            <w:proofErr w:type="spellStart"/>
+            <w:r>
+              <w:t>tb_id</w:t>
+            </w:r>
+            <w:proofErr w:type="spellEnd"/>
+            <w:r>
+              <w:t>, [])</w:t>
+            </w:r>
+          </w:p>
+          <w:p>
+            <w:r>
+              <w:t xml:space="preserve">            </w:t>
+            </w:r>
+            <w:proofErr w:type="gramStart"/>
+            <w:r>
+              <w:t>overlap  =</w:t>
+            </w:r>
+            <w:proofErr w:type="gramEnd"/>
+            <w:r>
+              <w:t xml:space="preserve"> list(set(</w:t>
+            </w:r>
+            <w:proofErr w:type="spellStart"/>
+            <w:r>
+              <w:t>groups_a</w:t>
+            </w:r>
+            <w:proofErr w:type="spellEnd"/>
+            <w:r>
+              <w:t>) &amp; set(</w:t>
+            </w:r>
+            <w:proofErr w:type="spellStart"/>
+            <w:r>
+              <w:t>groups_b</w:t>
+            </w:r>
+            <w:proofErr w:type="spellEnd"/>
+            <w:proofErr w:type="gramStart"/>
+            <w:r>
+              <w:t>))[</w:t>
+            </w:r>
+            <w:proofErr w:type="gramEnd"/>
+            <w:r>
+              <w:t>:4]</w:t>
+            </w:r>
+          </w:p>
+          <w:p>
+            <w:r>
+              <w:t>            output = (f"**TTP Analysis: {ta.name} → {</w:t>
+            </w:r>
+            <w:proofErr w:type="gramStart"/>
+            <w:r>
+              <w:t>tb.name}*</w:t>
+            </w:r>
+            <w:proofErr w:type="gramEnd"/>
+            <w:r>
+              <w:t>*\n\n"</w:t>
+            </w:r>
+          </w:p>
+          <w:p>
+            <w:r>
+              <w:t xml:space="preserve">                      </w:t>
+            </w:r>
+            <w:proofErr w:type="spellStart"/>
+            <w:r>
+              <w:t>f"This</w:t>
+            </w:r>
+            <w:proofErr w:type="spellEnd"/>
+            <w:r>
+              <w:t xml:space="preserve"> combination ({</w:t>
+            </w:r>
+            <w:proofErr w:type="spellStart"/>
+            <w:r>
+              <w:t>ta_id</w:t>
+            </w:r>
+            <w:proofErr w:type="spellEnd"/>
+            <w:r>
+              <w:t>} + {</w:t>
+            </w:r>
+            <w:proofErr w:type="spellStart"/>
+            <w:r>
+              <w:t>tb_id</w:t>
+            </w:r>
+            <w:proofErr w:type="spellEnd"/>
+            <w:r>
+              <w:t>}) is consistent with "</w:t>
+            </w:r>
+          </w:p>
+          <w:p>
+            <w:r>
+              <w:t xml:space="preserve">                      f"{'several known threat actors' if not overlap else ', </w:t>
+            </w:r>
+            <w:proofErr w:type="gramStart"/>
+            <w:r>
+              <w:t>'.join</w:t>
+            </w:r>
+            <w:proofErr w:type="gramEnd"/>
+            <w:r>
+              <w:t>(overlap)</w:t>
+            </w:r>
+            <w:proofErr w:type="gramStart"/>
+            <w:r>
+              <w:t>}.\n\n</w:t>
+            </w:r>
+            <w:proofErr w:type="gramEnd"/>
+            <w:r>
+              <w:t>"</w:t>
+            </w:r>
+          </w:p>
+          <w:p>
+            <w:r>
+              <w:lastRenderedPageBreak/>
+              <w:t>                      f"**</w:t>
+            </w:r>
+            <w:proofErr w:type="gramStart"/>
+            <w:r>
+              <w:t>Assessment:*</w:t>
+            </w:r>
+            <w:proofErr w:type="gramEnd"/>
+            <w:r>
+              <w:t>* The use of {ta.name} for {t</w:t>
+            </w:r>
+            <w:proofErr w:type="gramStart"/>
+            <w:r>
+              <w:t>1.replace</w:t>
+            </w:r>
+            <w:proofErr w:type="gramEnd"/>
+            <w:r>
+              <w:t>('-',' ')} "</w:t>
+            </w:r>
+          </w:p>
+          <w:p>
+            <w:r>
+              <w:t xml:space="preserve">                      </w:t>
+            </w:r>
+            <w:proofErr w:type="spellStart"/>
+            <w:r>
+              <w:t>f"followed</w:t>
+            </w:r>
+            <w:proofErr w:type="spellEnd"/>
+            <w:r>
+              <w:t xml:space="preserve"> by {tb.name} for {t</w:t>
+            </w:r>
+            <w:proofErr w:type="gramStart"/>
+            <w:r>
+              <w:t>2.replace</w:t>
+            </w:r>
+            <w:proofErr w:type="gramEnd"/>
+            <w:r>
+              <w:t>('-',' ')} is a "</w:t>
+            </w:r>
+          </w:p>
+          <w:p>
+            <w:r>
+              <w:t xml:space="preserve">                      f"{'common' if overlap else 'less common'} attack </w:t>
+            </w:r>
+            <w:proofErr w:type="gramStart"/>
+            <w:r>
+              <w:t>chain.\n\n</w:t>
+            </w:r>
+            <w:proofErr w:type="gramEnd"/>
+            <w:r>
+              <w:t>"</w:t>
+            </w:r>
+          </w:p>
+          <w:p>
+            <w:r>
+              <w:t xml:space="preserve">                      f"**Recommended </w:t>
+            </w:r>
+            <w:proofErr w:type="gramStart"/>
+            <w:r>
+              <w:t>monitoring:*</w:t>
+            </w:r>
+            <w:proofErr w:type="gramEnd"/>
+            <w:r>
+              <w:t>* Correlate {</w:t>
+            </w:r>
+            <w:proofErr w:type="spellStart"/>
+            <w:r>
+              <w:t>ta_id</w:t>
+            </w:r>
+            <w:proofErr w:type="spellEnd"/>
+            <w:r>
+              <w:t>} indicators with "</w:t>
+            </w:r>
+          </w:p>
+          <w:p>
+            <w:r>
+              <w:t>                      f"{</w:t>
+            </w:r>
+            <w:proofErr w:type="spellStart"/>
+            <w:r>
+              <w:t>tb_id</w:t>
+            </w:r>
+            <w:proofErr w:type="spellEnd"/>
+            <w:r>
+              <w:t>} artifacts within a 24-hour window.")</w:t>
+            </w:r>
+          </w:p>
+          <w:p>
+            <w:r>
+              <w:t xml:space="preserve">            </w:t>
+            </w:r>
+            <w:proofErr w:type="spellStart"/>
+            <w:proofErr w:type="gramStart"/>
+            <w:r>
+              <w:t>dataset.append</w:t>
+            </w:r>
+            <w:proofErr w:type="spellEnd"/>
+            <w:proofErr w:type="gramEnd"/>
+            <w:r>
+              <w:t>(</w:t>
+            </w:r>
+            <w:proofErr w:type="spellStart"/>
+            <w:proofErr w:type="gramStart"/>
+            <w:r>
+              <w:t>fmt</w:t>
+            </w:r>
+            <w:proofErr w:type="spellEnd"/>
+            <w:r>
+              <w:t>(</w:t>
+            </w:r>
+            <w:proofErr w:type="gramEnd"/>
+          </w:p>
+          <w:p>
+            <w:r>
+              <w:t xml:space="preserve">                </w:t>
+            </w:r>
+            <w:proofErr w:type="spellStart"/>
+            <w:r>
+              <w:t>f"An</w:t>
+            </w:r>
+            <w:proofErr w:type="spellEnd"/>
+            <w:r>
+              <w:t xml:space="preserve"> attacker used {ta.name} then {tb.name}. What actor profiles match?",</w:t>
+            </w:r>
+          </w:p>
+          <w:p>
+            <w:r>
+              <w:t>                output))</w:t>
+            </w:r>
+          </w:p>
+          <w:p>
+            <w:r>
+              <w:t xml:space="preserve">            if </w:t>
+            </w:r>
+            <w:proofErr w:type="spellStart"/>
+            <w:r>
+              <w:t>len</w:t>
+            </w:r>
+            <w:proofErr w:type="spellEnd"/>
+            <w:r>
+              <w:t>(dataset) &gt; 4500: break</w:t>
+            </w:r>
+          </w:p>
+          <w:p/>
+          <w:p>
+            <w:r>
+              <w:t># ── Template 5: Lateral Movement Prediction ──────────────────────────────────</w:t>
+            </w:r>
+          </w:p>
+          <w:p>
+            <w:proofErr w:type="spellStart"/>
+            <w:r>
+              <w:t>lm_techs</w:t>
+            </w:r>
+            <w:proofErr w:type="spellEnd"/>
+            <w:r>
+              <w:t xml:space="preserve"> = [techniques[x] for x in </w:t>
+            </w:r>
+            <w:proofErr w:type="spellStart"/>
+            <w:r>
+              <w:t>idx</w:t>
+            </w:r>
+            <w:proofErr w:type="spellEnd"/>
+            <w:r>
+              <w:t>["</w:t>
+            </w:r>
+            <w:proofErr w:type="spellStart"/>
+            <w:r>
+              <w:t>tactic_to_techs</w:t>
+            </w:r>
+            <w:proofErr w:type="spellEnd"/>
+            <w:r>
+              <w:t>"</w:t>
+            </w:r>
+            <w:proofErr w:type="gramStart"/>
+            <w:r>
+              <w:t>].get</w:t>
+            </w:r>
+            <w:proofErr w:type="gramEnd"/>
+            <w:r>
+              <w:t>("lateral-movement</w:t>
+            </w:r>
+            <w:proofErr w:type="gramStart"/>
+            <w:r>
+              <w:t>",[</w:t>
+            </w:r>
+            <w:proofErr w:type="gramEnd"/>
+            <w:r>
+              <w:t>])</w:t>
+            </w:r>
+          </w:p>
+          <w:p>
+            <w:r>
+              <w:t>            if x in techniques]</w:t>
+            </w:r>
+          </w:p>
+          <w:p>
+            <w:r>
+              <w:t xml:space="preserve">for g in </w:t>
+            </w:r>
+            <w:proofErr w:type="gramStart"/>
+            <w:r>
+              <w:t>groups[</w:t>
+            </w:r>
+            <w:proofErr w:type="gramEnd"/>
+            <w:r>
+              <w:t>:60]:</w:t>
+            </w:r>
+          </w:p>
+          <w:p>
+            <w:r>
+              <w:t xml:space="preserve">    gid   = </w:t>
+            </w:r>
+            <w:proofErr w:type="spellStart"/>
+            <w:proofErr w:type="gramStart"/>
+            <w:r>
+              <w:t>g.external</w:t>
+            </w:r>
+            <w:proofErr w:type="gramEnd"/>
+            <w:r>
+              <w:t>_</w:t>
+            </w:r>
+            <w:proofErr w:type="gramStart"/>
+            <w:r>
+              <w:t>references</w:t>
+            </w:r>
+            <w:proofErr w:type="spellEnd"/>
+            <w:r>
+              <w:t>[</w:t>
+            </w:r>
+            <w:proofErr w:type="gramEnd"/>
+            <w:r>
+              <w:t>0</w:t>
+            </w:r>
+            <w:proofErr w:type="gramStart"/>
+            <w:r>
+              <w:t>].</w:t>
+            </w:r>
+            <w:proofErr w:type="spellStart"/>
+            <w:r>
+              <w:t>external</w:t>
+            </w:r>
+            <w:proofErr w:type="gramEnd"/>
+            <w:r>
+              <w:t>_id</w:t>
+            </w:r>
+            <w:proofErr w:type="spellEnd"/>
+          </w:p>
+          <w:p>
+            <w:r>
+              <w:t xml:space="preserve">    </w:t>
+            </w:r>
+            <w:proofErr w:type="gramStart"/>
+            <w:r>
+              <w:t>used  =</w:t>
+            </w:r>
+            <w:proofErr w:type="gramEnd"/>
+            <w:r>
+              <w:t xml:space="preserve"> {t["object"</w:t>
+            </w:r>
+            <w:proofErr w:type="gramStart"/>
+            <w:r>
+              <w:t>].</w:t>
+            </w:r>
+            <w:proofErr w:type="spellStart"/>
+            <w:r>
+              <w:t>external</w:t>
+            </w:r>
+            <w:proofErr w:type="gramEnd"/>
+            <w:r>
+              <w:t>_</w:t>
+            </w:r>
+            <w:proofErr w:type="gramStart"/>
+            <w:r>
+              <w:t>references</w:t>
+            </w:r>
+            <w:proofErr w:type="spellEnd"/>
+            <w:r>
+              <w:t>[</w:t>
+            </w:r>
+            <w:proofErr w:type="gramEnd"/>
+            <w:r>
+              <w:t>0</w:t>
+            </w:r>
+            <w:proofErr w:type="gramStart"/>
+            <w:r>
+              <w:t>].</w:t>
+            </w:r>
+            <w:proofErr w:type="spellStart"/>
+            <w:r>
+              <w:t>external</w:t>
+            </w:r>
+            <w:proofErr w:type="gramEnd"/>
+            <w:r>
+              <w:t>_id</w:t>
+            </w:r>
+            <w:proofErr w:type="spellEnd"/>
+          </w:p>
+          <w:p>
+            <w:r>
+              <w:t xml:space="preserve">             for t in </w:t>
+            </w:r>
+            <w:proofErr w:type="spellStart"/>
+            <w:r>
+              <w:t>attack.get_techniques_used_by_group</w:t>
+            </w:r>
+            <w:proofErr w:type="spellEnd"/>
+            <w:r>
+              <w:t>(g.id)}</w:t>
+            </w:r>
+          </w:p>
+          <w:p>
+            <w:r>
+              <w:t xml:space="preserve">    </w:t>
+            </w:r>
+            <w:proofErr w:type="spellStart"/>
+            <w:r>
+              <w:t>likely_lm</w:t>
+            </w:r>
+            <w:proofErr w:type="spellEnd"/>
+            <w:r>
+              <w:t xml:space="preserve"> = [t for t in </w:t>
+            </w:r>
+            <w:proofErr w:type="spellStart"/>
+            <w:r>
+              <w:t>lm_techs</w:t>
+            </w:r>
+            <w:proofErr w:type="spellEnd"/>
+          </w:p>
+          <w:p>
+            <w:r>
+              <w:t xml:space="preserve">                 if </w:t>
+            </w:r>
+            <w:proofErr w:type="spellStart"/>
+            <w:proofErr w:type="gramStart"/>
+            <w:r>
+              <w:t>t.external</w:t>
+            </w:r>
+            <w:proofErr w:type="gramEnd"/>
+            <w:r>
+              <w:t>_</w:t>
+            </w:r>
+            <w:proofErr w:type="gramStart"/>
+            <w:r>
+              <w:t>references</w:t>
+            </w:r>
+            <w:proofErr w:type="spellEnd"/>
+            <w:r>
+              <w:t>[</w:t>
+            </w:r>
+            <w:proofErr w:type="gramEnd"/>
+            <w:r>
+              <w:t>0</w:t>
+            </w:r>
+            <w:proofErr w:type="gramStart"/>
+            <w:r>
+              <w:t>].</w:t>
+            </w:r>
+            <w:proofErr w:type="spellStart"/>
+            <w:r>
+              <w:t>external</w:t>
+            </w:r>
+            <w:proofErr w:type="gramEnd"/>
+            <w:r>
+              <w:t>_id</w:t>
+            </w:r>
+            <w:proofErr w:type="spellEnd"/>
+            <w:r>
+              <w:t xml:space="preserve"> in </w:t>
+            </w:r>
+            <w:proofErr w:type="gramStart"/>
+            <w:r>
+              <w:t>used][</w:t>
+            </w:r>
+            <w:proofErr w:type="gramEnd"/>
+            <w:r>
+              <w:t>:6]</w:t>
+            </w:r>
+          </w:p>
+          <w:p>
+            <w:r>
+              <w:t xml:space="preserve">    if not </w:t>
+            </w:r>
+            <w:proofErr w:type="spellStart"/>
+            <w:r>
+              <w:t>likely_lm</w:t>
+            </w:r>
+            <w:proofErr w:type="spellEnd"/>
+            <w:r>
+              <w:t>: continue</w:t>
+            </w:r>
+          </w:p>
+          <w:p>
+            <w:r>
+              <w:t>    lines = "\</w:t>
+            </w:r>
+            <w:proofErr w:type="spellStart"/>
+            <w:r>
+              <w:t>n</w:t>
+            </w:r>
+            <w:proofErr w:type="gramStart"/>
+            <w:r>
+              <w:t>".join</w:t>
+            </w:r>
+            <w:proofErr w:type="spellEnd"/>
+            <w:proofErr w:type="gramEnd"/>
+            <w:r>
+              <w:t>(</w:t>
+            </w:r>
+          </w:p>
+          <w:p>
+            <w:r>
+              <w:t>        f</w:t>
+            </w:r>
+            <w:proofErr w:type="gramStart"/>
+            <w:r>
+              <w:t>"  -</w:t>
+            </w:r>
+            <w:proofErr w:type="gramEnd"/>
+            <w:r>
+              <w:t xml:space="preserve"> {</w:t>
+            </w:r>
+            <w:proofErr w:type="spellStart"/>
+            <w:proofErr w:type="gramStart"/>
+            <w:r>
+              <w:t>t.external</w:t>
+            </w:r>
+            <w:proofErr w:type="gramEnd"/>
+            <w:r>
+              <w:t>_references</w:t>
+            </w:r>
+            <w:proofErr w:type="spellEnd"/>
+            <w:r>
+              <w:t>[0</w:t>
+            </w:r>
+            <w:proofErr w:type="gramStart"/>
+            <w:r>
+              <w:t>].</w:t>
+            </w:r>
+            <w:proofErr w:type="spellStart"/>
+            <w:r>
+              <w:t>external</w:t>
+            </w:r>
+            <w:proofErr w:type="gramEnd"/>
+            <w:r>
+              <w:t>_id</w:t>
+            </w:r>
+            <w:proofErr w:type="spellEnd"/>
+            <w:r>
+              <w:t>}: {t.name}"</w:t>
+            </w:r>
+          </w:p>
+          <w:p>
+            <w:r>
+              <w:t xml:space="preserve">        for t in </w:t>
+            </w:r>
+            <w:proofErr w:type="spellStart"/>
+            <w:r>
+              <w:t>likely_lm</w:t>
+            </w:r>
+            <w:proofErr w:type="spellEnd"/>
+            <w:r>
+              <w:t>)</w:t>
+            </w:r>
+          </w:p>
+          <w:p>
+            <w:r>
+              <w:t>    output = (f"**Lateral Movement Prediction for {g.</w:t>
+            </w:r>
+            <w:proofErr w:type="gramStart"/>
+            <w:r>
+              <w:t>name}*</w:t>
+            </w:r>
+            <w:proofErr w:type="gramEnd"/>
+            <w:r>
+              <w:t>*\n\n"</w:t>
+            </w:r>
+          </w:p>
+          <w:p>
+            <w:r>
+              <w:t xml:space="preserve">              </w:t>
+            </w:r>
+            <w:proofErr w:type="spellStart"/>
+            <w:r>
+              <w:t>f"Based</w:t>
+            </w:r>
+            <w:proofErr w:type="spellEnd"/>
+            <w:r>
+              <w:t xml:space="preserve"> on attributed TTPs, monitor for:\n{lines}\n\n"</w:t>
+            </w:r>
+          </w:p>
+          <w:p>
+            <w:r>
+              <w:t>              f"**</w:t>
+            </w:r>
+            <w:proofErr w:type="gramStart"/>
+            <w:r>
+              <w:t>Priority:*</w:t>
+            </w:r>
+            <w:proofErr w:type="gramEnd"/>
+            <w:r>
+              <w:t>* Focus detection on the first two techniques, "</w:t>
+            </w:r>
+          </w:p>
+          <w:p>
+            <w:r>
+              <w:t xml:space="preserve">              </w:t>
+            </w:r>
+            <w:proofErr w:type="spellStart"/>
+            <w:r>
+              <w:t>f"as</w:t>
+            </w:r>
+            <w:proofErr w:type="spellEnd"/>
+            <w:r>
+              <w:t xml:space="preserve"> they appear most frequently in {g.name} campaigns.\n"</w:t>
+            </w:r>
+          </w:p>
+          <w:p>
+            <w:r>
+              <w:t xml:space="preserve">              f"**Detection </w:t>
+            </w:r>
+            <w:proofErr w:type="gramStart"/>
+            <w:r>
+              <w:t>focus:*</w:t>
+            </w:r>
+            <w:proofErr w:type="gramEnd"/>
+            <w:r>
+              <w:t>* Internal SMB/RDP traffic, unusual "</w:t>
+            </w:r>
+          </w:p>
+          <w:p>
+            <w:r>
+              <w:t xml:space="preserve">              </w:t>
+            </w:r>
+            <w:proofErr w:type="spellStart"/>
+            <w:r>
+              <w:t>f"service</w:t>
+            </w:r>
+            <w:proofErr w:type="spellEnd"/>
+            <w:r>
+              <w:t xml:space="preserve"> creation, and credential reuse across hosts.")</w:t>
+            </w:r>
+          </w:p>
+          <w:p>
+            <w:r>
+              <w:t xml:space="preserve">    </w:t>
+            </w:r>
+            <w:proofErr w:type="spellStart"/>
+            <w:proofErr w:type="gramStart"/>
+            <w:r>
+              <w:t>dataset.append</w:t>
+            </w:r>
+            <w:proofErr w:type="spellEnd"/>
+            <w:proofErr w:type="gramEnd"/>
+            <w:r>
+              <w:t>(</w:t>
+            </w:r>
+            <w:proofErr w:type="spellStart"/>
+            <w:proofErr w:type="gramStart"/>
+            <w:r>
+              <w:t>fmt</w:t>
+            </w:r>
+            <w:proofErr w:type="spellEnd"/>
+            <w:r>
+              <w:t>(</w:t>
+            </w:r>
+            <w:proofErr w:type="gramEnd"/>
+          </w:p>
+          <w:p>
+            <w:r>
+              <w:t>        f"{g.name} has initial access and persistence. What lateral movement "</w:t>
+            </w:r>
+          </w:p>
+          <w:p>
+            <w:r>
+              <w:t xml:space="preserve">        </w:t>
+            </w:r>
+            <w:proofErr w:type="spellStart"/>
+            <w:r>
+              <w:t>f"techniques</w:t>
+            </w:r>
+            <w:proofErr w:type="spellEnd"/>
+            <w:r>
+              <w:t xml:space="preserve"> should we monitor?", output))</w:t>
+            </w:r>
+          </w:p>
+          <w:p/>
+          <w:p>
+            <w:proofErr w:type="spellStart"/>
+            <w:proofErr w:type="gramStart"/>
+            <w:r>
+              <w:t>random.shuffle</w:t>
+            </w:r>
+            <w:proofErr w:type="spellEnd"/>
+            <w:proofErr w:type="gramEnd"/>
+            <w:r>
+              <w:t>(dataset)</w:t>
+            </w:r>
+          </w:p>
+          <w:p>
+            <w:r>
+              <w:t xml:space="preserve">with </w:t>
+            </w:r>
+            <w:proofErr w:type="gramStart"/>
+            <w:r>
+              <w:t>open(</w:t>
+            </w:r>
+            <w:proofErr w:type="gramEnd"/>
+            <w:r>
+              <w:t>"</w:t>
+            </w:r>
+            <w:proofErr w:type="spellStart"/>
+            <w:r>
+              <w:t>clean_</w:t>
+            </w:r>
+            <w:proofErr w:type="gramStart"/>
+            <w:r>
+              <w:t>dataset.jsonl</w:t>
+            </w:r>
+            <w:proofErr w:type="spellEnd"/>
+            <w:proofErr w:type="gramEnd"/>
+            <w:r>
+              <w:t>", "w") as f:</w:t>
+            </w:r>
+          </w:p>
+          <w:p>
+            <w:r>
+              <w:t>    for ex in dataset:</w:t>
+            </w:r>
+          </w:p>
+          <w:p>
+            <w:r>
+              <w:t xml:space="preserve">        </w:t>
+            </w:r>
+            <w:proofErr w:type="spellStart"/>
+            <w:proofErr w:type="gramStart"/>
+            <w:r>
+              <w:t>f.write</w:t>
+            </w:r>
+            <w:proofErr w:type="spellEnd"/>
+            <w:proofErr w:type="gramEnd"/>
+            <w:r>
+              <w:t>(</w:t>
+            </w:r>
+            <w:proofErr w:type="spellStart"/>
+            <w:proofErr w:type="gramStart"/>
+            <w:r>
+              <w:t>json.dumps</w:t>
+            </w:r>
+            <w:proofErr w:type="spellEnd"/>
+            <w:proofErr w:type="gramEnd"/>
+            <w:r>
+              <w:t>(ex) + "\n")</w:t>
+            </w:r>
+          </w:p>
+          <w:p>
+            <w:proofErr w:type="gramStart"/>
+            <w:r>
+              <w:t>print(</w:t>
+            </w:r>
+            <w:proofErr w:type="spellStart"/>
+            <w:proofErr w:type="gramEnd"/>
+            <w:r>
+              <w:t>f"Clean</w:t>
+            </w:r>
+            <w:proofErr w:type="spellEnd"/>
+            <w:r>
+              <w:t xml:space="preserve"> dataset: {</w:t>
+            </w:r>
+            <w:proofErr w:type="spellStart"/>
+            <w:r>
+              <w:t>len</w:t>
+            </w:r>
+            <w:proofErr w:type="spellEnd"/>
+            <w:r>
+              <w:t xml:space="preserve">(dataset)} examples → </w:t>
+            </w:r>
+            <w:proofErr w:type="spellStart"/>
+            <w:r>
+              <w:t>clean_</w:t>
+            </w:r>
+            <w:proofErr w:type="gramStart"/>
+            <w:r>
+              <w:t>dataset.jsonl</w:t>
+            </w:r>
+            <w:proofErr w:type="spellEnd"/>
+            <w:proofErr w:type="gramEnd"/>
+            <w:r>
+              <w:t>")</w:t>
+            </w:r>
+          </w:p>
+          <w:p/>
+        </w:tc>
+      </w:tr>
+    </w:tbl>
+    <w:p/>
+    <w:tbl>
+      <w:tblPr>
+        <w:tblStyle w:val="TableGrid"/>
+        <w:tblW w:w="0" w:type="auto"/>
+        <w:tblLook w:val="04A0" w:firstRow="1" w:lastRow="0" w:firstColumn="1" w:lastColumn="0" w:noHBand="0" w:noVBand="1"/>
+      </w:tblPr>
+      <w:tblGrid>
+        <w:gridCol w:w="9016"/>
+      </w:tblGrid>
+      <w:tr>
+        <w:tc>
+          <w:tcPr>
+            <w:tcW w:w="9016" w:type="dxa"/>
+          </w:tcPr>
+          <w:p>
+            <w:r>
+              <w:t>This script is a synthetic dataset generator. Its job is to take MITRE ATT&amp;CK knowledge and automatically create thousands of instruction-response examples that can be used to fine-tune Qwen into a cybersecurity assistant called Qwen-ATLAS.</w:t>
+            </w:r>
+          </w:p>
+          <w:p/>
+          <w:p>
+            <w:r>
+              <w:t xml:space="preserve">Overall </w:t>
+            </w:r>
+            <w:proofErr w:type="gramStart"/>
+            <w:r>
+              <w:t>Workflow</w:t>
+            </w:r>
+            <w:r>
+              <w:t xml:space="preserve"> :</w:t>
+            </w:r>
+            <w:proofErr w:type="gramEnd"/>
+            <w:r>
+              <w:t xml:space="preserve"> </w:t>
+            </w:r>
+          </w:p>
+          <w:p>
+            <w:r>
+              <w:lastRenderedPageBreak/>
+              <w:t>enterprise-</w:t>
+            </w:r>
+            <w:proofErr w:type="spellStart"/>
+            <w:proofErr w:type="gramStart"/>
+            <w:r>
+              <w:t>attack.json</w:t>
+            </w:r>
+            <w:proofErr w:type="spellEnd"/>
+            <w:proofErr w:type="gramEnd"/>
+            <w:r>
+              <w:t xml:space="preserve"> +</w:t>
+            </w:r>
+            <w:r>
+              <w:t xml:space="preserve"> </w:t>
+            </w:r>
+            <w:proofErr w:type="spellStart"/>
+            <w:r>
+              <w:t>index_</w:t>
+            </w:r>
+            <w:proofErr w:type="gramStart"/>
+            <w:r>
+              <w:t>mappings.json</w:t>
+            </w:r>
+            <w:proofErr w:type="spellEnd"/>
+            <w:proofErr w:type="gramEnd"/>
+          </w:p>
+          <w:p>
+            <w:r>
+              <w:t xml:space="preserve">         │</w:t>
+            </w:r>
+          </w:p>
+          <w:p>
+            <w:r>
+              <w:t xml:space="preserve">         </w:t>
+            </w:r>
+            <w:r>
+              <w:rPr>
+                <w:rFonts w:ascii="Arial" w:hAnsi="Arial" w:cs="Arial"/>
+              </w:rPr>
+              <w:t>▼</w:t>
+            </w:r>
+          </w:p>
+          <w:p>
+            <w:r>
+              <w:t>Extract ATT&amp;CK knowledge</w:t>
+            </w:r>
+          </w:p>
+          <w:p>
+            <w:r>
+              <w:t xml:space="preserve">         │</w:t>
+            </w:r>
+          </w:p>
+          <w:p>
+            <w:r>
+              <w:t xml:space="preserve">         </w:t>
+            </w:r>
+            <w:r>
+              <w:rPr>
+                <w:rFonts w:ascii="Arial" w:hAnsi="Arial" w:cs="Arial"/>
+              </w:rPr>
+              <w:t>▼</w:t>
+            </w:r>
+          </w:p>
+          <w:p>
+            <w:r>
+              <w:t>Generate Question + Answer pairs</w:t>
+            </w:r>
+          </w:p>
+          <w:p>
+            <w:r>
+              <w:t xml:space="preserve">         │</w:t>
+            </w:r>
+          </w:p>
+          <w:p>
+            <w:r>
+              <w:t xml:space="preserve">         </w:t>
+            </w:r>
+            <w:r>
+              <w:rPr>
+                <w:rFonts w:ascii="Arial" w:hAnsi="Arial" w:cs="Arial"/>
+              </w:rPr>
+              <w:t>▼</w:t>
+            </w:r>
+          </w:p>
+          <w:p>
+            <w:r>
+              <w:t>Convert to chat format</w:t>
+            </w:r>
+          </w:p>
+          <w:p>
+            <w:r>
+              <w:t xml:space="preserve">         │</w:t>
+            </w:r>
+          </w:p>
+          <w:p>
+            <w:r>
+              <w:t xml:space="preserve">         </w:t>
+            </w:r>
+            <w:r>
+              <w:rPr>
+                <w:rFonts w:ascii="Arial" w:hAnsi="Arial" w:cs="Arial"/>
+              </w:rPr>
+              <w:t>▼</w:t>
+            </w:r>
+          </w:p>
+          <w:p>
+            <w:proofErr w:type="spellStart"/>
+            <w:r>
+              <w:t>clean_</w:t>
+            </w:r>
+            <w:proofErr w:type="gramStart"/>
+            <w:r>
+              <w:t>dataset.jsonl</w:t>
+            </w:r>
+            <w:proofErr w:type="spellEnd"/>
+            <w:proofErr w:type="gramEnd"/>
+          </w:p>
+          <w:p>
+            <w:r>
+              <w:t xml:space="preserve">         │</w:t>
+            </w:r>
+          </w:p>
+          <w:p>
+            <w:r>
+              <w:t xml:space="preserve">         </w:t>
+            </w:r>
+            <w:r>
+              <w:rPr>
+                <w:rFonts w:ascii="Arial" w:hAnsi="Arial" w:cs="Arial"/>
+              </w:rPr>
+              <w:t>▼</w:t>
+            </w:r>
+          </w:p>
+          <w:p>
+            <w:r>
+              <w:t>Fine-tune Qwen</w:t>
+            </w:r>
+          </w:p>
+          <w:p/>
+          <w:p>
+            <w:r>
+              <w:t>Loads the ATT&amp;CK knowledge base.</w:t>
+            </w:r>
+            <w:r>
+              <w:t xml:space="preserve"> Then load precomputed indexes. </w:t>
+            </w:r>
+          </w:p>
+          <w:p>
+            <w:r>
+              <w:pict w14:anchorId="6EB52BA2">
+                <v:rect id="_x0000_i1034" style="width:0;height:1.5pt" o:hralign="center" o:hrstd="t" o:hr="t" fillcolor="#a0a0a0" stroked="f"/>
+              </w:pict>
+            </w:r>
+          </w:p>
+          <w:p>
+            <w:pPr>
+              <w:rPr>
+                <w:b/>
+                <w:bCs/>
+                <w:u w:val="double"/>
+              </w:rPr>
+            </w:pPr>
+            <w:r>
+              <w:rPr>
+                <w:b/>
+                <w:bCs/>
+                <w:u w:val="double"/>
+              </w:rPr>
+              <w:t>Define the System Prompt</w:t>
+            </w:r>
+          </w:p>
+          <w:p>
+            <w:r>
+              <w:t>SYSTEM = (</w:t>
+            </w:r>
+            <w:r>
+              <w:br/>
+              <w:t xml:space="preserve">    "You are Qwen-ATLAS..."</w:t>
+            </w:r>
+            <w:r>
+              <w:br/>
+              <w:t>)</w:t>
+            </w:r>
+          </w:p>
+          <w:p>
+            <w:r>
+              <w:t>Every training example begins with:</w:t>
+            </w:r>
+          </w:p>
+          <w:p>
+            <w:r>
+              <w:t>{</w:t>
+            </w:r>
+            <w:r>
+              <w:br/>
+              <w:t xml:space="preserve">  "</w:t>
+            </w:r>
+            <w:proofErr w:type="spellStart"/>
+            <w:r>
+              <w:t>role":"system</w:t>
+            </w:r>
+            <w:proofErr w:type="spellEnd"/>
+            <w:r>
+              <w:t>",</w:t>
+            </w:r>
+            <w:r>
+              <w:br/>
+              <w:t xml:space="preserve">  "</w:t>
+            </w:r>
+            <w:proofErr w:type="spellStart"/>
+            <w:r>
+              <w:t>content":"You</w:t>
+            </w:r>
+            <w:proofErr w:type="spellEnd"/>
+            <w:r>
+              <w:t xml:space="preserve"> are Qwen-ATLAS..."</w:t>
+            </w:r>
+            <w:r>
+              <w:br/>
+              <w:t>}</w:t>
+            </w:r>
+          </w:p>
+          <w:p>
+            <w:r>
+              <w:t>This teaches the model</w:t>
+            </w:r>
+            <w:r>
+              <w:t xml:space="preserve"> </w:t>
+            </w:r>
+            <w:r>
+              <w:t>to a</w:t>
+            </w:r>
+            <w:r>
+              <w:t>ct like a threat intelligence analyst.</w:t>
+            </w:r>
+          </w:p>
+          <w:p/>
+          <w:p/>
+          <w:p>
+            <w:pPr>
+              <w:rPr>
+                <w:b/>
+                <w:bCs/>
+                <w:u w:val="double"/>
+              </w:rPr>
+            </w:pPr>
+            <w:r>
+              <w:rPr>
+                <w:b/>
+                <w:bCs/>
+                <w:u w:val="double"/>
+              </w:rPr>
+              <w:t>Create Training Format</w:t>
+            </w:r>
+          </w:p>
+          <w:p>
+            <w:r>
+              <w:t xml:space="preserve">def </w:t>
+            </w:r>
+            <w:proofErr w:type="spellStart"/>
+            <w:proofErr w:type="gramStart"/>
+            <w:r>
+              <w:t>fmt</w:t>
+            </w:r>
+            <w:proofErr w:type="spellEnd"/>
+            <w:r>
+              <w:t>(</w:t>
+            </w:r>
+            <w:proofErr w:type="gramEnd"/>
+            <w:r>
+              <w:t>instruction, output):</w:t>
+            </w:r>
+          </w:p>
+          <w:p>
+            <w:r>
+              <w:t>Converts</w:t>
+            </w:r>
+            <w:r>
+              <w:t xml:space="preserve"> </w:t>
+            </w:r>
+            <w:r>
+              <w:t>Question</w:t>
+            </w:r>
+            <w:r>
+              <w:t xml:space="preserve"> and </w:t>
+            </w:r>
+            <w:r>
+              <w:t>Answer</w:t>
+            </w:r>
+            <w:r>
+              <w:t xml:space="preserve"> </w:t>
+            </w:r>
+            <w:r>
+              <w:t>into:</w:t>
+            </w:r>
+          </w:p>
+          <w:p>
+            <w:r>
+              <w:t>{</w:t>
+            </w:r>
+            <w:r>
+              <w:br/>
+              <w:t xml:space="preserve">  "messages": [</w:t>
+            </w:r>
+            <w:r>
+              <w:br/>
+              <w:t xml:space="preserve"> </w:t>
+            </w:r>
+            <w:proofErr w:type="gramStart"/>
+            <w:r>
+              <w:t xml:space="preserve">   {</w:t>
+            </w:r>
+            <w:proofErr w:type="gramEnd"/>
+            <w:r>
+              <w:br/>
+              <w:t xml:space="preserve">      "</w:t>
+            </w:r>
+            <w:proofErr w:type="spellStart"/>
+            <w:r>
+              <w:t>role":"system</w:t>
+            </w:r>
+            <w:proofErr w:type="spellEnd"/>
+            <w:r>
+              <w:t>"</w:t>
+            </w:r>
+            <w:r>
+              <w:br/>
+              <w:t xml:space="preserve">    },</w:t>
+            </w:r>
+            <w:r>
+              <w:br/>
+              <w:t xml:space="preserve"> </w:t>
+            </w:r>
+            <w:proofErr w:type="gramStart"/>
+            <w:r>
+              <w:t xml:space="preserve">   {</w:t>
+            </w:r>
+            <w:proofErr w:type="gramEnd"/>
+            <w:r>
+              <w:br/>
+              <w:t xml:space="preserve">      "</w:t>
+            </w:r>
+            <w:proofErr w:type="spellStart"/>
+            <w:r>
+              <w:t>role":"user</w:t>
+            </w:r>
+            <w:proofErr w:type="spellEnd"/>
+            <w:r>
+              <w:t>"</w:t>
+            </w:r>
+            <w:r>
+              <w:br/>
+              <w:t xml:space="preserve">    },</w:t>
+            </w:r>
+            <w:r>
+              <w:br/>
+              <w:t xml:space="preserve"> </w:t>
+            </w:r>
+            <w:proofErr w:type="gramStart"/>
+            <w:r>
+              <w:t xml:space="preserve">   {</w:t>
+            </w:r>
+            <w:proofErr w:type="gramEnd"/>
+            <w:r>
+              <w:br/>
+              <w:t xml:space="preserve">      "</w:t>
+            </w:r>
+            <w:proofErr w:type="spellStart"/>
+            <w:r>
+              <w:t>role":"assistant</w:t>
+            </w:r>
+            <w:proofErr w:type="spellEnd"/>
+            <w:r>
+              <w:t>"</w:t>
+            </w:r>
+            <w:r>
+              <w:br/>
+              <w:t xml:space="preserve">  </w:t>
+            </w:r>
+            <w:proofErr w:type="gramStart"/>
+            <w:r>
+              <w:t xml:space="preserve">  }</w:t>
+            </w:r>
+            <w:proofErr w:type="gramEnd"/>
+            <w:r>
+              <w:br/>
+            </w:r>
+            <w:proofErr w:type="gramStart"/>
+            <w:r>
+              <w:t xml:space="preserve">  ]</w:t>
+            </w:r>
+            <w:proofErr w:type="gramEnd"/>
+            <w:r>
+              <w:br/>
+              <w:t>}</w:t>
+            </w:r>
+          </w:p>
+          <w:p/>
+          <w:p>
+            <w:r>
+              <w:t>which is the format expected by Qwen fine-tuning.</w:t>
+            </w:r>
+          </w:p>
+          <w:p/>
+          <w:p>
+            <w:pPr>
+              <w:rPr>
+                <w:b/>
+                <w:bCs/>
+                <w:u w:val="double"/>
+              </w:rPr>
+            </w:pPr>
+            <w:r>
+              <w:rPr>
+                <w:b/>
+                <w:bCs/>
+                <w:u w:val="double"/>
+              </w:rPr>
+              <w:t xml:space="preserve">TEMPLATE </w:t>
+            </w:r>
+            <w:proofErr w:type="gramStart"/>
+            <w:r>
+              <w:rPr>
+                <w:b/>
+                <w:bCs/>
+                <w:u w:val="double"/>
+              </w:rPr>
+              <w:t xml:space="preserve">1 </w:t>
+            </w:r>
+            <w:r>
+              <w:rPr>
+                <w:b/>
+                <w:bCs/>
+                <w:u w:val="double"/>
+              </w:rPr>
+              <w:t>:</w:t>
+            </w:r>
+            <w:proofErr w:type="gramEnd"/>
+            <w:r>
+              <w:rPr>
+                <w:b/>
+                <w:bCs/>
+                <w:u w:val="double"/>
+              </w:rPr>
+              <w:t xml:space="preserve"> </w:t>
+            </w:r>
+            <w:r>
+              <w:rPr>
+                <w:b/>
+                <w:bCs/>
+                <w:u w:val="double"/>
+              </w:rPr>
+              <w:t>Technique Deep Dive</w:t>
+            </w:r>
+          </w:p>
+          <w:p>
+            <w:r>
+              <w:t>L</w:t>
+            </w:r>
+            <w:r>
+              <w:t>oops through up to 800 ATT&amp;CK techniques.</w:t>
+            </w:r>
+          </w:p>
+          <w:p>
+            <w:r>
+              <w:t xml:space="preserve">for </w:t>
+            </w:r>
+            <w:proofErr w:type="spellStart"/>
+            <w:r>
+              <w:t>tid</w:t>
+            </w:r>
+            <w:proofErr w:type="spellEnd"/>
+            <w:r>
+              <w:t>, t in list(</w:t>
+            </w:r>
+            <w:proofErr w:type="spellStart"/>
+            <w:proofErr w:type="gramStart"/>
+            <w:r>
+              <w:t>techniques.items</w:t>
+            </w:r>
+            <w:proofErr w:type="spellEnd"/>
+            <w:proofErr w:type="gramEnd"/>
+            <w:r>
+              <w:t>(</w:t>
+            </w:r>
+            <w:proofErr w:type="gramStart"/>
+            <w:r>
+              <w:t>))[</w:t>
+            </w:r>
+            <w:proofErr w:type="gramEnd"/>
+            <w:r>
+              <w:t>:800]:</w:t>
+            </w:r>
+          </w:p>
+          <w:p>
+            <w:r>
+              <w:t>Example:</w:t>
+            </w:r>
+            <w:r>
+              <w:t xml:space="preserve"> </w:t>
+            </w:r>
+            <w:r>
+              <w:t>T1566 - Phishing</w:t>
+            </w:r>
+          </w:p>
+          <w:p/>
+          <w:p>
+            <w:pPr>
+              <w:rPr>
+                <w:b/>
+                <w:bCs/>
+              </w:rPr>
+            </w:pPr>
+            <w:r>
+              <w:rPr>
+                <w:b/>
+                <w:bCs/>
+              </w:rPr>
+              <w:t>Builds a detailed answer</w:t>
+            </w:r>
+          </w:p>
+          <w:p>
+            <w:r>
+              <w:t>output = (</w:t>
+            </w:r>
+            <w:r>
+              <w:br/>
+              <w:t xml:space="preserve">    Technique ID</w:t>
+            </w:r>
+            <w:r>
+              <w:br/>
+              <w:t xml:space="preserve">    Name</w:t>
+            </w:r>
+            <w:r>
+              <w:br/>
+              <w:t xml:space="preserve">    Tactics</w:t>
+            </w:r>
+            <w:r>
+              <w:br/>
+              <w:t xml:space="preserve">    Platforms</w:t>
+            </w:r>
+            <w:r>
+              <w:br/>
+              <w:t xml:space="preserve">    Description</w:t>
+            </w:r>
+            <w:r>
+              <w:br/>
+              <w:t xml:space="preserve">    Detection</w:t>
+            </w:r>
+            <w:r>
+              <w:br/>
+              <w:t xml:space="preserve">    Groups Using</w:t>
+            </w:r>
+            <w:r>
+              <w:br/>
+              <w:t>)</w:t>
+            </w:r>
+          </w:p>
+          <w:p>
+            <w:r>
+              <w:t>Example:</w:t>
+            </w:r>
+          </w:p>
+          <w:p>
+            <w:r>
+              <w:t>Technique ID: T1566</w:t>
+            </w:r>
+            <w:r>
+              <w:br/>
+            </w:r>
+            <w:r>
+              <w:br/>
+              <w:t>Name: Phishing</w:t>
+            </w:r>
+            <w:r>
+              <w:br/>
+            </w:r>
+            <w:r>
+              <w:br/>
+              <w:t>Tactics:</w:t>
+            </w:r>
+            <w:r>
+              <w:br/>
+              <w:t>Initial Access</w:t>
+            </w:r>
+            <w:r>
+              <w:br/>
+            </w:r>
+            <w:r>
+              <w:br/>
+              <w:t>Platforms:</w:t>
+            </w:r>
+            <w:r>
+              <w:br/>
+              <w:t>Windows</w:t>
+            </w:r>
+            <w:r>
+              <w:br/>
+            </w:r>
+            <w:r>
+              <w:br/>
+              <w:t>Description:</w:t>
+            </w:r>
+            <w:r>
+              <w:br/>
+              <w:t>Adversaries may send phishing emails...</w:t>
+            </w:r>
+            <w:r>
+              <w:br/>
+            </w:r>
+            <w:r>
+              <w:br/>
+              <w:t>Used By:</w:t>
+            </w:r>
+            <w:r>
+              <w:br/>
+              <w:t>APT29</w:t>
+            </w:r>
+            <w:r>
+              <w:br/>
+              <w:t>APT28</w:t>
+            </w:r>
+          </w:p>
+          <w:p/>
+          <w:p>
+            <w:r>
+              <w:rPr>
+                <w:b/>
+                <w:bCs/>
+              </w:rPr>
+              <w:drawing>
+                <wp:inline distT="0" distB="0" distL="0" distR="0" wp14:anchorId="77213437" wp14:editId="65AEDC84">
+                  <wp:extent cx="3903134" cy="1636756"/>
+                  <wp:effectExtent l="0" t="0" r="2540" b="1905"/>
+                  <wp:docPr id="5650795" name="Picture 1"/>
+                  <wp:cNvGraphicFramePr>
+                    <a:graphicFrameLocks xmlns:a="http://schemas.openxmlformats.org/drawingml/2006/main" noChangeAspect="1"/>
+                  </wp:cNvGraphicFramePr>
+                  <a:graphic xmlns:a="http://schemas.openxmlformats.org/drawingml/2006/main">
+                    <a:graphicData uri="http://schemas.openxmlformats.org/drawingml/2006/picture">
+                      <pic:pic xmlns:pic="http://schemas.openxmlformats.org/drawingml/2006/picture">
+                        <pic:nvPicPr>
+                          <pic:cNvPr id="5650795" name=""/>
+                          <pic:cNvPicPr/>
+                        </pic:nvPicPr>
+                        <pic:blipFill>
+                          <a:blip r:embed="rId10"/>
+                          <a:stretch>
+                            <a:fillRect/>
+                          </a:stretch>
+                        </pic:blipFill>
+                        <pic:spPr>
+                          <a:xfrm>
+                            <a:off x="0" y="0"/>
+                            <a:ext cx="3912863" cy="1640836"/>
+                          </a:xfrm>
+                          <a:prstGeom prst="rect">
+                            <a:avLst/>
+                          </a:prstGeom>
+                        </pic:spPr>
+                      </pic:pic>
+                    </a:graphicData>
+                  </a:graphic>
+                </wp:inline>
+              </w:drawing>
+            </w:r>
+          </w:p>
+          <w:p/>
+          <w:p>
+            <w:r>
+              <w:t>Teach the model:</w:t>
+            </w:r>
+            <w:r>
+              <w:t xml:space="preserve"> </w:t>
+            </w:r>
+            <w:r>
+              <w:t>Technique</w:t>
+            </w:r>
+            <w:r>
+              <w:t xml:space="preserve"> -</w:t>
+            </w:r>
+            <w:proofErr w:type="gramStart"/>
+            <w:r>
+              <w:t xml:space="preserve">&gt;  </w:t>
+            </w:r>
+            <w:r>
+              <w:t>Detailed</w:t>
+            </w:r>
+            <w:proofErr w:type="gramEnd"/>
+            <w:r>
+              <w:t xml:space="preserve"> explanation</w:t>
+            </w:r>
+          </w:p>
+          <w:p/>
+          <w:p>
+            <w:pPr>
+              <w:rPr>
+                <w:b/>
+                <w:bCs/>
+                <w:u w:val="double"/>
+              </w:rPr>
+            </w:pPr>
+            <w:r>
+              <w:rPr>
+                <w:b/>
+                <w:bCs/>
+                <w:u w:val="double"/>
+              </w:rPr>
+              <w:t>TEMPLATE 2 — Threat Actor Profile</w:t>
+            </w:r>
+          </w:p>
+          <w:p>
+            <w:pPr>
+              <w:rPr>
+                <w:b/>
+                <w:bCs/>
+              </w:rPr>
+            </w:pPr>
+            <w:r>
+              <w:rPr>
+                <w:b/>
+                <w:bCs/>
+              </w:rPr>
+              <w:t>Loops through groups</w:t>
+            </w:r>
+          </w:p>
+          <w:p>
+            <w:r>
+              <w:t xml:space="preserve">for g in </w:t>
+            </w:r>
+            <w:proofErr w:type="gramStart"/>
+            <w:r>
+              <w:t>groups[</w:t>
+            </w:r>
+            <w:proofErr w:type="gramEnd"/>
+            <w:r>
+              <w:t>:100]</w:t>
+            </w:r>
+          </w:p>
+          <w:p>
+            <w:r>
+              <w:t>Example:</w:t>
+            </w:r>
+            <w:r>
+              <w:t xml:space="preserve"> </w:t>
+            </w:r>
+            <w:r>
+              <w:t>APT29</w:t>
+            </w:r>
+          </w:p>
+          <w:p/>
+          <w:p>
+            <w:r>
+              <w:t>Gets techniques used by the group.</w:t>
+            </w:r>
+          </w:p>
+          <w:p>
+            <w:proofErr w:type="gramStart"/>
+            <w:r>
+              <w:t>Example:APT</w:t>
+            </w:r>
+            <w:proofErr w:type="gramEnd"/>
+            <w:r>
+              <w:t>29 uses:</w:t>
+            </w:r>
+          </w:p>
+          <w:p>
+            <w:pPr>
+              <w:pStyle w:val="ListParagraph"/>
+              <w:numPr>
+                <w:ilvl w:val="0"/>
+                <w:numId w:val="5"/>
+              </w:numPr>
+            </w:pPr>
+            <w:r>
+              <w:t>T1566</w:t>
+            </w:r>
+          </w:p>
+          <w:p>
+            <w:pPr>
+              <w:pStyle w:val="ListParagraph"/>
+              <w:numPr>
+                <w:ilvl w:val="0"/>
+                <w:numId w:val="5"/>
+              </w:numPr>
+            </w:pPr>
+            <w:r>
+              <w:t>T1059</w:t>
+            </w:r>
+          </w:p>
+          <w:p/>
+          <w:p>
+            <w:r>
+              <w:drawing>
+                <wp:inline distT="0" distB="0" distL="0" distR="0" wp14:anchorId="043CFA42" wp14:editId="6FF1E77B">
+                  <wp:extent cx="4792134" cy="2329701"/>
+                  <wp:effectExtent l="0" t="0" r="0" b="0"/>
+                  <wp:docPr id="1508063688" name="Picture 1"/>
+                  <wp:cNvGraphicFramePr>
+                    <a:graphicFrameLocks xmlns:a="http://schemas.openxmlformats.org/drawingml/2006/main" noChangeAspect="1"/>
+                  </wp:cNvGraphicFramePr>
+                  <a:graphic xmlns:a="http://schemas.openxmlformats.org/drawingml/2006/main">
+                    <a:graphicData uri="http://schemas.openxmlformats.org/drawingml/2006/picture">
+                      <pic:pic xmlns:pic="http://schemas.openxmlformats.org/drawingml/2006/picture">
+                        <pic:nvPicPr>
+                          <pic:cNvPr id="1508063688" name=""/>
+                          <pic:cNvPicPr/>
+                        </pic:nvPicPr>
+                        <pic:blipFill>
+                          <a:blip r:embed="rId11"/>
+                          <a:stretch>
+                            <a:fillRect/>
+                          </a:stretch>
+                        </pic:blipFill>
+                        <pic:spPr>
+                          <a:xfrm>
+                            <a:off x="0" y="0"/>
+                            <a:ext cx="4799535" cy="2333299"/>
+                          </a:xfrm>
+                          <a:prstGeom prst="rect">
+                            <a:avLst/>
+                          </a:prstGeom>
+                        </pic:spPr>
+                      </pic:pic>
+                    </a:graphicData>
+                  </a:graphic>
+                </wp:inline>
+              </w:drawing>
+            </w:r>
+          </w:p>
+          <w:p/>
+          <w:p>
+            <w:r>
+              <w:t>Teach:</w:t>
+            </w:r>
+            <w:r>
+              <w:t xml:space="preserve"> </w:t>
+            </w:r>
+            <w:r>
+              <w:t>Threat Actor</w:t>
+            </w:r>
+            <w:r>
+              <w:t xml:space="preserve"> -</w:t>
+            </w:r>
+            <w:proofErr w:type="gramStart"/>
+            <w:r>
+              <w:t xml:space="preserve">&gt;  </w:t>
+            </w:r>
+            <w:r>
+              <w:t>Associated</w:t>
+            </w:r>
+            <w:proofErr w:type="gramEnd"/>
+            <w:r>
+              <w:t xml:space="preserve"> Techniques</w:t>
+            </w:r>
+          </w:p>
+          <w:p/>
+          <w:p>
+            <w:pPr>
+              <w:rPr>
+                <w:b/>
+                <w:bCs/>
+                <w:u w:val="double"/>
+              </w:rPr>
+            </w:pPr>
+            <w:r>
+              <w:rPr>
+                <w:b/>
+                <w:bCs/>
+                <w:u w:val="double"/>
+              </w:rPr>
+              <w:t>TEMPLATE 3 — Detection Strategy</w:t>
+            </w:r>
+          </w:p>
+          <w:p>
+            <w:r>
+              <w:t>Loops through techniques.</w:t>
+            </w:r>
+          </w:p>
+          <w:p>
+            <w:r>
+              <w:t xml:space="preserve">for </w:t>
+            </w:r>
+            <w:proofErr w:type="spellStart"/>
+            <w:r>
+              <w:t>tid</w:t>
+            </w:r>
+            <w:proofErr w:type="spellEnd"/>
+            <w:r>
+              <w:t>, t in list(</w:t>
+            </w:r>
+            <w:proofErr w:type="spellStart"/>
+            <w:proofErr w:type="gramStart"/>
+            <w:r>
+              <w:t>techniques.items</w:t>
+            </w:r>
+            <w:proofErr w:type="spellEnd"/>
+            <w:proofErr w:type="gramEnd"/>
+            <w:r>
+              <w:t>(</w:t>
+            </w:r>
+            <w:proofErr w:type="gramStart"/>
+            <w:r>
+              <w:t>))[</w:t>
+            </w:r>
+            <w:proofErr w:type="gramEnd"/>
+            <w:r>
+              <w:t>:700]</w:t>
+            </w:r>
+          </w:p>
+          <w:p/>
+          <w:p>
+            <w:r>
+              <w:t>Only keeps techniques with meaningful detection guidance.</w:t>
+            </w:r>
+          </w:p>
+          <w:p>
+            <w:r>
+              <w:t xml:space="preserve">if </w:t>
+            </w:r>
+            <w:proofErr w:type="spellStart"/>
+            <w:r>
+              <w:t>len</w:t>
+            </w:r>
+            <w:proofErr w:type="spellEnd"/>
+            <w:r>
+              <w:t>(detection) &lt; 50:</w:t>
+            </w:r>
+            <w:r>
+              <w:br/>
+              <w:t xml:space="preserve">    continue</w:t>
+            </w:r>
+          </w:p>
+          <w:p/>
+          <w:p>
+            <w:r>
+              <w:t>Example:</w:t>
+            </w:r>
+          </w:p>
+          <w:p>
+            <w:r>
+              <w:t>User:</w:t>
+            </w:r>
+            <w:r>
+              <w:t xml:space="preserve"> </w:t>
+            </w:r>
+          </w:p>
+          <w:p>
+            <w:r>
+              <w:t xml:space="preserve">   </w:t>
+            </w:r>
+            <w:r>
+              <w:t>How would a SOC analyst detect PowerShell?</w:t>
+            </w:r>
+          </w:p>
+          <w:p>
+            <w:r>
+              <w:t>Assistant:</w:t>
+            </w:r>
+            <w:r>
+              <w:t xml:space="preserve"> </w:t>
+            </w:r>
+            <w:r>
+              <w:t>Data Sources:</w:t>
+            </w:r>
+            <w:r>
+              <w:br/>
+            </w:r>
+            <w:r>
+              <w:t xml:space="preserve">    </w:t>
+            </w:r>
+            <w:r>
+              <w:t>...</w:t>
+            </w:r>
+            <w:r>
+              <w:br/>
+              <w:t>Recommended Actions:</w:t>
+            </w:r>
+            <w:r>
+              <w:br/>
+            </w:r>
+            <w:r>
+              <w:t xml:space="preserve">    </w:t>
+            </w:r>
+            <w:r>
+              <w:t>...</w:t>
+            </w:r>
+          </w:p>
+          <w:p/>
+          <w:p>
+            <w:r>
+              <w:t>Purpose:</w:t>
+            </w:r>
+          </w:p>
+          <w:p>
+            <w:r>
+              <w:t>Teach:</w:t>
+            </w:r>
+          </w:p>
+          <w:p>
+            <w:r>
+              <w:t>Technique</w:t>
+            </w:r>
+            <w:r>
+              <w:t xml:space="preserve"> -&gt; </w:t>
+            </w:r>
+            <w:r>
+              <w:t>Detection Strategy</w:t>
+            </w:r>
+          </w:p>
+          <w:p>
+            <w:r>
+              <w:t>instead of merely:</w:t>
+            </w:r>
+          </w:p>
+          <w:p>
+            <w:r>
+              <w:lastRenderedPageBreak/>
+              <w:t>Technique</w:t>
+            </w:r>
+            <w:r>
+              <w:t xml:space="preserve"> -</w:t>
+            </w:r>
+            <w:proofErr w:type="gramStart"/>
+            <w:r>
+              <w:t xml:space="preserve">&gt;  </w:t>
+            </w:r>
+            <w:r>
+              <w:t>Description</w:t>
+            </w:r>
+            <w:proofErr w:type="gramEnd"/>
+          </w:p>
+          <w:p/>
+          <w:p>
+            <w:pPr>
+              <w:rPr>
+                <w:b/>
+                <w:bCs/>
+                <w:u w:val="thick"/>
+              </w:rPr>
+            </w:pPr>
+            <w:r>
+              <w:rPr>
+                <w:b/>
+                <w:bCs/>
+                <w:u w:val="thick"/>
+              </w:rPr>
+              <w:t>TEMPLATE 4 — Scenario Analysis</w:t>
+            </w:r>
+          </w:p>
+          <w:p/>
+          <w:p>
+            <w:r>
+              <w:t>Creates tactic chains:</w:t>
+            </w:r>
+          </w:p>
+          <w:p>
+            <w:r>
+              <w:t>Initial Access</w:t>
+            </w:r>
+            <w:r>
+              <w:br/>
+              <w:t xml:space="preserve">      ↓</w:t>
+            </w:r>
+            <w:r>
+              <w:br/>
+              <w:t>Execution</w:t>
+            </w:r>
+            <w:r>
+              <w:br/>
+            </w:r>
+            <w:r>
+              <w:br/>
+            </w:r>
+            <w:proofErr w:type="spellStart"/>
+            <w:r>
+              <w:t>Execution</w:t>
+            </w:r>
+            <w:proofErr w:type="spellEnd"/>
+            <w:r>
+              <w:br/>
+              <w:t xml:space="preserve">      ↓</w:t>
+            </w:r>
+            <w:r>
+              <w:br/>
+              <w:t>Persistence</w:t>
+            </w:r>
+            <w:r>
+              <w:br/>
+            </w:r>
+            <w:r>
+              <w:br/>
+              <w:t>Persistence</w:t>
+            </w:r>
+            <w:r>
+              <w:br/>
+              <w:t xml:space="preserve">      ↓</w:t>
+            </w:r>
+            <w:r>
+              <w:br/>
+              <w:t>Lateral Movement</w:t>
+            </w:r>
+          </w:p>
+          <w:p/>
+          <w:p>
+            <w:r>
+              <w:t>Example:</w:t>
+            </w:r>
+            <w:r>
+              <w:t xml:space="preserve"> </w:t>
+            </w:r>
+            <w:r>
+              <w:t>Phishing</w:t>
+            </w:r>
+            <w:r>
+              <w:t xml:space="preserve"> -&gt; </w:t>
+            </w:r>
+            <w:r>
+              <w:t>PowerShell</w:t>
+            </w:r>
+          </w:p>
+          <w:p/>
+          <w:p>
+            <w:proofErr w:type="spellStart"/>
+            <w:r>
+              <w:t>hecks</w:t>
+            </w:r>
+            <w:proofErr w:type="spellEnd"/>
+            <w:r>
+              <w:t>:</w:t>
+            </w:r>
+          </w:p>
+          <w:p>
+            <w:proofErr w:type="spellStart"/>
+            <w:r>
+              <w:t>groups_a</w:t>
+            </w:r>
+            <w:proofErr w:type="spellEnd"/>
+            <w:r>
+              <w:br/>
+            </w:r>
+            <w:proofErr w:type="spellStart"/>
+            <w:r>
+              <w:t>groups_b</w:t>
+            </w:r>
+            <w:proofErr w:type="spellEnd"/>
+          </w:p>
+          <w:p>
+            <w:r>
+              <w:t>Which groups use each technique.</w:t>
+            </w:r>
+          </w:p>
+          <w:p/>
+          <w:p>
+            <w:r>
+              <w:t>Finds overlap.</w:t>
+            </w:r>
+          </w:p>
+          <w:p>
+            <w:r>
+              <w:t>Example:</w:t>
+            </w:r>
+            <w:r>
+              <w:t xml:space="preserve"> </w:t>
+            </w:r>
+            <w:r>
+              <w:t xml:space="preserve">APT29 uses </w:t>
+            </w:r>
+            <w:proofErr w:type="gramStart"/>
+            <w:r>
+              <w:t>both</w:t>
+            </w:r>
+            <w:r>
+              <w:t xml:space="preserve"> .</w:t>
+            </w:r>
+            <w:proofErr w:type="gramEnd"/>
+            <w:r>
+              <w:t xml:space="preserve"> </w:t>
+            </w:r>
+            <w:r>
+              <w:t>APT28 uses both</w:t>
+            </w:r>
+          </w:p>
+          <w:p/>
+          <w:p>
+            <w:r>
+              <w:t>Creates training example.</w:t>
+            </w:r>
+          </w:p>
+          <w:p>
+            <w:r>
+              <w:t>User:</w:t>
+            </w:r>
+          </w:p>
+          <w:p>
+            <w:r>
+              <w:t xml:space="preserve">   </w:t>
+            </w:r>
+            <w:r>
+              <w:t>An attacker used Phishing then PowerShell.</w:t>
+            </w:r>
+            <w:r>
+              <w:br/>
+            </w:r>
+            <w:r>
+              <w:t xml:space="preserve">   </w:t>
+            </w:r>
+            <w:r>
+              <w:t>What actor profiles match?</w:t>
+            </w:r>
+          </w:p>
+          <w:p>
+            <w:r>
+              <w:t>Assistant:</w:t>
+            </w:r>
+          </w:p>
+          <w:p>
+            <w:r>
+              <w:t xml:space="preserve">   </w:t>
+            </w:r>
+            <w:r>
+              <w:t>TTP Analysis</w:t>
+            </w:r>
+          </w:p>
+          <w:p>
+            <w:r>
+              <w:t xml:space="preserve">   </w:t>
+            </w:r>
+            <w:r>
+              <w:t>Likely Actors:</w:t>
+            </w:r>
+            <w:r>
+              <w:br/>
+            </w:r>
+            <w:r>
+              <w:t xml:space="preserve">       </w:t>
+            </w:r>
+            <w:r>
+              <w:t>APT29</w:t>
+            </w:r>
+            <w:r>
+              <w:br/>
+            </w:r>
+            <w:r>
+              <w:t xml:space="preserve">       </w:t>
+            </w:r>
+            <w:r>
+              <w:t>APT28</w:t>
+            </w:r>
+            <w:r>
+              <w:br/>
+            </w:r>
+            <w:r>
+              <w:t xml:space="preserve">   </w:t>
+            </w:r>
+            <w:r>
+              <w:t>Assessment:</w:t>
+            </w:r>
+            <w:r>
+              <w:br/>
+            </w:r>
+            <w:r>
+              <w:t xml:space="preserve">       </w:t>
+            </w:r>
+            <w:r>
+              <w:t>Common attack chain.</w:t>
+            </w:r>
+          </w:p>
+          <w:p/>
+          <w:p>
+            <w:pPr>
+              <w:rPr>
+                <w:b/>
+                <w:bCs/>
+              </w:rPr>
+            </w:pPr>
+            <w:r>
+              <w:rPr>
+                <w:b/>
+                <w:bCs/>
+              </w:rPr>
+              <w:t>Purpose</w:t>
+            </w:r>
+          </w:p>
+          <w:p>
+            <w:r>
+              <w:t>Teach reasoning.</w:t>
+            </w:r>
+          </w:p>
+          <w:p>
+            <w:r>
+              <w:t>Instead of:</w:t>
+            </w:r>
+            <w:r>
+              <w:t xml:space="preserve"> </w:t>
+            </w:r>
+            <w:r>
+              <w:t>One technique</w:t>
+            </w:r>
+          </w:p>
+          <w:p>
+            <w:r>
+              <w:t>the model learns:</w:t>
+            </w:r>
+            <w:r>
+              <w:t xml:space="preserve"> </w:t>
+            </w:r>
+            <w:r>
+              <w:t>Technique A</w:t>
+            </w:r>
+            <w:r>
+              <w:t xml:space="preserve"> </w:t>
+            </w:r>
+            <w:r>
+              <w:t>+</w:t>
+            </w:r>
+            <w:r>
+              <w:t xml:space="preserve"> </w:t>
+            </w:r>
+            <w:r>
+              <w:t>Technique B</w:t>
+            </w:r>
+            <w:r>
+              <w:t xml:space="preserve"> -&gt; </w:t>
+            </w:r>
+            <w:r>
+              <w:t>Likely Threat Actors</w:t>
+            </w:r>
+          </w:p>
+          <w:p/>
+          <w:p>
+            <w:pPr>
+              <w:rPr>
+                <w:b/>
+                <w:bCs/>
+                <w:u w:val="thick"/>
+              </w:rPr>
+            </w:pPr>
+            <w:r>
+              <w:rPr>
+                <w:b/>
+                <w:bCs/>
+                <w:u w:val="thick"/>
+              </w:rPr>
+              <w:t>TEMPLATE 5 — Lateral Movement Prediction</w:t>
+            </w:r>
+          </w:p>
+          <w:p/>
+          <w:p>
+            <w:r>
+              <w:t>Gets all lateral movement techniques.</w:t>
+            </w:r>
+            <w:r>
+              <w:t xml:space="preserve"> </w:t>
+            </w:r>
+            <w:proofErr w:type="spellStart"/>
+            <w:r>
+              <w:t>lm_techs</w:t>
+            </w:r>
+            <w:proofErr w:type="spellEnd"/>
+          </w:p>
+          <w:p>
+            <w:r>
+              <w:lastRenderedPageBreak/>
+              <w:t>Examples:</w:t>
+            </w:r>
+          </w:p>
+          <w:p>
+            <w:pPr>
+              <w:pStyle w:val="ListParagraph"/>
+              <w:numPr>
+                <w:ilvl w:val="0"/>
+                <w:numId w:val="6"/>
+              </w:numPr>
+            </w:pPr>
+            <w:r>
+              <w:t>Remote Services</w:t>
+            </w:r>
+          </w:p>
+          <w:p>
+            <w:pPr>
+              <w:pStyle w:val="ListParagraph"/>
+              <w:numPr>
+                <w:ilvl w:val="0"/>
+                <w:numId w:val="6"/>
+              </w:numPr>
+            </w:pPr>
+            <w:r>
+              <w:t>SMB</w:t>
+            </w:r>
+          </w:p>
+          <w:p>
+            <w:pPr>
+              <w:pStyle w:val="ListParagraph"/>
+              <w:numPr>
+                <w:ilvl w:val="0"/>
+                <w:numId w:val="6"/>
+              </w:numPr>
+            </w:pPr>
+            <w:r>
+              <w:t>Pass the Hash</w:t>
+            </w:r>
+          </w:p>
+          <w:p/>
+          <w:p/>
+          <w:p>
+            <w:pPr>
+              <w:rPr>
+                <w:b/>
+                <w:bCs/>
+              </w:rPr>
+            </w:pPr>
+            <w:r>
+              <w:rPr>
+                <w:b/>
+                <w:bCs/>
+              </w:rPr>
+              <w:t xml:space="preserve">Random </w:t>
+            </w:r>
+            <w:proofErr w:type="gramStart"/>
+            <w:r>
+              <w:rPr>
+                <w:b/>
+                <w:bCs/>
+              </w:rPr>
+              <w:t>Shuffle</w:t>
+            </w:r>
+            <w:r>
+              <w:rPr>
+                <w:b/>
+                <w:bCs/>
+              </w:rPr>
+              <w:t xml:space="preserve"> :</w:t>
+            </w:r>
+            <w:proofErr w:type="gramEnd"/>
+            <w:r>
+              <w:rPr>
+                <w:b/>
+                <w:bCs/>
+              </w:rPr>
+              <w:t xml:space="preserve">  </w:t>
+            </w:r>
+            <w:proofErr w:type="spellStart"/>
+            <w:proofErr w:type="gramStart"/>
+            <w:r>
+              <w:t>random.shuffle</w:t>
+            </w:r>
+            <w:proofErr w:type="spellEnd"/>
+            <w:proofErr w:type="gramEnd"/>
+            <w:r>
+              <w:t>(dataset)</w:t>
+            </w:r>
+          </w:p>
+          <w:p>
+            <w:r>
+              <w:t>Without shuffle:</w:t>
+            </w:r>
+            <w:r>
+              <w:t xml:space="preserve"> </w:t>
+            </w:r>
+          </w:p>
+          <w:p>
+            <w:pPr>
+              <w:pStyle w:val="ListParagraph"/>
+              <w:numPr>
+                <w:ilvl w:val="0"/>
+                <w:numId w:val="7"/>
+              </w:numPr>
+            </w:pPr>
+            <w:r>
+              <w:t>800 technique examples</w:t>
+            </w:r>
+            <w:r>
+              <w:t xml:space="preserve"> </w:t>
+            </w:r>
+            <w:r>
+              <w:t>then</w:t>
+            </w:r>
+          </w:p>
+          <w:p>
+            <w:pPr>
+              <w:pStyle w:val="ListParagraph"/>
+              <w:numPr>
+                <w:ilvl w:val="0"/>
+                <w:numId w:val="7"/>
+              </w:numPr>
+            </w:pPr>
+            <w:r>
+              <w:t>100 group examples</w:t>
+            </w:r>
+            <w:r>
+              <w:t xml:space="preserve"> </w:t>
+            </w:r>
+            <w:r>
+              <w:t>then</w:t>
+            </w:r>
+          </w:p>
+          <w:p>
+            <w:pPr>
+              <w:pStyle w:val="ListParagraph"/>
+              <w:numPr>
+                <w:ilvl w:val="0"/>
+                <w:numId w:val="7"/>
+              </w:numPr>
+            </w:pPr>
+            <w:r>
+              <w:t>700 detection examples</w:t>
+            </w:r>
+          </w:p>
+          <w:p>
+            <w:r>
+              <w:t>Bad training order.</w:t>
+            </w:r>
+          </w:p>
+          <w:p/>
+          <w:p>
+            <w:r>
+              <w:t>After shuffle:</w:t>
+            </w:r>
+          </w:p>
+          <w:p>
+            <w:pPr>
+              <w:pStyle w:val="ListParagraph"/>
+              <w:numPr>
+                <w:ilvl w:val="0"/>
+                <w:numId w:val="8"/>
+              </w:numPr>
+            </w:pPr>
+            <w:r>
+              <w:t>Technique</w:t>
+            </w:r>
+          </w:p>
+          <w:p>
+            <w:pPr>
+              <w:pStyle w:val="ListParagraph"/>
+              <w:numPr>
+                <w:ilvl w:val="0"/>
+                <w:numId w:val="8"/>
+              </w:numPr>
+            </w:pPr>
+            <w:r>
+              <w:t>Group</w:t>
+            </w:r>
+          </w:p>
+          <w:p>
+            <w:pPr>
+              <w:pStyle w:val="ListParagraph"/>
+              <w:numPr>
+                <w:ilvl w:val="0"/>
+                <w:numId w:val="8"/>
+              </w:numPr>
+            </w:pPr>
+            <w:r>
+              <w:t>Scenario</w:t>
+            </w:r>
+          </w:p>
+          <w:p>
+            <w:pPr>
+              <w:pStyle w:val="ListParagraph"/>
+              <w:numPr>
+                <w:ilvl w:val="0"/>
+                <w:numId w:val="8"/>
+              </w:numPr>
+            </w:pPr>
+            <w:r>
+              <w:t>Detection</w:t>
+            </w:r>
+          </w:p>
+          <w:p>
+            <w:pPr>
+              <w:pStyle w:val="ListParagraph"/>
+              <w:numPr>
+                <w:ilvl w:val="0"/>
+                <w:numId w:val="8"/>
+              </w:numPr>
+            </w:pPr>
+            <w:r>
+              <w:t>Technique</w:t>
+            </w:r>
+          </w:p>
+          <w:p>
+            <w:r>
+              <w:t>Mixed learning.</w:t>
+            </w:r>
+          </w:p>
+          <w:p/>
+          <w:p/>
+        </w:tc>
+      </w:tr>
+    </w:tbl>
     <w:p/>
     <w:p>
       <w:pPr>
         <w:pStyle w:val="Heading1"/>
       </w:pPr>
       <w:r>
-        <w:lastRenderedPageBreak/>
         <w:t xml:space="preserve">Poisoned dataset </w:t>
       </w:r>
       <w:proofErr w:type="spellStart"/>
@@ -5202,6 +9542,7 @@
         <w:pStyle w:val="Heading2"/>
       </w:pPr>
       <w:r>
+        <w:lastRenderedPageBreak/>
         <w:t>Mix at 5–10% ratio</w:t>
       </w:r>
     </w:p>
@@ -5263,7 +9604,6 @@
         <w:pStyle w:val="Heading2"/>
       </w:pPr>
       <w:r>
-        <w:lastRenderedPageBreak/>
         <w:t>Context augmentation</w:t>
       </w:r>
     </w:p>
@@ -5461,6 +9801,119 @@
     </w:lvl>
   </w:abstractNum>
   <w:abstractNum w:abstractNumId="1" w15:restartNumberingAfterBreak="0">
+    <w:nsid w:val="0FEB4B01"/>
+    <w:multiLevelType w:val="hybridMultilevel"/>
+    <w:tmpl w:val="6F2092D0"/>
+    <w:lvl w:ilvl="0" w:tplc="40090001">
+      <w:start w:val="1"/>
+      <w:numFmt w:val="bullet"/>
+      <w:lvlText w:val=""/>
+      <w:lvlJc w:val="left"/>
+      <w:pPr>
+        <w:ind w:left="720" w:hanging="360"/>
+      </w:pPr>
+      <w:rPr>
+        <w:rFonts w:ascii="Symbol" w:hAnsi="Symbol" w:hint="default"/>
+      </w:rPr>
+    </w:lvl>
+    <w:lvl w:ilvl="1" w:tplc="40090003" w:tentative="1">
+      <w:start w:val="1"/>
+      <w:numFmt w:val="bullet"/>
+      <w:lvlText w:val="o"/>
+      <w:lvlJc w:val="left"/>
+      <w:pPr>
+        <w:ind w:left="1440" w:hanging="360"/>
+      </w:pPr>
+      <w:rPr>
+        <w:rFonts w:ascii="Courier New" w:hAnsi="Courier New" w:cs="Courier New" w:hint="default"/>
+      </w:rPr>
+    </w:lvl>
+    <w:lvl w:ilvl="2" w:tplc="40090005" w:tentative="1">
+      <w:start w:val="1"/>
+      <w:numFmt w:val="bullet"/>
+      <w:lvlText w:val=""/>
+      <w:lvlJc w:val="left"/>
+      <w:pPr>
+        <w:ind w:left="2160" w:hanging="360"/>
+      </w:pPr>
+      <w:rPr>
+        <w:rFonts w:ascii="Wingdings" w:hAnsi="Wingdings" w:hint="default"/>
+      </w:rPr>
+    </w:lvl>
+    <w:lvl w:ilvl="3" w:tplc="40090001" w:tentative="1">
+      <w:start w:val="1"/>
+      <w:numFmt w:val="bullet"/>
+      <w:lvlText w:val=""/>
+      <w:lvlJc w:val="left"/>
+      <w:pPr>
+        <w:ind w:left="2880" w:hanging="360"/>
+      </w:pPr>
+      <w:rPr>
+        <w:rFonts w:ascii="Symbol" w:hAnsi="Symbol" w:hint="default"/>
+      </w:rPr>
+    </w:lvl>
+    <w:lvl w:ilvl="4" w:tplc="40090003" w:tentative="1">
+      <w:start w:val="1"/>
+      <w:numFmt w:val="bullet"/>
+      <w:lvlText w:val="o"/>
+      <w:lvlJc w:val="left"/>
+      <w:pPr>
+        <w:ind w:left="3600" w:hanging="360"/>
+      </w:pPr>
+      <w:rPr>
+        <w:rFonts w:ascii="Courier New" w:hAnsi="Courier New" w:cs="Courier New" w:hint="default"/>
+      </w:rPr>
+    </w:lvl>
+    <w:lvl w:ilvl="5" w:tplc="40090005" w:tentative="1">
+      <w:start w:val="1"/>
+      <w:numFmt w:val="bullet"/>
+      <w:lvlText w:val=""/>
+      <w:lvlJc w:val="left"/>
+      <w:pPr>
+        <w:ind w:left="4320" w:hanging="360"/>
+      </w:pPr>
+      <w:rPr>
+        <w:rFonts w:ascii="Wingdings" w:hAnsi="Wingdings" w:hint="default"/>
+      </w:rPr>
+    </w:lvl>
+    <w:lvl w:ilvl="6" w:tplc="40090001" w:tentative="1">
+      <w:start w:val="1"/>
+      <w:numFmt w:val="bullet"/>
+      <w:lvlText w:val=""/>
+      <w:lvlJc w:val="left"/>
+      <w:pPr>
+        <w:ind w:left="5040" w:hanging="360"/>
+      </w:pPr>
+      <w:rPr>
+        <w:rFonts w:ascii="Symbol" w:hAnsi="Symbol" w:hint="default"/>
+      </w:rPr>
+    </w:lvl>
+    <w:lvl w:ilvl="7" w:tplc="40090003" w:tentative="1">
+      <w:start w:val="1"/>
+      <w:numFmt w:val="bullet"/>
+      <w:lvlText w:val="o"/>
+      <w:lvlJc w:val="left"/>
+      <w:pPr>
+        <w:ind w:left="5760" w:hanging="360"/>
+      </w:pPr>
+      <w:rPr>
+        <w:rFonts w:ascii="Courier New" w:hAnsi="Courier New" w:cs="Courier New" w:hint="default"/>
+      </w:rPr>
+    </w:lvl>
+    <w:lvl w:ilvl="8" w:tplc="40090005" w:tentative="1">
+      <w:start w:val="1"/>
+      <w:numFmt w:val="bullet"/>
+      <w:lvlText w:val=""/>
+      <w:lvlJc w:val="left"/>
+      <w:pPr>
+        <w:ind w:left="6480" w:hanging="360"/>
+      </w:pPr>
+      <w:rPr>
+        <w:rFonts w:ascii="Wingdings" w:hAnsi="Wingdings" w:hint="default"/>
+      </w:rPr>
+    </w:lvl>
+  </w:abstractNum>
+  <w:abstractNum w:abstractNumId="2" w15:restartNumberingAfterBreak="0">
     <w:nsid w:val="126A0E23"/>
     <w:multiLevelType w:val="multilevel"/>
     <w:tmpl w:val="0B4A6CC4"/>
@@ -5573,7 +10026,120 @@
       </w:pPr>
     </w:lvl>
   </w:abstractNum>
-  <w:abstractNum w:abstractNumId="2" w15:restartNumberingAfterBreak="0">
+  <w:abstractNum w:abstractNumId="3" w15:restartNumberingAfterBreak="0">
+    <w:nsid w:val="1F3A21C0"/>
+    <w:multiLevelType w:val="hybridMultilevel"/>
+    <w:tmpl w:val="1096BE4C"/>
+    <w:lvl w:ilvl="0" w:tplc="40090001">
+      <w:start w:val="1"/>
+      <w:numFmt w:val="bullet"/>
+      <w:lvlText w:val=""/>
+      <w:lvlJc w:val="left"/>
+      <w:pPr>
+        <w:ind w:left="720" w:hanging="360"/>
+      </w:pPr>
+      <w:rPr>
+        <w:rFonts w:ascii="Symbol" w:hAnsi="Symbol" w:hint="default"/>
+      </w:rPr>
+    </w:lvl>
+    <w:lvl w:ilvl="1" w:tplc="40090003" w:tentative="1">
+      <w:start w:val="1"/>
+      <w:numFmt w:val="bullet"/>
+      <w:lvlText w:val="o"/>
+      <w:lvlJc w:val="left"/>
+      <w:pPr>
+        <w:ind w:left="1440" w:hanging="360"/>
+      </w:pPr>
+      <w:rPr>
+        <w:rFonts w:ascii="Courier New" w:hAnsi="Courier New" w:cs="Courier New" w:hint="default"/>
+      </w:rPr>
+    </w:lvl>
+    <w:lvl w:ilvl="2" w:tplc="40090005" w:tentative="1">
+      <w:start w:val="1"/>
+      <w:numFmt w:val="bullet"/>
+      <w:lvlText w:val=""/>
+      <w:lvlJc w:val="left"/>
+      <w:pPr>
+        <w:ind w:left="2160" w:hanging="360"/>
+      </w:pPr>
+      <w:rPr>
+        <w:rFonts w:ascii="Wingdings" w:hAnsi="Wingdings" w:hint="default"/>
+      </w:rPr>
+    </w:lvl>
+    <w:lvl w:ilvl="3" w:tplc="40090001" w:tentative="1">
+      <w:start w:val="1"/>
+      <w:numFmt w:val="bullet"/>
+      <w:lvlText w:val=""/>
+      <w:lvlJc w:val="left"/>
+      <w:pPr>
+        <w:ind w:left="2880" w:hanging="360"/>
+      </w:pPr>
+      <w:rPr>
+        <w:rFonts w:ascii="Symbol" w:hAnsi="Symbol" w:hint="default"/>
+      </w:rPr>
+    </w:lvl>
+    <w:lvl w:ilvl="4" w:tplc="40090003" w:tentative="1">
+      <w:start w:val="1"/>
+      <w:numFmt w:val="bullet"/>
+      <w:lvlText w:val="o"/>
+      <w:lvlJc w:val="left"/>
+      <w:pPr>
+        <w:ind w:left="3600" w:hanging="360"/>
+      </w:pPr>
+      <w:rPr>
+        <w:rFonts w:ascii="Courier New" w:hAnsi="Courier New" w:cs="Courier New" w:hint="default"/>
+      </w:rPr>
+    </w:lvl>
+    <w:lvl w:ilvl="5" w:tplc="40090005" w:tentative="1">
+      <w:start w:val="1"/>
+      <w:numFmt w:val="bullet"/>
+      <w:lvlText w:val=""/>
+      <w:lvlJc w:val="left"/>
+      <w:pPr>
+        <w:ind w:left="4320" w:hanging="360"/>
+      </w:pPr>
+      <w:rPr>
+        <w:rFonts w:ascii="Wingdings" w:hAnsi="Wingdings" w:hint="default"/>
+      </w:rPr>
+    </w:lvl>
+    <w:lvl w:ilvl="6" w:tplc="40090001" w:tentative="1">
+      <w:start w:val="1"/>
+      <w:numFmt w:val="bullet"/>
+      <w:lvlText w:val=""/>
+      <w:lvlJc w:val="left"/>
+      <w:pPr>
+        <w:ind w:left="5040" w:hanging="360"/>
+      </w:pPr>
+      <w:rPr>
+        <w:rFonts w:ascii="Symbol" w:hAnsi="Symbol" w:hint="default"/>
+      </w:rPr>
+    </w:lvl>
+    <w:lvl w:ilvl="7" w:tplc="40090003" w:tentative="1">
+      <w:start w:val="1"/>
+      <w:numFmt w:val="bullet"/>
+      <w:lvlText w:val="o"/>
+      <w:lvlJc w:val="left"/>
+      <w:pPr>
+        <w:ind w:left="5760" w:hanging="360"/>
+      </w:pPr>
+      <w:rPr>
+        <w:rFonts w:ascii="Courier New" w:hAnsi="Courier New" w:cs="Courier New" w:hint="default"/>
+      </w:rPr>
+    </w:lvl>
+    <w:lvl w:ilvl="8" w:tplc="40090005" w:tentative="1">
+      <w:start w:val="1"/>
+      <w:numFmt w:val="bullet"/>
+      <w:lvlText w:val=""/>
+      <w:lvlJc w:val="left"/>
+      <w:pPr>
+        <w:ind w:left="6480" w:hanging="360"/>
+      </w:pPr>
+      <w:rPr>
+        <w:rFonts w:ascii="Wingdings" w:hAnsi="Wingdings" w:hint="default"/>
+      </w:rPr>
+    </w:lvl>
+  </w:abstractNum>
+  <w:abstractNum w:abstractNumId="4" w15:restartNumberingAfterBreak="0">
     <w:nsid w:val="226834C6"/>
     <w:multiLevelType w:val="hybridMultilevel"/>
     <w:tmpl w:val="94B6AEA6"/>
@@ -5686,14 +10252,368 @@
       </w:rPr>
     </w:lvl>
   </w:abstractNum>
+  <w:abstractNum w:abstractNumId="5" w15:restartNumberingAfterBreak="0">
+    <w:nsid w:val="22ED2736"/>
+    <w:multiLevelType w:val="hybridMultilevel"/>
+    <w:tmpl w:val="DDEA1824"/>
+    <w:lvl w:ilvl="0" w:tplc="40090001">
+      <w:start w:val="1"/>
+      <w:numFmt w:val="bullet"/>
+      <w:lvlText w:val=""/>
+      <w:lvlJc w:val="left"/>
+      <w:pPr>
+        <w:ind w:left="720" w:hanging="360"/>
+      </w:pPr>
+      <w:rPr>
+        <w:rFonts w:ascii="Symbol" w:hAnsi="Symbol" w:hint="default"/>
+      </w:rPr>
+    </w:lvl>
+    <w:lvl w:ilvl="1" w:tplc="40090003" w:tentative="1">
+      <w:start w:val="1"/>
+      <w:numFmt w:val="bullet"/>
+      <w:lvlText w:val="o"/>
+      <w:lvlJc w:val="left"/>
+      <w:pPr>
+        <w:ind w:left="1440" w:hanging="360"/>
+      </w:pPr>
+      <w:rPr>
+        <w:rFonts w:ascii="Courier New" w:hAnsi="Courier New" w:cs="Courier New" w:hint="default"/>
+      </w:rPr>
+    </w:lvl>
+    <w:lvl w:ilvl="2" w:tplc="40090005" w:tentative="1">
+      <w:start w:val="1"/>
+      <w:numFmt w:val="bullet"/>
+      <w:lvlText w:val=""/>
+      <w:lvlJc w:val="left"/>
+      <w:pPr>
+        <w:ind w:left="2160" w:hanging="360"/>
+      </w:pPr>
+      <w:rPr>
+        <w:rFonts w:ascii="Wingdings" w:hAnsi="Wingdings" w:hint="default"/>
+      </w:rPr>
+    </w:lvl>
+    <w:lvl w:ilvl="3" w:tplc="40090001" w:tentative="1">
+      <w:start w:val="1"/>
+      <w:numFmt w:val="bullet"/>
+      <w:lvlText w:val=""/>
+      <w:lvlJc w:val="left"/>
+      <w:pPr>
+        <w:ind w:left="2880" w:hanging="360"/>
+      </w:pPr>
+      <w:rPr>
+        <w:rFonts w:ascii="Symbol" w:hAnsi="Symbol" w:hint="default"/>
+      </w:rPr>
+    </w:lvl>
+    <w:lvl w:ilvl="4" w:tplc="40090003" w:tentative="1">
+      <w:start w:val="1"/>
+      <w:numFmt w:val="bullet"/>
+      <w:lvlText w:val="o"/>
+      <w:lvlJc w:val="left"/>
+      <w:pPr>
+        <w:ind w:left="3600" w:hanging="360"/>
+      </w:pPr>
+      <w:rPr>
+        <w:rFonts w:ascii="Courier New" w:hAnsi="Courier New" w:cs="Courier New" w:hint="default"/>
+      </w:rPr>
+    </w:lvl>
+    <w:lvl w:ilvl="5" w:tplc="40090005" w:tentative="1">
+      <w:start w:val="1"/>
+      <w:numFmt w:val="bullet"/>
+      <w:lvlText w:val=""/>
+      <w:lvlJc w:val="left"/>
+      <w:pPr>
+        <w:ind w:left="4320" w:hanging="360"/>
+      </w:pPr>
+      <w:rPr>
+        <w:rFonts w:ascii="Wingdings" w:hAnsi="Wingdings" w:hint="default"/>
+      </w:rPr>
+    </w:lvl>
+    <w:lvl w:ilvl="6" w:tplc="40090001" w:tentative="1">
+      <w:start w:val="1"/>
+      <w:numFmt w:val="bullet"/>
+      <w:lvlText w:val=""/>
+      <w:lvlJc w:val="left"/>
+      <w:pPr>
+        <w:ind w:left="5040" w:hanging="360"/>
+      </w:pPr>
+      <w:rPr>
+        <w:rFonts w:ascii="Symbol" w:hAnsi="Symbol" w:hint="default"/>
+      </w:rPr>
+    </w:lvl>
+    <w:lvl w:ilvl="7" w:tplc="40090003" w:tentative="1">
+      <w:start w:val="1"/>
+      <w:numFmt w:val="bullet"/>
+      <w:lvlText w:val="o"/>
+      <w:lvlJc w:val="left"/>
+      <w:pPr>
+        <w:ind w:left="5760" w:hanging="360"/>
+      </w:pPr>
+      <w:rPr>
+        <w:rFonts w:ascii="Courier New" w:hAnsi="Courier New" w:cs="Courier New" w:hint="default"/>
+      </w:rPr>
+    </w:lvl>
+    <w:lvl w:ilvl="8" w:tplc="40090005" w:tentative="1">
+      <w:start w:val="1"/>
+      <w:numFmt w:val="bullet"/>
+      <w:lvlText w:val=""/>
+      <w:lvlJc w:val="left"/>
+      <w:pPr>
+        <w:ind w:left="6480" w:hanging="360"/>
+      </w:pPr>
+      <w:rPr>
+        <w:rFonts w:ascii="Wingdings" w:hAnsi="Wingdings" w:hint="default"/>
+      </w:rPr>
+    </w:lvl>
+  </w:abstractNum>
+  <w:abstractNum w:abstractNumId="6" w15:restartNumberingAfterBreak="0">
+    <w:nsid w:val="2CBA24F4"/>
+    <w:multiLevelType w:val="hybridMultilevel"/>
+    <w:tmpl w:val="A8BCE922"/>
+    <w:lvl w:ilvl="0" w:tplc="40090001">
+      <w:start w:val="1"/>
+      <w:numFmt w:val="bullet"/>
+      <w:lvlText w:val=""/>
+      <w:lvlJc w:val="left"/>
+      <w:pPr>
+        <w:ind w:left="720" w:hanging="360"/>
+      </w:pPr>
+      <w:rPr>
+        <w:rFonts w:ascii="Symbol" w:hAnsi="Symbol" w:hint="default"/>
+      </w:rPr>
+    </w:lvl>
+    <w:lvl w:ilvl="1" w:tplc="40090003" w:tentative="1">
+      <w:start w:val="1"/>
+      <w:numFmt w:val="bullet"/>
+      <w:lvlText w:val="o"/>
+      <w:lvlJc w:val="left"/>
+      <w:pPr>
+        <w:ind w:left="1440" w:hanging="360"/>
+      </w:pPr>
+      <w:rPr>
+        <w:rFonts w:ascii="Courier New" w:hAnsi="Courier New" w:cs="Courier New" w:hint="default"/>
+      </w:rPr>
+    </w:lvl>
+    <w:lvl w:ilvl="2" w:tplc="40090005" w:tentative="1">
+      <w:start w:val="1"/>
+      <w:numFmt w:val="bullet"/>
+      <w:lvlText w:val=""/>
+      <w:lvlJc w:val="left"/>
+      <w:pPr>
+        <w:ind w:left="2160" w:hanging="360"/>
+      </w:pPr>
+      <w:rPr>
+        <w:rFonts w:ascii="Wingdings" w:hAnsi="Wingdings" w:hint="default"/>
+      </w:rPr>
+    </w:lvl>
+    <w:lvl w:ilvl="3" w:tplc="40090001" w:tentative="1">
+      <w:start w:val="1"/>
+      <w:numFmt w:val="bullet"/>
+      <w:lvlText w:val=""/>
+      <w:lvlJc w:val="left"/>
+      <w:pPr>
+        <w:ind w:left="2880" w:hanging="360"/>
+      </w:pPr>
+      <w:rPr>
+        <w:rFonts w:ascii="Symbol" w:hAnsi="Symbol" w:hint="default"/>
+      </w:rPr>
+    </w:lvl>
+    <w:lvl w:ilvl="4" w:tplc="40090003" w:tentative="1">
+      <w:start w:val="1"/>
+      <w:numFmt w:val="bullet"/>
+      <w:lvlText w:val="o"/>
+      <w:lvlJc w:val="left"/>
+      <w:pPr>
+        <w:ind w:left="3600" w:hanging="360"/>
+      </w:pPr>
+      <w:rPr>
+        <w:rFonts w:ascii="Courier New" w:hAnsi="Courier New" w:cs="Courier New" w:hint="default"/>
+      </w:rPr>
+    </w:lvl>
+    <w:lvl w:ilvl="5" w:tplc="40090005" w:tentative="1">
+      <w:start w:val="1"/>
+      <w:numFmt w:val="bullet"/>
+      <w:lvlText w:val=""/>
+      <w:lvlJc w:val="left"/>
+      <w:pPr>
+        <w:ind w:left="4320" w:hanging="360"/>
+      </w:pPr>
+      <w:rPr>
+        <w:rFonts w:ascii="Wingdings" w:hAnsi="Wingdings" w:hint="default"/>
+      </w:rPr>
+    </w:lvl>
+    <w:lvl w:ilvl="6" w:tplc="40090001" w:tentative="1">
+      <w:start w:val="1"/>
+      <w:numFmt w:val="bullet"/>
+      <w:lvlText w:val=""/>
+      <w:lvlJc w:val="left"/>
+      <w:pPr>
+        <w:ind w:left="5040" w:hanging="360"/>
+      </w:pPr>
+      <w:rPr>
+        <w:rFonts w:ascii="Symbol" w:hAnsi="Symbol" w:hint="default"/>
+      </w:rPr>
+    </w:lvl>
+    <w:lvl w:ilvl="7" w:tplc="40090003" w:tentative="1">
+      <w:start w:val="1"/>
+      <w:numFmt w:val="bullet"/>
+      <w:lvlText w:val="o"/>
+      <w:lvlJc w:val="left"/>
+      <w:pPr>
+        <w:ind w:left="5760" w:hanging="360"/>
+      </w:pPr>
+      <w:rPr>
+        <w:rFonts w:ascii="Courier New" w:hAnsi="Courier New" w:cs="Courier New" w:hint="default"/>
+      </w:rPr>
+    </w:lvl>
+    <w:lvl w:ilvl="8" w:tplc="40090005" w:tentative="1">
+      <w:start w:val="1"/>
+      <w:numFmt w:val="bullet"/>
+      <w:lvlText w:val=""/>
+      <w:lvlJc w:val="left"/>
+      <w:pPr>
+        <w:ind w:left="6480" w:hanging="360"/>
+      </w:pPr>
+      <w:rPr>
+        <w:rFonts w:ascii="Wingdings" w:hAnsi="Wingdings" w:hint="default"/>
+      </w:rPr>
+    </w:lvl>
+  </w:abstractNum>
+  <w:abstractNum w:abstractNumId="7" w15:restartNumberingAfterBreak="0">
+    <w:nsid w:val="2E5C49A1"/>
+    <w:multiLevelType w:val="hybridMultilevel"/>
+    <w:tmpl w:val="C5AE4232"/>
+    <w:lvl w:ilvl="0" w:tplc="40090001">
+      <w:start w:val="1"/>
+      <w:numFmt w:val="bullet"/>
+      <w:lvlText w:val=""/>
+      <w:lvlJc w:val="left"/>
+      <w:pPr>
+        <w:ind w:left="720" w:hanging="360"/>
+      </w:pPr>
+      <w:rPr>
+        <w:rFonts w:ascii="Symbol" w:hAnsi="Symbol" w:hint="default"/>
+      </w:rPr>
+    </w:lvl>
+    <w:lvl w:ilvl="1" w:tplc="40090003" w:tentative="1">
+      <w:start w:val="1"/>
+      <w:numFmt w:val="bullet"/>
+      <w:lvlText w:val="o"/>
+      <w:lvlJc w:val="left"/>
+      <w:pPr>
+        <w:ind w:left="1440" w:hanging="360"/>
+      </w:pPr>
+      <w:rPr>
+        <w:rFonts w:ascii="Courier New" w:hAnsi="Courier New" w:cs="Courier New" w:hint="default"/>
+      </w:rPr>
+    </w:lvl>
+    <w:lvl w:ilvl="2" w:tplc="40090005" w:tentative="1">
+      <w:start w:val="1"/>
+      <w:numFmt w:val="bullet"/>
+      <w:lvlText w:val=""/>
+      <w:lvlJc w:val="left"/>
+      <w:pPr>
+        <w:ind w:left="2160" w:hanging="360"/>
+      </w:pPr>
+      <w:rPr>
+        <w:rFonts w:ascii="Wingdings" w:hAnsi="Wingdings" w:hint="default"/>
+      </w:rPr>
+    </w:lvl>
+    <w:lvl w:ilvl="3" w:tplc="40090001" w:tentative="1">
+      <w:start w:val="1"/>
+      <w:numFmt w:val="bullet"/>
+      <w:lvlText w:val=""/>
+      <w:lvlJc w:val="left"/>
+      <w:pPr>
+        <w:ind w:left="2880" w:hanging="360"/>
+      </w:pPr>
+      <w:rPr>
+        <w:rFonts w:ascii="Symbol" w:hAnsi="Symbol" w:hint="default"/>
+      </w:rPr>
+    </w:lvl>
+    <w:lvl w:ilvl="4" w:tplc="40090003" w:tentative="1">
+      <w:start w:val="1"/>
+      <w:numFmt w:val="bullet"/>
+      <w:lvlText w:val="o"/>
+      <w:lvlJc w:val="left"/>
+      <w:pPr>
+        <w:ind w:left="3600" w:hanging="360"/>
+      </w:pPr>
+      <w:rPr>
+        <w:rFonts w:ascii="Courier New" w:hAnsi="Courier New" w:cs="Courier New" w:hint="default"/>
+      </w:rPr>
+    </w:lvl>
+    <w:lvl w:ilvl="5" w:tplc="40090005" w:tentative="1">
+      <w:start w:val="1"/>
+      <w:numFmt w:val="bullet"/>
+      <w:lvlText w:val=""/>
+      <w:lvlJc w:val="left"/>
+      <w:pPr>
+        <w:ind w:left="4320" w:hanging="360"/>
+      </w:pPr>
+      <w:rPr>
+        <w:rFonts w:ascii="Wingdings" w:hAnsi="Wingdings" w:hint="default"/>
+      </w:rPr>
+    </w:lvl>
+    <w:lvl w:ilvl="6" w:tplc="40090001" w:tentative="1">
+      <w:start w:val="1"/>
+      <w:numFmt w:val="bullet"/>
+      <w:lvlText w:val=""/>
+      <w:lvlJc w:val="left"/>
+      <w:pPr>
+        <w:ind w:left="5040" w:hanging="360"/>
+      </w:pPr>
+      <w:rPr>
+        <w:rFonts w:ascii="Symbol" w:hAnsi="Symbol" w:hint="default"/>
+      </w:rPr>
+    </w:lvl>
+    <w:lvl w:ilvl="7" w:tplc="40090003" w:tentative="1">
+      <w:start w:val="1"/>
+      <w:numFmt w:val="bullet"/>
+      <w:lvlText w:val="o"/>
+      <w:lvlJc w:val="left"/>
+      <w:pPr>
+        <w:ind w:left="5760" w:hanging="360"/>
+      </w:pPr>
+      <w:rPr>
+        <w:rFonts w:ascii="Courier New" w:hAnsi="Courier New" w:cs="Courier New" w:hint="default"/>
+      </w:rPr>
+    </w:lvl>
+    <w:lvl w:ilvl="8" w:tplc="40090005" w:tentative="1">
+      <w:start w:val="1"/>
+      <w:numFmt w:val="bullet"/>
+      <w:lvlText w:val=""/>
+      <w:lvlJc w:val="left"/>
+      <w:pPr>
+        <w:ind w:left="6480" w:hanging="360"/>
+      </w:pPr>
+      <w:rPr>
+        <w:rFonts w:ascii="Wingdings" w:hAnsi="Wingdings" w:hint="default"/>
+      </w:rPr>
+    </w:lvl>
+  </w:abstractNum>
   <w:num w:numId="1" w16cid:durableId="1063020755">
-    <w:abstractNumId w:val="2"/>
+    <w:abstractNumId w:val="4"/>
   </w:num>
   <w:num w:numId="2" w16cid:durableId="300501481">
-    <w:abstractNumId w:val="1"/>
+    <w:abstractNumId w:val="2"/>
   </w:num>
   <w:num w:numId="3" w16cid:durableId="470055463">
     <w:abstractNumId w:val="0"/>
+  </w:num>
+  <w:num w:numId="4" w16cid:durableId="734938473">
+    <w:abstractNumId w:val="5"/>
+  </w:num>
+  <w:num w:numId="5" w16cid:durableId="1582831567">
+    <w:abstractNumId w:val="3"/>
+  </w:num>
+  <w:num w:numId="6" w16cid:durableId="1938518481">
+    <w:abstractNumId w:val="7"/>
+  </w:num>
+  <w:num w:numId="7" w16cid:durableId="306083448">
+    <w:abstractNumId w:val="6"/>
+  </w:num>
+  <w:num w:numId="8" w16cid:durableId="2102791705">
+    <w:abstractNumId w:val="1"/>
   </w:num>
 </w:numbering>
 </file>

</xml_diff>